<commit_message>
proposal v0.15: operationalize anchor tests and add project memory
</commit_message>
<xml_diff>
--- a/deliverables/DeepAlign-Bench_完整人话版.docx
+++ b/deliverables/DeepAlign-Bench_完整人话版.docx
@@ -131,7 +131,7 @@
                 <w:color w:val="5B6B7A"/>
                 <w:sz w:val="21"/>
               </w:rPr>
-              <w:t>v0.13 · 完整人话版</w:t>
+              <w:t>v0.15 · 完整人话版</w:t>
             </w:r>
           </w:p>
         </w:tc>
@@ -2378,7 +2378,41 @@
         <w:rPr>
           <w:rFonts w:ascii="Calibri" w:hAnsi="Calibri" w:eastAsia="PingFang SC"/>
         </w:rPr>
-        <w:t>8 个 anchor family 会加入以下部分条件：</w:t>
+        <w:t>这里要分清两件事：</w:t>
+      </w:r>
+      <w:r>
+        <w:rPr>
+          <w:rFonts w:ascii="Calibri" w:hAnsi="Calibri" w:eastAsia="PingFang SC"/>
+          <w:b/>
+        </w:rPr>
+        <w:t>persona 与 task 匹配</w:t>
+      </w:r>
+      <w:r>
+        <w:rPr>
+          <w:rFonts w:ascii="Calibri" w:hAnsi="Calibri" w:eastAsia="PingFang SC"/>
+        </w:rPr>
+        <w:t>用于先做出一组有效的干净题；</w:t>
+      </w:r>
+      <w:r>
+        <w:rPr>
+          <w:rFonts w:ascii="Calibri" w:hAnsi="Calibri" w:eastAsia="PingFang SC"/>
+          <w:b/>
+        </w:rPr>
+        <w:t>压力测试</w:t>
+      </w:r>
+      <w:r>
+        <w:rPr>
+          <w:rFonts w:ascii="Calibri" w:hAnsi="Calibri" w:eastAsia="PingFang SC"/>
+        </w:rPr>
+        <w:t>是在这组题上单独改一个输入或过程因素。Anchor family 只是从 24 个 family 中选出的 8 个合适实验宿主，不是 8 种 persona，也不等于 8 种失败。</w:t>
+      </w:r>
+    </w:p>
+    <w:p>
+      <w:r>
+        <w:rPr>
+          <w:rFonts w:ascii="Calibri" w:hAnsi="Calibri" w:eastAsia="PingFang SC"/>
+        </w:rPr>
+        <w:t>先固定目标用户、任务、证据和预算，再做以下配对改变：</w:t>
       </w:r>
     </w:p>
     <w:p>
@@ -2456,6 +2490,22 @@
           <w:rFonts w:ascii="Calibri" w:hAnsi="Calibri" w:eastAsia="PingFang SC"/>
         </w:rPr>
         <w:t>在交付前重新提醒约束，观察能否恢复。</w:t>
+      </w:r>
+    </w:p>
+    <w:p>
+      <w:r>
+        <w:rPr>
+          <w:rFonts w:ascii="Calibri" w:hAnsi="Calibri" w:eastAsia="PingFang SC"/>
+        </w:rPr>
+        <w:t>前三个共同对照（clean、persona swap、无关信息）在所有 anchor 上运行；冲突、稀释、handoff 和动态更新只放到确实适合的 family。Re-anchor 不是 attack，而是恢复干预；预先确定哪些样本重跑，不能看见失败后再挑样本。这样才能把“这个任务本来难”与“用户信息被错配、稀释、丢失或没有更新”分开。</w:t>
+      </w:r>
+    </w:p>
+    <w:p>
+      <w:r>
+        <w:rPr>
+          <w:rFonts w:ascii="Calibri" w:hAnsi="Calibri" w:eastAsia="PingFang SC"/>
+        </w:rPr>
+        <w:t>每个扰动都要记录：什么保持不变、改了什么、何时插入、agent 当时能看见什么、配对 clean run 是哪一个、哪些结果应该变化/保持，以及恢复策略。对应指标分别是 ΔPF、无关信息 invariance、冲突解析率、PF retention/AUC、handoff loss、update correctness 和 recovery gain；同时检查事实、共同质量、长度和隐私是否受损。</w:t>
       </w:r>
     </w:p>
     <w:p>

</xml_diff>

<commit_message>
proposal v0.16: sharpen related-work gap and add paper brief
</commit_message>
<xml_diff>
--- a/deliverables/DeepAlign-Bench_完整人话版.docx
+++ b/deliverables/DeepAlign-Bench_完整人话版.docx
@@ -131,7 +131,7 @@
                 <w:color w:val="5B6B7A"/>
                 <w:sz w:val="21"/>
               </w:rPr>
-              <w:t>v0.15 · 完整人话版</w:t>
+              <w:t>v0.16 · 完整人话版</w:t>
             </w:r>
           </w:p>
         </w:tc>
@@ -713,7 +713,7 @@
         <w:pStyle w:val="Heading2"/>
       </w:pPr>
       <w:r>
-        <w:t>1.1 高质量不等于适合用户</w:t>
+        <w:t>1.1 现有工作不是没测个性化，而是各测了一段</w:t>
       </w:r>
     </w:p>
     <w:p>
@@ -721,7 +721,102 @@
         <w:rPr>
           <w:rFonts w:ascii="Calibri" w:hAnsi="Calibri" w:eastAsia="PingFang SC"/>
         </w:rPr>
-        <w:t>现有 Deep Research benchmark 大多关注：答案是否正确、搜索是否充分、引用是否可靠、报告是否完整。这些都重要，但它们回答的是“报告好不好”，没有直接回答“报告对这个用户好不好”。</w:t>
+        <w:t>先把故事讲准确。现有 Deep Research benchmark 大多关注答案是否正确、搜索是否充分、引用是否可靠、报告是否完整。这些工作回答“报告好不好”。但最近的个性化 benchmark 已经开始回答更多问题：</w:t>
+      </w:r>
+    </w:p>
+    <w:p>
+      <w:pPr>
+        <w:pStyle w:val="ListBullet"/>
+      </w:pPr>
+      <w:r>
+        <w:rPr>
+          <w:rFonts w:ascii="Calibri" w:hAnsi="Calibri" w:eastAsia="PingFang SC"/>
+        </w:rPr>
+        <w:t>Setoka 测 agent 能否从异构记录中由事实逐步推到情景、行为模式和人格特质；</w:t>
+      </w:r>
+    </w:p>
+    <w:p>
+      <w:pPr>
+        <w:pStyle w:val="ListBullet"/>
+      </w:pPr>
+      <w:r>
+        <w:rPr>
+          <w:rFonts w:ascii="Calibri" w:hAnsi="Calibri" w:eastAsia="PingFang SC"/>
+        </w:rPr>
+        <w:t>PersonaTrail 和 APeB 测 agent 能否从浏览或商品行为历史中恢复偏好、意图和过去事件；</w:t>
+      </w:r>
+    </w:p>
+    <w:p>
+      <w:pPr>
+        <w:pStyle w:val="ListBullet"/>
+      </w:pPr>
+      <w:r>
+        <w:rPr>
+          <w:rFonts w:ascii="Calibri" w:hAnsi="Calibri" w:eastAsia="PingFang SC"/>
+        </w:rPr>
+        <w:t>TARS 测个性化代码解释是否降低用户时间与认知负担；</w:t>
+      </w:r>
+    </w:p>
+    <w:p>
+      <w:pPr>
+        <w:pStyle w:val="ListBullet"/>
+      </w:pPr>
+      <w:r>
+        <w:rPr>
+          <w:rFonts w:ascii="Calibri" w:hAnsi="Calibri" w:eastAsia="PingFang SC"/>
+        </w:rPr>
+        <w:t>PASB 测错误用户观点写入长期状态后，是否污染之后的新任务；</w:t>
+      </w:r>
+    </w:p>
+    <w:p>
+      <w:pPr>
+        <w:pStyle w:val="ListBullet"/>
+      </w:pPr>
+      <w:r>
+        <w:rPr>
+          <w:rFonts w:ascii="Calibri" w:hAnsi="Calibri" w:eastAsia="PingFang SC"/>
+        </w:rPr>
+        <w:t>temporal-intervention 工作提出：必须有明确时间事件、跨事件持久状态、跨能力影响和用户间差异；</w:t>
+      </w:r>
+    </w:p>
+    <w:p>
+      <w:pPr>
+        <w:pStyle w:val="ListBullet"/>
+      </w:pPr>
+      <w:r>
+        <w:rPr>
+          <w:rFonts w:ascii="Calibri" w:hAnsi="Calibri" w:eastAsia="PingFang SC"/>
+        </w:rPr>
+        <w:t>SARSI 提出 personal agent 的任务契约、外部验证、交接和治理架构。</w:t>
+      </w:r>
+    </w:p>
+    <w:p>
+      <w:r>
+        <w:rPr>
+          <w:rFonts w:ascii="Calibri" w:hAnsi="Calibri" w:eastAsia="PingFang SC"/>
+        </w:rPr>
+        <w:t>所以我们不能说“没人测用户理解、历史或长程状态”。更准确的说法是：这些工作大多各测能力链的一段，还没有在广义 Deep Research 中，把</w:t>
+      </w:r>
+      <w:r>
+        <w:rPr>
+          <w:rFonts w:ascii="Calibri" w:hAnsi="Calibri" w:eastAsia="PingFang SC"/>
+          <w:b/>
+        </w:rPr>
+        <w:t>用户信息从哪里来、agent 如何长程执行、最终交付物该怎样因用户而变、这种变化如何被反事实验证</w:t>
+      </w:r>
+      <w:r>
+        <w:rPr>
+          <w:rFonts w:ascii="Calibri" w:hAnsi="Calibri" w:eastAsia="PingFang SC"/>
+        </w:rPr>
+        <w:t>连成一个可审计协议。</w:t>
+      </w:r>
+    </w:p>
+    <w:p>
+      <w:r>
+        <w:rPr>
+          <w:rFonts w:ascii="Calibri" w:hAnsi="Calibri" w:eastAsia="PingFang SC"/>
+        </w:rPr>
+        <w:t>PDR-Bench 已经最接近最后一步，但如果给 agent 一份 persona 后得分更高，仍然可能有三种替代解释：</w:t>
       </w:r>
     </w:p>
     <w:p>
@@ -828,7 +923,7 @@
         <w:rPr>
           <w:rFonts w:ascii="Calibri" w:hAnsi="Calibri" w:eastAsia="PingFang SC"/>
         </w:rPr>
-        <w:t>如果只是把 persona、任务和 agent 数量扩大，评审很容易把本项目看成 PDR-Bench 的扩展版。因此核心贡献必须是可以单独验证的方法：</w:t>
+        <w:t>如果只是把 persona、任务和 agent 数量扩大，评审很容易把本项目看成 PDR-Bench、Setoka、PersonaTrail 或 APeB 的拼接版。因此核心贡献必须是可以单独验证的方法：</w:t>
       </w:r>
     </w:p>
     <w:p>
@@ -909,6 +1004,27 @@
           <w:rFonts w:ascii="Calibri" w:hAnsi="Calibri" w:eastAsia="PingFang SC"/>
         </w:rPr>
         <w:t>用压力测试区分获取、保持、利用、更新和恢复问题。</w:t>
+      </w:r>
+    </w:p>
+    <w:p>
+      <w:r>
+        <w:rPr>
+          <w:rFonts w:ascii="Calibri" w:hAnsi="Calibri" w:eastAsia="PingFang SC"/>
+        </w:rPr>
+        <w:t>我们也要主动缩小首创表述：不声称首先研究 personalization、history、persistent state 或 temporal intervention。我们的候选贡献是把这些已有方向连接到</w:t>
+      </w:r>
+      <w:r>
+        <w:rPr>
+          <w:rFonts w:ascii="Calibri" w:hAnsi="Calibri" w:eastAsia="PingFang SC"/>
+          <w:b/>
+        </w:rPr>
+        <w:t>广义 Deep Research 最终交付物的反事实测量</w:t>
+      </w:r>
+      <w:r>
+        <w:rPr>
+          <w:rFonts w:ascii="Calibri" w:hAnsi="Calibri" w:eastAsia="PingFang SC"/>
+        </w:rPr>
+        <w:t>。如果 matched/swapped 人评不稳定，或者差异可以被长度、风格和共同质量解释，这个贡献就没有成立。</w:t>
       </w:r>
     </w:p>
     <w:p>
@@ -4757,6 +4873,202 @@
         <w:t>. NeurIPS Datasets and Benchmarks, 2025.</w:t>
       </w:r>
     </w:p>
+    <w:p>
+      <w:pPr>
+        <w:spacing w:after="80" w:line="264" w:lineRule="auto"/>
+        <w:ind w:left="360" w:hanging="360"/>
+      </w:pPr>
+      <w:r>
+        <w:rPr>
+          <w:rFonts w:ascii="Calibri" w:hAnsi="Calibri" w:eastAsia="PingFang SC"/>
+          <w:sz w:val="19"/>
+        </w:rPr>
+        <w:t xml:space="preserve">[13] Zeng et al. </w:t>
+      </w:r>
+      <w:r>
+        <w:rPr>
+          <w:rFonts w:ascii="Calibri" w:hAnsi="Calibri" w:eastAsia="PingFang SC"/>
+          <w:i/>
+          <w:sz w:val="19"/>
+        </w:rPr>
+        <w:t>Setoka</w:t>
+      </w:r>
+      <w:r>
+        <w:rPr>
+          <w:rFonts w:ascii="Calibri" w:hAnsi="Calibri" w:eastAsia="PingFang SC"/>
+          <w:sz w:val="19"/>
+        </w:rPr>
+        <w:t>. arXiv:2607.27056, 2026.</w:t>
+      </w:r>
+    </w:p>
+    <w:p>
+      <w:pPr>
+        <w:spacing w:after="80" w:line="264" w:lineRule="auto"/>
+        <w:ind w:left="360" w:hanging="360"/>
+      </w:pPr>
+      <w:r>
+        <w:rPr>
+          <w:rFonts w:ascii="Calibri" w:hAnsi="Calibri" w:eastAsia="PingFang SC"/>
+          <w:sz w:val="19"/>
+        </w:rPr>
+        <w:t xml:space="preserve">[14] Qian et al. </w:t>
+      </w:r>
+      <w:r>
+        <w:rPr>
+          <w:rFonts w:ascii="Calibri" w:hAnsi="Calibri" w:eastAsia="PingFang SC"/>
+          <w:i/>
+          <w:sz w:val="19"/>
+        </w:rPr>
+        <w:t>Toward User-Conditioned Evaluation of Personal LLM Agents under Temporal Interventions</w:t>
+      </w:r>
+      <w:r>
+        <w:rPr>
+          <w:rFonts w:ascii="Calibri" w:hAnsi="Calibri" w:eastAsia="PingFang SC"/>
+          <w:sz w:val="19"/>
+        </w:rPr>
+        <w:t>. arXiv:2607.21635, 2026.</w:t>
+      </w:r>
+    </w:p>
+    <w:p>
+      <w:pPr>
+        <w:spacing w:after="80" w:line="264" w:lineRule="auto"/>
+        <w:ind w:left="360" w:hanging="360"/>
+      </w:pPr>
+      <w:r>
+        <w:rPr>
+          <w:rFonts w:ascii="Calibri" w:hAnsi="Calibri" w:eastAsia="PingFang SC"/>
+          <w:sz w:val="19"/>
+        </w:rPr>
+        <w:t xml:space="preserve">[15] Yang et al. </w:t>
+      </w:r>
+      <w:r>
+        <w:rPr>
+          <w:rFonts w:ascii="Calibri" w:hAnsi="Calibri" w:eastAsia="PingFang SC"/>
+          <w:i/>
+          <w:sz w:val="19"/>
+        </w:rPr>
+        <w:t>PersonaTrail</w:t>
+      </w:r>
+      <w:r>
+        <w:rPr>
+          <w:rFonts w:ascii="Calibri" w:hAnsi="Calibri" w:eastAsia="PingFang SC"/>
+          <w:sz w:val="19"/>
+        </w:rPr>
+        <w:t>. arXiv:2607.20482, 2026.</w:t>
+      </w:r>
+    </w:p>
+    <w:p>
+      <w:pPr>
+        <w:spacing w:after="80" w:line="264" w:lineRule="auto"/>
+        <w:ind w:left="360" w:hanging="360"/>
+      </w:pPr>
+      <w:r>
+        <w:rPr>
+          <w:rFonts w:ascii="Calibri" w:hAnsi="Calibri" w:eastAsia="PingFang SC"/>
+          <w:sz w:val="19"/>
+        </w:rPr>
+        <w:t xml:space="preserve">[16] Todisco et al. </w:t>
+      </w:r>
+      <w:r>
+        <w:rPr>
+          <w:rFonts w:ascii="Calibri" w:hAnsi="Calibri" w:eastAsia="PingFang SC"/>
+          <w:i/>
+          <w:sz w:val="19"/>
+        </w:rPr>
+        <w:t>TARS</w:t>
+      </w:r>
+      <w:r>
+        <w:rPr>
+          <w:rFonts w:ascii="Calibri" w:hAnsi="Calibri" w:eastAsia="PingFang SC"/>
+          <w:sz w:val="19"/>
+        </w:rPr>
+        <w:t>. arXiv:2607.15948, 2026.</w:t>
+      </w:r>
+    </w:p>
+    <w:p>
+      <w:pPr>
+        <w:spacing w:after="80" w:line="264" w:lineRule="auto"/>
+        <w:ind w:left="360" w:hanging="360"/>
+      </w:pPr>
+      <w:r>
+        <w:rPr>
+          <w:rFonts w:ascii="Calibri" w:hAnsi="Calibri" w:eastAsia="PingFang SC"/>
+          <w:sz w:val="19"/>
+        </w:rPr>
+        <w:t xml:space="preserve">[17] Yang. </w:t>
+      </w:r>
+      <w:r>
+        <w:rPr>
+          <w:rFonts w:ascii="Calibri" w:hAnsi="Calibri" w:eastAsia="PingFang SC"/>
+          <w:i/>
+          <w:sz w:val="19"/>
+        </w:rPr>
+        <w:t>Self-Aware Recursively Self-Improving Agents for Personal Singularity</w:t>
+      </w:r>
+      <w:r>
+        <w:rPr>
+          <w:rFonts w:ascii="Calibri" w:hAnsi="Calibri" w:eastAsia="PingFang SC"/>
+          <w:sz w:val="19"/>
+        </w:rPr>
+        <w:t>. arXiv:2607.12254, 2026.</w:t>
+      </w:r>
+    </w:p>
+    <w:p>
+      <w:pPr>
+        <w:spacing w:after="80" w:line="264" w:lineRule="auto"/>
+        <w:ind w:left="360" w:hanging="360"/>
+      </w:pPr>
+      <w:r>
+        <w:rPr>
+          <w:rFonts w:ascii="Calibri" w:hAnsi="Calibri" w:eastAsia="PingFang SC"/>
+          <w:sz w:val="19"/>
+        </w:rPr>
+        <w:t xml:space="preserve">[18] Mao et al. </w:t>
+      </w:r>
+      <w:r>
+        <w:rPr>
+          <w:rFonts w:ascii="Calibri" w:hAnsi="Calibri" w:eastAsia="PingFang SC"/>
+          <w:i/>
+          <w:sz w:val="19"/>
+        </w:rPr>
+        <w:t>Agents Don't Just Agree, They Remember</w:t>
+      </w:r>
+      <w:r>
+        <w:rPr>
+          <w:rFonts w:ascii="Calibri" w:hAnsi="Calibri" w:eastAsia="PingFang SC"/>
+          <w:sz w:val="19"/>
+        </w:rPr>
+        <w:t>. arXiv:2607.10526, 2026.</w:t>
+      </w:r>
+    </w:p>
+    <w:p>
+      <w:pPr>
+        <w:spacing w:after="80" w:line="264" w:lineRule="auto"/>
+        <w:ind w:left="360" w:hanging="360"/>
+      </w:pPr>
+      <w:r>
+        <w:rPr>
+          <w:rFonts w:ascii="Calibri" w:hAnsi="Calibri" w:eastAsia="PingFang SC"/>
+          <w:sz w:val="19"/>
+        </w:rPr>
+        <w:t xml:space="preserve">[19] Yang et al. </w:t>
+      </w:r>
+      <w:r>
+        <w:rPr>
+          <w:rFonts w:ascii="Calibri" w:hAnsi="Calibri" w:eastAsia="PingFang SC"/>
+          <w:i/>
+          <w:sz w:val="19"/>
+        </w:rPr>
+        <w:t>APeB</w:t>
+      </w:r>
+      <w:r>
+        <w:rPr>
+          <w:rFonts w:ascii="Calibri" w:hAnsi="Calibri" w:eastAsia="PingFang SC"/>
+          <w:sz w:val="19"/>
+        </w:rPr>
+        <w:t>. arXiv:2607.03162, 2026.</w:t>
+      </w:r>
+    </w:p>
     <w:sectPr>
       <w:headerReference w:type="default" r:id="rId14"/>
       <w:footerReference w:type="default" r:id="rId15"/>

</xml_diff>

<commit_message>
proposal v0.17: add traceable in-text citations
</commit_message>
<xml_diff>
--- a/deliverables/DeepAlign-Bench_完整人话版.docx
+++ b/deliverables/DeepAlign-Bench_完整人话版.docx
@@ -131,7 +131,7 @@
                 <w:color w:val="5B6B7A"/>
                 <w:sz w:val="21"/>
               </w:rPr>
-              <w:t>v0.16 · 完整人话版</w:t>
+              <w:t>v0.17 · 完整人话版</w:t>
             </w:r>
           </w:p>
         </w:tc>
@@ -732,7 +732,7 @@
         <w:rPr>
           <w:rFonts w:ascii="Calibri" w:hAnsi="Calibri" w:eastAsia="PingFang SC"/>
         </w:rPr>
-        <w:t>Setoka 测 agent 能否从异构记录中由事实逐步推到情景、行为模式和人格特质；</w:t>
+        <w:t>Setoka 测 agent 能否从异构记录中由事实逐步推到情景、行为模式和人格特质；[13]</w:t>
       </w:r>
     </w:p>
     <w:p>
@@ -743,7 +743,7 @@
         <w:rPr>
           <w:rFonts w:ascii="Calibri" w:hAnsi="Calibri" w:eastAsia="PingFang SC"/>
         </w:rPr>
-        <w:t>PersonaTrail 和 APeB 测 agent 能否从浏览或商品行为历史中恢复偏好、意图和过去事件；</w:t>
+        <w:t>PersonaTrail 和 APeB 测 agent 能否从浏览或商品行为历史中恢复偏好、意图和过去事件；[15][19]</w:t>
       </w:r>
     </w:p>
     <w:p>
@@ -754,7 +754,7 @@
         <w:rPr>
           <w:rFonts w:ascii="Calibri" w:hAnsi="Calibri" w:eastAsia="PingFang SC"/>
         </w:rPr>
-        <w:t>TARS 测个性化代码解释是否降低用户时间与认知负担；</w:t>
+        <w:t>TARS 测个性化代码解释是否降低用户时间与认知负担；[16]</w:t>
       </w:r>
     </w:p>
     <w:p>
@@ -765,7 +765,7 @@
         <w:rPr>
           <w:rFonts w:ascii="Calibri" w:hAnsi="Calibri" w:eastAsia="PingFang SC"/>
         </w:rPr>
-        <w:t>PASB 测错误用户观点写入长期状态后，是否污染之后的新任务；</w:t>
+        <w:t>PASB 测错误用户观点写入长期状态后，是否污染之后的新任务；[18]</w:t>
       </w:r>
     </w:p>
     <w:p>
@@ -776,7 +776,7 @@
         <w:rPr>
           <w:rFonts w:ascii="Calibri" w:hAnsi="Calibri" w:eastAsia="PingFang SC"/>
         </w:rPr>
-        <w:t>temporal-intervention 工作提出：必须有明确时间事件、跨事件持久状态、跨能力影响和用户间差异；</w:t>
+        <w:t>temporal-intervention 工作提出：必须有明确时间事件、跨事件持久状态、跨能力影响和用户间差异；[14]</w:t>
       </w:r>
     </w:p>
     <w:p>
@@ -787,7 +787,7 @@
         <w:rPr>
           <w:rFonts w:ascii="Calibri" w:hAnsi="Calibri" w:eastAsia="PingFang SC"/>
         </w:rPr>
-        <w:t>SARSI 提出 personal agent 的任务契约、外部验证、交接和治理架构。</w:t>
+        <w:t>SARSI 提出 personal agent 的任务契约、外部验证、交接和治理架构。[17]</w:t>
       </w:r>
     </w:p>
     <w:p>
@@ -816,7 +816,7 @@
         <w:rPr>
           <w:rFonts w:ascii="Calibri" w:hAnsi="Calibri" w:eastAsia="PingFang SC"/>
         </w:rPr>
-        <w:t>PDR-Bench 已经最接近最后一步，但如果给 agent 一份 persona 后得分更高，仍然可能有三种替代解释：</w:t>
+        <w:t>PDR-Bench 已经最接近最后一步，[4] 但如果给 agent 一份 persona 后得分更高，仍然可能有三种替代解释：</w:t>
       </w:r>
     </w:p>
     <w:p>
@@ -923,7 +923,7 @@
         <w:rPr>
           <w:rFonts w:ascii="Calibri" w:hAnsi="Calibri" w:eastAsia="PingFang SC"/>
         </w:rPr>
-        <w:t>如果只是把 persona、任务和 agent 数量扩大，评审很容易把本项目看成 PDR-Bench、Setoka、PersonaTrail 或 APeB 的拼接版。因此核心贡献必须是可以单独验证的方法：</w:t>
+        <w:t>如果只是把 persona、任务和 agent 数量扩大，评审很容易把本项目看成 PDR-Bench、Setoka、PersonaTrail 或 APeB 的拼接版。[4][13][15][19] 因此核心贡献必须是可以单独验证的方法：</w:t>
       </w:r>
     </w:p>
     <w:p>

</xml_diff>

<commit_message>
proposal v0.18: link every in-text citation
</commit_message>
<xml_diff>
--- a/deliverables/DeepAlign-Bench_完整人话版.docx
+++ b/deliverables/DeepAlign-Bench_完整人话版.docx
@@ -131,7 +131,7 @@
                 <w:color w:val="5B6B7A"/>
                 <w:sz w:val="21"/>
               </w:rPr>
-              <w:t>v0.17 · 完整人话版</w:t>
+              <w:t>v0.18 · 完整人话版</w:t>
             </w:r>
           </w:p>
         </w:tc>
@@ -189,7 +189,7 @@
                 <w:color w:val="5B6B7A"/>
                 <w:sz w:val="21"/>
               </w:rPr>
-              <w:t>2026 年 8 月 2 日</w:t>
+              <w:t>2026 年 8 月 3 日</w:t>
             </w:r>
           </w:p>
         </w:tc>
@@ -732,8 +732,18 @@
         <w:rPr>
           <w:rFonts w:ascii="Calibri" w:hAnsi="Calibri" w:eastAsia="PingFang SC"/>
         </w:rPr>
-        <w:t>Setoka 测 agent 能否从异构记录中由事实逐步推到情景、行为模式和人格特质；[13]</w:t>
-      </w:r>
+        <w:t>Setoka 测 agent 能否从异构记录中由事实逐步推到情景、行为模式和人格特质；</w:t>
+      </w:r>
+      <w:hyperlink r:id="rId16">
+        <w:r>
+          <w:rPr>
+            <w:rFonts w:ascii="Calibri" w:hAnsi="Calibri" w:eastAsia="PingFang SC"/>
+            <w:color w:val="2E74B5"/>
+            <w:u w:val="single"/>
+          </w:rPr>
+          <w:t>[13]</w:t>
+        </w:r>
+      </w:hyperlink>
     </w:p>
     <w:p>
       <w:pPr>
@@ -743,8 +753,28 @@
         <w:rPr>
           <w:rFonts w:ascii="Calibri" w:hAnsi="Calibri" w:eastAsia="PingFang SC"/>
         </w:rPr>
-        <w:t>PersonaTrail 和 APeB 测 agent 能否从浏览或商品行为历史中恢复偏好、意图和过去事件；[15][19]</w:t>
-      </w:r>
+        <w:t>PersonaTrail 和 APeB 测 agent 能否从浏览或商品行为历史中恢复偏好、意图和过去事件；</w:t>
+      </w:r>
+      <w:hyperlink r:id="rId17">
+        <w:r>
+          <w:rPr>
+            <w:rFonts w:ascii="Calibri" w:hAnsi="Calibri" w:eastAsia="PingFang SC"/>
+            <w:color w:val="2E74B5"/>
+            <w:u w:val="single"/>
+          </w:rPr>
+          <w:t>[15]</w:t>
+        </w:r>
+      </w:hyperlink>
+      <w:hyperlink r:id="rId18">
+        <w:r>
+          <w:rPr>
+            <w:rFonts w:ascii="Calibri" w:hAnsi="Calibri" w:eastAsia="PingFang SC"/>
+            <w:color w:val="2E74B5"/>
+            <w:u w:val="single"/>
+          </w:rPr>
+          <w:t>[19]</w:t>
+        </w:r>
+      </w:hyperlink>
     </w:p>
     <w:p>
       <w:pPr>
@@ -754,8 +784,18 @@
         <w:rPr>
           <w:rFonts w:ascii="Calibri" w:hAnsi="Calibri" w:eastAsia="PingFang SC"/>
         </w:rPr>
-        <w:t>TARS 测个性化代码解释是否降低用户时间与认知负担；[16]</w:t>
-      </w:r>
+        <w:t>TARS 测个性化代码解释是否降低用户时间与认知负担；</w:t>
+      </w:r>
+      <w:hyperlink r:id="rId19">
+        <w:r>
+          <w:rPr>
+            <w:rFonts w:ascii="Calibri" w:hAnsi="Calibri" w:eastAsia="PingFang SC"/>
+            <w:color w:val="2E74B5"/>
+            <w:u w:val="single"/>
+          </w:rPr>
+          <w:t>[16]</w:t>
+        </w:r>
+      </w:hyperlink>
     </w:p>
     <w:p>
       <w:pPr>
@@ -765,8 +805,18 @@
         <w:rPr>
           <w:rFonts w:ascii="Calibri" w:hAnsi="Calibri" w:eastAsia="PingFang SC"/>
         </w:rPr>
-        <w:t>PASB 测错误用户观点写入长期状态后，是否污染之后的新任务；[18]</w:t>
-      </w:r>
+        <w:t>PASB 测错误用户观点写入长期状态后，是否污染之后的新任务；</w:t>
+      </w:r>
+      <w:hyperlink r:id="rId20">
+        <w:r>
+          <w:rPr>
+            <w:rFonts w:ascii="Calibri" w:hAnsi="Calibri" w:eastAsia="PingFang SC"/>
+            <w:color w:val="2E74B5"/>
+            <w:u w:val="single"/>
+          </w:rPr>
+          <w:t>[18]</w:t>
+        </w:r>
+      </w:hyperlink>
     </w:p>
     <w:p>
       <w:pPr>
@@ -776,8 +826,18 @@
         <w:rPr>
           <w:rFonts w:ascii="Calibri" w:hAnsi="Calibri" w:eastAsia="PingFang SC"/>
         </w:rPr>
-        <w:t>temporal-intervention 工作提出：必须有明确时间事件、跨事件持久状态、跨能力影响和用户间差异；[14]</w:t>
-      </w:r>
+        <w:t>temporal-intervention 工作提出：必须有明确时间事件、跨事件持久状态、跨能力影响和用户间差异；</w:t>
+      </w:r>
+      <w:hyperlink r:id="rId21">
+        <w:r>
+          <w:rPr>
+            <w:rFonts w:ascii="Calibri" w:hAnsi="Calibri" w:eastAsia="PingFang SC"/>
+            <w:color w:val="2E74B5"/>
+            <w:u w:val="single"/>
+          </w:rPr>
+          <w:t>[14]</w:t>
+        </w:r>
+      </w:hyperlink>
     </w:p>
     <w:p>
       <w:pPr>
@@ -787,8 +847,18 @@
         <w:rPr>
           <w:rFonts w:ascii="Calibri" w:hAnsi="Calibri" w:eastAsia="PingFang SC"/>
         </w:rPr>
-        <w:t>SARSI 提出 personal agent 的任务契约、外部验证、交接和治理架构。[17]</w:t>
-      </w:r>
+        <w:t>SARSI 提出 personal agent 的任务契约、外部验证、交接和治理架构。</w:t>
+      </w:r>
+      <w:hyperlink r:id="rId22">
+        <w:r>
+          <w:rPr>
+            <w:rFonts w:ascii="Calibri" w:hAnsi="Calibri" w:eastAsia="PingFang SC"/>
+            <w:color w:val="2E74B5"/>
+            <w:u w:val="single"/>
+          </w:rPr>
+          <w:t>[17]</w:t>
+        </w:r>
+      </w:hyperlink>
     </w:p>
     <w:p>
       <w:r>
@@ -816,7 +886,23 @@
         <w:rPr>
           <w:rFonts w:ascii="Calibri" w:hAnsi="Calibri" w:eastAsia="PingFang SC"/>
         </w:rPr>
-        <w:t>PDR-Bench 已经最接近最后一步，[4] 但如果给 agent 一份 persona 后得分更高，仍然可能有三种替代解释：</w:t>
+        <w:t>PDR-Bench 已经最接近最后一步，</w:t>
+      </w:r>
+      <w:hyperlink r:id="rId23">
+        <w:r>
+          <w:rPr>
+            <w:rFonts w:ascii="Calibri" w:hAnsi="Calibri" w:eastAsia="PingFang SC"/>
+            <w:color w:val="2E74B5"/>
+            <w:u w:val="single"/>
+          </w:rPr>
+          <w:t>[4]</w:t>
+        </w:r>
+      </w:hyperlink>
+      <w:r>
+        <w:rPr>
+          <w:rFonts w:ascii="Calibri" w:hAnsi="Calibri" w:eastAsia="PingFang SC"/>
+        </w:rPr>
+        <w:t xml:space="preserve"> 但如果给 agent 一份 persona 后得分更高，仍然可能有三种替代解释：</w:t>
       </w:r>
     </w:p>
     <w:p>
@@ -923,7 +1009,53 @@
         <w:rPr>
           <w:rFonts w:ascii="Calibri" w:hAnsi="Calibri" w:eastAsia="PingFang SC"/>
         </w:rPr>
-        <w:t>如果只是把 persona、任务和 agent 数量扩大，评审很容易把本项目看成 PDR-Bench、Setoka、PersonaTrail 或 APeB 的拼接版。[4][13][15][19] 因此核心贡献必须是可以单独验证的方法：</w:t>
+        <w:t>如果只是把 persona、任务和 agent 数量扩大，评审很容易把本项目看成 PDR-Bench、Setoka、PersonaTrail 或 APeB 的拼接版。</w:t>
+      </w:r>
+      <w:hyperlink r:id="rId23">
+        <w:r>
+          <w:rPr>
+            <w:rFonts w:ascii="Calibri" w:hAnsi="Calibri" w:eastAsia="PingFang SC"/>
+            <w:color w:val="2E74B5"/>
+            <w:u w:val="single"/>
+          </w:rPr>
+          <w:t>[4]</w:t>
+        </w:r>
+      </w:hyperlink>
+      <w:hyperlink r:id="rId16">
+        <w:r>
+          <w:rPr>
+            <w:rFonts w:ascii="Calibri" w:hAnsi="Calibri" w:eastAsia="PingFang SC"/>
+            <w:color w:val="2E74B5"/>
+            <w:u w:val="single"/>
+          </w:rPr>
+          <w:t>[13]</w:t>
+        </w:r>
+      </w:hyperlink>
+      <w:hyperlink r:id="rId17">
+        <w:r>
+          <w:rPr>
+            <w:rFonts w:ascii="Calibri" w:hAnsi="Calibri" w:eastAsia="PingFang SC"/>
+            <w:color w:val="2E74B5"/>
+            <w:u w:val="single"/>
+          </w:rPr>
+          <w:t>[15]</w:t>
+        </w:r>
+      </w:hyperlink>
+      <w:hyperlink r:id="rId18">
+        <w:r>
+          <w:rPr>
+            <w:rFonts w:ascii="Calibri" w:hAnsi="Calibri" w:eastAsia="PingFang SC"/>
+            <w:color w:val="2E74B5"/>
+            <w:u w:val="single"/>
+          </w:rPr>
+          <w:t>[19]</w:t>
+        </w:r>
+      </w:hyperlink>
+      <w:r>
+        <w:rPr>
+          <w:rFonts w:ascii="Calibri" w:hAnsi="Calibri" w:eastAsia="PingFang SC"/>
+        </w:rPr>
+        <w:t xml:space="preserve"> 因此核心贡献必须是可以单独验证的方法：</w:t>
       </w:r>
     </w:p>
     <w:p>
@@ -4590,8 +4722,20 @@
           <w:rFonts w:ascii="Calibri" w:hAnsi="Calibri" w:eastAsia="PingFang SC"/>
           <w:sz w:val="19"/>
         </w:rPr>
-        <w:t>. https://evalscope.readthedocs.io/en/refact_readme/get_started/introduction.html</w:t>
-      </w:r>
+        <w:t xml:space="preserve">. </w:t>
+      </w:r>
+      <w:hyperlink r:id="rId24">
+        <w:r>
+          <w:rPr>
+            <w:rFonts w:ascii="Calibri" w:hAnsi="Calibri" w:eastAsia="PingFang SC"/>
+            <w:color w:val="2E74B5"/>
+            <w:u w:val="single"/>
+            <w:sz w:val="19"/>
+            <w:szCs w:val="19"/>
+          </w:rPr>
+          <w:t>https://evalscope.readthedocs.io/en/refact_readme/get_started/introduction.html</w:t>
+        </w:r>
+      </w:hyperlink>
     </w:p>
     <w:p>
       <w:pPr>
@@ -5096,7 +5240,7 @@
         <w:color w:val="5B6B7A"/>
         <w:sz w:val="18"/>
       </w:rPr>
-      <w:t xml:space="preserve">2026-8-2   ·   </w:t>
+      <w:t xml:space="preserve">2026-8-3   ·   </w:t>
     </w:r>
     <w:r>
       <w:rPr>
@@ -5129,7 +5273,7 @@
         <w:color w:val="5B6B7A"/>
         <w:sz w:val="18"/>
       </w:rPr>
-      <w:t xml:space="preserve">2026-8-2   ·   </w:t>
+      <w:t xml:space="preserve">2026-8-3   ·   </w:t>
     </w:r>
     <w:r>
       <w:rPr>
@@ -5162,7 +5306,7 @@
         <w:color w:val="5B6B7A"/>
         <w:sz w:val="18"/>
       </w:rPr>
-      <w:t xml:space="preserve">2026-8-2   ·   </w:t>
+      <w:t xml:space="preserve">2026-8-3   ·   </w:t>
     </w:r>
     <w:r>
       <w:rPr>

</xml_diff>

<commit_message>
proposal v0.19: tighten related-work identification gap
</commit_message>
<xml_diff>
--- a/deliverables/DeepAlign-Bench_完整人话版.docx
+++ b/deliverables/DeepAlign-Bench_完整人话版.docx
@@ -131,7 +131,7 @@
                 <w:color w:val="5B6B7A"/>
                 <w:sz w:val="21"/>
               </w:rPr>
-              <w:t>v0.18 · 完整人话版</w:t>
+              <w:t>v0.19 · 完整人话版</w:t>
             </w:r>
           </w:p>
         </w:tc>
@@ -603,7 +603,7 @@
         <w:rPr>
           <w:rFonts w:ascii="Calibri" w:hAnsi="Calibri" w:eastAsia="PingFang SC"/>
         </w:rPr>
-        <w:t>主实验固定为 24 个 task family、每题两个强对比用户、4 种用户信息条件和 3 类 agent，最多 576 个 episode；其中 8 个 family 负责压力测试。另建 240-unit JudgeBench，并对至少 20% 输出做人评。这个规模用于验证方法，不声称覆盖所有 Deep Research 模式；未测试、不适用和延期组合都会明确标出。</w:t>
+        <w:t>主实验固定为 24 个 task family、每题两个强对比用户、4 种用户信息条件和 3 类 agent，最多 576 个 episode；其中 8 个 family 负责压力测试。另建 240-unit JudgeBench，并对至少 20% 输出做人评。领域专家负责事实和共同质量，目标用户负责判断 matched/swapped 哪份更适合自己；合成 persona 不能代替这一步。这个规模用于验证方法，不声称覆盖所有 Deep Research 模式；未测试、不适用和延期组合都会明确标出。</w:t>
       </w:r>
     </w:p>
     <w:p>
@@ -713,7 +713,7 @@
         <w:pStyle w:val="Heading2"/>
       </w:pPr>
       <w:r>
-        <w:t>1.1 现有工作不是没测个性化，而是各测了一段</w:t>
+        <w:t>1.1 研究问题是怎样一步步收敛的</w:t>
       </w:r>
     </w:p>
     <w:p>
@@ -721,20 +721,53 @@
         <w:rPr>
           <w:rFonts w:ascii="Calibri" w:hAnsi="Calibri" w:eastAsia="PingFang SC"/>
         </w:rPr>
-        <w:t>先把故事讲准确。现有 Deep Research benchmark 大多关注答案是否正确、搜索是否充分、引用是否可靠、报告是否完整。这些工作回答“报告好不好”。但最近的个性化 benchmark 已经开始回答更多问题：</w:t>
+        <w:t>第一步，Deep Research benchmark 先回答“报告一般好不好”：任务有没有完成、事实和引用是否可靠、分析是否完整。这是所有个性化结果都必须先过的底线，但它没有说明同一份报告更适合哪一个用户。</w:t>
       </w:r>
     </w:p>
     <w:p>
-      <w:pPr>
-        <w:pStyle w:val="ListBullet"/>
-      </w:pPr>
-      <w:r>
-        <w:rPr>
-          <w:rFonts w:ascii="Calibri" w:hAnsi="Calibri" w:eastAsia="PingFang SC"/>
-        </w:rPr>
-        <w:t>Setoka 测 agent 能否从异构记录中由事实逐步推到情景、行为模式和人格特质；</w:t>
+      <w:r>
+        <w:rPr>
+          <w:rFonts w:ascii="Calibri" w:hAnsi="Calibri" w:eastAsia="PingFang SC"/>
+        </w:rPr>
+        <w:t>第二步，个性化研究开始回答“agent 是否理解了用户”。LaMP 用用户历史评测个性化生成，PersonaLens 在任务型对话里同时看偏好、任务成功和回复质量，PersonaMem 要求模型跟踪会变化的用户画像。</w:t>
       </w:r>
       <w:hyperlink r:id="rId16">
+        <w:r>
+          <w:rPr>
+            <w:rFonts w:ascii="Calibri" w:hAnsi="Calibri" w:eastAsia="PingFang SC"/>
+            <w:color w:val="2E74B5"/>
+            <w:u w:val="single"/>
+          </w:rPr>
+          <w:t>[20]</w:t>
+        </w:r>
+      </w:hyperlink>
+      <w:hyperlink r:id="rId17">
+        <w:r>
+          <w:rPr>
+            <w:rFonts w:ascii="Calibri" w:hAnsi="Calibri" w:eastAsia="PingFang SC"/>
+            <w:color w:val="2E74B5"/>
+            <w:u w:val="single"/>
+          </w:rPr>
+          <w:t>[22]</w:t>
+        </w:r>
+      </w:hyperlink>
+      <w:hyperlink r:id="rId18">
+        <w:r>
+          <w:rPr>
+            <w:rFonts w:ascii="Calibri" w:hAnsi="Calibri" w:eastAsia="PingFang SC"/>
+            <w:color w:val="2E74B5"/>
+            <w:u w:val="single"/>
+          </w:rPr>
+          <w:t>[23]</w:t>
+        </w:r>
+      </w:hyperlink>
+      <w:r>
+        <w:rPr>
+          <w:rFonts w:ascii="Calibri" w:hAnsi="Calibri" w:eastAsia="PingFang SC"/>
+        </w:rPr>
+        <w:t xml:space="preserve"> Setoka、PersonaTrail 和 APeB 又把信号扩展到异构记录、浏览轨迹和商品行为。</w:t>
+      </w:r>
+      <w:hyperlink r:id="rId19">
         <w:r>
           <w:rPr>
             <w:rFonts w:ascii="Calibri" w:hAnsi="Calibri" w:eastAsia="PingFang SC"/>
@@ -744,18 +777,7 @@
           <w:t>[13]</w:t>
         </w:r>
       </w:hyperlink>
-    </w:p>
-    <w:p>
-      <w:pPr>
-        <w:pStyle w:val="ListBullet"/>
-      </w:pPr>
-      <w:r>
-        <w:rPr>
-          <w:rFonts w:ascii="Calibri" w:hAnsi="Calibri" w:eastAsia="PingFang SC"/>
-        </w:rPr>
-        <w:t>PersonaTrail 和 APeB 测 agent 能否从浏览或商品行为历史中恢复偏好、意图和过去事件；</w:t>
-      </w:r>
-      <w:hyperlink r:id="rId17">
+      <w:hyperlink r:id="rId20">
         <w:r>
           <w:rPr>
             <w:rFonts w:ascii="Calibri" w:hAnsi="Calibri" w:eastAsia="PingFang SC"/>
@@ -765,7 +787,7 @@
           <w:t>[15]</w:t>
         </w:r>
       </w:hyperlink>
-      <w:hyperlink r:id="rId18">
+      <w:hyperlink r:id="rId21">
         <w:r>
           <w:rPr>
             <w:rFonts w:ascii="Calibri" w:hAnsi="Calibri" w:eastAsia="PingFang SC"/>
@@ -775,18 +797,77 @@
           <w:t>[19]</w:t>
         </w:r>
       </w:hyperlink>
+      <w:r>
+        <w:rPr>
+          <w:rFonts w:ascii="Calibri" w:hAnsi="Calibri" w:eastAsia="PingFang SC"/>
+        </w:rPr>
+        <w:t xml:space="preserve"> 所以“用户理解和历史利用没人测”已经说不通；这些工作大多停在响应选择、记忆问答或单域意图。</w:t>
+      </w:r>
     </w:p>
     <w:p>
-      <w:pPr>
-        <w:pStyle w:val="ListBullet"/>
-      </w:pPr>
-      <w:r>
-        <w:rPr>
-          <w:rFonts w:ascii="Calibri" w:hAnsi="Calibri" w:eastAsia="PingFang SC"/>
-        </w:rPr>
-        <w:t>TARS 测个性化代码解释是否降低用户时间与认知负担；</w:t>
-      </w:r>
-      <w:hyperlink r:id="rId19">
+      <w:r>
+        <w:rPr>
+          <w:rFonts w:ascii="Calibri" w:hAnsi="Calibri" w:eastAsia="PingFang SC"/>
+        </w:rPr>
+        <w:t>第三步，研究已经开始回答“理解之后有没有真的行动”。TravelPlanner+ 让用户模型改变旅行计划，ETAPP 和 ToolSpectrum 让画像与环境改变工具选择，Mem2ActBench 与 APOLLO 检查长期偏好能否落实到工具和参数。</w:t>
+      </w:r>
+      <w:hyperlink r:id="rId22">
+        <w:r>
+          <w:rPr>
+            <w:rFonts w:ascii="Calibri" w:hAnsi="Calibri" w:eastAsia="PingFang SC"/>
+            <w:color w:val="2E74B5"/>
+            <w:u w:val="single"/>
+          </w:rPr>
+          <w:t>[21]</w:t>
+        </w:r>
+      </w:hyperlink>
+      <w:hyperlink r:id="rId23">
+        <w:r>
+          <w:rPr>
+            <w:rFonts w:ascii="Calibri" w:hAnsi="Calibri" w:eastAsia="PingFang SC"/>
+            <w:color w:val="2E74B5"/>
+            <w:u w:val="single"/>
+          </w:rPr>
+          <w:t>[24]</w:t>
+        </w:r>
+      </w:hyperlink>
+      <w:hyperlink r:id="rId24">
+        <w:r>
+          <w:rPr>
+            <w:rFonts w:ascii="Calibri" w:hAnsi="Calibri" w:eastAsia="PingFang SC"/>
+            <w:color w:val="2E74B5"/>
+            <w:u w:val="single"/>
+          </w:rPr>
+          <w:t>[25]</w:t>
+        </w:r>
+      </w:hyperlink>
+      <w:hyperlink r:id="rId25">
+        <w:r>
+          <w:rPr>
+            <w:rFonts w:ascii="Calibri" w:hAnsi="Calibri" w:eastAsia="PingFang SC"/>
+            <w:color w:val="2E74B5"/>
+            <w:u w:val="single"/>
+          </w:rPr>
+          <w:t>[35]</w:t>
+        </w:r>
+      </w:hyperlink>
+      <w:hyperlink r:id="rId26">
+        <w:r>
+          <w:rPr>
+            <w:rFonts w:ascii="Calibri" w:hAnsi="Calibri" w:eastAsia="PingFang SC"/>
+            <w:color w:val="2E74B5"/>
+            <w:u w:val="single"/>
+          </w:rPr>
+          <w:t>[36]</w:t>
+        </w:r>
+      </w:hyperlink>
+      <w:r>
+        <w:rPr>
+          <w:rFonts w:ascii="Calibri" w:hAnsi="Calibri" w:eastAsia="PingFang SC"/>
+        </w:rPr>
+        <w:t xml:space="preserve"> TARS 还直接测了用户时间和认知负担。</w:t>
+      </w:r>
+      <w:hyperlink r:id="rId27">
         <w:r>
           <w:rPr>
             <w:rFonts w:ascii="Calibri" w:hAnsi="Calibri" w:eastAsia="PingFang SC"/>
@@ -796,18 +877,77 @@
           <w:t>[16]</w:t>
         </w:r>
       </w:hyperlink>
+      <w:r>
+        <w:rPr>
+          <w:rFonts w:ascii="Calibri" w:hAnsi="Calibri" w:eastAsia="PingFang SC"/>
+        </w:rPr>
+        <w:t xml:space="preserve"> 因此，“个性化行动无人评测”同样不是我们的 gap；这些任务多是单域计划或离散工具/GUI 动作，和开放式、多证据的 DR 最终交付物仍不同。</w:t>
+      </w:r>
     </w:p>
     <w:p>
-      <w:pPr>
-        <w:pStyle w:val="ListBullet"/>
-      </w:pPr>
-      <w:r>
-        <w:rPr>
-          <w:rFonts w:ascii="Calibri" w:hAnsi="Calibri" w:eastAsia="PingFang SC"/>
-        </w:rPr>
-        <w:t>PASB 测错误用户观点写入长期状态后，是否污染之后的新任务；</w:t>
-      </w:r>
-      <w:hyperlink r:id="rId20">
+      <w:r>
+        <w:rPr>
+          <w:rFonts w:ascii="Calibri" w:hAnsi="Calibri" w:eastAsia="PingFang SC"/>
+        </w:rPr>
+        <w:t>第四步，研究把时间和风险也纳入进来。RPEval 测无关记忆会不会导致不理性个性化，PAHF 用澄清、记忆和反馈适应偏好变化，PerMemBench 问“哪些信息值得为这个用户写入”，Memora 与 CloneMem 测过期事实和多年数字轨迹。</w:t>
+      </w:r>
+      <w:hyperlink r:id="rId28">
+        <w:r>
+          <w:rPr>
+            <w:rFonts w:ascii="Calibri" w:hAnsi="Calibri" w:eastAsia="PingFang SC"/>
+            <w:color w:val="2E74B5"/>
+            <w:u w:val="single"/>
+          </w:rPr>
+          <w:t>[30]</w:t>
+        </w:r>
+      </w:hyperlink>
+      <w:hyperlink r:id="rId29">
+        <w:r>
+          <w:rPr>
+            <w:rFonts w:ascii="Calibri" w:hAnsi="Calibri" w:eastAsia="PingFang SC"/>
+            <w:color w:val="2E74B5"/>
+            <w:u w:val="single"/>
+          </w:rPr>
+          <w:t>[31]</w:t>
+        </w:r>
+      </w:hyperlink>
+      <w:hyperlink r:id="rId30">
+        <w:r>
+          <w:rPr>
+            <w:rFonts w:ascii="Calibri" w:hAnsi="Calibri" w:eastAsia="PingFang SC"/>
+            <w:color w:val="2E74B5"/>
+            <w:u w:val="single"/>
+          </w:rPr>
+          <w:t>[32]</w:t>
+        </w:r>
+      </w:hyperlink>
+      <w:hyperlink r:id="rId31">
+        <w:r>
+          <w:rPr>
+            <w:rFonts w:ascii="Calibri" w:hAnsi="Calibri" w:eastAsia="PingFang SC"/>
+            <w:color w:val="2E74B5"/>
+            <w:u w:val="single"/>
+          </w:rPr>
+          <w:t>[33]</w:t>
+        </w:r>
+      </w:hyperlink>
+      <w:hyperlink r:id="rId32">
+        <w:r>
+          <w:rPr>
+            <w:rFonts w:ascii="Calibri" w:hAnsi="Calibri" w:eastAsia="PingFang SC"/>
+            <w:color w:val="2E74B5"/>
+            <w:u w:val="single"/>
+          </w:rPr>
+          <w:t>[34]</w:t>
+        </w:r>
+      </w:hyperlink>
+      <w:r>
+        <w:rPr>
+          <w:rFonts w:ascii="Calibri" w:hAnsi="Calibri" w:eastAsia="PingFang SC"/>
+        </w:rPr>
+        <w:t xml:space="preserve"> PASB 和 PS-Bench 又说明，持久记忆不仅可能过期，还可能把迎合或危险意图长期合理化。</w:t>
+      </w:r>
+      <w:hyperlink r:id="rId33">
         <w:r>
           <w:rPr>
             <w:rFonts w:ascii="Calibri" w:hAnsi="Calibri" w:eastAsia="PingFang SC"/>
@@ -817,78 +957,31 @@
           <w:t>[18]</w:t>
         </w:r>
       </w:hyperlink>
-    </w:p>
-    <w:p>
-      <w:pPr>
-        <w:pStyle w:val="ListBullet"/>
-      </w:pPr>
-      <w:r>
-        <w:rPr>
-          <w:rFonts w:ascii="Calibri" w:hAnsi="Calibri" w:eastAsia="PingFang SC"/>
-        </w:rPr>
-        <w:t>temporal-intervention 工作提出：必须有明确时间事件、跨事件持久状态、跨能力影响和用户间差异；</w:t>
-      </w:r>
-      <w:hyperlink r:id="rId21">
+      <w:hyperlink r:id="rId34">
         <w:r>
           <w:rPr>
             <w:rFonts w:ascii="Calibri" w:hAnsi="Calibri" w:eastAsia="PingFang SC"/>
             <w:color w:val="2E74B5"/>
             <w:u w:val="single"/>
           </w:rPr>
-          <w:t>[14]</w:t>
+          <w:t>[39]</w:t>
         </w:r>
       </w:hyperlink>
+      <w:r>
+        <w:rPr>
+          <w:rFonts w:ascii="Calibri" w:hAnsi="Calibri" w:eastAsia="PingFang SC"/>
+        </w:rPr>
+        <w:t xml:space="preserve"> 这要求我们的 irrelevant、stale、write、update 和 must-not 测试成为正式实验，而不是几个演示案例。</w:t>
+      </w:r>
     </w:p>
     <w:p>
-      <w:pPr>
-        <w:pStyle w:val="ListBullet"/>
-      </w:pPr>
-      <w:r>
-        <w:rPr>
-          <w:rFonts w:ascii="Calibri" w:hAnsi="Calibri" w:eastAsia="PingFang SC"/>
-        </w:rPr>
-        <w:t>SARSI 提出 personal agent 的任务契约、外部验证、交接和治理架构。</w:t>
-      </w:r>
-      <w:hyperlink r:id="rId22">
-        <w:r>
-          <w:rPr>
-            <w:rFonts w:ascii="Calibri" w:hAnsi="Calibri" w:eastAsia="PingFang SC"/>
-            <w:color w:val="2E74B5"/>
-            <w:u w:val="single"/>
-          </w:rPr>
-          <w:t>[17]</w:t>
-        </w:r>
-      </w:hyperlink>
-    </w:p>
-    <w:p>
-      <w:r>
-        <w:rPr>
-          <w:rFonts w:ascii="Calibri" w:hAnsi="Calibri" w:eastAsia="PingFang SC"/>
-        </w:rPr>
-        <w:t>所以我们不能说“没人测用户理解、历史或长程状态”。更准确的说法是：这些工作大多各测能力链的一段，还没有在广义 Deep Research 中，把</w:t>
-      </w:r>
-      <w:r>
-        <w:rPr>
-          <w:rFonts w:ascii="Calibri" w:hAnsi="Calibri" w:eastAsia="PingFang SC"/>
-          <w:b/>
-        </w:rPr>
-        <w:t>用户信息从哪里来、agent 如何长程执行、最终交付物该怎样因用户而变、这种变化如何被反事实验证</w:t>
-      </w:r>
-      <w:r>
-        <w:rPr>
-          <w:rFonts w:ascii="Calibri" w:hAnsi="Calibri" w:eastAsia="PingFang SC"/>
-        </w:rPr>
-        <w:t>连成一个可审计协议。</w:t>
-      </w:r>
-    </w:p>
-    <w:p>
-      <w:r>
-        <w:rPr>
-          <w:rFonts w:ascii="Calibri" w:hAnsi="Calibri" w:eastAsia="PingFang SC"/>
-        </w:rPr>
-        <w:t>PDR-Bench 已经最接近最后一步，</w:t>
-      </w:r>
-      <w:hyperlink r:id="rId23">
+      <w:r>
+        <w:rPr>
+          <w:rFonts w:ascii="Calibri" w:hAnsi="Calibri" w:eastAsia="PingFang SC"/>
+        </w:rPr>
+        <w:t>最后，PDR-Bench 与另一项 PDR 工作已经直接研究 persona 驱动的 Deep Research；</w:t>
+      </w:r>
+      <w:hyperlink r:id="rId35">
         <w:r>
           <w:rPr>
             <w:rFonts w:ascii="Calibri" w:hAnsi="Calibri" w:eastAsia="PingFang SC"/>
@@ -898,11 +991,50 @@
           <w:t>[4]</w:t>
         </w:r>
       </w:hyperlink>
-      <w:r>
-        <w:rPr>
-          <w:rFonts w:ascii="Calibri" w:hAnsi="Calibri" w:eastAsia="PingFang SC"/>
-        </w:rPr>
-        <w:t xml:space="preserve"> 但如果给 agent 一份 persona 后得分更高，仍然可能有三种替代解释：</w:t>
+      <w:hyperlink r:id="rId36">
+        <w:r>
+          <w:rPr>
+            <w:rFonts w:ascii="Calibri" w:hAnsi="Calibri" w:eastAsia="PingFang SC"/>
+            <w:color w:val="2E74B5"/>
+            <w:u w:val="single"/>
+          </w:rPr>
+          <w:t>[27]</w:t>
+        </w:r>
+      </w:hyperlink>
+      <w:r>
+        <w:rPr>
+          <w:rFonts w:ascii="Calibri" w:hAnsi="Calibri" w:eastAsia="PingFang SC"/>
+        </w:rPr>
+        <w:t xml:space="preserve"> MyScholarQA 甚至发现，合成用户和 LLM judge 会漏掉真人指出的九类细微个性化错误。</w:t>
+      </w:r>
+      <w:hyperlink r:id="rId37">
+        <w:r>
+          <w:rPr>
+            <w:rFonts w:ascii="Calibri" w:hAnsi="Calibri" w:eastAsia="PingFang SC"/>
+            <w:color w:val="2E74B5"/>
+            <w:u w:val="single"/>
+          </w:rPr>
+          <w:t>[28]</w:t>
+        </w:r>
+      </w:hyperlink>
+      <w:r>
+        <w:rPr>
+          <w:rFonts w:ascii="Calibri" w:hAnsi="Calibri" w:eastAsia="PingFang SC"/>
+        </w:rPr>
+        <w:t xml:space="preserve"> 这使我们的题目最终收敛到：</w:t>
+      </w:r>
+      <w:r>
+        <w:rPr>
+          <w:rFonts w:ascii="Calibri" w:hAnsi="Calibri" w:eastAsia="PingFang SC"/>
+          <w:b/>
+        </w:rPr>
+        <w:t>固定任务、证据、工具和预算，只交换两个都合理的用户，哪份最终交付物仍然更适合谁？</w:t>
+      </w:r>
+      <w:r>
+        <w:rPr>
+          <w:rFonts w:ascii="Calibri" w:hAnsi="Calibri" w:eastAsia="PingFang SC"/>
+        </w:rPr>
+        <w:t xml:space="preserve"> 这比“把用户信息给 agent 后有没有涨分”更窄，但也更容易被证伪。</w:t>
       </w:r>
     </w:p>
     <w:p>
@@ -1011,7 +1143,7 @@
         </w:rPr>
         <w:t>如果只是把 persona、任务和 agent 数量扩大，评审很容易把本项目看成 PDR-Bench、Setoka、PersonaTrail 或 APeB 的拼接版。</w:t>
       </w:r>
-      <w:hyperlink r:id="rId23">
+      <w:hyperlink r:id="rId35">
         <w:r>
           <w:rPr>
             <w:rFonts w:ascii="Calibri" w:hAnsi="Calibri" w:eastAsia="PingFang SC"/>
@@ -1021,7 +1153,7 @@
           <w:t>[4]</w:t>
         </w:r>
       </w:hyperlink>
-      <w:hyperlink r:id="rId16">
+      <w:hyperlink r:id="rId19">
         <w:r>
           <w:rPr>
             <w:rFonts w:ascii="Calibri" w:hAnsi="Calibri" w:eastAsia="PingFang SC"/>
@@ -1031,7 +1163,7 @@
           <w:t>[13]</w:t>
         </w:r>
       </w:hyperlink>
-      <w:hyperlink r:id="rId17">
+      <w:hyperlink r:id="rId20">
         <w:r>
           <w:rPr>
             <w:rFonts w:ascii="Calibri" w:hAnsi="Calibri" w:eastAsia="PingFang SC"/>
@@ -1041,7 +1173,7 @@
           <w:t>[15]</w:t>
         </w:r>
       </w:hyperlink>
-      <w:hyperlink r:id="rId18">
+      <w:hyperlink r:id="rId21">
         <w:r>
           <w:rPr>
             <w:rFonts w:ascii="Calibri" w:hAnsi="Calibri" w:eastAsia="PingFang SC"/>
@@ -1143,7 +1275,7 @@
         <w:rPr>
           <w:rFonts w:ascii="Calibri" w:hAnsi="Calibri" w:eastAsia="PingFang SC"/>
         </w:rPr>
-        <w:t>我们也要主动缩小首创表述：不声称首先研究 personalization、history、persistent state 或 temporal intervention。我们的候选贡献是把这些已有方向连接到</w:t>
+        <w:t>我们也要主动缩小首创表述：不声称首先研究 personalization、history、tool use、persistent state 或 temporal intervention。我们的候选贡献是把这些已有方向连接到</w:t>
       </w:r>
       <w:r>
         <w:rPr>
@@ -2478,6 +2610,24 @@
         </w:rPr>
         <w:t>这些内容必须在模型运行前冻结。LLM 可以帮助检查遗漏，但不能单独决定 gold。</w:t>
       </w:r>
+    </w:p>
+    <w:p>
+      <w:r>
+        <w:rPr>
+          <w:rFonts w:ascii="Calibri" w:hAnsi="Calibri" w:eastAsia="PingFang SC"/>
+        </w:rPr>
+        <w:t>人评也不能混成一个角色。领域专家或训练过的标注者检查事实、证据、共同质量和 must-hold；目标用户本人确认 must-change / must-not，并在不知道报告来自哪个条件时比较 matched 与 swapped。所有 real-user-gold family 和至少 8 个分层 family 都要有这种目标用户盲评；合成 persona 只用于可控压力测试和 judge 对抗题。MyScholarQA 已经说明，合成用户与 LLM judge 会漏掉真人真正介意的个性化错误。</w:t>
+      </w:r>
+      <w:hyperlink r:id="rId37">
+        <w:r>
+          <w:rPr>
+            <w:rFonts w:ascii="Calibri" w:hAnsi="Calibri" w:eastAsia="PingFang SC"/>
+            <w:color w:val="2E74B5"/>
+            <w:u w:val="single"/>
+          </w:rPr>
+          <w:t>[28]</w:t>
+        </w:r>
+      </w:hyperlink>
     </w:p>
     <w:p>
       <w:pPr>
@@ -4724,7 +4874,7 @@
         </w:rPr>
         <w:t xml:space="preserve">. </w:t>
       </w:r>
-      <w:hyperlink r:id="rId24">
+      <w:hyperlink r:id="rId38">
         <w:r>
           <w:rPr>
             <w:rFonts w:ascii="Calibri" w:hAnsi="Calibri" w:eastAsia="PingFang SC"/>
@@ -5212,6 +5362,734 @@
         </w:rPr>
         <w:t>. arXiv:2607.03162, 2026.</w:t>
       </w:r>
+    </w:p>
+    <w:p>
+      <w:pPr>
+        <w:spacing w:after="80" w:line="264" w:lineRule="auto"/>
+        <w:ind w:left="360" w:hanging="360"/>
+      </w:pPr>
+      <w:r>
+        <w:rPr>
+          <w:rFonts w:ascii="Calibri" w:hAnsi="Calibri" w:eastAsia="PingFang SC"/>
+          <w:sz w:val="19"/>
+        </w:rPr>
+        <w:t xml:space="preserve">[20] Salemi et al. </w:t>
+      </w:r>
+      <w:r>
+        <w:rPr>
+          <w:rFonts w:ascii="Calibri" w:hAnsi="Calibri" w:eastAsia="PingFang SC"/>
+          <w:i/>
+          <w:sz w:val="19"/>
+        </w:rPr>
+        <w:t>LaMP: When Large Language Models Meet Personalization</w:t>
+      </w:r>
+      <w:r>
+        <w:rPr>
+          <w:rFonts w:ascii="Calibri" w:hAnsi="Calibri" w:eastAsia="PingFang SC"/>
+          <w:sz w:val="19"/>
+        </w:rPr>
+        <w:t xml:space="preserve">. ACL, 2024. </w:t>
+      </w:r>
+      <w:hyperlink r:id="rId16">
+        <w:r>
+          <w:rPr>
+            <w:rFonts w:ascii="Calibri" w:hAnsi="Calibri" w:eastAsia="PingFang SC"/>
+            <w:color w:val="2E74B5"/>
+            <w:u w:val="single"/>
+            <w:sz w:val="19"/>
+            <w:szCs w:val="19"/>
+          </w:rPr>
+          <w:t>https://aclanthology.org/2024.acl-long.399/</w:t>
+        </w:r>
+      </w:hyperlink>
+    </w:p>
+    <w:p>
+      <w:pPr>
+        <w:spacing w:after="80" w:line="264" w:lineRule="auto"/>
+        <w:ind w:left="360" w:hanging="360"/>
+      </w:pPr>
+      <w:r>
+        <w:rPr>
+          <w:rFonts w:ascii="Calibri" w:hAnsi="Calibri" w:eastAsia="PingFang SC"/>
+          <w:sz w:val="19"/>
+        </w:rPr>
+        <w:t xml:space="preserve">[21] Singh et al. </w:t>
+      </w:r>
+      <w:r>
+        <w:rPr>
+          <w:rFonts w:ascii="Calibri" w:hAnsi="Calibri" w:eastAsia="PingFang SC"/>
+          <w:i/>
+          <w:sz w:val="19"/>
+        </w:rPr>
+        <w:t>Personal Large Language Model Agents: A Case Study on Tailored Travel Planning</w:t>
+      </w:r>
+      <w:r>
+        <w:rPr>
+          <w:rFonts w:ascii="Calibri" w:hAnsi="Calibri" w:eastAsia="PingFang SC"/>
+          <w:sz w:val="19"/>
+        </w:rPr>
+        <w:t xml:space="preserve">. EMNLP Industry Track, 2024. </w:t>
+      </w:r>
+      <w:hyperlink r:id="rId22">
+        <w:r>
+          <w:rPr>
+            <w:rFonts w:ascii="Calibri" w:hAnsi="Calibri" w:eastAsia="PingFang SC"/>
+            <w:color w:val="2E74B5"/>
+            <w:u w:val="single"/>
+            <w:sz w:val="19"/>
+            <w:szCs w:val="19"/>
+          </w:rPr>
+          <w:t>https://aclanthology.org/2024.emnlp-industry.37/</w:t>
+        </w:r>
+      </w:hyperlink>
+    </w:p>
+    <w:p>
+      <w:pPr>
+        <w:spacing w:after="80" w:line="264" w:lineRule="auto"/>
+        <w:ind w:left="360" w:hanging="360"/>
+      </w:pPr>
+      <w:r>
+        <w:rPr>
+          <w:rFonts w:ascii="Calibri" w:hAnsi="Calibri" w:eastAsia="PingFang SC"/>
+          <w:sz w:val="19"/>
+        </w:rPr>
+        <w:t xml:space="preserve">[22] Zhao et al. </w:t>
+      </w:r>
+      <w:r>
+        <w:rPr>
+          <w:rFonts w:ascii="Calibri" w:hAnsi="Calibri" w:eastAsia="PingFang SC"/>
+          <w:i/>
+          <w:sz w:val="19"/>
+        </w:rPr>
+        <w:t>PersonaLens</w:t>
+      </w:r>
+      <w:r>
+        <w:rPr>
+          <w:rFonts w:ascii="Calibri" w:hAnsi="Calibri" w:eastAsia="PingFang SC"/>
+          <w:sz w:val="19"/>
+        </w:rPr>
+        <w:t xml:space="preserve">. Findings of ACL, 2025. </w:t>
+      </w:r>
+      <w:hyperlink r:id="rId17">
+        <w:r>
+          <w:rPr>
+            <w:rFonts w:ascii="Calibri" w:hAnsi="Calibri" w:eastAsia="PingFang SC"/>
+            <w:color w:val="2E74B5"/>
+            <w:u w:val="single"/>
+            <w:sz w:val="19"/>
+            <w:szCs w:val="19"/>
+          </w:rPr>
+          <w:t>https://aclanthology.org/2025.findings-acl.927/</w:t>
+        </w:r>
+      </w:hyperlink>
+    </w:p>
+    <w:p>
+      <w:pPr>
+        <w:spacing w:after="80" w:line="264" w:lineRule="auto"/>
+        <w:ind w:left="360" w:hanging="360"/>
+      </w:pPr>
+      <w:r>
+        <w:rPr>
+          <w:rFonts w:ascii="Calibri" w:hAnsi="Calibri" w:eastAsia="PingFang SC"/>
+          <w:sz w:val="19"/>
+        </w:rPr>
+        <w:t xml:space="preserve">[23] Jiang et al. </w:t>
+      </w:r>
+      <w:r>
+        <w:rPr>
+          <w:rFonts w:ascii="Calibri" w:hAnsi="Calibri" w:eastAsia="PingFang SC"/>
+          <w:i/>
+          <w:sz w:val="19"/>
+        </w:rPr>
+        <w:t>Know Me, Respond to Me</w:t>
+      </w:r>
+      <w:r>
+        <w:rPr>
+          <w:rFonts w:ascii="Calibri" w:hAnsi="Calibri" w:eastAsia="PingFang SC"/>
+          <w:sz w:val="19"/>
+        </w:rPr>
+        <w:t>. arXiv:2504.14225, 2025.</w:t>
+      </w:r>
+    </w:p>
+    <w:p>
+      <w:pPr>
+        <w:spacing w:after="80" w:line="264" w:lineRule="auto"/>
+        <w:ind w:left="360" w:hanging="360"/>
+      </w:pPr>
+      <w:r>
+        <w:rPr>
+          <w:rFonts w:ascii="Calibri" w:hAnsi="Calibri" w:eastAsia="PingFang SC"/>
+          <w:sz w:val="19"/>
+        </w:rPr>
+        <w:t xml:space="preserve">[24] Hao et al. </w:t>
+      </w:r>
+      <w:r>
+        <w:rPr>
+          <w:rFonts w:ascii="Calibri" w:hAnsi="Calibri" w:eastAsia="PingFang SC"/>
+          <w:i/>
+          <w:sz w:val="19"/>
+        </w:rPr>
+        <w:t>Evaluating Personalized Tool-Augmented LLMs from the Perspectives of Personalization and Proactivity</w:t>
+      </w:r>
+      <w:r>
+        <w:rPr>
+          <w:rFonts w:ascii="Calibri" w:hAnsi="Calibri" w:eastAsia="PingFang SC"/>
+          <w:sz w:val="19"/>
+        </w:rPr>
+        <w:t xml:space="preserve">. ACL, 2025. </w:t>
+      </w:r>
+      <w:hyperlink r:id="rId23">
+        <w:r>
+          <w:rPr>
+            <w:rFonts w:ascii="Calibri" w:hAnsi="Calibri" w:eastAsia="PingFang SC"/>
+            <w:color w:val="2E74B5"/>
+            <w:u w:val="single"/>
+            <w:sz w:val="19"/>
+            <w:szCs w:val="19"/>
+          </w:rPr>
+          <w:t>https://aclanthology.org/2025.acl-long.1064/</w:t>
+        </w:r>
+      </w:hyperlink>
+    </w:p>
+    <w:p>
+      <w:pPr>
+        <w:spacing w:after="80" w:line="264" w:lineRule="auto"/>
+        <w:ind w:left="360" w:hanging="360"/>
+      </w:pPr>
+      <w:r>
+        <w:rPr>
+          <w:rFonts w:ascii="Calibri" w:hAnsi="Calibri" w:eastAsia="PingFang SC"/>
+          <w:sz w:val="19"/>
+        </w:rPr>
+        <w:t xml:space="preserve">[25] Cheng et al. </w:t>
+      </w:r>
+      <w:r>
+        <w:rPr>
+          <w:rFonts w:ascii="Calibri" w:hAnsi="Calibri" w:eastAsia="PingFang SC"/>
+          <w:i/>
+          <w:sz w:val="19"/>
+        </w:rPr>
+        <w:t>ToolSpectrum</w:t>
+      </w:r>
+      <w:r>
+        <w:rPr>
+          <w:rFonts w:ascii="Calibri" w:hAnsi="Calibri" w:eastAsia="PingFang SC"/>
+          <w:sz w:val="19"/>
+        </w:rPr>
+        <w:t>. arXiv:2505.13176, 2025.</w:t>
+      </w:r>
+    </w:p>
+    <w:p>
+      <w:pPr>
+        <w:spacing w:after="80" w:line="264" w:lineRule="auto"/>
+        <w:ind w:left="360" w:hanging="360"/>
+      </w:pPr>
+      <w:r>
+        <w:rPr>
+          <w:rFonts w:ascii="Calibri" w:hAnsi="Calibri" w:eastAsia="PingFang SC"/>
+          <w:sz w:val="19"/>
+        </w:rPr>
+        <w:t xml:space="preserve">[26] Zhang et al. </w:t>
+      </w:r>
+      <w:r>
+        <w:rPr>
+          <w:rFonts w:ascii="Calibri" w:hAnsi="Calibri" w:eastAsia="PingFang SC"/>
+          <w:i/>
+          <w:sz w:val="19"/>
+        </w:rPr>
+        <w:t>PRIME</w:t>
+      </w:r>
+      <w:r>
+        <w:rPr>
+          <w:rFonts w:ascii="Calibri" w:hAnsi="Calibri" w:eastAsia="PingFang SC"/>
+          <w:sz w:val="19"/>
+        </w:rPr>
+        <w:t xml:space="preserve">. EMNLP, 2025. </w:t>
+      </w:r>
+      <w:hyperlink r:id="rId39">
+        <w:r>
+          <w:rPr>
+            <w:rFonts w:ascii="Calibri" w:hAnsi="Calibri" w:eastAsia="PingFang SC"/>
+            <w:color w:val="2E74B5"/>
+            <w:u w:val="single"/>
+            <w:sz w:val="19"/>
+            <w:szCs w:val="19"/>
+          </w:rPr>
+          <w:t>https://aclanthology.org/2025.emnlp-main.1711/</w:t>
+        </w:r>
+      </w:hyperlink>
+    </w:p>
+    <w:p>
+      <w:pPr>
+        <w:spacing w:after="80" w:line="264" w:lineRule="auto"/>
+        <w:ind w:left="360" w:hanging="360"/>
+      </w:pPr>
+      <w:r>
+        <w:rPr>
+          <w:rFonts w:ascii="Calibri" w:hAnsi="Calibri" w:eastAsia="PingFang SC"/>
+          <w:sz w:val="19"/>
+        </w:rPr>
+        <w:t xml:space="preserve">[27] Li et al. </w:t>
+      </w:r>
+      <w:r>
+        <w:rPr>
+          <w:rFonts w:ascii="Calibri" w:hAnsi="Calibri" w:eastAsia="PingFang SC"/>
+          <w:i/>
+          <w:sz w:val="19"/>
+        </w:rPr>
+        <w:t>Personalized Deep Research: A User-Centric Framework, Dataset, and Hybrid Evaluation</w:t>
+      </w:r>
+      <w:r>
+        <w:rPr>
+          <w:rFonts w:ascii="Calibri" w:hAnsi="Calibri" w:eastAsia="PingFang SC"/>
+          <w:sz w:val="19"/>
+        </w:rPr>
+        <w:t>. arXiv:2605.10530, 2026.</w:t>
+      </w:r>
+    </w:p>
+    <w:p>
+      <w:pPr>
+        <w:spacing w:after="80" w:line="264" w:lineRule="auto"/>
+        <w:ind w:left="360" w:hanging="360"/>
+      </w:pPr>
+      <w:r>
+        <w:rPr>
+          <w:rFonts w:ascii="Calibri" w:hAnsi="Calibri" w:eastAsia="PingFang SC"/>
+          <w:sz w:val="19"/>
+        </w:rPr>
+        <w:t xml:space="preserve">[28] Balepur et al. </w:t>
+      </w:r>
+      <w:r>
+        <w:rPr>
+          <w:rFonts w:ascii="Calibri" w:hAnsi="Calibri" w:eastAsia="PingFang SC"/>
+          <w:i/>
+          <w:sz w:val="19"/>
+        </w:rPr>
+        <w:t>Language Models Don't Know What You Want</w:t>
+      </w:r>
+      <w:r>
+        <w:rPr>
+          <w:rFonts w:ascii="Calibri" w:hAnsi="Calibri" w:eastAsia="PingFang SC"/>
+          <w:sz w:val="19"/>
+        </w:rPr>
+        <w:t xml:space="preserve">. ACL, 2026. </w:t>
+      </w:r>
+      <w:hyperlink r:id="rId37">
+        <w:r>
+          <w:rPr>
+            <w:rFonts w:ascii="Calibri" w:hAnsi="Calibri" w:eastAsia="PingFang SC"/>
+            <w:color w:val="2E74B5"/>
+            <w:u w:val="single"/>
+            <w:sz w:val="19"/>
+            <w:szCs w:val="19"/>
+          </w:rPr>
+          <w:t>https://aclanthology.org/2026.acl-long.723/</w:t>
+        </w:r>
+      </w:hyperlink>
+    </w:p>
+    <w:p>
+      <w:pPr>
+        <w:spacing w:after="80" w:line="264" w:lineRule="auto"/>
+        <w:ind w:left="360" w:hanging="360"/>
+      </w:pPr>
+      <w:r>
+        <w:rPr>
+          <w:rFonts w:ascii="Calibri" w:hAnsi="Calibri" w:eastAsia="PingFang SC"/>
+          <w:sz w:val="19"/>
+        </w:rPr>
+        <w:t xml:space="preserve">[29] Garbacea et al. </w:t>
+      </w:r>
+      <w:r>
+        <w:rPr>
+          <w:rFonts w:ascii="Calibri" w:hAnsi="Calibri" w:eastAsia="PingFang SC"/>
+          <w:i/>
+          <w:sz w:val="19"/>
+        </w:rPr>
+        <w:t>Personalized Benchmarking: Evaluating LLMs by Individual Preferences</w:t>
+      </w:r>
+      <w:r>
+        <w:rPr>
+          <w:rFonts w:ascii="Calibri" w:hAnsi="Calibri" w:eastAsia="PingFang SC"/>
+          <w:sz w:val="19"/>
+        </w:rPr>
+        <w:t xml:space="preserve">. Findings of ACL, 2026. </w:t>
+      </w:r>
+      <w:hyperlink r:id="rId40">
+        <w:r>
+          <w:rPr>
+            <w:rFonts w:ascii="Calibri" w:hAnsi="Calibri" w:eastAsia="PingFang SC"/>
+            <w:color w:val="2E74B5"/>
+            <w:u w:val="single"/>
+            <w:sz w:val="19"/>
+            <w:szCs w:val="19"/>
+          </w:rPr>
+          <w:t>https://aclanthology.org/2026.findings-acl.31/</w:t>
+        </w:r>
+      </w:hyperlink>
+    </w:p>
+    <w:p>
+      <w:pPr>
+        <w:spacing w:after="80" w:line="264" w:lineRule="auto"/>
+        <w:ind w:left="360" w:hanging="360"/>
+      </w:pPr>
+      <w:r>
+        <w:rPr>
+          <w:rFonts w:ascii="Calibri" w:hAnsi="Calibri" w:eastAsia="PingFang SC"/>
+          <w:sz w:val="19"/>
+        </w:rPr>
+        <w:t xml:space="preserve">[30] Feng et al. </w:t>
+      </w:r>
+      <w:r>
+        <w:rPr>
+          <w:rFonts w:ascii="Calibri" w:hAnsi="Calibri" w:eastAsia="PingFang SC"/>
+          <w:i/>
+          <w:sz w:val="19"/>
+        </w:rPr>
+        <w:t>How Does Personalized Memory Shape LLM Behavior?</w:t>
+      </w:r>
+      <w:r>
+        <w:rPr>
+          <w:rFonts w:ascii="Calibri" w:hAnsi="Calibri" w:eastAsia="PingFang SC"/>
+          <w:sz w:val="19"/>
+        </w:rPr>
+        <w:t xml:space="preserve"> arXiv:2601.16621, 2026.</w:t>
+      </w:r>
+    </w:p>
+    <w:p>
+      <w:pPr>
+        <w:spacing w:after="80" w:line="264" w:lineRule="auto"/>
+        <w:ind w:left="360" w:hanging="360"/>
+      </w:pPr>
+      <w:r>
+        <w:rPr>
+          <w:rFonts w:ascii="Calibri" w:hAnsi="Calibri" w:eastAsia="PingFang SC"/>
+          <w:sz w:val="19"/>
+        </w:rPr>
+        <w:t xml:space="preserve">[31] Liang et al. </w:t>
+      </w:r>
+      <w:r>
+        <w:rPr>
+          <w:rFonts w:ascii="Calibri" w:hAnsi="Calibri" w:eastAsia="PingFang SC"/>
+          <w:i/>
+          <w:sz w:val="19"/>
+        </w:rPr>
+        <w:t>Learning Personalized Agents from Human Feedback</w:t>
+      </w:r>
+      <w:r>
+        <w:rPr>
+          <w:rFonts w:ascii="Calibri" w:hAnsi="Calibri" w:eastAsia="PingFang SC"/>
+          <w:sz w:val="19"/>
+        </w:rPr>
+        <w:t>. arXiv:2602.16173, 2026.</w:t>
+      </w:r>
+    </w:p>
+    <w:p>
+      <w:pPr>
+        <w:spacing w:after="80" w:line="264" w:lineRule="auto"/>
+        <w:ind w:left="360" w:hanging="360"/>
+      </w:pPr>
+      <w:r>
+        <w:rPr>
+          <w:rFonts w:ascii="Calibri" w:hAnsi="Calibri" w:eastAsia="PingFang SC"/>
+          <w:sz w:val="19"/>
+        </w:rPr>
+        <w:t xml:space="preserve">[32] In et al. </w:t>
+      </w:r>
+      <w:r>
+        <w:rPr>
+          <w:rFonts w:ascii="Calibri" w:hAnsi="Calibri" w:eastAsia="PingFang SC"/>
+          <w:i/>
+          <w:sz w:val="19"/>
+        </w:rPr>
+        <w:t>Personalize-then-Store</w:t>
+      </w:r>
+      <w:r>
+        <w:rPr>
+          <w:rFonts w:ascii="Calibri" w:hAnsi="Calibri" w:eastAsia="PingFang SC"/>
+          <w:sz w:val="19"/>
+        </w:rPr>
+        <w:t>. arXiv:2605.25535, 2026.</w:t>
+      </w:r>
+    </w:p>
+    <w:p>
+      <w:pPr>
+        <w:spacing w:after="80" w:line="264" w:lineRule="auto"/>
+        <w:ind w:left="360" w:hanging="360"/>
+      </w:pPr>
+      <w:r>
+        <w:rPr>
+          <w:rFonts w:ascii="Calibri" w:hAnsi="Calibri" w:eastAsia="PingFang SC"/>
+          <w:sz w:val="19"/>
+        </w:rPr>
+        <w:t xml:space="preserve">[33] Uddin et al. </w:t>
+      </w:r>
+      <w:r>
+        <w:rPr>
+          <w:rFonts w:ascii="Calibri" w:hAnsi="Calibri" w:eastAsia="PingFang SC"/>
+          <w:i/>
+          <w:sz w:val="19"/>
+        </w:rPr>
+        <w:t>From Recall to Forgetting</w:t>
+      </w:r>
+      <w:r>
+        <w:rPr>
+          <w:rFonts w:ascii="Calibri" w:hAnsi="Calibri" w:eastAsia="PingFang SC"/>
+          <w:sz w:val="19"/>
+        </w:rPr>
+        <w:t xml:space="preserve">. Findings of ACL, 2026. </w:t>
+      </w:r>
+      <w:hyperlink r:id="rId31">
+        <w:r>
+          <w:rPr>
+            <w:rFonts w:ascii="Calibri" w:hAnsi="Calibri" w:eastAsia="PingFang SC"/>
+            <w:color w:val="2E74B5"/>
+            <w:u w:val="single"/>
+            <w:sz w:val="19"/>
+            <w:szCs w:val="19"/>
+          </w:rPr>
+          <w:t>https://aclanthology.org/2026.findings-acl.1337/</w:t>
+        </w:r>
+      </w:hyperlink>
+    </w:p>
+    <w:p>
+      <w:pPr>
+        <w:spacing w:after="80" w:line="264" w:lineRule="auto"/>
+        <w:ind w:left="360" w:hanging="360"/>
+      </w:pPr>
+      <w:r>
+        <w:rPr>
+          <w:rFonts w:ascii="Calibri" w:hAnsi="Calibri" w:eastAsia="PingFang SC"/>
+          <w:sz w:val="19"/>
+        </w:rPr>
+        <w:t xml:space="preserve">[34] Hu et al. </w:t>
+      </w:r>
+      <w:r>
+        <w:rPr>
+          <w:rFonts w:ascii="Calibri" w:hAnsi="Calibri" w:eastAsia="PingFang SC"/>
+          <w:i/>
+          <w:sz w:val="19"/>
+        </w:rPr>
+        <w:t>CloneMem</w:t>
+      </w:r>
+      <w:r>
+        <w:rPr>
+          <w:rFonts w:ascii="Calibri" w:hAnsi="Calibri" w:eastAsia="PingFang SC"/>
+          <w:sz w:val="19"/>
+        </w:rPr>
+        <w:t xml:space="preserve">. ACL, 2026. </w:t>
+      </w:r>
+      <w:hyperlink r:id="rId32">
+        <w:r>
+          <w:rPr>
+            <w:rFonts w:ascii="Calibri" w:hAnsi="Calibri" w:eastAsia="PingFang SC"/>
+            <w:color w:val="2E74B5"/>
+            <w:u w:val="single"/>
+            <w:sz w:val="19"/>
+            <w:szCs w:val="19"/>
+          </w:rPr>
+          <w:t>https://aclanthology.org/2026.acl-long.1549/</w:t>
+        </w:r>
+      </w:hyperlink>
+    </w:p>
+    <w:p>
+      <w:pPr>
+        <w:spacing w:after="80" w:line="264" w:lineRule="auto"/>
+        <w:ind w:left="360" w:hanging="360"/>
+      </w:pPr>
+      <w:r>
+        <w:rPr>
+          <w:rFonts w:ascii="Calibri" w:hAnsi="Calibri" w:eastAsia="PingFang SC"/>
+          <w:sz w:val="19"/>
+        </w:rPr>
+        <w:t xml:space="preserve">[35] Shen et al. </w:t>
+      </w:r>
+      <w:r>
+        <w:rPr>
+          <w:rFonts w:ascii="Calibri" w:hAnsi="Calibri" w:eastAsia="PingFang SC"/>
+          <w:i/>
+          <w:sz w:val="19"/>
+        </w:rPr>
+        <w:t>Mem2ActBench</w:t>
+      </w:r>
+      <w:r>
+        <w:rPr>
+          <w:rFonts w:ascii="Calibri" w:hAnsi="Calibri" w:eastAsia="PingFang SC"/>
+          <w:sz w:val="19"/>
+        </w:rPr>
+        <w:t xml:space="preserve">. ACL, 2026. </w:t>
+      </w:r>
+      <w:hyperlink r:id="rId25">
+        <w:r>
+          <w:rPr>
+            <w:rFonts w:ascii="Calibri" w:hAnsi="Calibri" w:eastAsia="PingFang SC"/>
+            <w:color w:val="2E74B5"/>
+            <w:u w:val="single"/>
+            <w:sz w:val="19"/>
+            <w:szCs w:val="19"/>
+          </w:rPr>
+          <w:t>https://aclanthology.org/2026.acl-long.370/</w:t>
+        </w:r>
+      </w:hyperlink>
+    </w:p>
+    <w:p>
+      <w:pPr>
+        <w:spacing w:after="80" w:line="264" w:lineRule="auto"/>
+        <w:ind w:left="360" w:hanging="360"/>
+      </w:pPr>
+      <w:r>
+        <w:rPr>
+          <w:rFonts w:ascii="Calibri" w:hAnsi="Calibri" w:eastAsia="PingFang SC"/>
+          <w:sz w:val="19"/>
+        </w:rPr>
+        <w:t xml:space="preserve">[36] Chen et al. </w:t>
+      </w:r>
+      <w:r>
+        <w:rPr>
+          <w:rFonts w:ascii="Calibri" w:hAnsi="Calibri" w:eastAsia="PingFang SC"/>
+          <w:i/>
+          <w:sz w:val="19"/>
+        </w:rPr>
+        <w:t>Towards Preference Following in Tool Calling Language Agents</w:t>
+      </w:r>
+      <w:r>
+        <w:rPr>
+          <w:rFonts w:ascii="Calibri" w:hAnsi="Calibri" w:eastAsia="PingFang SC"/>
+          <w:sz w:val="19"/>
+        </w:rPr>
+        <w:t xml:space="preserve">. Findings of ACL, 2026. </w:t>
+      </w:r>
+      <w:hyperlink r:id="rId26">
+        <w:r>
+          <w:rPr>
+            <w:rFonts w:ascii="Calibri" w:hAnsi="Calibri" w:eastAsia="PingFang SC"/>
+            <w:color w:val="2E74B5"/>
+            <w:u w:val="single"/>
+            <w:sz w:val="19"/>
+            <w:szCs w:val="19"/>
+          </w:rPr>
+          <w:t>https://aclanthology.org/2026.findings-acl.1676/</w:t>
+        </w:r>
+      </w:hyperlink>
+    </w:p>
+    <w:p>
+      <w:pPr>
+        <w:spacing w:after="80" w:line="264" w:lineRule="auto"/>
+        <w:ind w:left="360" w:hanging="360"/>
+      </w:pPr>
+      <w:r>
+        <w:rPr>
+          <w:rFonts w:ascii="Calibri" w:hAnsi="Calibri" w:eastAsia="PingFang SC"/>
+          <w:sz w:val="19"/>
+        </w:rPr>
+        <w:t xml:space="preserve">[37] Lyu et al. </w:t>
+      </w:r>
+      <w:r>
+        <w:rPr>
+          <w:rFonts w:ascii="Calibri" w:hAnsi="Calibri" w:eastAsia="PingFang SC"/>
+          <w:i/>
+          <w:sz w:val="19"/>
+        </w:rPr>
+        <w:t>PersonalAlign</w:t>
+      </w:r>
+      <w:r>
+        <w:rPr>
+          <w:rFonts w:ascii="Calibri" w:hAnsi="Calibri" w:eastAsia="PingFang SC"/>
+          <w:sz w:val="19"/>
+        </w:rPr>
+        <w:t xml:space="preserve">. ACL, 2026. </w:t>
+      </w:r>
+      <w:hyperlink r:id="rId41">
+        <w:r>
+          <w:rPr>
+            <w:rFonts w:ascii="Calibri" w:hAnsi="Calibri" w:eastAsia="PingFang SC"/>
+            <w:color w:val="2E74B5"/>
+            <w:u w:val="single"/>
+            <w:sz w:val="19"/>
+            <w:szCs w:val="19"/>
+          </w:rPr>
+          <w:t>https://aclanthology.org/2026.acl-long.1669/</w:t>
+        </w:r>
+      </w:hyperlink>
+    </w:p>
+    <w:p>
+      <w:pPr>
+        <w:spacing w:after="80" w:line="264" w:lineRule="auto"/>
+        <w:ind w:left="360" w:hanging="360"/>
+      </w:pPr>
+      <w:r>
+        <w:rPr>
+          <w:rFonts w:ascii="Calibri" w:hAnsi="Calibri" w:eastAsia="PingFang SC"/>
+          <w:sz w:val="19"/>
+        </w:rPr>
+        <w:t xml:space="preserve">[38] Wang et al. </w:t>
+      </w:r>
+      <w:r>
+        <w:rPr>
+          <w:rFonts w:ascii="Calibri" w:hAnsi="Calibri" w:eastAsia="PingFang SC"/>
+          <w:i/>
+          <w:sz w:val="19"/>
+        </w:rPr>
+        <w:t>OPeRA</w:t>
+      </w:r>
+      <w:r>
+        <w:rPr>
+          <w:rFonts w:ascii="Calibri" w:hAnsi="Calibri" w:eastAsia="PingFang SC"/>
+          <w:sz w:val="19"/>
+        </w:rPr>
+        <w:t xml:space="preserve">. ACL, 2026. </w:t>
+      </w:r>
+      <w:hyperlink r:id="rId42">
+        <w:r>
+          <w:rPr>
+            <w:rFonts w:ascii="Calibri" w:hAnsi="Calibri" w:eastAsia="PingFang SC"/>
+            <w:color w:val="2E74B5"/>
+            <w:u w:val="single"/>
+            <w:sz w:val="19"/>
+            <w:szCs w:val="19"/>
+          </w:rPr>
+          <w:t>https://aclanthology.org/2026.acl-long.2033/</w:t>
+        </w:r>
+      </w:hyperlink>
+    </w:p>
+    <w:p>
+      <w:pPr>
+        <w:spacing w:after="80" w:line="264" w:lineRule="auto"/>
+        <w:ind w:left="360" w:hanging="360"/>
+      </w:pPr>
+      <w:r>
+        <w:rPr>
+          <w:rFonts w:ascii="Calibri" w:hAnsi="Calibri" w:eastAsia="PingFang SC"/>
+          <w:sz w:val="19"/>
+        </w:rPr>
+        <w:t xml:space="preserve">[39] Guo et al. </w:t>
+      </w:r>
+      <w:r>
+        <w:rPr>
+          <w:rFonts w:ascii="Calibri" w:hAnsi="Calibri" w:eastAsia="PingFang SC"/>
+          <w:i/>
+          <w:sz w:val="19"/>
+        </w:rPr>
+        <w:t>When Personalization Legitimizes Risks</w:t>
+      </w:r>
+      <w:r>
+        <w:rPr>
+          <w:rFonts w:ascii="Calibri" w:hAnsi="Calibri" w:eastAsia="PingFang SC"/>
+          <w:sz w:val="19"/>
+        </w:rPr>
+        <w:t xml:space="preserve">. ACL, 2026. </w:t>
+      </w:r>
+      <w:hyperlink r:id="rId34">
+        <w:r>
+          <w:rPr>
+            <w:rFonts w:ascii="Calibri" w:hAnsi="Calibri" w:eastAsia="PingFang SC"/>
+            <w:color w:val="2E74B5"/>
+            <w:u w:val="single"/>
+            <w:sz w:val="19"/>
+            <w:szCs w:val="19"/>
+          </w:rPr>
+          <w:t>https://aclanthology.org/2026.acl-long.1260/</w:t>
+        </w:r>
+      </w:hyperlink>
     </w:p>
     <w:sectPr>
       <w:headerReference w:type="default" r:id="rId14"/>
@@ -5878,8 +6756,8 @@
       <w:outlineLvl w:val="0"/>
     </w:pPr>
     <w:rPr>
-      <w:rFonts w:asciiTheme="majorHAnsi" w:eastAsiaTheme="majorEastAsia" w:hAnsiTheme="majorHAnsi" w:cstheme="majorBidi" w:ascii="Calibri" w:hAnsi="Calibri" w:eastAsia="PingFang SC"/>
-      <w:b/>
+      <w:rFonts w:asciiTheme="majorHAnsi" w:eastAsiaTheme="majorEastAsia" w:hAnsiTheme="majorHAnsi" w:cstheme="majorBidi" w:ascii="Calibri" w:hAnsi="Calibri" w:eastAsia="Hiragino Sans GB"/>
+      <w:b w:val="0"/>
       <w:bCs/>
       <w:color w:val="2E74B5"/>
       <w:sz w:val="32"/>
@@ -5902,8 +6780,8 @@
       <w:outlineLvl w:val="1"/>
     </w:pPr>
     <w:rPr>
-      <w:rFonts w:asciiTheme="majorHAnsi" w:eastAsiaTheme="majorEastAsia" w:hAnsiTheme="majorHAnsi" w:cstheme="majorBidi" w:ascii="Calibri" w:hAnsi="Calibri" w:eastAsia="PingFang SC"/>
-      <w:b/>
+      <w:rFonts w:asciiTheme="majorHAnsi" w:eastAsiaTheme="majorEastAsia" w:hAnsiTheme="majorHAnsi" w:cstheme="majorBidi" w:ascii="Calibri" w:hAnsi="Calibri" w:eastAsia="Hiragino Sans GB"/>
+      <w:b w:val="0"/>
       <w:bCs/>
       <w:color w:val="2E74B5"/>
       <w:sz w:val="26"/>
@@ -5926,8 +6804,8 @@
       <w:outlineLvl w:val="2"/>
     </w:pPr>
     <w:rPr>
-      <w:rFonts w:asciiTheme="majorHAnsi" w:eastAsiaTheme="majorEastAsia" w:hAnsiTheme="majorHAnsi" w:cstheme="majorBidi" w:ascii="Calibri" w:hAnsi="Calibri" w:eastAsia="PingFang SC"/>
-      <w:b/>
+      <w:rFonts w:asciiTheme="majorHAnsi" w:eastAsiaTheme="majorEastAsia" w:hAnsiTheme="majorHAnsi" w:cstheme="majorBidi" w:ascii="Calibri" w:hAnsi="Calibri" w:eastAsia="Hiragino Sans GB"/>
+      <w:b w:val="0"/>
       <w:bCs/>
       <w:color w:val="163A63"/>
       <w:sz w:val="24"/>

</xml_diff>

<commit_message>
proposal v0.20: calibrate PDR gap and cue robustness
</commit_message>
<xml_diff>
--- a/deliverables/DeepAlign-Bench_完整人话版.docx
+++ b/deliverables/DeepAlign-Bench_完整人话版.docx
@@ -131,7 +131,7 @@
                 <w:color w:val="5B6B7A"/>
                 <w:sz w:val="21"/>
               </w:rPr>
-              <w:t>v0.19 · 完整人话版</w:t>
+              <w:t>v0.20 · 完整人话版</w:t>
             </w:r>
           </w:p>
         </w:tc>
@@ -283,7 +283,7 @@
           <w:color w:val="163A63"/>
           <w:sz w:val="24"/>
         </w:rPr>
-        <w:t>同一任务和证据下，只改变用户；匹配用户的结果必须优于错配结果，而且事实和共同质量不能变差。</w:t>
+        <w:t>同一任务和证据下，只改变用户；匹配结果应呈现跨用户对角优势，换成语义等价表达后仍应成立。</w:t>
       </w:r>
     </w:p>
     <w:p>
@@ -539,7 +539,7 @@
         <w:rPr>
           <w:rFonts w:ascii="Calibri" w:hAnsi="Calibri" w:eastAsia="PingFang SC"/>
         </w:rPr>
-        <w:t>这种差异是不是来自用户信息，而不是报告更长、格式更漂亮或说了更多好听的话？</w:t>
+        <w:t>同一任务换一个同样合理的用户后，交付物是否在该变的地方变化、在不该变的地方保持？</w:t>
       </w:r>
     </w:p>
     <w:p>
@@ -1021,20 +1021,7 @@
         <w:rPr>
           <w:rFonts w:ascii="Calibri" w:hAnsi="Calibri" w:eastAsia="PingFang SC"/>
         </w:rPr>
-        <w:t xml:space="preserve"> 这使我们的题目最终收敛到：</w:t>
-      </w:r>
-      <w:r>
-        <w:rPr>
-          <w:rFonts w:ascii="Calibri" w:hAnsi="Calibri" w:eastAsia="PingFang SC"/>
-          <w:b/>
-        </w:rPr>
-        <w:t>固定任务、证据、工具和预算，只交换两个都合理的用户，哪份最终交付物仍然更适合谁？</w:t>
-      </w:r>
-      <w:r>
-        <w:rPr>
-          <w:rFonts w:ascii="Calibri" w:hAnsi="Calibri" w:eastAsia="PingFang SC"/>
-        </w:rPr>
-        <w:t xml:space="preserve"> 这比“把用户信息给 agent 后有没有涨分”更窄，但也更容易被证伪。</w:t>
+        <w:t xml:space="preserve"> 这里必须公平描述 PDR-Bench：它不是把 persona 只当作一段附加文字，也不是用通用文风分来评个性化。它会根据 task 和 persona 生成 P-Score 的权重与子标准，再评价目标、内容、呈现和可行动性；人类校准还会比较同一个 user-query 下两种 agent 的报告。</w:t>
       </w:r>
     </w:p>
     <w:p>
@@ -1042,48 +1029,73 @@
         <w:rPr>
           <w:rFonts w:ascii="Calibri" w:hAnsi="Calibri" w:eastAsia="PingFang SC"/>
         </w:rPr>
-        <w:t>如果给 agent 一份 persona 后得分更高，仍然可能有三种替代解释：</w:t>
+        <w:t>它已经回答了一个重要问题：</w:t>
+      </w:r>
+      <w:r>
+        <w:rPr>
+          <w:rFonts w:ascii="Calibri" w:hAnsi="Calibri" w:eastAsia="PingFang SC"/>
+          <w:b/>
+        </w:rPr>
+        <w:t>给定这个用户，这份报告是否适合他/她？</w:t>
+      </w:r>
+      <w:r>
+        <w:rPr>
+          <w:rFonts w:ascii="Calibri" w:hAnsi="Calibri" w:eastAsia="PingFang SC"/>
+        </w:rPr>
+        <w:t xml:space="preserve"> DeepAlign 要补的是下一层：</w:t>
+      </w:r>
+      <w:r>
+        <w:rPr>
+          <w:rFonts w:ascii="Calibri" w:hAnsi="Calibri" w:eastAsia="PingFang SC"/>
+          <w:b/>
+        </w:rPr>
+        <w:t>同一任务和证据换成另一个同样合理的用户后，两份报告是否各自更适合自己的用户？</w:t>
+      </w:r>
+      <w:r>
+        <w:rPr>
+          <w:rFonts w:ascii="Calibri" w:hAnsi="Calibri" w:eastAsia="PingFang SC"/>
+        </w:rPr>
+        <w:t xml:space="preserve"> PDR-Bench 的 pairwise 比较是“同一用户下哪个 agent 报告更好”，不是“A/B 用户的报告交叉给两个人评分”。所以我们的差异不是 rubric 更会看 persona，而是增加跨用户 2×2 matched/swapped 矩阵和预冻结差异真值。</w:t>
       </w:r>
     </w:p>
     <w:p>
-      <w:pPr>
-        <w:pStyle w:val="ListBullet"/>
-      </w:pPr>
-      <w:r>
-        <w:rPr>
-          <w:rFonts w:ascii="Calibri" w:hAnsi="Calibri" w:eastAsia="PingFang SC"/>
-        </w:rPr>
-        <w:t>persona 让 prompt 更长，模型因此写得更多；</w:t>
-      </w:r>
-    </w:p>
-    <w:p>
-      <w:pPr>
-        <w:pStyle w:val="ListBullet"/>
-      </w:pPr>
-      <w:r>
-        <w:rPr>
-          <w:rFonts w:ascii="Calibri" w:hAnsi="Calibri" w:eastAsia="PingFang SC"/>
-        </w:rPr>
-        <w:t>judge 喜欢报告复述用户背景；</w:t>
-      </w:r>
-    </w:p>
-    <w:p>
-      <w:pPr>
-        <w:pStyle w:val="ListBullet"/>
-      </w:pPr>
-      <w:r>
-        <w:rPr>
-          <w:rFonts w:ascii="Calibri" w:hAnsi="Calibri" w:eastAsia="PingFang SC"/>
-        </w:rPr>
-        <w:t>persona 给了额外任务信息，而不是个性化信息。</w:t>
-      </w:r>
-    </w:p>
-    <w:p>
-      <w:r>
-        <w:rPr>
-          <w:rFonts w:ascii="Calibri" w:hAnsi="Calibri" w:eastAsia="PingFang SC"/>
-        </w:rPr>
-        <w:t>因此，单纯比较 task-only、context 和 persona 三组平均分，不能证明 agent 真正在利用用户模型。</w:t>
+      <w:r>
+        <w:rPr>
+          <w:rFonts w:ascii="Calibri" w:hAnsi="Calibri" w:eastAsia="PingFang SC"/>
+        </w:rPr>
+        <w:t>还要避免另一个过度主张：matched/swapped 通过，也不能证明模型内部“真的理解了用户”。模型可能只是看到“不懂 AI”就调用短报告模板。为此我们要再检查：同一用户需求改写成结构化 persona、自然历史、澄清对话或去掉显眼关键词后，关键决策是否保持；只换无关人口属性或措辞时，不该变的事实和结论是否稳定。ACL 2026 的研究已经发现，同一 persona 换一种提示线索就可能改变测量结论；</w:t>
+      </w:r>
+      <w:hyperlink r:id="rId38">
+        <w:r>
+          <w:rPr>
+            <w:rFonts w:ascii="Calibri" w:hAnsi="Calibri" w:eastAsia="PingFang SC"/>
+            <w:color w:val="2E74B5"/>
+            <w:u w:val="single"/>
+          </w:rPr>
+          <w:t>[40]</w:t>
+        </w:r>
+      </w:hyperlink>
+      <w:r>
+        <w:rPr>
+          <w:rFonts w:ascii="Calibri" w:hAnsi="Calibri" w:eastAsia="PingFang SC"/>
+        </w:rPr>
+        <w:t xml:space="preserve"> PARL 也强调个性化 rubric 必须同时有代表性、用户一致性和区分力。</w:t>
+      </w:r>
+      <w:hyperlink r:id="rId39">
+        <w:r>
+          <w:rPr>
+            <w:rFonts w:ascii="Calibri" w:hAnsi="Calibri" w:eastAsia="PingFang SC"/>
+            <w:color w:val="2E74B5"/>
+            <w:u w:val="single"/>
+          </w:rPr>
+          <w:t>[41]</w:t>
+        </w:r>
+      </w:hyperlink>
+      <w:r>
+        <w:rPr>
+          <w:rFonts w:ascii="Calibri" w:hAnsi="Calibri" w:eastAsia="PingFang SC"/>
+        </w:rPr>
+        <w:t xml:space="preserve"> 长度、格式和关键词诱饵仍然要测，但主要用于审计 judge 是否稳健，不再用来概括 PDR-Bench 的不足。</w:t>
       </w:r>
     </w:p>
     <w:p>
@@ -1219,7 +1231,7 @@
         <w:rPr>
           <w:rFonts w:ascii="Calibri" w:hAnsi="Calibri" w:eastAsia="PingFang SC"/>
         </w:rPr>
-        <w:t>用反事实任务族识别真正的用户适配；</w:t>
+        <w:t>用反事实任务族识别可观察的用户特异结果，而不是推断模型内部认知；</w:t>
       </w:r>
     </w:p>
     <w:p>
@@ -1275,20 +1287,20 @@
         <w:rPr>
           <w:rFonts w:ascii="Calibri" w:hAnsi="Calibri" w:eastAsia="PingFang SC"/>
         </w:rPr>
-        <w:t>我们也要主动缩小首创表述：不声称首先研究 personalization、history、tool use、persistent state 或 temporal intervention。我们的候选贡献是把这些已有方向连接到</w:t>
+        <w:t>我们也要主动缩小首创表述：不声称首先研究 personalization、history、tool use、persistent state 或 temporal intervention，也不声称通过输出实验证明了模型“真正理解用户”。我们的候选贡献是把这些已有方向连接到</w:t>
       </w:r>
       <w:r>
         <w:rPr>
           <w:rFonts w:ascii="Calibri" w:hAnsi="Calibri" w:eastAsia="PingFang SC"/>
           <w:b/>
         </w:rPr>
-        <w:t>广义 Deep Research 最终交付物的反事实测量</w:t>
-      </w:r>
-      <w:r>
-        <w:rPr>
-          <w:rFonts w:ascii="Calibri" w:hAnsi="Calibri" w:eastAsia="PingFang SC"/>
-        </w:rPr>
-        <w:t>。如果 matched/swapped 人评不稳定，或者差异可以被长度、风格和共同质量解释，这个贡献就没有成立。</w:t>
+        <w:t>广义 Deep Research 最终交付物的反事实特异性测量</w:t>
+      </w:r>
+      <w:r>
+        <w:rPr>
+          <w:rFonts w:ascii="Calibri" w:hAnsi="Calibri" w:eastAsia="PingFang SC"/>
+        </w:rPr>
+        <w:t>。如果 matched/swapped 人评不稳定，或同一用户需求换一种语义等价表达就改变结论，这个贡献就没有成立。</w:t>
       </w:r>
     </w:p>
     <w:p>
@@ -3224,7 +3236,7 @@
         <w:pStyle w:val="Heading2"/>
       </w:pPr>
       <w:r>
-        <w:t>7.4 Rubric 进入主实验前必须过四关</w:t>
+        <w:t>7.4 Rubric 进入主实验前必须过五关</w:t>
       </w:r>
     </w:p>
     <w:p>
@@ -3272,7 +3284,7 @@
         <w:rPr>
           <w:rFonts w:ascii="Calibri" w:hAnsi="Calibri" w:eastAsia="PingFang SC"/>
         </w:rPr>
-        <w:t>加入无关 persona、改变篇幅或文风不能提高不相关分数；</w:t>
+        <w:t>同一 user-state 换成语义等价 signal view 后，must-change / must-hold 判断应稳定；</w:t>
       </w:r>
     </w:p>
     <w:p>
@@ -3288,6 +3300,22 @@
         <w:rPr>
           <w:rFonts w:ascii="Calibri" w:hAnsi="Calibri" w:eastAsia="PingFang SC"/>
         </w:rPr>
+        <w:t>加入无关 persona、改变篇幅或文风不能提高不相关分数；</w:t>
+      </w:r>
+    </w:p>
+    <w:p>
+      <w:pPr>
+        <w:numPr>
+          <w:ilvl w:val="0"/>
+          <w:numId w:val="17"/>
+        </w:numPr>
+        <w:spacing w:after="80" w:line="290" w:lineRule="auto"/>
+        <w:ind w:left="540" w:hanging="279"/>
+      </w:pPr>
+      <w:r>
+        <w:rPr>
+          <w:rFonts w:ascii="Calibri" w:hAnsi="Calibri" w:eastAsia="PingFang SC"/>
+        </w:rPr>
         <w:t>judge 在不同任务、交付物、用户信息渠道和风险等级上都要单独校准。</w:t>
       </w:r>
     </w:p>
@@ -3462,7 +3490,7 @@
         <w:rPr>
           <w:rFonts w:ascii="Calibri" w:hAnsi="Calibri" w:eastAsia="PingFang SC"/>
         </w:rPr>
-        <w:t>CFA 大于 0 才说明“对的人更喜欢对的版本”，而不是所有 persona 条件下报告都变长了。</w:t>
+        <w:t>CFA 大于 0 说明评分矩阵出现“对的人更适合自己的版本”的对角优势，但它不解释模型为什么做到，也不会自动排除长度等因素。因此还要报告：语义等价 views 中最差的 CFA、不同 views 间的最大差距（Cue Gap）、must-change/must-hold 一致率，以及只改无关 cue 后分数是否变化。</w:t>
       </w:r>
     </w:p>
     <w:p>
@@ -3519,7 +3547,7 @@
         <w:rPr>
           <w:rFonts w:ascii="Calibri" w:hAnsi="Calibri" w:eastAsia="PingFang SC"/>
         </w:rPr>
-        <w:t>主榜先检查 TQ、FR 和关键隐私门槛，再报告 PF−MP、CFA、Retention、Recovery、隐私违规率、成本和时间。不同 evidence track、工具预算和 agent 类型不应混排。</w:t>
+        <w:t>主榜先检查 TQ、FR 和关键隐私门槛，再报告 PF−MP、CFA、cue robustness、Retention、Recovery、隐私违规率、成本和时间。不同 evidence track、工具预算和 agent 类型不应混排。</w:t>
       </w:r>
     </w:p>
     <w:p>
@@ -4649,7 +4677,7 @@
         <w:rPr>
           <w:rFonts w:ascii="Calibri" w:hAnsi="Calibri" w:eastAsia="PingFang SC"/>
         </w:rPr>
-        <w:t>回答不能是“我们任务更多”。必须证明 Atlas、反事实识别、rubric compiler、JudgeBench 和长程压力测试各自提供了新的、可验证的方法贡献。</w:t>
+        <w:t>回答不能是“我们任务更多”，也不能说 PDR-Bench 没有 persona-aware rubric。应先承认它已经测单用户条件下的绝对适配；再证明 DeepAlign 的跨用户 2×2 对角优势、预冻结变化/不变项和跨线索表达测试各自提供了新的、可验证的信息。Atlas、JudgeBench 和长程压力测试用于外部效度与失效诊断。</w:t>
       </w:r>
     </w:p>
     <w:p>
@@ -4767,7 +4795,7 @@
         <w:rPr>
           <w:rFonts w:ascii="Calibri" w:hAnsi="Calibri" w:eastAsia="PingFang SC"/>
         </w:rPr>
-        <w:t>反事实任务族能区分真正用户适配和表面 persona 复述；</w:t>
+        <w:t>反事实任务族能识别交付物的用户特异性，语义等价信号测试再检查其是否只依赖表面 persona 线索；</w:t>
       </w:r>
     </w:p>
     <w:p>
@@ -4874,7 +4902,7 @@
         </w:rPr>
         <w:t xml:space="preserve">. </w:t>
       </w:r>
-      <w:hyperlink r:id="rId38">
+      <w:hyperlink r:id="rId40">
         <w:r>
           <w:rPr>
             <w:rFonts w:ascii="Calibri" w:hAnsi="Calibri" w:eastAsia="PingFang SC"/>
@@ -5606,7 +5634,7 @@
         </w:rPr>
         <w:t xml:space="preserve">. EMNLP, 2025. </w:t>
       </w:r>
-      <w:hyperlink r:id="rId39">
+      <w:hyperlink r:id="rId41">
         <w:r>
           <w:rPr>
             <w:rFonts w:ascii="Calibri" w:hAnsi="Calibri" w:eastAsia="PingFang SC"/>
@@ -5714,7 +5742,7 @@
         </w:rPr>
         <w:t xml:space="preserve">. Findings of ACL, 2026. </w:t>
       </w:r>
-      <w:hyperlink r:id="rId40">
+      <w:hyperlink r:id="rId42">
         <w:r>
           <w:rPr>
             <w:rFonts w:ascii="Calibri" w:hAnsi="Calibri" w:eastAsia="PingFang SC"/>
@@ -5998,7 +6026,7 @@
         </w:rPr>
         <w:t xml:space="preserve">. ACL, 2026. </w:t>
       </w:r>
-      <w:hyperlink r:id="rId41">
+      <w:hyperlink r:id="rId43">
         <w:r>
           <w:rPr>
             <w:rFonts w:ascii="Calibri" w:hAnsi="Calibri" w:eastAsia="PingFang SC"/>
@@ -6038,7 +6066,7 @@
         </w:rPr>
         <w:t xml:space="preserve">. ACL, 2026. </w:t>
       </w:r>
-      <w:hyperlink r:id="rId42">
+      <w:hyperlink r:id="rId44">
         <w:r>
           <w:rPr>
             <w:rFonts w:ascii="Calibri" w:hAnsi="Calibri" w:eastAsia="PingFang SC"/>
@@ -6088,6 +6116,86 @@
             <w:szCs w:val="19"/>
           </w:rPr>
           <w:t>https://aclanthology.org/2026.acl-long.1260/</w:t>
+        </w:r>
+      </w:hyperlink>
+    </w:p>
+    <w:p>
+      <w:pPr>
+        <w:spacing w:after="80" w:line="264" w:lineRule="auto"/>
+        <w:ind w:left="360" w:hanging="360"/>
+      </w:pPr>
+      <w:r>
+        <w:rPr>
+          <w:rFonts w:ascii="Calibri" w:hAnsi="Calibri" w:eastAsia="PingFang SC"/>
+          <w:sz w:val="19"/>
+        </w:rPr>
+        <w:t xml:space="preserve">[40] Weeber et al. </w:t>
+      </w:r>
+      <w:r>
+        <w:rPr>
+          <w:rFonts w:ascii="Calibri" w:hAnsi="Calibri" w:eastAsia="PingFang SC"/>
+          <w:i/>
+          <w:sz w:val="19"/>
+        </w:rPr>
+        <w:t>One Persona, Many Cues, Different Results</w:t>
+      </w:r>
+      <w:r>
+        <w:rPr>
+          <w:rFonts w:ascii="Calibri" w:hAnsi="Calibri" w:eastAsia="PingFang SC"/>
+          <w:sz w:val="19"/>
+        </w:rPr>
+        <w:t xml:space="preserve">. ACL, 2026. </w:t>
+      </w:r>
+      <w:hyperlink r:id="rId38">
+        <w:r>
+          <w:rPr>
+            <w:rFonts w:ascii="Calibri" w:hAnsi="Calibri" w:eastAsia="PingFang SC"/>
+            <w:color w:val="2E74B5"/>
+            <w:u w:val="single"/>
+            <w:sz w:val="19"/>
+            <w:szCs w:val="19"/>
+          </w:rPr>
+          <w:t>https://aclanthology.org/2026.acl-long.2079/</w:t>
+        </w:r>
+      </w:hyperlink>
+    </w:p>
+    <w:p>
+      <w:pPr>
+        <w:spacing w:after="80" w:line="264" w:lineRule="auto"/>
+        <w:ind w:left="360" w:hanging="360"/>
+      </w:pPr>
+      <w:r>
+        <w:rPr>
+          <w:rFonts w:ascii="Calibri" w:hAnsi="Calibri" w:eastAsia="PingFang SC"/>
+          <w:sz w:val="19"/>
+        </w:rPr>
+        <w:t xml:space="preserve">[41] Qiu et al. </w:t>
+      </w:r>
+      <w:r>
+        <w:rPr>
+          <w:rFonts w:ascii="Calibri" w:hAnsi="Calibri" w:eastAsia="PingFang SC"/>
+          <w:i/>
+          <w:sz w:val="19"/>
+        </w:rPr>
+        <w:t>Preference-Aware Rubric Learning for Personalized Evaluation</w:t>
+      </w:r>
+      <w:r>
+        <w:rPr>
+          <w:rFonts w:ascii="Calibri" w:hAnsi="Calibri" w:eastAsia="PingFang SC"/>
+          <w:sz w:val="19"/>
+        </w:rPr>
+        <w:t xml:space="preserve">. arXiv:2605.31545, 2026. </w:t>
+      </w:r>
+      <w:hyperlink r:id="rId39">
+        <w:r>
+          <w:rPr>
+            <w:rFonts w:ascii="Calibri" w:hAnsi="Calibri" w:eastAsia="PingFang SC"/>
+            <w:color w:val="2E74B5"/>
+            <w:u w:val="single"/>
+            <w:sz w:val="19"/>
+            <w:szCs w:val="19"/>
+          </w:rPr>
+          <w:t>https://arxiv.org/abs/2605.31545</w:t>
         </w:r>
       </w:hyperlink>
     </w:p>

</xml_diff>

<commit_message>
proposal v0.21: reframe PDR gap as counterfactual effect
</commit_message>
<xml_diff>
--- a/deliverables/DeepAlign-Bench_完整人话版.docx
+++ b/deliverables/DeepAlign-Bench_完整人话版.docx
@@ -131,7 +131,7 @@
                 <w:color w:val="5B6B7A"/>
                 <w:sz w:val="21"/>
               </w:rPr>
-              <w:t>v0.20 · 完整人话版</w:t>
+              <w:t>v0.21 · 完整人话版</w:t>
             </w:r>
           </w:p>
         </w:tc>
@@ -1005,7 +1005,7 @@
         <w:rPr>
           <w:rFonts w:ascii="Calibri" w:hAnsi="Calibri" w:eastAsia="PingFang SC"/>
         </w:rPr>
-        <w:t xml:space="preserve"> MyScholarQA 甚至发现，合成用户和 LLM judge 会漏掉真人指出的九类细微个性化错误。</w:t>
+        <w:t xml:space="preserve"> MyScholarQA 还发现，合成用户和 LLM judge 会漏掉真人指出的九类细微个性化错误。</w:t>
       </w:r>
       <w:hyperlink r:id="rId37">
         <w:r>
@@ -1021,7 +1021,7 @@
         <w:rPr>
           <w:rFonts w:ascii="Calibri" w:hAnsi="Calibri" w:eastAsia="PingFang SC"/>
         </w:rPr>
-        <w:t xml:space="preserve"> 这里必须公平描述 PDR-Bench：它不是把 persona 只当作一段附加文字，也不是用通用文风分来评个性化。它会根据 task 和 persona 生成 P-Score 的权重与子标准，再评价目标、内容、呈现和可行动性；人类校准还会比较同一个 user-query 下两种 agent 的报告。</w:t>
+        <w:t xml:space="preserve"> PDR-Bench 会根据 task 和 persona 生成 P-Score 的权重与子标准，再评价目标、内容、呈现和可行动性；它已经能可靠表达“给定这个 task 和 persona，这份报告有多适合该用户”这一 absolute adaptation 问题。</w:t>
       </w:r>
     </w:p>
     <w:p>
@@ -1029,33 +1029,70 @@
         <w:rPr>
           <w:rFonts w:ascii="Calibri" w:hAnsi="Calibri" w:eastAsia="PingFang SC"/>
         </w:rPr>
-        <w:t>它已经回答了一个重要问题：</w:t>
+        <w:t>DeepAlign 不重复回答这个问题，而是换一个 estimand：</w:t>
       </w:r>
       <w:r>
         <w:rPr>
           <w:rFonts w:ascii="Calibri" w:hAnsi="Calibri" w:eastAsia="PingFang SC"/>
           <w:b/>
         </w:rPr>
-        <w:t>给定这个用户，这份报告是否适合他/她？</w:t>
-      </w:r>
-      <w:r>
-        <w:rPr>
-          <w:rFonts w:ascii="Calibri" w:hAnsi="Calibri" w:eastAsia="PingFang SC"/>
-        </w:rPr>
-        <w:t xml:space="preserve"> DeepAlign 要补的是下一层：</w:t>
-      </w:r>
-      <w:r>
-        <w:rPr>
-          <w:rFonts w:ascii="Calibri" w:hAnsi="Calibri" w:eastAsia="PingFang SC"/>
-          <w:b/>
-        </w:rPr>
         <w:t>同一任务和证据换成另一个同样合理的用户后，两份报告是否各自更适合自己的用户？</w:t>
       </w:r>
       <w:r>
         <w:rPr>
           <w:rFonts w:ascii="Calibri" w:hAnsi="Calibri" w:eastAsia="PingFang SC"/>
         </w:rPr>
-        <w:t xml:space="preserve"> PDR-Bench 的 pairwise 比较是“同一用户下哪个 agent 报告更好”，不是“A/B 用户的报告交叉给两个人评分”。所以我们的差异不是 rubric 更会看 persona，而是增加跨用户 2×2 matched/swapped 矩阵和预冻结差异真值。</w:t>
+        <w:t xml:space="preserve"> PDR-Bench 的 pairwise 比较回答“同一用户下哪个 agent 报告更好”；DeepAlign 的跨用户 2×2 matched/swapped 矩阵回答“只改变用户条件后，输出是否发生方向正确的变化”。这就是从 absolute adaptation evaluation 到 counterfactual personalization effect identification。</w:t>
+      </w:r>
+    </w:p>
+    <w:p>
+      <w:r>
+        <w:rPr>
+          <w:rFonts w:ascii="Calibri" w:hAnsi="Calibri" w:eastAsia="PingFang SC"/>
+        </w:rPr>
+        <w:t>仅仅看到两份输出不同还不够。</w:t>
+      </w:r>
+      <w:r>
+        <w:rPr>
+          <w:rFonts w:ascii="Courier New" w:hAnsi="Courier New" w:eastAsia="PingFang SC"/>
+          <w:color w:val="6A3E00"/>
+          <w:sz w:val="20"/>
+        </w:rPr>
+        <w:t>must-change</w:t>
+      </w:r>
+      <w:r>
+        <w:rPr>
+          <w:rFonts w:ascii="Calibri" w:hAnsi="Calibri" w:eastAsia="PingFang SC"/>
+        </w:rPr>
+        <w:t xml:space="preserve"> 规定哪些决策必须随用户改变；</w:t>
+      </w:r>
+      <w:r>
+        <w:rPr>
+          <w:rFonts w:ascii="Courier New" w:hAnsi="Courier New" w:eastAsia="PingFang SC"/>
+          <w:color w:val="6A3E00"/>
+          <w:sz w:val="20"/>
+        </w:rPr>
+        <w:t>must-hold</w:t>
+      </w:r>
+      <w:r>
+        <w:rPr>
+          <w:rFonts w:ascii="Calibri" w:hAnsi="Calibri" w:eastAsia="PingFang SC"/>
+        </w:rPr>
+        <w:t xml:space="preserve"> 规定哪些事实、证据和共同质量不能改变；</w:t>
+      </w:r>
+      <w:r>
+        <w:rPr>
+          <w:rFonts w:ascii="Courier New" w:hAnsi="Courier New" w:eastAsia="PingFang SC"/>
+          <w:color w:val="6A3E00"/>
+          <w:sz w:val="20"/>
+        </w:rPr>
+        <w:t>must-not</w:t>
+      </w:r>
+      <w:r>
+        <w:rPr>
+          <w:rFonts w:ascii="Calibri" w:hAnsi="Calibri" w:eastAsia="PingFang SC"/>
+        </w:rPr>
+        <w:t xml:space="preserve"> 规定不能因为 persona 就额外推断、迎合或泄露什么。三者共同防止把随机差异、质量下降或过度个性化误认为有效 personalization。</w:t>
       </w:r>
     </w:p>
     <w:p>
@@ -1095,7 +1132,7 @@
         <w:rPr>
           <w:rFonts w:ascii="Calibri" w:hAnsi="Calibri" w:eastAsia="PingFang SC"/>
         </w:rPr>
-        <w:t xml:space="preserve"> 长度、格式和关键词诱饵仍然要测，但主要用于审计 judge 是否稳健，不再用来概括 PDR-Bench 的不足。</w:t>
+        <w:t xml:space="preserve"> 长度、格式和关键词诱饵是 DeepAlign 对自身 judge 的独立测量有效性审计，与 PDR-Bench 的能力判断无关。</w:t>
       </w:r>
     </w:p>
     <w:p>
@@ -4677,7 +4714,7 @@
         <w:rPr>
           <w:rFonts w:ascii="Calibri" w:hAnsi="Calibri" w:eastAsia="PingFang SC"/>
         </w:rPr>
-        <w:t>回答不能是“我们任务更多”，也不能说 PDR-Bench 没有 persona-aware rubric。应先承认它已经测单用户条件下的绝对适配；再证明 DeepAlign 的跨用户 2×2 对角优势、预冻结变化/不变项和跨线索表达测试各自提供了新的、可验证的信息。Atlas、JudgeBench 和长程压力测试用于外部效度与失效诊断。</w:t>
+        <w:t>应先承认 PDR-Bench 已经测 task–persona 条件下的 absolute adaptation；再证明 DeepAlign 的跨用户 2×2 对角优势和预冻结 must-change/must-hold/must-not 能识别 counterfactual personalization effect。跨线索表达、Atlas、JudgeBench 和长程压力测试只用于稳健性、外部效度与失效诊断。</w:t>
       </w:r>
     </w:p>
     <w:p>

</xml_diff>

<commit_message>
proposal v0.22: operationalize families anchors and execution regimes
</commit_message>
<xml_diff>
--- a/deliverables/DeepAlign-Bench_完整人话版.docx
+++ b/deliverables/DeepAlign-Bench_完整人话版.docx
@@ -131,7 +131,7 @@
                 <w:color w:val="5B6B7A"/>
                 <w:sz w:val="21"/>
               </w:rPr>
-              <w:t>v0.21 · 完整人话版</w:t>
+              <w:t>v0.22 · 完整人话版</w:t>
             </w:r>
           </w:p>
         </w:tc>
@@ -1021,7 +1021,7 @@
         <w:rPr>
           <w:rFonts w:ascii="Calibri" w:hAnsi="Calibri" w:eastAsia="PingFang SC"/>
         </w:rPr>
-        <w:t xml:space="preserve"> PDR-Bench 会根据 task 和 persona 生成 P-Score 的权重与子标准，再评价目标、内容、呈现和可行动性；它已经能可靠表达“给定这个 task 和 persona，这份报告有多适合该用户”这一 absolute adaptation 问题。</w:t>
+        <w:t xml:space="preserve"> PDR-Bench 会根据 task 和 persona 生成 P-Score 的权重与子标准，再评价目标、内容、呈现和可行动性；它已经能表达“给定这个 task 和 persona，这份报告有多适合该用户”这一 absolute adaptation 问题。</w:t>
       </w:r>
     </w:p>
     <w:p>
@@ -1093,6 +1093,37 @@
           <w:rFonts w:ascii="Calibri" w:hAnsi="Calibri" w:eastAsia="PingFang SC"/>
         </w:rPr>
         <w:t xml:space="preserve"> 规定不能因为 persona 就额外推断、迎合或泄露什么。三者共同防止把随机差异、质量下降或过度个性化误认为有效 personalization。</w:t>
+      </w:r>
+    </w:p>
+    <w:p>
+      <w:r>
+        <w:rPr>
+          <w:rFonts w:ascii="Calibri" w:hAnsi="Calibri" w:eastAsia="PingFang SC"/>
+        </w:rPr>
+        <w:t>但是 PDR-Bench 的自动评价不能被写成已经完全解决。它在 15 个 query、两个 agent 上做人类校准，最好的 GPT-5 judge 与人类 pairwise 顺序一致率只有 0.43，平均评分偏差为 1.40。</w:t>
+      </w:r>
+      <w:hyperlink r:id="rId35">
+        <w:r>
+          <w:rPr>
+            <w:rFonts w:ascii="Calibri" w:hAnsi="Calibri" w:eastAsia="PingFang SC"/>
+            <w:color w:val="2E74B5"/>
+            <w:u w:val="single"/>
+          </w:rPr>
+          <w:t>[4]</w:t>
+        </w:r>
+      </w:hyperlink>
+      <w:r>
+        <w:rPr>
+          <w:rFonts w:ascii="Calibri" w:hAnsi="Calibri" w:eastAsia="PingFang SC"/>
+        </w:rPr>
+        <w:t xml:space="preserve"> 另外，权重/子标准由一次 LLM 生成、分数再由另一个 LLM 生成，量尺本身可能波动；human panel 也不等于 persona 本人；事实分还依赖 claim 抽取、去重、网页抓取和支持判断；P/Q/R 平均又可能让事实失败被其他分补回来。正确说法是：</w:t>
+      </w:r>
+      <w:r>
+        <w:rPr>
+          <w:rFonts w:ascii="Calibri" w:hAnsi="Calibri" w:eastAsia="PingFang SC"/>
+          <w:b/>
+        </w:rPr>
+        <w:t>PDR 的 rubric 已经能表示 absolute adaptation，但其 judge 校准和评分链条仍不足以直接支撑精细、跨系统的榜单。</w:t>
       </w:r>
     </w:p>
     <w:p>
@@ -1132,7 +1163,7 @@
         <w:rPr>
           <w:rFonts w:ascii="Calibri" w:hAnsi="Calibri" w:eastAsia="PingFang SC"/>
         </w:rPr>
-        <w:t xml:space="preserve"> 长度、格式和关键词诱饵是 DeepAlign 对自身 judge 的独立测量有效性审计，与 PDR-Bench 的能力判断无关。</w:t>
+        <w:t xml:space="preserve"> DeepAlign 的 JudgeBench 同时补 PDR 尚未报告的 wrong-user swap、位置、长度、关键词和隐私诱饵，但 judge 改进与 estimand 创新要分开写。</w:t>
       </w:r>
     </w:p>
     <w:p>
@@ -2307,42 +2338,18 @@
     </w:p>
     <w:p>
       <w:pPr>
-        <w:pStyle w:val="Heading1"/>
-      </w:pPr>
-      <w:r>
-        <w:t>4. Persona 和用户真值怎么做</w:t>
+        <w:pStyle w:val="Heading2"/>
+      </w:pPr>
+      <w:r>
+        <w:t>3.5 一个 task family 到底怎么造</w:t>
       </w:r>
     </w:p>
     <w:p>
-      <w:pPr>
-        <w:pStyle w:val="Heading2"/>
-      </w:pPr>
-      <w:r>
-        <w:t>4.1 Persona 不是人物小传</w:t>
-      </w:r>
-    </w:p>
-    <w:p>
-      <w:r>
-        <w:rPr>
-          <w:rFonts w:ascii="Calibri" w:hAnsi="Calibri" w:eastAsia="PingFang SC"/>
-        </w:rPr>
-        <w:t>Persona 只是用户状态的一种展示形式。我们真正保存的是一个与任务相关的 user-state ledger。每条信息都记录：来源、时间、可靠度、敏感程度、与任务是否相关、是否允许用于推理、是否允许写进最终交付物。</w:t>
-      </w:r>
-    </w:p>
-    <w:p>
-      <w:r>
-        <w:rPr>
-          <w:rFonts w:ascii="Calibri" w:hAnsi="Calibri" w:eastAsia="PingFang SC"/>
-        </w:rPr>
-        <w:t>同一份 ledger 可以被转成 structured persona、自然对话历史、澄清回答或 memory 记录。不同形式必须保持语义等价，否则测到的就不是“渠道差异”，而是“信息内容不同”。</w:t>
-      </w:r>
-    </w:p>
-    <w:p>
-      <w:pPr>
-        <w:pStyle w:val="Heading2"/>
-      </w:pPr>
-      <w:r>
-        <w:t>4.2 六道 persona-task 检查</w:t>
+      <w:r>
+        <w:rPr>
+          <w:rFonts w:ascii="Calibri" w:hAnsi="Calibri" w:eastAsia="PingFang SC"/>
+        </w:rPr>
+        <w:t>Task family 不是“旅行类”“学术类”这样的标签，而是一套能生成受控条件的蓝图。实际按八步做：</w:t>
       </w:r>
     </w:p>
     <w:p>
@@ -2357,15 +2364,8 @@
       <w:r>
         <w:rPr>
           <w:rFonts w:ascii="Calibri" w:hAnsi="Calibri" w:eastAsia="PingFang SC"/>
-          <w:b/>
-        </w:rPr>
-        <w:t>场景真实</w:t>
-      </w:r>
-      <w:r>
-        <w:rPr>
-          <w:rFonts w:ascii="Calibri" w:hAnsi="Calibri" w:eastAsia="PingFang SC"/>
-        </w:rPr>
-        <w:t>：这个用户自然地会提出这个任务；</w:t>
+        </w:rPr>
+        <w:t>从真实用户、专业工作流或已有 benchmark 收集一个确实需要多步研究的问题；</w:t>
       </w:r>
     </w:p>
     <w:p>
@@ -2380,15 +2380,8 @@
       <w:r>
         <w:rPr>
           <w:rFonts w:ascii="Calibri" w:hAnsi="Calibri" w:eastAsia="PingFang SC"/>
-          <w:b/>
-        </w:rPr>
-        <w:t>会影响结果</w:t>
-      </w:r>
-      <w:r>
-        <w:rPr>
-          <w:rFonts w:ascii="Calibri" w:hAnsi="Calibri" w:eastAsia="PingFang SC"/>
-        </w:rPr>
-        <w:t>：至少两条用户信息会改变内容、决策、深度、行动或披露边界；</w:t>
+        </w:rPr>
+        <w:t>固定所有用户共同的目标、证据截止时间、工具、预算和交付物；</w:t>
       </w:r>
     </w:p>
     <w:p>
@@ -2403,15 +2396,8 @@
       <w:r>
         <w:rPr>
           <w:rFonts w:ascii="Calibri" w:hAnsi="Calibri" w:eastAsia="PingFang SC"/>
-          <w:b/>
-        </w:rPr>
-        <w:t>两个用户可区分</w:t>
-      </w:r>
-      <w:r>
-        <w:rPr>
-          <w:rFonts w:ascii="Calibri" w:hAnsi="Calibri" w:eastAsia="PingFang SC"/>
-        </w:rPr>
-        <w:t>：盲评者能说清楚两份正确交付物应该在哪里不同；</w:t>
+        </w:rPr>
+        <w:t>标注使用情境、研究意图、交付物和需求剖面；</w:t>
       </w:r>
     </w:p>
     <w:p>
@@ -2426,15 +2412,8 @@
       <w:r>
         <w:rPr>
           <w:rFonts w:ascii="Calibri" w:hAnsi="Calibri" w:eastAsia="PingFang SC"/>
-          <w:b/>
-        </w:rPr>
-        <w:t>仍有共同核心</w:t>
-      </w:r>
-      <w:r>
-        <w:rPr>
-          <w:rFonts w:ascii="Calibri" w:hAnsi="Calibri" w:eastAsia="PingFang SC"/>
-        </w:rPr>
-        <w:t>：事实、证据和基本质量要求不能随用户改变；</w:t>
+        </w:rPr>
+        <w:t>建 frozen evidence pack、困难负例、时间戳和权限视图；</w:t>
       </w:r>
     </w:p>
     <w:p>
@@ -2449,15 +2428,8 @@
       <w:r>
         <w:rPr>
           <w:rFonts w:ascii="Calibri" w:hAnsi="Calibri" w:eastAsia="PingFang SC"/>
-          <w:b/>
-        </w:rPr>
-        <w:t>信息最少且隐私可控</w:t>
-      </w:r>
-      <w:r>
-        <w:rPr>
-          <w:rFonts w:ascii="Calibri" w:hAnsi="Calibri" w:eastAsia="PingFang SC"/>
-        </w:rPr>
-        <w:t>：不加入完成任务不需要的个人信息；</w:t>
+        </w:rPr>
+        <w:t>预先定义搜索 fan-out、冲突、上下文、handoff、更新等难度旋钮；</w:t>
       </w:r>
     </w:p>
     <w:p>
@@ -2465,6 +2437,255 @@
         <w:numPr>
           <w:ilvl w:val="0"/>
           <w:numId w:val="15"/>
+        </w:numPr>
+        <w:spacing w:after="80" w:line="290" w:lineRule="auto"/>
+        <w:ind w:left="540" w:hanging="279"/>
+      </w:pPr>
+      <w:r>
+        <w:rPr>
+          <w:rFonts w:ascii="Calibri" w:hAnsi="Calibri" w:eastAsia="PingFang SC"/>
+        </w:rPr>
+        <w:t>配两个都自然、但会改变至少两项交付决策的用户；</w:t>
+      </w:r>
+    </w:p>
+    <w:p>
+      <w:pPr>
+        <w:numPr>
+          <w:ilvl w:val="0"/>
+          <w:numId w:val="15"/>
+        </w:numPr>
+        <w:spacing w:after="80" w:line="290" w:lineRule="auto"/>
+        <w:ind w:left="540" w:hanging="279"/>
+      </w:pPr>
+      <w:r>
+        <w:rPr>
+          <w:rFonts w:ascii="Calibri" w:hAnsi="Calibri" w:eastAsia="PingFang SC"/>
+        </w:rPr>
+        <w:t>在模型运行前写 must-change / must-hold / must-not 和可接受替代；</w:t>
+      </w:r>
+    </w:p>
+    <w:p>
+      <w:pPr>
+        <w:numPr>
+          <w:ilvl w:val="0"/>
+          <w:numId w:val="15"/>
+        </w:numPr>
+        <w:spacing w:after="80" w:line="290" w:lineRule="auto"/>
+        <w:ind w:left="540" w:hanging="279"/>
+      </w:pPr>
+      <w:r>
+        <w:rPr>
+          <w:rFonts w:ascii="Calibri" w:hAnsi="Calibri" w:eastAsia="PingFang SC"/>
+        </w:rPr>
+        <w:t>用参考 matched/swapped 输出做人评 pilot，分不出来就删题。</w:t>
+      </w:r>
+    </w:p>
+    <w:p>
+      <w:r>
+        <w:rPr>
+          <w:rFonts w:ascii="Calibri" w:hAnsi="Calibri" w:eastAsia="PingFang SC"/>
+        </w:rPr>
+        <w:t>所以“同一个医疗 AI 采购研究 + 医院管理者/临床 AI 研究员”是一个 family：法规和产品事实不变，但 ROI/流程/合规与验证/漂移/复现的优先级必须变化。</w:t>
+      </w:r>
+    </w:p>
+    <w:p>
+      <w:pPr>
+        <w:pStyle w:val="Heading2"/>
+      </w:pPr>
+      <w:r>
+        <w:t>3.6 难度怎么逐级增加</w:t>
+      </w:r>
+    </w:p>
+    <w:p>
+      <w:r>
+        <w:rPr>
+          <w:rFonts w:ascii="Calibri" w:hAnsi="Calibri" w:eastAsia="PingFang SC"/>
+        </w:rPr>
+        <w:t>难度用六个独立旋钮表示：证据复杂度、用户信号复杂度、上下文长度、交接负载、权限敏感度、用户差异细微度。Anchor 内按同一前缀运行：</w:t>
+      </w:r>
+      <w:r>
+        <w:rPr>
+          <w:rFonts w:ascii="Courier New" w:hAnsi="Courier New" w:eastAsia="PingFang SC"/>
+          <w:color w:val="6A3E00"/>
+          <w:sz w:val="20"/>
+        </w:rPr>
+        <w:t>S0 clean → S1 单个轻扰动 → S2 单个强扰动 → S3 两个正交扰动 → S4 对 S3 做恢复</w:t>
+      </w:r>
+      <w:r>
+        <w:rPr>
+          <w:rFonts w:ascii="Calibri" w:hAnsi="Calibri" w:eastAsia="PingFang SC"/>
+        </w:rPr>
+        <w:t>。S4 不是更难，而是恢复配对。Risk 说明失败伤害什么，failure mode 说明想暴露什么机制，stress level 说明触发有多强；三者不能混成一个总难度分。</w:t>
+      </w:r>
+    </w:p>
+    <w:p>
+      <w:pPr>
+        <w:pStyle w:val="Heading1"/>
+      </w:pPr>
+      <w:r>
+        <w:t>4. Persona 和用户真值怎么做</w:t>
+      </w:r>
+    </w:p>
+    <w:p>
+      <w:pPr>
+        <w:pStyle w:val="Heading2"/>
+      </w:pPr>
+      <w:r>
+        <w:t>4.1 Persona 不是人物小传</w:t>
+      </w:r>
+    </w:p>
+    <w:p>
+      <w:r>
+        <w:rPr>
+          <w:rFonts w:ascii="Calibri" w:hAnsi="Calibri" w:eastAsia="PingFang SC"/>
+        </w:rPr>
+        <w:t>Persona 只是用户状态的一种展示形式。我们真正保存的是一个与任务相关的 user-state ledger。每条信息都记录：来源、时间、可靠度、敏感程度、与任务是否相关、是否允许用于推理、是否允许写进最终交付物。</w:t>
+      </w:r>
+    </w:p>
+    <w:p>
+      <w:r>
+        <w:rPr>
+          <w:rFonts w:ascii="Calibri" w:hAnsi="Calibri" w:eastAsia="PingFang SC"/>
+        </w:rPr>
+        <w:t>同一份 ledger 可以被转成 structured persona、自然对话历史、澄清回答或 memory 记录。不同形式必须保持语义等价，否则测到的就不是“渠道差异”，而是“信息内容不同”。</w:t>
+      </w:r>
+    </w:p>
+    <w:p>
+      <w:r>
+        <w:rPr>
+          <w:rFonts w:ascii="Calibri" w:hAnsi="Calibri" w:eastAsia="PingFang SC"/>
+        </w:rPr>
+        <w:t>具体不是让作者凭空写人物，而是：真实需求记录 → 提取目标/知识/硬约束/风险/受众/权限 → 先写 Ua/Ub 共享核心 → 只改 2–3 个有决策后果的字段 → 每条事实映射到一条评价契约 → 从同一 ledger 生成不同 signal view → 再生成 demographic-only、irrelevant、wrong-user、stale 和 redacted 负对照 → 原用户、相似用户与领域专家三方验证。没有 rubric 后果的 biography 细节从核心 persona 删除。</w:t>
+      </w:r>
+    </w:p>
+    <w:p>
+      <w:pPr>
+        <w:pStyle w:val="Heading2"/>
+      </w:pPr>
+      <w:r>
+        <w:t>4.2 六道 persona-task 检查</w:t>
+      </w:r>
+    </w:p>
+    <w:p>
+      <w:pPr>
+        <w:numPr>
+          <w:ilvl w:val="0"/>
+          <w:numId w:val="16"/>
+        </w:numPr>
+        <w:spacing w:after="80" w:line="290" w:lineRule="auto"/>
+        <w:ind w:left="540" w:hanging="279"/>
+      </w:pPr>
+      <w:r>
+        <w:rPr>
+          <w:rFonts w:ascii="Calibri" w:hAnsi="Calibri" w:eastAsia="PingFang SC"/>
+          <w:b/>
+        </w:rPr>
+        <w:t>场景真实</w:t>
+      </w:r>
+      <w:r>
+        <w:rPr>
+          <w:rFonts w:ascii="Calibri" w:hAnsi="Calibri" w:eastAsia="PingFang SC"/>
+        </w:rPr>
+        <w:t>：这个用户自然地会提出这个任务；</w:t>
+      </w:r>
+    </w:p>
+    <w:p>
+      <w:pPr>
+        <w:numPr>
+          <w:ilvl w:val="0"/>
+          <w:numId w:val="16"/>
+        </w:numPr>
+        <w:spacing w:after="80" w:line="290" w:lineRule="auto"/>
+        <w:ind w:left="540" w:hanging="279"/>
+      </w:pPr>
+      <w:r>
+        <w:rPr>
+          <w:rFonts w:ascii="Calibri" w:hAnsi="Calibri" w:eastAsia="PingFang SC"/>
+          <w:b/>
+        </w:rPr>
+        <w:t>会影响结果</w:t>
+      </w:r>
+      <w:r>
+        <w:rPr>
+          <w:rFonts w:ascii="Calibri" w:hAnsi="Calibri" w:eastAsia="PingFang SC"/>
+        </w:rPr>
+        <w:t>：至少两条用户信息会改变内容、决策、深度、行动或披露边界；</w:t>
+      </w:r>
+    </w:p>
+    <w:p>
+      <w:pPr>
+        <w:numPr>
+          <w:ilvl w:val="0"/>
+          <w:numId w:val="16"/>
+        </w:numPr>
+        <w:spacing w:after="80" w:line="290" w:lineRule="auto"/>
+        <w:ind w:left="540" w:hanging="279"/>
+      </w:pPr>
+      <w:r>
+        <w:rPr>
+          <w:rFonts w:ascii="Calibri" w:hAnsi="Calibri" w:eastAsia="PingFang SC"/>
+          <w:b/>
+        </w:rPr>
+        <w:t>两个用户可区分</w:t>
+      </w:r>
+      <w:r>
+        <w:rPr>
+          <w:rFonts w:ascii="Calibri" w:hAnsi="Calibri" w:eastAsia="PingFang SC"/>
+        </w:rPr>
+        <w:t>：盲评者能说清楚两份正确交付物应该在哪里不同；</w:t>
+      </w:r>
+    </w:p>
+    <w:p>
+      <w:pPr>
+        <w:numPr>
+          <w:ilvl w:val="0"/>
+          <w:numId w:val="16"/>
+        </w:numPr>
+        <w:spacing w:after="80" w:line="290" w:lineRule="auto"/>
+        <w:ind w:left="540" w:hanging="279"/>
+      </w:pPr>
+      <w:r>
+        <w:rPr>
+          <w:rFonts w:ascii="Calibri" w:hAnsi="Calibri" w:eastAsia="PingFang SC"/>
+          <w:b/>
+        </w:rPr>
+        <w:t>仍有共同核心</w:t>
+      </w:r>
+      <w:r>
+        <w:rPr>
+          <w:rFonts w:ascii="Calibri" w:hAnsi="Calibri" w:eastAsia="PingFang SC"/>
+        </w:rPr>
+        <w:t>：事实、证据和基本质量要求不能随用户改变；</w:t>
+      </w:r>
+    </w:p>
+    <w:p>
+      <w:pPr>
+        <w:numPr>
+          <w:ilvl w:val="0"/>
+          <w:numId w:val="16"/>
+        </w:numPr>
+        <w:spacing w:after="80" w:line="290" w:lineRule="auto"/>
+        <w:ind w:left="540" w:hanging="279"/>
+      </w:pPr>
+      <w:r>
+        <w:rPr>
+          <w:rFonts w:ascii="Calibri" w:hAnsi="Calibri" w:eastAsia="PingFang SC"/>
+          <w:b/>
+        </w:rPr>
+        <w:t>信息最少且隐私可控</w:t>
+      </w:r>
+      <w:r>
+        <w:rPr>
+          <w:rFonts w:ascii="Calibri" w:hAnsi="Calibri" w:eastAsia="PingFang SC"/>
+        </w:rPr>
+        <w:t>：不加入完成任务不需要的个人信息；</w:t>
+      </w:r>
+    </w:p>
+    <w:p>
+      <w:pPr>
+        <w:numPr>
+          <w:ilvl w:val="0"/>
+          <w:numId w:val="16"/>
         </w:numPr>
         <w:spacing w:after="80" w:line="290" w:lineRule="auto"/>
         <w:ind w:left="540" w:hanging="279"/>
@@ -2731,7 +2952,7 @@
         <w:rPr>
           <w:rFonts w:ascii="Calibri" w:hAnsi="Calibri" w:eastAsia="PingFang SC"/>
         </w:rPr>
-        <w:t>三类核心 agent 是：一个商业 Deep Research 产品、一个在统一搜索和工具条件下运行的通用 agent、一个可复现的开源 Deep Research agent。</w:t>
+        <w:t>三类核心 agent 是：M1 商业 Deep Research 产品、M2 在统一搜索和工具条件下运行的通用 harness、M3 可复现开源 DRA。M4 code agent、M5 multi-agent、M6 memory-enhanced 是架构 probe，只在适合的 anchor 上运行。</w:t>
       </w:r>
     </w:p>
     <w:p>
@@ -2759,13 +2980,13 @@
           <w:rFonts w:ascii="Calibri" w:hAnsi="Calibri" w:eastAsia="PingFang SC"/>
           <w:b/>
         </w:rPr>
-        <w:t>Frozen Core</w:t>
-      </w:r>
-      <w:r>
-        <w:rPr>
-          <w:rFonts w:ascii="Calibri" w:hAnsi="Calibri" w:eastAsia="PingFang SC"/>
-        </w:rPr>
-        <w:t>：证据和工具固定，用于主要科学结论；</w:t>
+        <w:t>E1 Frozen Harness</w:t>
+      </w:r>
+      <w:r>
+        <w:rPr>
+          <w:rFonts w:ascii="Calibri" w:hAnsi="Calibri" w:eastAsia="PingFang SC"/>
+        </w:rPr>
+        <w:t>：只读证据快照、统一工具和预算；每次 reset 后以同一 seed 成对运行，形成因果主榜；</w:t>
       </w:r>
     </w:p>
     <w:p>
@@ -2777,13 +2998,13 @@
           <w:rFonts w:ascii="Calibri" w:hAnsi="Calibri" w:eastAsia="PingFang SC"/>
           <w:b/>
         </w:rPr>
-        <w:t>Live Web</w:t>
-      </w:r>
-      <w:r>
-        <w:rPr>
-          <w:rFonts w:ascii="Calibri" w:hAnsi="Calibri" w:eastAsia="PingFang SC"/>
-        </w:rPr>
-        <w:t>：记录日期、搜索服务和网页快照，只用于生态观察；</w:t>
+        <w:t>E2 Live Product/Web</w:t>
+      </w:r>
+      <w:r>
+        <w:rPr>
+          <w:rFonts w:ascii="Calibri" w:hAnsi="Calibri" w:eastAsia="PingFang SC"/>
+        </w:rPr>
+        <w:t>：系统使用原生搜索和规划；记录日期、地区、订阅、版本、工具和 URL 快照，形成产品榜；</w:t>
       </w:r>
     </w:p>
     <w:p>
@@ -2795,13 +3016,13 @@
           <w:rFonts w:ascii="Calibri" w:hAnsi="Calibri" w:eastAsia="PingFang SC"/>
           <w:b/>
         </w:rPr>
-        <w:t>Longitudinal/Interactive</w:t>
-      </w:r>
-      <w:r>
-        <w:rPr>
-          <w:rFonts w:ascii="Calibri" w:hAnsi="Calibri" w:eastAsia="PingFang SC"/>
-        </w:rPr>
-        <w:t>：用户状态中途变化，用于保持、更新和恢复测试。</w:t>
+        <w:t>E3 Stateful Sandbox</w:t>
+      </w:r>
+      <w:r>
+        <w:rPr>
+          <w:rFonts w:ascii="Calibri" w:hAnsi="Calibri" w:eastAsia="PingFang SC"/>
+        </w:rPr>
+        <w:t>：事件脚本在固定 checkpoint 注入澄清、冲突、handoff、更新和 re-anchor，共享前缀后分叉，形成机制榜。</w:t>
       </w:r>
     </w:p>
     <w:p>
@@ -2809,7 +3030,7 @@
         <w:rPr>
           <w:rFonts w:ascii="Calibri" w:hAnsi="Calibri" w:eastAsia="PingFang SC"/>
         </w:rPr>
-        <w:t>三条轨道不能混成一个总榜。商业产品版本和 live web 条件变化太快，必须单独报告。</w:t>
+        <w:t>三条轨道是运行环境，不是 agent 类型。统一 adapter 至少要能 reset、提供 signal、运行到 checkpoint、注入 event、导出 artifact，并声明能保存 artifact-only、tool events、message events 还是 full state。三条轨道不能混成一个总榜。</w:t>
       </w:r>
     </w:p>
     <w:p>
@@ -2944,7 +3165,7 @@
         <w:rPr>
           <w:rFonts w:ascii="Calibri" w:hAnsi="Calibri" w:eastAsia="PingFang SC"/>
         </w:rPr>
-        <w:t>前三个共同对照（clean、persona swap、无关信息）在所有 anchor 上运行；冲突、稀释、handoff 和动态更新只放到确实适合的 family。Re-anchor 不是 attack，而是恢复干预；预先确定哪些样本重跑，不能看见失败后再挑样本。这样才能把“这个任务本来难”与“用户信息被错配、稀释、丢失或没有更新”分开。</w:t>
+        <w:t>8 个 anchor 固定覆盖：日常决策、学习/职业、金融信息、健康信息、企业采购/合规、软件生产、学术前沿、政策传播。前三个共同对照（clean、persona swap、无关信息）在所有 anchor 上运行；冲突、稀释、handoff 和动态更新用平衡不完全区组分配，每类 failure mode 至少出现在两个不同 anchor。Re-anchor 不是 attack；预先确定哪些样本重跑，不能看见失败后再挑样本。</w:t>
       </w:r>
     </w:p>
     <w:p>
@@ -3203,7 +3424,7 @@
       <w:pPr>
         <w:numPr>
           <w:ilvl w:val="0"/>
-          <w:numId w:val="16"/>
+          <w:numId w:val="17"/>
         </w:numPr>
         <w:spacing w:after="80" w:line="290" w:lineRule="auto"/>
         <w:ind w:left="540" w:hanging="279"/>
@@ -3220,60 +3441,6 @@
           <w:rFonts w:ascii="Calibri" w:hAnsi="Calibri" w:eastAsia="PingFang SC"/>
         </w:rPr>
         <w:t>：任务完成、事实、证据、推理、行动性、文件完整性；</w:t>
-      </w:r>
-    </w:p>
-    <w:p>
-      <w:pPr>
-        <w:numPr>
-          <w:ilvl w:val="0"/>
-          <w:numId w:val="16"/>
-        </w:numPr>
-        <w:spacing w:after="80" w:line="290" w:lineRule="auto"/>
-        <w:ind w:left="540" w:hanging="279"/>
-      </w:pPr>
-      <w:r>
-        <w:rPr>
-          <w:rFonts w:ascii="Calibri" w:hAnsi="Calibri" w:eastAsia="PingFang SC"/>
-          <w:b/>
-        </w:rPr>
-        <w:t>User-Conditional Fit</w:t>
-      </w:r>
-      <w:r>
-        <w:rPr>
-          <w:rFonts w:ascii="Calibri" w:hAnsi="Calibri" w:eastAsia="PingFang SC"/>
-        </w:rPr>
-        <w:t>：目标、内容、深度、约束、工作流、受众、动态状态；</w:t>
-      </w:r>
-    </w:p>
-    <w:p>
-      <w:pPr>
-        <w:numPr>
-          <w:ilvl w:val="0"/>
-          <w:numId w:val="16"/>
-        </w:numPr>
-        <w:spacing w:after="80" w:line="290" w:lineRule="auto"/>
-        <w:ind w:left="540" w:hanging="279"/>
-      </w:pPr>
-      <w:r>
-        <w:rPr>
-          <w:rFonts w:ascii="Calibri" w:hAnsi="Calibri" w:eastAsia="PingFang SC"/>
-          <w:b/>
-        </w:rPr>
-        <w:t>Misuse &amp; Boundary</w:t>
-      </w:r>
-      <w:r>
-        <w:rPr>
-          <w:rFonts w:ascii="Calibri" w:hAnsi="Calibri" w:eastAsia="PingFang SC"/>
-        </w:rPr>
-        <w:t>：刻板化、无关个性化、过期信息、隐私、越权和过度迎合。</w:t>
-      </w:r>
-    </w:p>
-    <w:p>
-      <w:pPr>
-        <w:pStyle w:val="Heading2"/>
-      </w:pPr>
-      <w:r>
-        <w:t>7.4 Rubric 进入主实验前必须过五关</w:t>
       </w:r>
     </w:p>
     <w:p>
@@ -3288,8 +3455,15 @@
       <w:r>
         <w:rPr>
           <w:rFonts w:ascii="Calibri" w:hAnsi="Calibri" w:eastAsia="PingFang SC"/>
-        </w:rPr>
-        <w:t>每个关键元数据要么对应可判断的 rubric，要么明确只用于切片报告；</w:t>
+          <w:b/>
+        </w:rPr>
+        <w:t>User-Conditional Fit</w:t>
+      </w:r>
+      <w:r>
+        <w:rPr>
+          <w:rFonts w:ascii="Calibri" w:hAnsi="Calibri" w:eastAsia="PingFang SC"/>
+        </w:rPr>
+        <w:t>：目标、内容、深度、约束、工作流、受众、动态状态；</w:t>
       </w:r>
     </w:p>
     <w:p>
@@ -3304,303 +3478,23 @@
       <w:r>
         <w:rPr>
           <w:rFonts w:ascii="Calibri" w:hAnsi="Calibri" w:eastAsia="PingFang SC"/>
-        </w:rPr>
-        <w:t>人写的 matched 参考结果应明显优于 swapped 或错误版本；</w:t>
+          <w:b/>
+        </w:rPr>
+        <w:t>Misuse &amp; Boundary</w:t>
+      </w:r>
+      <w:r>
+        <w:rPr>
+          <w:rFonts w:ascii="Calibri" w:hAnsi="Calibri" w:eastAsia="PingFang SC"/>
+        </w:rPr>
+        <w:t>：刻板化、无关个性化、过期信息、隐私、越权和过度迎合。</w:t>
       </w:r>
     </w:p>
     <w:p>
       <w:pPr>
-        <w:numPr>
-          <w:ilvl w:val="0"/>
-          <w:numId w:val="17"/>
-        </w:numPr>
-        <w:spacing w:after="80" w:line="290" w:lineRule="auto"/>
-        <w:ind w:left="540" w:hanging="279"/>
-      </w:pPr>
-      <w:r>
-        <w:rPr>
-          <w:rFonts w:ascii="Calibri" w:hAnsi="Calibri" w:eastAsia="PingFang SC"/>
-        </w:rPr>
-        <w:t>同一 user-state 换成语义等价 signal view 后，must-change / must-hold 判断应稳定；</w:t>
-      </w:r>
-    </w:p>
-    <w:p>
-      <w:pPr>
-        <w:numPr>
-          <w:ilvl w:val="0"/>
-          <w:numId w:val="17"/>
-        </w:numPr>
-        <w:spacing w:after="80" w:line="290" w:lineRule="auto"/>
-        <w:ind w:left="540" w:hanging="279"/>
-      </w:pPr>
-      <w:r>
-        <w:rPr>
-          <w:rFonts w:ascii="Calibri" w:hAnsi="Calibri" w:eastAsia="PingFang SC"/>
-        </w:rPr>
-        <w:t>加入无关 persona、改变篇幅或文风不能提高不相关分数；</w:t>
-      </w:r>
-    </w:p>
-    <w:p>
-      <w:pPr>
-        <w:numPr>
-          <w:ilvl w:val="0"/>
-          <w:numId w:val="17"/>
-        </w:numPr>
-        <w:spacing w:after="80" w:line="290" w:lineRule="auto"/>
-        <w:ind w:left="540" w:hanging="279"/>
-      </w:pPr>
-      <w:r>
-        <w:rPr>
-          <w:rFonts w:ascii="Calibri" w:hAnsi="Calibri" w:eastAsia="PingFang SC"/>
-        </w:rPr>
-        <w:t>judge 在不同任务、交付物、用户信息渠道和风险等级上都要单独校准。</w:t>
-      </w:r>
-    </w:p>
-    <w:p>
-      <w:r>
-        <w:rPr>
-          <w:rFonts w:ascii="Calibri" w:hAnsi="Calibri" w:eastAsia="PingFang SC"/>
-        </w:rPr>
-        <w:t>无法稳定判断、不能区分 matched/swapped 的 rubric 必须删除或降级，不能靠调权重保留。</w:t>
-      </w:r>
-    </w:p>
-    <w:p>
-      <w:pPr>
-        <w:pStyle w:val="Heading1"/>
-      </w:pPr>
-      <w:r>
-        <w:t>8. Metrics 怎么读</w:t>
-      </w:r>
-    </w:p>
-    <w:p>
-      <w:pPr>
         <w:pStyle w:val="Heading2"/>
       </w:pPr>
       <w:r>
-        <w:t>8.1 共同质量与事实性</w:t>
-      </w:r>
-    </w:p>
-    <w:p>
-      <w:pPr>
-        <w:pStyle w:val="ListBullet"/>
-      </w:pPr>
-      <w:r>
-        <w:rPr>
-          <w:rFonts w:ascii="Calibri" w:hAnsi="Calibri" w:eastAsia="PingFang SC"/>
-          <w:b/>
-        </w:rPr>
-        <w:t>TQ</w:t>
-      </w:r>
-      <w:r>
-        <w:rPr>
-          <w:rFonts w:ascii="Calibri" w:hAnsi="Calibri" w:eastAsia="PingFang SC"/>
-        </w:rPr>
-        <w:t>：任务完成和基本可用性；</w:t>
-      </w:r>
-    </w:p>
-    <w:p>
-      <w:pPr>
-        <w:pStyle w:val="ListBullet"/>
-      </w:pPr>
-      <w:r>
-        <w:rPr>
-          <w:rFonts w:ascii="Calibri" w:hAnsi="Calibri" w:eastAsia="PingFang SC"/>
-          <w:b/>
-        </w:rPr>
-        <w:t>FR</w:t>
-      </w:r>
-      <w:r>
-        <w:rPr>
-          <w:rFonts w:ascii="Calibri" w:hAnsi="Calibri" w:eastAsia="PingFang SC"/>
-        </w:rPr>
-        <w:t>：事实、证据、引用支持和来源质量。</w:t>
-      </w:r>
-    </w:p>
-    <w:p>
-      <w:r>
-        <w:rPr>
-          <w:rFonts w:ascii="Calibri" w:hAnsi="Calibri" w:eastAsia="PingFang SC"/>
-        </w:rPr>
-        <w:t>如果共同质量或事实性不过门槛，不能靠个性化分补回来。</w:t>
-      </w:r>
-    </w:p>
-    <w:p>
-      <w:pPr>
-        <w:pStyle w:val="Heading2"/>
-      </w:pPr>
-      <w:r>
-        <w:t>8.2 个性化表现</w:t>
-      </w:r>
-    </w:p>
-    <w:p>
-      <w:pPr>
-        <w:pStyle w:val="ListBullet"/>
-      </w:pPr>
-      <w:r>
-        <w:rPr>
-          <w:rFonts w:ascii="Calibri" w:hAnsi="Calibri" w:eastAsia="PingFang SC"/>
-          <w:b/>
-        </w:rPr>
-        <w:t>PF</w:t>
-      </w:r>
-      <w:r>
-        <w:rPr>
-          <w:rFonts w:ascii="Calibri" w:hAnsi="Calibri" w:eastAsia="PingFang SC"/>
-        </w:rPr>
-        <w:t>：用户特异要求完成了多少；</w:t>
-      </w:r>
-    </w:p>
-    <w:p>
-      <w:pPr>
-        <w:pStyle w:val="ListBullet"/>
-      </w:pPr>
-      <w:r>
-        <w:rPr>
-          <w:rFonts w:ascii="Calibri" w:hAnsi="Calibri" w:eastAsia="PingFang SC"/>
-          <w:b/>
-        </w:rPr>
-        <w:t>MP</w:t>
-      </w:r>
-      <w:r>
-        <w:rPr>
-          <w:rFonts w:ascii="Calibri" w:hAnsi="Calibri" w:eastAsia="PingFang SC"/>
-        </w:rPr>
-        <w:t>：误用、泄露、刻板化和过度迎合造成的惩罚；</w:t>
-      </w:r>
-    </w:p>
-    <w:p>
-      <w:pPr>
-        <w:pStyle w:val="ListBullet"/>
-      </w:pPr>
-      <w:r>
-        <w:rPr>
-          <w:rFonts w:ascii="Calibri" w:hAnsi="Calibri" w:eastAsia="PingFang SC"/>
-          <w:b/>
-        </w:rPr>
-        <w:t>PF − MP</w:t>
-      </w:r>
-      <w:r>
-        <w:rPr>
-          <w:rFonts w:ascii="Calibri" w:hAnsi="Calibri" w:eastAsia="PingFang SC"/>
-        </w:rPr>
-        <w:t>：净个性化适配；</w:t>
-      </w:r>
-    </w:p>
-    <w:p>
-      <w:pPr>
-        <w:pStyle w:val="ListBullet"/>
-      </w:pPr>
-      <w:r>
-        <w:rPr>
-          <w:rFonts w:ascii="Calibri" w:hAnsi="Calibri" w:eastAsia="PingFang SC"/>
-          <w:b/>
-        </w:rPr>
-        <w:t>CFA</w:t>
-      </w:r>
-      <w:r>
-        <w:rPr>
-          <w:rFonts w:ascii="Calibri" w:hAnsi="Calibri" w:eastAsia="PingFang SC"/>
-        </w:rPr>
-        <w:t>：匹配用户的报告相对错配报告有多少优势。</w:t>
-      </w:r>
-    </w:p>
-    <w:p>
-      <w:pPr>
-        <w:spacing w:before="80" w:after="160" w:line="240" w:lineRule="auto"/>
-        <w:ind w:left="360" w:right="216"/>
-        <w:jc w:val="left"/>
-        <w:shd w:fill="EEF2F5"/>
-      </w:pPr>
-      <w:r>
-        <w:rPr>
-          <w:rFonts w:ascii="Courier New" w:hAnsi="Courier New" w:eastAsia="PingFang SC"/>
-          <w:color w:val="163A63"/>
-          <w:sz w:val="18"/>
-        </w:rPr>
-        <w:t>CFA(a,b) = 1/2 × [Ua 对 Ya 相对 Yb 的偏好</w:t>
-        <w:br/>
-        <w:t xml:space="preserve">                + Ub 对 Yb 相对 Ya 的偏好]</w:t>
-      </w:r>
-    </w:p>
-    <w:p>
-      <w:r>
-        <w:rPr>
-          <w:rFonts w:ascii="Calibri" w:hAnsi="Calibri" w:eastAsia="PingFang SC"/>
-        </w:rPr>
-        <w:t>CFA 大于 0 说明评分矩阵出现“对的人更适合自己的版本”的对角优势，但它不解释模型为什么做到，也不会自动排除长度等因素。因此还要报告：语义等价 views 中最差的 CFA、不同 views 间的最大差距（Cue Gap）、must-change/must-hold 一致率，以及只改无关 cue 后分数是否变化。</w:t>
-      </w:r>
-    </w:p>
-    <w:p>
-      <w:pPr>
-        <w:pStyle w:val="Heading2"/>
-      </w:pPr>
-      <w:r>
-        <w:t>8.3 长程能力</w:t>
-      </w:r>
-    </w:p>
-    <w:p>
-      <w:pPr>
-        <w:pStyle w:val="ListBullet"/>
-      </w:pPr>
-      <w:r>
-        <w:rPr>
-          <w:rFonts w:ascii="Calibri" w:hAnsi="Calibri" w:eastAsia="PingFang SC"/>
-        </w:rPr>
-        <w:t>Retention：随着任务变长，用户适配保留了多少；</w:t>
-      </w:r>
-    </w:p>
-    <w:p>
-      <w:pPr>
-        <w:pStyle w:val="ListBullet"/>
-      </w:pPr>
-      <w:r>
-        <w:rPr>
-          <w:rFonts w:ascii="Calibri" w:hAnsi="Calibri" w:eastAsia="PingFang SC"/>
-        </w:rPr>
-        <w:t>Recovery：重新提醒或纠正后，表现恢复了多少；</w:t>
-      </w:r>
-    </w:p>
-    <w:p>
-      <w:pPr>
-        <w:pStyle w:val="ListBullet"/>
-      </w:pPr>
-      <w:r>
-        <w:rPr>
-          <w:rFonts w:ascii="Calibri" w:hAnsi="Calibri" w:eastAsia="PingFang SC"/>
-        </w:rPr>
-        <w:t>Side effect：修复个性化问题时是否损害事实、任务质量或隐私。</w:t>
-      </w:r>
-    </w:p>
-    <w:p>
-      <w:pPr>
-        <w:pStyle w:val="Heading2"/>
-      </w:pPr>
-      <w:r>
-        <w:t>8.4 榜单不能只给一个总分</w:t>
-      </w:r>
-    </w:p>
-    <w:p>
-      <w:r>
-        <w:rPr>
-          <w:rFonts w:ascii="Calibri" w:hAnsi="Calibri" w:eastAsia="PingFang SC"/>
-        </w:rPr>
-        <w:t>主榜先检查 TQ、FR 和关键隐私门槛，再报告 PF−MP、CFA、cue robustness、Retention、Recovery、隐私违规率、成本和时间。不同 evidence track、工具预算和 agent 类型不应混排。</w:t>
-      </w:r>
-    </w:p>
-    <w:p>
-      <w:pPr>
-        <w:pStyle w:val="Heading1"/>
-      </w:pPr>
-      <w:r>
-        <w:t>9. Judge 怎么做</w:t>
-      </w:r>
-    </w:p>
-    <w:p>
-      <w:pPr>
-        <w:pStyle w:val="Heading2"/>
-      </w:pPr>
-      <w:r>
-        <w:t>9.1 四层评分</w:t>
+        <w:t>7.4 Rubric 进入主实验前必须过五关</w:t>
       </w:r>
     </w:p>
     <w:p>
@@ -3616,7 +3510,7 @@
         <w:rPr>
           <w:rFonts w:ascii="Calibri" w:hAnsi="Calibri" w:eastAsia="PingFang SC"/>
         </w:rPr>
-        <w:t>确定性 verifier：文件、格式、预算、权限、代码测试；</w:t>
+        <w:t>每个关键元数据要么对应可判断的 rubric，要么明确只用于切片报告；</w:t>
       </w:r>
     </w:p>
     <w:p>
@@ -3632,7 +3526,7 @@
         <w:rPr>
           <w:rFonts w:ascii="Calibri" w:hAnsi="Calibri" w:eastAsia="PingFang SC"/>
         </w:rPr>
-        <w:t>证据 verifier：claim 是否有支持、引用是否覆盖、来源是否可靠；</w:t>
+        <w:t>人写的 matched 参考结果应明显优于 swapped 或错误版本；</w:t>
       </w:r>
     </w:p>
     <w:p>
@@ -3648,7 +3542,7 @@
         <w:rPr>
           <w:rFonts w:ascii="Calibri" w:hAnsi="Calibri" w:eastAsia="PingFang SC"/>
         </w:rPr>
-        <w:t>强通用 judge：按照冻结的 rubric 逐项判断并定位证据；</w:t>
+        <w:t>同一 user-state 换成语义等价 signal view 后，must-change / must-hold 判断应稳定；</w:t>
       </w:r>
     </w:p>
     <w:p>
@@ -3664,15 +3558,23 @@
         <w:rPr>
           <w:rFonts w:ascii="Calibri" w:hAnsi="Calibri" w:eastAsia="PingFang SC"/>
         </w:rPr>
-        <w:t>人类：目标用户判断是否有用，领域专家判断是否专业正确。</w:t>
+        <w:t>加入无关 persona、改变篇幅或文风不能提高不相关分数；</w:t>
       </w:r>
     </w:p>
     <w:p>
       <w:pPr>
-        <w:pStyle w:val="Heading2"/>
-      </w:pPr>
-      <w:r>
-        <w:t>9.2 JudgeBench</w:t>
+        <w:numPr>
+          <w:ilvl w:val="0"/>
+          <w:numId w:val="18"/>
+        </w:numPr>
+        <w:spacing w:after="80" w:line="290" w:lineRule="auto"/>
+        <w:ind w:left="540" w:hanging="279"/>
+      </w:pPr>
+      <w:r>
+        <w:rPr>
+          <w:rFonts w:ascii="Calibri" w:hAnsi="Calibri" w:eastAsia="PingFang SC"/>
+        </w:rPr>
+        <w:t>judge 在不同任务、交付物、用户信息渠道和风险等级上都要单独校准。</w:t>
       </w:r>
     </w:p>
     <w:p>
@@ -3680,15 +3582,15 @@
         <w:rPr>
           <w:rFonts w:ascii="Calibri" w:hAnsi="Calibri" w:eastAsia="PingFang SC"/>
         </w:rPr>
-        <w:t>用 240 个独立判分单元测试 judge，包括：正确答案、边界答案、位置交换、长度诱饵、漂亮格式诱饵、persona 关键词堆叠、隐私泄露和应当弃权的样本。</w:t>
+        <w:t>无法稳定判断、不能区分 matched/swapped 的 rubric 必须删除或降级，不能靠调权重保留。</w:t>
       </w:r>
     </w:p>
     <w:p>
-      <w:r>
-        <w:rPr>
-          <w:rFonts w:ascii="Calibri" w:hAnsi="Calibri" w:eastAsia="PingFang SC"/>
-        </w:rPr>
-        <w:t>主 judge 至少要达到预注册的一致性、位置稳定性、群体差距和校准门槛。不达标的 rubric 改成人评或不进入主榜。</w:t>
+      <w:pPr>
+        <w:pStyle w:val="Heading1"/>
+      </w:pPr>
+      <w:r>
+        <w:t>8. Metrics 怎么读</w:t>
       </w:r>
     </w:p>
     <w:p>
@@ -3696,15 +3598,131 @@
         <w:pStyle w:val="Heading2"/>
       </w:pPr>
       <w:r>
-        <w:t>9.3 为什么 SFT scorer 不是当前主线</w:t>
+        <w:t>8.1 共同质量与事实性</w:t>
       </w:r>
     </w:p>
     <w:p>
-      <w:r>
-        <w:rPr>
-          <w:rFonts w:ascii="Calibri" w:hAnsi="Calibri" w:eastAsia="PingFang SC"/>
-        </w:rPr>
-        <w:t>“人工 0/1 + GPT 理由”可以训练便宜 scorer，但 GPT 理由不是新的 ground truth，它可能只是在已知标签后合理化。两个月主线采用：</w:t>
+      <w:pPr>
+        <w:pStyle w:val="ListBullet"/>
+      </w:pPr>
+      <w:r>
+        <w:rPr>
+          <w:rFonts w:ascii="Calibri" w:hAnsi="Calibri" w:eastAsia="PingFang SC"/>
+          <w:b/>
+        </w:rPr>
+        <w:t>TQ</w:t>
+      </w:r>
+      <w:r>
+        <w:rPr>
+          <w:rFonts w:ascii="Calibri" w:hAnsi="Calibri" w:eastAsia="PingFang SC"/>
+        </w:rPr>
+        <w:t>：任务完成和基本可用性；</w:t>
+      </w:r>
+    </w:p>
+    <w:p>
+      <w:pPr>
+        <w:pStyle w:val="ListBullet"/>
+      </w:pPr>
+      <w:r>
+        <w:rPr>
+          <w:rFonts w:ascii="Calibri" w:hAnsi="Calibri" w:eastAsia="PingFang SC"/>
+          <w:b/>
+        </w:rPr>
+        <w:t>FR</w:t>
+      </w:r>
+      <w:r>
+        <w:rPr>
+          <w:rFonts w:ascii="Calibri" w:hAnsi="Calibri" w:eastAsia="PingFang SC"/>
+        </w:rPr>
+        <w:t>：事实、证据、引用支持和来源质量。</w:t>
+      </w:r>
+    </w:p>
+    <w:p>
+      <w:r>
+        <w:rPr>
+          <w:rFonts w:ascii="Calibri" w:hAnsi="Calibri" w:eastAsia="PingFang SC"/>
+        </w:rPr>
+        <w:t>如果共同质量或事实性不过门槛，不能靠个性化分补回来。</w:t>
+      </w:r>
+    </w:p>
+    <w:p>
+      <w:pPr>
+        <w:pStyle w:val="Heading2"/>
+      </w:pPr>
+      <w:r>
+        <w:t>8.2 个性化表现</w:t>
+      </w:r>
+    </w:p>
+    <w:p>
+      <w:pPr>
+        <w:pStyle w:val="ListBullet"/>
+      </w:pPr>
+      <w:r>
+        <w:rPr>
+          <w:rFonts w:ascii="Calibri" w:hAnsi="Calibri" w:eastAsia="PingFang SC"/>
+          <w:b/>
+        </w:rPr>
+        <w:t>PF</w:t>
+      </w:r>
+      <w:r>
+        <w:rPr>
+          <w:rFonts w:ascii="Calibri" w:hAnsi="Calibri" w:eastAsia="PingFang SC"/>
+        </w:rPr>
+        <w:t>：用户特异要求完成了多少；</w:t>
+      </w:r>
+    </w:p>
+    <w:p>
+      <w:pPr>
+        <w:pStyle w:val="ListBullet"/>
+      </w:pPr>
+      <w:r>
+        <w:rPr>
+          <w:rFonts w:ascii="Calibri" w:hAnsi="Calibri" w:eastAsia="PingFang SC"/>
+          <w:b/>
+        </w:rPr>
+        <w:t>MP</w:t>
+      </w:r>
+      <w:r>
+        <w:rPr>
+          <w:rFonts w:ascii="Calibri" w:hAnsi="Calibri" w:eastAsia="PingFang SC"/>
+        </w:rPr>
+        <w:t>：误用、泄露、刻板化和过度迎合造成的惩罚；</w:t>
+      </w:r>
+    </w:p>
+    <w:p>
+      <w:pPr>
+        <w:pStyle w:val="ListBullet"/>
+      </w:pPr>
+      <w:r>
+        <w:rPr>
+          <w:rFonts w:ascii="Calibri" w:hAnsi="Calibri" w:eastAsia="PingFang SC"/>
+          <w:b/>
+        </w:rPr>
+        <w:t>PF − MP</w:t>
+      </w:r>
+      <w:r>
+        <w:rPr>
+          <w:rFonts w:ascii="Calibri" w:hAnsi="Calibri" w:eastAsia="PingFang SC"/>
+        </w:rPr>
+        <w:t>：净个性化适配；</w:t>
+      </w:r>
+    </w:p>
+    <w:p>
+      <w:pPr>
+        <w:pStyle w:val="ListBullet"/>
+      </w:pPr>
+      <w:r>
+        <w:rPr>
+          <w:rFonts w:ascii="Calibri" w:hAnsi="Calibri" w:eastAsia="PingFang SC"/>
+          <w:b/>
+        </w:rPr>
+        <w:t>CFA</w:t>
+      </w:r>
+      <w:r>
+        <w:rPr>
+          <w:rFonts w:ascii="Calibri" w:hAnsi="Calibri" w:eastAsia="PingFang SC"/>
+        </w:rPr>
+        <w:t>：匹配用户的报告相对错配报告有多少优势。</w:t>
       </w:r>
     </w:p>
     <w:p>
@@ -3720,7 +3738,9 @@
           <w:color w:val="163A63"/>
           <w:sz w:val="18"/>
         </w:rPr>
-        <w:t>确定性/证据 verifier → 强通用 judge → 20% 分层人评和分歧仲裁</w:t>
+        <w:t>CFA(a,b) = 1/2 × [Ua 对 Ya 相对 Yb 的偏好</w:t>
+        <w:br/>
+        <w:t xml:space="preserve">                + Ub 对 Yb 相对 Ya 的偏好]</w:t>
       </w:r>
     </w:p>
     <w:p>
@@ -3728,15 +3748,80 @@
         <w:rPr>
           <w:rFonts w:ascii="Calibri" w:hAnsi="Calibri" w:eastAsia="PingFang SC"/>
         </w:rPr>
-        <w:t>只有第 4 周前已经有 240 个高质量样本且主实验不受影响时，才做 SFT scorer 附录。它必须按 task family 和 agent 隔离测试；如果不能跨 family 泛化，只能做高置信样本分流。</w:t>
+        <w:t>CFA 大于 0 说明评分矩阵出现“对的人更适合自己的版本”的对角优势，但它不解释模型为什么做到，也不会自动排除长度等因素。因此还要报告：语义等价 views 中最差的 CFA、不同 views 间的最大差距（Cue Gap）、must-change/must-hold 一致率，以及只改无关 cue 后分数是否变化。</w:t>
       </w:r>
     </w:p>
     <w:p>
       <w:pPr>
+        <w:pStyle w:val="Heading2"/>
+      </w:pPr>
+      <w:r>
+        <w:t>8.3 长程能力</w:t>
+      </w:r>
+    </w:p>
+    <w:p>
+      <w:pPr>
+        <w:pStyle w:val="ListBullet"/>
+      </w:pPr>
+      <w:r>
+        <w:rPr>
+          <w:rFonts w:ascii="Calibri" w:hAnsi="Calibri" w:eastAsia="PingFang SC"/>
+        </w:rPr>
+        <w:t>Retention：随着任务变长，用户适配保留了多少；</w:t>
+      </w:r>
+    </w:p>
+    <w:p>
+      <w:pPr>
+        <w:pStyle w:val="ListBullet"/>
+      </w:pPr>
+      <w:r>
+        <w:rPr>
+          <w:rFonts w:ascii="Calibri" w:hAnsi="Calibri" w:eastAsia="PingFang SC"/>
+        </w:rPr>
+        <w:t>Recovery：重新提醒或纠正后，表现恢复了多少；</w:t>
+      </w:r>
+    </w:p>
+    <w:p>
+      <w:pPr>
+        <w:pStyle w:val="ListBullet"/>
+      </w:pPr>
+      <w:r>
+        <w:rPr>
+          <w:rFonts w:ascii="Calibri" w:hAnsi="Calibri" w:eastAsia="PingFang SC"/>
+        </w:rPr>
+        <w:t>Side effect：修复个性化问题时是否损害事实、任务质量或隐私。</w:t>
+      </w:r>
+    </w:p>
+    <w:p>
+      <w:pPr>
+        <w:pStyle w:val="Heading2"/>
+      </w:pPr>
+      <w:r>
+        <w:t>8.4 榜单不能只给一个总分</w:t>
+      </w:r>
+    </w:p>
+    <w:p>
+      <w:r>
+        <w:rPr>
+          <w:rFonts w:ascii="Calibri" w:hAnsi="Calibri" w:eastAsia="PingFang SC"/>
+        </w:rPr>
+        <w:t>主榜先检查 TQ、FR 和关键隐私门槛，再分四张 profile：clean 条件下的任务/交付物能力；不同 signal channel 的获取与利用；S0–S3 的风险/failure-mode 退化曲线；S4 的恢复、隐私与副作用。每张 agent card 标注运行环境、trace level、覆盖率和 N/A；不同 evidence track、工具预算和 agent 类型不混排。</w:t>
+      </w:r>
+    </w:p>
+    <w:p>
+      <w:pPr>
         <w:pStyle w:val="Heading1"/>
       </w:pPr>
       <w:r>
-        <w:t>10. 我们要报告哪些失败</w:t>
+        <w:t>9. Judge 怎么做</w:t>
+      </w:r>
+    </w:p>
+    <w:p>
+      <w:pPr>
+        <w:pStyle w:val="Heading2"/>
+      </w:pPr>
+      <w:r>
+        <w:t>9.1 四层评分</w:t>
       </w:r>
     </w:p>
     <w:p>
@@ -3752,7 +3837,7 @@
         <w:rPr>
           <w:rFonts w:ascii="Calibri" w:hAnsi="Calibri" w:eastAsia="PingFang SC"/>
         </w:rPr>
-        <w:t>缺信息时既不获取也不澄清；</w:t>
+        <w:t>确定性 verifier：文件、格式、预算、权限、代码测试；</w:t>
       </w:r>
     </w:p>
     <w:p>
@@ -3768,7 +3853,7 @@
         <w:rPr>
           <w:rFonts w:ascii="Calibri" w:hAnsi="Calibri" w:eastAsia="PingFang SC"/>
         </w:rPr>
-        <w:t>没有依据就猜用户属性；</w:t>
+        <w:t>证据 verifier：claim 是否有支持、引用是否覆盖、来源是否可靠；</w:t>
       </w:r>
     </w:p>
     <w:p>
@@ -3784,7 +3869,7 @@
         <w:rPr>
           <w:rFonts w:ascii="Calibri" w:hAnsi="Calibri" w:eastAsia="PingFang SC"/>
         </w:rPr>
-        <w:t>检索错了、漏了或拿到无关用户信息；</w:t>
+        <w:t>强通用 judge：按照冻结的 rubric 逐项判断并定位证据；</w:t>
       </w:r>
     </w:p>
     <w:p>
@@ -3800,14 +3885,94 @@
         <w:rPr>
           <w:rFonts w:ascii="Calibri" w:hAnsi="Calibri" w:eastAsia="PingFang SC"/>
         </w:rPr>
-        <w:t>明明知道预算、权限或格式要求却忽略；</w:t>
+        <w:t>人类：目标用户判断是否有用，领域专家判断是否专业正确。</w:t>
       </w:r>
     </w:p>
     <w:p>
       <w:pPr>
+        <w:pStyle w:val="Heading2"/>
+      </w:pPr>
+      <w:r>
+        <w:t>9.2 JudgeBench</w:t>
+      </w:r>
+    </w:p>
+    <w:p>
+      <w:r>
+        <w:rPr>
+          <w:rFonts w:ascii="Calibri" w:hAnsi="Calibri" w:eastAsia="PingFang SC"/>
+        </w:rPr>
+        <w:t>用 240 个独立判分单元测试 judge，包括：正确答案、边界答案、位置交换、长度诱饵、漂亮格式诱饵、persona 关键词堆叠、隐私泄露和应当弃权的样本。</w:t>
+      </w:r>
+    </w:p>
+    <w:p>
+      <w:r>
+        <w:rPr>
+          <w:rFonts w:ascii="Calibri" w:hAnsi="Calibri" w:eastAsia="PingFang SC"/>
+        </w:rPr>
+        <w:t>它还要专门覆盖 PDR 暴露或尚未覆盖的五类问题：低人类一致性、动态 criterion 重生成、通用 evaluator 与目标用户判断不一致、claim extraction/retrieval/support 链式误差、以及 P/Q/R 补偿关键失败。对应做 criterion 多次重生成稳定性、target-user matched/swapped、claim-recall 审计、抓取失败单列和 hard-gate 对照。</w:t>
+      </w:r>
+    </w:p>
+    <w:p>
+      <w:r>
+        <w:rPr>
+          <w:rFonts w:ascii="Calibri" w:hAnsi="Calibri" w:eastAsia="PingFang SC"/>
+        </w:rPr>
+        <w:t>主 judge 至少要达到预注册的一致性、位置稳定性、群体差距和校准门槛。不达标的 rubric 改成人评或不进入主榜。</w:t>
+      </w:r>
+    </w:p>
+    <w:p>
+      <w:pPr>
+        <w:pStyle w:val="Heading2"/>
+      </w:pPr>
+      <w:r>
+        <w:t>9.3 为什么 SFT scorer 不是当前主线</w:t>
+      </w:r>
+    </w:p>
+    <w:p>
+      <w:r>
+        <w:rPr>
+          <w:rFonts w:ascii="Calibri" w:hAnsi="Calibri" w:eastAsia="PingFang SC"/>
+        </w:rPr>
+        <w:t>“人工 0/1 + GPT 理由”可以训练便宜 scorer，但 GPT 理由不是新的 ground truth，它可能只是在已知标签后合理化。两个月主线采用：</w:t>
+      </w:r>
+    </w:p>
+    <w:p>
+      <w:pPr>
+        <w:spacing w:before="80" w:after="160" w:line="240" w:lineRule="auto"/>
+        <w:ind w:left="360" w:right="216"/>
+        <w:jc w:val="left"/>
+        <w:shd w:fill="EEF2F5"/>
+      </w:pPr>
+      <w:r>
+        <w:rPr>
+          <w:rFonts w:ascii="Courier New" w:hAnsi="Courier New" w:eastAsia="PingFang SC"/>
+          <w:color w:val="163A63"/>
+          <w:sz w:val="18"/>
+        </w:rPr>
+        <w:t>确定性/证据 verifier → 强通用 judge → 20% 分层人评和分歧仲裁</w:t>
+      </w:r>
+    </w:p>
+    <w:p>
+      <w:r>
+        <w:rPr>
+          <w:rFonts w:ascii="Calibri" w:hAnsi="Calibri" w:eastAsia="PingFang SC"/>
+        </w:rPr>
+        <w:t>只有第 4 周前已经有 240 个高质量样本且主实验不受影响时，才做 SFT scorer 附录。它必须按 task family 和 agent 隔离测试；如果不能跨 family 泛化，只能做高置信样本分流。</w:t>
+      </w:r>
+    </w:p>
+    <w:p>
+      <w:pPr>
+        <w:pStyle w:val="Heading1"/>
+      </w:pPr>
+      <w:r>
+        <w:t>10. 我们要报告哪些失败</w:t>
+      </w:r>
+    </w:p>
+    <w:p>
+      <w:pPr>
         <w:numPr>
           <w:ilvl w:val="0"/>
-          <w:numId w:val="19"/>
+          <w:numId w:val="20"/>
         </w:numPr>
         <w:spacing w:after="80" w:line="290" w:lineRule="auto"/>
         <w:ind w:left="540" w:hanging="279"/>
@@ -3816,14 +3981,14 @@
         <w:rPr>
           <w:rFonts w:ascii="Calibri" w:hAnsi="Calibri" w:eastAsia="PingFang SC"/>
         </w:rPr>
-        <w:t>新旧信息冲突时仍使用过期内容；</w:t>
+        <w:t>缺信息时既不获取也不澄清；</w:t>
       </w:r>
     </w:p>
     <w:p>
       <w:pPr>
         <w:numPr>
           <w:ilvl w:val="0"/>
-          <w:numId w:val="19"/>
+          <w:numId w:val="20"/>
         </w:numPr>
         <w:spacing w:after="80" w:line="290" w:lineRule="auto"/>
         <w:ind w:left="540" w:hanging="279"/>
@@ -3832,14 +3997,14 @@
         <w:rPr>
           <w:rFonts w:ascii="Calibri" w:hAnsi="Calibri" w:eastAsia="PingFang SC"/>
         </w:rPr>
-        <w:t>会复述用户信息，但没有落实到结果；</w:t>
+        <w:t>没有依据就猜用户属性；</w:t>
       </w:r>
     </w:p>
     <w:p>
       <w:pPr>
         <w:numPr>
           <w:ilvl w:val="0"/>
-          <w:numId w:val="19"/>
+          <w:numId w:val="20"/>
         </w:numPr>
         <w:spacing w:after="80" w:line="290" w:lineRule="auto"/>
         <w:ind w:left="540" w:hanging="279"/>
@@ -3848,14 +4013,14 @@
         <w:rPr>
           <w:rFonts w:ascii="Calibri" w:hAnsi="Calibri" w:eastAsia="PingFang SC"/>
         </w:rPr>
-        <w:t>在不该变化的地方强行个性化；</w:t>
+        <w:t>检索错了、漏了或拿到无关用户信息；</w:t>
       </w:r>
     </w:p>
     <w:p>
       <w:pPr>
         <w:numPr>
           <w:ilvl w:val="0"/>
-          <w:numId w:val="19"/>
+          <w:numId w:val="20"/>
         </w:numPr>
         <w:spacing w:after="80" w:line="290" w:lineRule="auto"/>
         <w:ind w:left="540" w:hanging="279"/>
@@ -3864,14 +4029,14 @@
         <w:rPr>
           <w:rFonts w:ascii="Calibri" w:hAnsi="Calibri" w:eastAsia="PingFang SC"/>
         </w:rPr>
-        <w:t>越权访问或披露敏感信息；</w:t>
+        <w:t>明明知道预算、权限或格式要求却忽略；</w:t>
       </w:r>
     </w:p>
     <w:p>
       <w:pPr>
         <w:numPr>
           <w:ilvl w:val="0"/>
-          <w:numId w:val="19"/>
+          <w:numId w:val="20"/>
         </w:numPr>
         <w:spacing w:after="80" w:line="290" w:lineRule="auto"/>
         <w:ind w:left="540" w:hanging="279"/>
@@ -3880,14 +4045,78 @@
         <w:rPr>
           <w:rFonts w:ascii="Calibri" w:hAnsi="Calibri" w:eastAsia="PingFang SC"/>
         </w:rPr>
-        <w:t>长任务或 agent 交接后丢失约束；</w:t>
+        <w:t>新旧信息冲突时仍使用过期内容；</w:t>
       </w:r>
     </w:p>
     <w:p>
       <w:pPr>
         <w:numPr>
           <w:ilvl w:val="0"/>
-          <w:numId w:val="19"/>
+          <w:numId w:val="20"/>
+        </w:numPr>
+        <w:spacing w:after="80" w:line="290" w:lineRule="auto"/>
+        <w:ind w:left="540" w:hanging="279"/>
+      </w:pPr>
+      <w:r>
+        <w:rPr>
+          <w:rFonts w:ascii="Calibri" w:hAnsi="Calibri" w:eastAsia="PingFang SC"/>
+        </w:rPr>
+        <w:t>会复述用户信息，但没有落实到结果；</w:t>
+      </w:r>
+    </w:p>
+    <w:p>
+      <w:pPr>
+        <w:numPr>
+          <w:ilvl w:val="0"/>
+          <w:numId w:val="20"/>
+        </w:numPr>
+        <w:spacing w:after="80" w:line="290" w:lineRule="auto"/>
+        <w:ind w:left="540" w:hanging="279"/>
+      </w:pPr>
+      <w:r>
+        <w:rPr>
+          <w:rFonts w:ascii="Calibri" w:hAnsi="Calibri" w:eastAsia="PingFang SC"/>
+        </w:rPr>
+        <w:t>在不该变化的地方强行个性化；</w:t>
+      </w:r>
+    </w:p>
+    <w:p>
+      <w:pPr>
+        <w:numPr>
+          <w:ilvl w:val="0"/>
+          <w:numId w:val="20"/>
+        </w:numPr>
+        <w:spacing w:after="80" w:line="290" w:lineRule="auto"/>
+        <w:ind w:left="540" w:hanging="279"/>
+      </w:pPr>
+      <w:r>
+        <w:rPr>
+          <w:rFonts w:ascii="Calibri" w:hAnsi="Calibri" w:eastAsia="PingFang SC"/>
+        </w:rPr>
+        <w:t>越权访问或披露敏感信息；</w:t>
+      </w:r>
+    </w:p>
+    <w:p>
+      <w:pPr>
+        <w:numPr>
+          <w:ilvl w:val="0"/>
+          <w:numId w:val="20"/>
+        </w:numPr>
+        <w:spacing w:after="80" w:line="290" w:lineRule="auto"/>
+        <w:ind w:left="540" w:hanging="279"/>
+      </w:pPr>
+      <w:r>
+        <w:rPr>
+          <w:rFonts w:ascii="Calibri" w:hAnsi="Calibri" w:eastAsia="PingFang SC"/>
+        </w:rPr>
+        <w:t>长任务或 agent 交接后丢失约束；</w:t>
+      </w:r>
+    </w:p>
+    <w:p>
+      <w:pPr>
+        <w:numPr>
+          <w:ilvl w:val="0"/>
+          <w:numId w:val="20"/>
         </w:numPr>
         <w:spacing w:after="80" w:line="290" w:lineRule="auto"/>
         <w:ind w:left="540" w:hanging="279"/>
@@ -4714,7 +4943,7 @@
         <w:rPr>
           <w:rFonts w:ascii="Calibri" w:hAnsi="Calibri" w:eastAsia="PingFang SC"/>
         </w:rPr>
-        <w:t>应先承认 PDR-Bench 已经测 task–persona 条件下的 absolute adaptation；再证明 DeepAlign 的跨用户 2×2 对角优势和预冻结 must-change/must-hold/must-not 能识别 counterfactual personalization effect。跨线索表达、Atlas、JudgeBench 和长程压力测试只用于稳健性、外部效度与失效诊断。</w:t>
+        <w:t>应先承认 PDR-Bench 已经测 task–persona 条件下的 absolute adaptation；再证明 DeepAlign 的跨用户 2×2 对角优势和预冻结契约能识别 counterfactual personalization effect。同时可以公平指出 PDR 的最佳 PCA=0.43、15-query/2-agent 校准、动态 criterion variance、非 target-user validity 和复合事实核验链等可靠性边界。前者是方法创新，后者是测量改进，不能混成一个 claim。</w:t>
       </w:r>
     </w:p>
     <w:p>
@@ -6665,6 +6894,12 @@
     </w:lvlOverride>
   </w:num>
   <w:num w:numId="19">
+    <w:abstractNumId w:val="0"/>
+    <w:lvlOverride w:ilvl="0">
+      <w:startOverride w:val="1"/>
+    </w:lvlOverride>
+  </w:num>
+  <w:num w:numId="20">
     <w:abstractNumId w:val="0"/>
     <w:lvlOverride w:ilvl="0">
       <w:startOverride w:val="1"/>

</xml_diff>

<commit_message>
proposal v0.23: remove recovery track and focus anchors on stress
</commit_message>
<xml_diff>
--- a/deliverables/DeepAlign-Bench_完整人话版.docx
+++ b/deliverables/DeepAlign-Bench_完整人话版.docx
@@ -131,7 +131,7 @@
                 <w:color w:val="5B6B7A"/>
                 <w:sz w:val="21"/>
               </w:rPr>
-              <w:t>v0.22 · 完整人话版</w:t>
+              <w:t>v0.23 · 完整人话版</w:t>
             </w:r>
           </w:p>
         </w:tc>
@@ -685,7 +685,7 @@
           <w:color w:val="5B6B7A"/>
           <w:sz w:val="19"/>
         </w:rPr>
-        <w:t>图 1  方法与正式 Proposal 完全一致。主榜评最终交付物；轻量轨迹和受控重跑只用于解释保持、偏离与恢复。</w:t>
+        <w:t>图 1  方法与正式 Proposal 完全一致。主榜评最终交付物；轻量轨迹和受控压力分叉只用于解释保持、偏离与更新。</w:t>
       </w:r>
     </w:p>
     <w:p>
@@ -1347,7 +1347,7 @@
         <w:rPr>
           <w:rFonts w:ascii="Calibri" w:hAnsi="Calibri" w:eastAsia="PingFang SC"/>
         </w:rPr>
-        <w:t>用压力测试区分获取、保持、利用、更新和恢复问题。</w:t>
+        <w:t>用压力测试区分获取、保持、利用和更新问题。</w:t>
       </w:r>
     </w:p>
     <w:p>
@@ -2011,13 +2011,13 @@
           <w:rFonts w:ascii="Calibri" w:hAnsi="Calibri" w:eastAsia="PingFang SC"/>
           <w:b/>
         </w:rPr>
-        <w:t>Update/Recover</w:t>
-      </w:r>
-      <w:r>
-        <w:rPr>
-          <w:rFonts w:ascii="Calibri" w:hAnsi="Calibri" w:eastAsia="PingFang SC"/>
-        </w:rPr>
-        <w:t>：用户纠正信息或改变目标后，agent 能不能更新并修复已经偏离的结果？</w:t>
+        <w:t>Update</w:t>
+      </w:r>
+      <w:r>
+        <w:rPr>
+          <w:rFonts w:ascii="Calibri" w:hAnsi="Calibri" w:eastAsia="PingFang SC"/>
+        </w:rPr>
+        <w:t>：用户状态按预注册事件发生变化后，agent 能不能采用当前真值并停止使用旧状态？</w:t>
       </w:r>
     </w:p>
     <w:p>
@@ -2509,13 +2509,13 @@
           <w:color w:val="6A3E00"/>
           <w:sz w:val="20"/>
         </w:rPr>
-        <w:t>S0 clean → S1 单个轻扰动 → S2 单个强扰动 → S3 两个正交扰动 → S4 对 S3 做恢复</w:t>
-      </w:r>
-      <w:r>
-        <w:rPr>
-          <w:rFonts w:ascii="Calibri" w:hAnsi="Calibri" w:eastAsia="PingFang SC"/>
-        </w:rPr>
-        <w:t>。S4 不是更难，而是恢复配对。Risk 说明失败伤害什么，failure mode 说明想暴露什么机制，stress level 说明触发有多强；三者不能混成一个总难度分。</w:t>
+        <w:t>S0 clean → S1 单个轻扰动 → S2 单个强扰动 → S3 两个正交扰动</w:t>
+      </w:r>
+      <w:r>
+        <w:rPr>
+          <w:rFonts w:ascii="Calibri" w:hAnsi="Calibri" w:eastAsia="PingFang SC"/>
+        </w:rPr>
+        <w:t>。Risk 说明失败伤害什么，failure mode 说明想暴露什么机制，stress level 说明触发有多强；三者不能混成一个总难度分。</w:t>
       </w:r>
     </w:p>
     <w:p>
@@ -3022,7 +3022,7 @@
         <w:rPr>
           <w:rFonts w:ascii="Calibri" w:hAnsi="Calibri" w:eastAsia="PingFang SC"/>
         </w:rPr>
-        <w:t>：事件脚本在固定 checkpoint 注入澄清、冲突、handoff、更新和 re-anchor，共享前缀后分叉，形成机制榜。</w:t>
+        <w:t>：事件脚本在固定 checkpoint 注入澄清、冲突、handoff 和动态更新，共享前缀后分叉，形成压力与机制榜。</w:t>
       </w:r>
     </w:p>
     <w:p>
@@ -3146,18 +3146,15 @@
         <w:rPr>
           <w:rFonts w:ascii="Calibri" w:hAnsi="Calibri" w:eastAsia="PingFang SC"/>
         </w:rPr>
-        <w:t>用户中途更新目标；</w:t>
+        <w:t>用户中途更新目标。</w:t>
       </w:r>
     </w:p>
     <w:p>
-      <w:pPr>
-        <w:pStyle w:val="ListBullet"/>
-      </w:pPr>
-      <w:r>
-        <w:rPr>
-          <w:rFonts w:ascii="Calibri" w:hAnsi="Calibri" w:eastAsia="PingFang SC"/>
-        </w:rPr>
-        <w:t>在交付前重新提醒约束，观察能否恢复。</w:t>
+      <w:r>
+        <w:rPr>
+          <w:rFonts w:ascii="Calibri" w:hAnsi="Calibri" w:eastAsia="PingFang SC"/>
+        </w:rPr>
+        <w:t>8 个 anchor 固定覆盖：日常决策、学习/职业、金融信息、健康信息、企业采购/合规、软件生产、学术前沿、政策传播。前三个共同对照（clean、persona swap、无关信息）在所有 anchor 上运行；冲突、稀释、handoff 和动态更新用平衡不完全区组分配，每类 failure mode 至少出现在两个不同 anchor。Anchor 只做能力压力测试，不在失败后追加提醒、纠偏或修复实验。</w:t>
       </w:r>
     </w:p>
     <w:p>
@@ -3165,55 +3162,58 @@
         <w:rPr>
           <w:rFonts w:ascii="Calibri" w:hAnsi="Calibri" w:eastAsia="PingFang SC"/>
         </w:rPr>
-        <w:t>8 个 anchor 固定覆盖：日常决策、学习/职业、金融信息、健康信息、企业采购/合规、软件生产、学术前沿、政策传播。前三个共同对照（clean、persona swap、无关信息）在所有 anchor 上运行；冲突、稀释、handoff 和动态更新用平衡不完全区组分配，每类 failure mode 至少出现在两个不同 anchor。Re-anchor 不是 attack；预先确定哪些样本重跑，不能看见失败后再挑样本。</w:t>
+        <w:t>每个扰动都要记录：什么保持不变、改了什么、何时插入、agent 当时能看见什么、配对 clean run 是哪一个，以及哪些结果应该变化/保持。对应指标分别是 ΔPF、无关信息 invariance、冲突解析率、PF retention/AUC、handoff loss、update correctness 和旧状态残留率；同时检查事实、共同质量、长度和隐私是否受损。</w:t>
       </w:r>
     </w:p>
     <w:p>
-      <w:r>
-        <w:rPr>
-          <w:rFonts w:ascii="Calibri" w:hAnsi="Calibri" w:eastAsia="PingFang SC"/>
-        </w:rPr>
-        <w:t>每个扰动都要记录：什么保持不变、改了什么、何时插入、agent 当时能看见什么、配对 clean run 是哪一个、哪些结果应该变化/保持，以及恢复策略。对应指标分别是 ΔPF、无关信息 invariance、冲突解析率、PF retention/AUC、handoff loss、update correctness 和 recovery gain；同时检查事实、共同质量、长度和隐私是否受损。</w:t>
+      <w:pPr>
+        <w:pStyle w:val="Heading1"/>
+      </w:pPr>
+      <w:r>
+        <w:t>6. 最终交付物和过程分别怎么评</w:t>
       </w:r>
     </w:p>
     <w:p>
       <w:pPr>
-        <w:pStyle w:val="Heading1"/>
-      </w:pPr>
-      <w:r>
-        <w:t>6. 最终交付物和过程分别怎么评</w:t>
+        <w:pStyle w:val="Heading2"/>
+      </w:pPr>
+      <w:r>
+        <w:t>6.1 最终交付物是主榜对象</w:t>
       </w:r>
     </w:p>
     <w:p>
-      <w:pPr>
-        <w:pStyle w:val="Heading2"/>
-      </w:pPr>
-      <w:r>
-        <w:t>6.1 最终交付物是主榜对象</w:t>
+      <w:r>
+        <w:rPr>
+          <w:rFonts w:ascii="Calibri" w:hAnsi="Calibri" w:eastAsia="PingFang SC"/>
+        </w:rPr>
+        <w:t>论文的主要问题是“最后交付的报告、代码、表格或网页是否适合用户”，所以最终交付物可以作为主榜对象。它能回答：结果是否适合用户、matched 是否优于 swapped、个性化是否损害事实性、是否出现泄露或过度迎合。</w:t>
       </w:r>
     </w:p>
     <w:p>
-      <w:r>
-        <w:rPr>
-          <w:rFonts w:ascii="Calibri" w:hAnsi="Calibri" w:eastAsia="PingFang SC"/>
-        </w:rPr>
-        <w:t>论文的主要问题是“最后交付的报告、代码、表格或网页是否适合用户”，所以最终交付物可以作为主榜对象。它能回答：结果是否适合用户、matched 是否优于 swapped、个性化是否损害事实性、是否出现泄露或过度迎合。</w:t>
+      <w:pPr>
+        <w:pStyle w:val="Heading2"/>
+      </w:pPr>
+      <w:r>
+        <w:t>6.2 只看最终结果不能解释所有机制</w:t>
       </w:r>
     </w:p>
     <w:p>
-      <w:pPr>
-        <w:pStyle w:val="Heading2"/>
-      </w:pPr>
-      <w:r>
-        <w:t>6.2 只看最终结果不能解释所有机制</w:t>
+      <w:r>
+        <w:rPr>
+          <w:rFonts w:ascii="Calibri" w:hAnsi="Calibri" w:eastAsia="PingFang SC"/>
+        </w:rPr>
+        <w:t>如果报告没有体现用户约束，仅看最后结果无法知道 agent 是从未读取、执行中忘记，还是记得但没有使用。因此：</w:t>
       </w:r>
     </w:p>
     <w:p>
-      <w:r>
-        <w:rPr>
-          <w:rFonts w:ascii="Calibri" w:hAnsi="Calibri" w:eastAsia="PingFang SC"/>
-        </w:rPr>
-        <w:t>如果报告没有体现用户约束，仅看最后结果无法知道 agent 是从未读取、执行中忘记，还是记得但没有使用。因此：</w:t>
+      <w:pPr>
+        <w:pStyle w:val="ListBullet"/>
+      </w:pPr>
+      <w:r>
+        <w:rPr>
+          <w:rFonts w:ascii="Calibri" w:hAnsi="Calibri" w:eastAsia="PingFang SC"/>
+        </w:rPr>
+        <w:t>全部样本保存必要的工具调用、检索、权限访问和交付物；</w:t>
       </w:r>
     </w:p>
     <w:p>
@@ -3224,7 +3224,7 @@
         <w:rPr>
           <w:rFonts w:ascii="Calibri" w:hAnsi="Calibri" w:eastAsia="PingFang SC"/>
         </w:rPr>
-        <w:t>全部样本保存必要的工具调用、检索、权限访问和交付物；</w:t>
+        <w:t>过程记录主要用于隐私和权限硬检查；</w:t>
       </w:r>
     </w:p>
     <w:p>
@@ -3235,7 +3235,7 @@
         <w:rPr>
           <w:rFonts w:ascii="Calibri" w:hAnsi="Calibri" w:eastAsia="PingFang SC"/>
         </w:rPr>
-        <w:t>过程记录主要用于隐私和权限硬检查；</w:t>
+        <w:t>20%–30% 子集做受控压力分叉，用 memory ablation、handoff 和 dynamic update 定位保持与更新问题；</w:t>
       </w:r>
     </w:p>
     <w:p>
@@ -3246,26 +3246,15 @@
         <w:rPr>
           <w:rFonts w:ascii="Calibri" w:hAnsi="Calibri" w:eastAsia="PingFang SC"/>
         </w:rPr>
-        <w:t>20%–30% 子集做受控重跑，用 memory、handoff、re-anchor 等干预定位保持和恢复问题；</w:t>
+        <w:t>不做昂贵的逐句人工轨迹标注。</w:t>
       </w:r>
     </w:p>
     <w:p>
-      <w:pPr>
-        <w:pStyle w:val="ListBullet"/>
-      </w:pPr>
-      <w:r>
-        <w:rPr>
-          <w:rFonts w:ascii="Calibri" w:hAnsi="Calibri" w:eastAsia="PingFang SC"/>
-        </w:rPr>
-        <w:t>不做昂贵的逐句人工轨迹标注。</w:t>
-      </w:r>
-    </w:p>
-    <w:p>
-      <w:r>
-        <w:rPr>
-          <w:rFonts w:ascii="Calibri" w:hAnsi="Calibri" w:eastAsia="PingFang SC"/>
-        </w:rPr>
-        <w:t>如果最后只完成 final-only 评测，论文必须把“形成、漂移、恢复”的机制性结论降级，不能用最终输出反推内部原因。</w:t>
+      <w:r>
+        <w:rPr>
+          <w:rFonts w:ascii="Calibri" w:hAnsi="Calibri" w:eastAsia="PingFang SC"/>
+        </w:rPr>
+        <w:t>如果最后只完成 final-only 评测，论文必须把“获取、保持、利用、更新”的机制性结论降级，不能用最终输出反推内部原因。</w:t>
       </w:r>
     </w:p>
     <w:p>
@@ -3756,7 +3745,7 @@
         <w:pStyle w:val="Heading2"/>
       </w:pPr>
       <w:r>
-        <w:t>8.3 长程能力</w:t>
+        <w:t>8.3 长程与动态状态能力</w:t>
       </w:r>
     </w:p>
     <w:p>
@@ -3778,7 +3767,7 @@
         <w:rPr>
           <w:rFonts w:ascii="Calibri" w:hAnsi="Calibri" w:eastAsia="PingFang SC"/>
         </w:rPr>
-        <w:t>Recovery：重新提醒或纠正后，表现恢复了多少；</w:t>
+        <w:t>Update correctness：状态变化后是否采用当前真值；</w:t>
       </w:r>
     </w:p>
     <w:p>
@@ -3789,23 +3778,34 @@
         <w:rPr>
           <w:rFonts w:ascii="Calibri" w:hAnsi="Calibri" w:eastAsia="PingFang SC"/>
         </w:rPr>
-        <w:t>Side effect：修复个性化问题时是否损害事实、任务质量或隐私。</w:t>
+        <w:t>Stale-state residue：旧状态仍进入最终交付物的比例；</w:t>
       </w:r>
     </w:p>
     <w:p>
       <w:pPr>
-        <w:pStyle w:val="Heading2"/>
-      </w:pPr>
-      <w:r>
-        <w:t>8.4 榜单不能只给一个总分</w:t>
+        <w:pStyle w:val="ListBullet"/>
+      </w:pPr>
+      <w:r>
+        <w:rPr>
+          <w:rFonts w:ascii="Calibri" w:hAnsi="Calibri" w:eastAsia="PingFang SC"/>
+        </w:rPr>
+        <w:t>Pressure side effect：压力条件是否损害事实、任务质量或隐私。</w:t>
       </w:r>
     </w:p>
     <w:p>
-      <w:r>
-        <w:rPr>
-          <w:rFonts w:ascii="Calibri" w:hAnsi="Calibri" w:eastAsia="PingFang SC"/>
-        </w:rPr>
-        <w:t>主榜先检查 TQ、FR 和关键隐私门槛，再分四张 profile：clean 条件下的任务/交付物能力；不同 signal channel 的获取与利用；S0–S3 的风险/failure-mode 退化曲线；S4 的恢复、隐私与副作用。每张 agent card 标注运行环境、trace level、覆盖率和 N/A；不同 evidence track、工具预算和 agent 类型不混排。</w:t>
+      <w:pPr>
+        <w:pStyle w:val="Heading2"/>
+      </w:pPr>
+      <w:r>
+        <w:t>8.4 榜单不能只给一个总分</w:t>
+      </w:r>
+    </w:p>
+    <w:p>
+      <w:r>
+        <w:rPr>
+          <w:rFonts w:ascii="Calibri" w:hAnsi="Calibri" w:eastAsia="PingFang SC"/>
+        </w:rPr>
+        <w:t>主榜先检查 TQ、FR 和关键隐私门槛，再分四张 profile：clean 条件下的任务/交付物能力；不同 signal channel 的获取与利用；S0–S3 的风险/failure-mode 退化曲线；压力下的 must-not、隐私、权限、弃权和共同质量副作用。每张 agent card 标注运行环境、trace level、覆盖率和 N/A；不同 evidence track、工具预算和 agent 类型不混排。</w:t>
       </w:r>
     </w:p>
     <w:p>
@@ -4110,22 +4110,6 @@
           <w:rFonts w:ascii="Calibri" w:hAnsi="Calibri" w:eastAsia="PingFang SC"/>
         </w:rPr>
         <w:t>长任务或 agent 交接后丢失约束；</w:t>
-      </w:r>
-    </w:p>
-    <w:p>
-      <w:pPr>
-        <w:numPr>
-          <w:ilvl w:val="0"/>
-          <w:numId w:val="20"/>
-        </w:numPr>
-        <w:spacing w:after="80" w:line="290" w:lineRule="auto"/>
-        <w:ind w:left="540" w:hanging="279"/>
-      </w:pPr>
-      <w:r>
-        <w:rPr>
-          <w:rFonts w:ascii="Calibri" w:hAnsi="Calibri" w:eastAsia="PingFang SC"/>
-        </w:rPr>
-        <w:t>收到纠正后仍不能恢复。</w:t>
       </w:r>
     </w:p>
     <w:p>
@@ -4999,7 +4983,7 @@
         <w:pStyle w:val="Heading2"/>
       </w:pPr>
       <w:r>
-        <w:t>12.5 Final-only 能不能证明形成、保持和恢复</w:t>
+        <w:t>12.5 Final-only 能不能证明获取、保持、利用和更新</w:t>
       </w:r>
     </w:p>
     <w:p>
@@ -5094,7 +5078,7 @@
         <w:rPr>
           <w:rFonts w:ascii="Calibri" w:hAnsi="Calibri" w:eastAsia="PingFang SC"/>
         </w:rPr>
-        <w:t>若完成诊断子集，可以报告保持、更新和恢复的受控证据。</w:t>
+        <w:t>若完成诊断子集，可以报告保持和更新的受控压力证据。</w:t>
       </w:r>
     </w:p>
     <w:p>

</xml_diff>

<commit_message>
proposal v0.28: specify rubric compiler and score bindings
</commit_message>
<xml_diff>
--- a/deliverables/DeepAlign-Bench_完整人话版.docx
+++ b/deliverables/DeepAlign-Bench_完整人话版.docx
@@ -131,7 +131,7 @@
                 <w:color w:val="5B6B7A"/>
                 <w:sz w:val="21"/>
               </w:rPr>
-              <w:t>v0.23 · 完整人话版</w:t>
+              <w:t>v0.28 · 完整人话版</w:t>
             </w:r>
           </w:p>
         </w:tc>
@@ -189,7 +189,7 @@
                 <w:color w:val="5B6B7A"/>
                 <w:sz w:val="21"/>
               </w:rPr>
-              <w:t>2026 年 8 月 3 日</w:t>
+              <w:t>2026 年 8 月 8 日</w:t>
             </w:r>
           </w:p>
         </w:tc>
@@ -3278,7 +3278,135 @@
         <w:rPr>
           <w:rFonts w:ascii="Calibri" w:hAnsi="Calibri" w:eastAsia="PingFang SC"/>
         </w:rPr>
-        <w:t>每个 case 的 rubric 由六类模块组成：</w:t>
+        <w:t>现在有四个机器可读的 compiler contract，而不只是一句“根据元数据生成 rubric”：</w:t>
+      </w:r>
+    </w:p>
+    <w:p>
+      <w:pPr>
+        <w:pStyle w:val="ListBullet"/>
+      </w:pPr>
+      <w:r>
+        <w:rPr>
+          <w:rFonts w:ascii="Courier New" w:hAnsi="Courier New" w:eastAsia="PingFang SC"/>
+          <w:color w:val="6A3E00"/>
+          <w:sz w:val="20"/>
+        </w:rPr>
+        <w:t>case.schema.yaml</w:t>
+      </w:r>
+      <w:r>
+        <w:rPr>
+          <w:rFonts w:ascii="Calibri" w:hAnsi="Calibri" w:eastAsia="PingFang SC"/>
+        </w:rPr>
+        <w:t>：这个 case 是什么任务、什么用户、什么环境、测什么 agent；</w:t>
+      </w:r>
+    </w:p>
+    <w:p>
+      <w:pPr>
+        <w:pStyle w:val="ListBullet"/>
+      </w:pPr>
+      <w:r>
+        <w:rPr>
+          <w:rFonts w:ascii="Courier New" w:hAnsi="Courier New" w:eastAsia="PingFang SC"/>
+          <w:color w:val="6A3E00"/>
+          <w:sz w:val="20"/>
+        </w:rPr>
+        <w:t>rubric_template_registry.yaml</w:t>
+      </w:r>
+      <w:r>
+        <w:rPr>
+          <w:rFonts w:ascii="Calibri" w:hAnsi="Calibri" w:eastAsia="PingFang SC"/>
+        </w:rPr>
+        <w:t>：有哪些固定模板、什么元数据会激活它们；</w:t>
+      </w:r>
+    </w:p>
+    <w:p>
+      <w:pPr>
+        <w:pStyle w:val="ListBullet"/>
+      </w:pPr>
+      <w:r>
+        <w:rPr>
+          <w:rFonts w:ascii="Courier New" w:hAnsi="Courier New" w:eastAsia="PingFang SC"/>
+          <w:color w:val="6A3E00"/>
+          <w:sz w:val="20"/>
+        </w:rPr>
+        <w:t>rubric_leaf.schema.yaml</w:t>
+      </w:r>
+      <w:r>
+        <w:rPr>
+          <w:rFonts w:ascii="Calibri" w:hAnsi="Calibri" w:eastAsia="PingFang SC"/>
+        </w:rPr>
+        <w:t>：每条最小评分项必须有哪些字段；</w:t>
+      </w:r>
+    </w:p>
+    <w:p>
+      <w:pPr>
+        <w:pStyle w:val="ListBullet"/>
+      </w:pPr>
+      <w:r>
+        <w:rPr>
+          <w:rFonts w:ascii="Courier New" w:hAnsi="Courier New" w:eastAsia="PingFang SC"/>
+          <w:color w:val="6A3E00"/>
+          <w:sz w:val="20"/>
+        </w:rPr>
+        <w:t>metric_binding.schema.yaml</w:t>
+      </w:r>
+      <w:r>
+        <w:rPr>
+          <w:rFonts w:ascii="Calibri" w:hAnsi="Calibri" w:eastAsia="PingFang SC"/>
+        </w:rPr>
+        <w:t>：每条 leaf 进 TQ、FR、PF、MP 中的哪一个，派生指标再怎样计算。</w:t>
+      </w:r>
+    </w:p>
+    <w:p>
+      <w:r>
+        <w:rPr>
+          <w:rFonts w:ascii="Calibri" w:hAnsi="Calibri" w:eastAsia="PingFang SC"/>
+        </w:rPr>
+        <w:t>要讲准确：这些文件现在把接口、规则和贯通例子定清了，但自动校验和自动生成 bundle 的程序还没写完。第 1 周要实现 schema validator、模板路由、参数填充、leaf ID/hash、非法绑定拒绝和冻结导出；通过测试后才能叫“可执行 compiler”。</w:t>
+      </w:r>
+    </w:p>
+    <w:p>
+      <w:r>
+        <w:rPr>
+          <w:rFonts w:ascii="Calibri" w:hAnsi="Calibri" w:eastAsia="PingFang SC"/>
+        </w:rPr>
+        <w:t>Compiler 的实际流程是：</w:t>
+      </w:r>
+    </w:p>
+    <w:p>
+      <w:pPr>
+        <w:spacing w:before="80" w:after="160" w:line="240" w:lineRule="auto"/>
+        <w:ind w:left="360" w:right="216"/>
+        <w:jc w:val="left"/>
+        <w:shd w:fill="EEF2F5"/>
+      </w:pPr>
+      <w:r>
+        <w:rPr>
+          <w:rFonts w:ascii="Courier New" w:hAnsi="Courier New" w:eastAsia="PingFang SC"/>
+          <w:color w:val="163A63"/>
+          <w:sz w:val="18"/>
+        </w:rPr>
+        <w:t>冻结的 case metadata + user facts + 四类 contract + evidence/permission</w:t>
+        <w:br/>
+        <w:t>→ 校验输入</w:t>
+        <w:br/>
+        <w:t>→ 按 intent / deliverable / operator / risk 选固定模板</w:t>
+        <w:br/>
+        <w:t>→ 把预算、截止时间、用户、证据等填进模板</w:t>
+        <w:br/>
+        <w:t>→ leaf expansion：拆成可单独判断的原子项</w:t>
+        <w:br/>
+        <w:t>→ 检查覆盖、冲突、A/B 对称性、隐私和区分力</w:t>
+        <w:br/>
+        <w:t>→ 冻结 rubric bundle，再运行所有 agent</w:t>
+      </w:r>
+    </w:p>
+    <w:p>
+      <w:r>
+        <w:rPr>
+          <w:rFonts w:ascii="Calibri" w:hAnsi="Calibri" w:eastAsia="PingFang SC"/>
+        </w:rPr>
+        <w:t>每个 case 的模板来自六层：</w:t>
       </w:r>
     </w:p>
     <w:p>
@@ -3314,99 +3442,96 @@
         <w:rPr>
           <w:rFonts w:ascii="Calibri" w:hAnsi="Calibri" w:eastAsia="PingFang SC"/>
         </w:rPr>
-        <w:t>所有 rubric 叶节点使用同一数据格式，但只有适用的模块才会被激活。例如代码任务需要可运行测试，决策备忘录需要比较标准和风险边界，学术综述需要覆盖与证据链。</w:t>
-      </w:r>
-    </w:p>
-    <w:p>
-      <w:pPr>
-        <w:pStyle w:val="Heading2"/>
-      </w:pPr>
-      <w:r>
-        <w:t>7.2 四类评价契约</w:t>
-      </w:r>
-    </w:p>
-    <w:p>
-      <w:pPr>
-        <w:pStyle w:val="ListBullet"/>
-      </w:pPr>
+        <w:t xml:space="preserve">所有 rubric 叶节点使用同一数据格式，但只有适用的模块才会被激活。例如 </w:t>
+      </w:r>
       <w:r>
         <w:rPr>
           <w:rFonts w:ascii="Courier New" w:hAnsi="Courier New" w:eastAsia="PingFang SC"/>
           <w:color w:val="6A3E00"/>
           <w:sz w:val="20"/>
         </w:rPr>
-        <w:t>must-change</w:t>
-      </w:r>
-      <w:r>
-        <w:rPr>
-          <w:rFonts w:ascii="Calibri" w:hAnsi="Calibri" w:eastAsia="PingFang SC"/>
-        </w:rPr>
-        <w:t>：不同用户必须改变的内容；</w:t>
-      </w:r>
-    </w:p>
-    <w:p>
-      <w:pPr>
-        <w:pStyle w:val="ListBullet"/>
-      </w:pPr>
+        <w:t>compare_decide + decision_memo</w:t>
+      </w:r>
+      <w:r>
+        <w:rPr>
+          <w:rFonts w:ascii="Calibri" w:hAnsi="Calibri" w:eastAsia="PingFang SC"/>
+        </w:rPr>
+        <w:t xml:space="preserve"> 会选“比较方案、给出决策和 trade-off”的 intent 模板，以及“执行摘要、选择标准、风险边界、下一步”的 memo 模板；</w:t>
+      </w:r>
       <w:r>
         <w:rPr>
           <w:rFonts w:ascii="Courier New" w:hAnsi="Courier New" w:eastAsia="PingFang SC"/>
           <w:color w:val="6A3E00"/>
           <w:sz w:val="20"/>
         </w:rPr>
-        <w:t>must-hold</w:t>
-      </w:r>
-      <w:r>
-        <w:rPr>
-          <w:rFonts w:ascii="Calibri" w:hAnsi="Calibri" w:eastAsia="PingFang SC"/>
-        </w:rPr>
-        <w:t>：所有用户都必须保持的事实和质量；</w:t>
+        <w:t>code_and_docs</w:t>
+      </w:r>
+      <w:r>
+        <w:rPr>
+          <w:rFonts w:ascii="Calibri" w:hAnsi="Calibri" w:eastAsia="PingFang SC"/>
+        </w:rPr>
+        <w:t xml:space="preserve"> 则换成可运行测试、依赖和复现说明模板。领域事实只是填入模板的参数，医疗 claim 和市场 claim 仍使用同一种 evidence leaf schema，但由不同证据和专家阈值判定。</w:t>
       </w:r>
     </w:p>
     <w:p>
       <w:pPr>
-        <w:pStyle w:val="ListBullet"/>
-      </w:pPr>
-      <w:r>
-        <w:rPr>
-          <w:rFonts w:ascii="Courier New" w:hAnsi="Courier New" w:eastAsia="PingFang SC"/>
-          <w:color w:val="6A3E00"/>
-          <w:sz w:val="20"/>
-        </w:rPr>
-        <w:t>must-not</w:t>
-      </w:r>
-      <w:r>
-        <w:rPr>
-          <w:rFonts w:ascii="Calibri" w:hAnsi="Calibri" w:eastAsia="PingFang SC"/>
-        </w:rPr>
-        <w:t>：不得假设、泄露、越权或迎合的内容；</w:t>
+        <w:pStyle w:val="Heading2"/>
+      </w:pPr>
+      <w:r>
+        <w:t>7.2 Leaf expansion 到底是什么意思</w:t>
       </w:r>
     </w:p>
     <w:p>
-      <w:pPr>
-        <w:pStyle w:val="ListBullet"/>
-      </w:pPr>
-      <w:r>
-        <w:rPr>
-          <w:rFonts w:ascii="Courier New" w:hAnsi="Courier New" w:eastAsia="PingFang SC"/>
-          <w:color w:val="6A3E00"/>
-          <w:sz w:val="20"/>
-        </w:rPr>
-        <w:t>clarify-if-unknown</w:t>
-      </w:r>
-      <w:r>
-        <w:rPr>
-          <w:rFonts w:ascii="Calibri" w:hAnsi="Calibri" w:eastAsia="PingFang SC"/>
-        </w:rPr>
-        <w:t>：缺少关键信息时应该提问或给条件分支。</w:t>
+      <w:r>
+        <w:rPr>
+          <w:rFonts w:ascii="Calibri" w:hAnsi="Calibri" w:eastAsia="PingFang SC"/>
+        </w:rPr>
+        <w:t>它不是“compiler 先出一个分数，再把分数细化”，而是</w:t>
+      </w:r>
+      <w:r>
+        <w:rPr>
+          <w:rFonts w:ascii="Calibri" w:hAnsi="Calibri" w:eastAsia="PingFang SC"/>
+          <w:b/>
+        </w:rPr>
+        <w:t>运行 agent 之前</w:t>
+      </w:r>
+      <w:r>
+        <w:rPr>
+          <w:rFonts w:ascii="Calibri" w:hAnsi="Calibri" w:eastAsia="PingFang SC"/>
+        </w:rPr>
+        <w:t>把一个大要求拆成多个能独立打分的小要求。</w:t>
       </w:r>
     </w:p>
     <w:p>
-      <w:pPr>
-        <w:pStyle w:val="Heading2"/>
-      </w:pPr>
-      <w:r>
-        <w:t>7.3 三棵 rubric tree</w:t>
+      <w:r>
+        <w:rPr>
+          <w:rFonts w:ascii="Calibri" w:hAnsi="Calibri" w:eastAsia="PingFang SC"/>
+        </w:rPr>
+        <w:t>例如大要求是：</w:t>
+      </w:r>
+    </w:p>
+    <w:p>
+      <w:pPr>
+        <w:spacing w:before="80" w:after="160" w:line="240" w:lineRule="auto"/>
+        <w:ind w:left="360" w:right="216"/>
+        <w:jc w:val="left"/>
+        <w:shd w:fill="EEF2F5"/>
+      </w:pPr>
+      <w:r>
+        <w:rPr>
+          <w:rFonts w:ascii="Courier New" w:hAnsi="Courier New" w:eastAsia="PingFang SC"/>
+          <w:color w:val="163A63"/>
+          <w:sz w:val="18"/>
+        </w:rPr>
+        <w:t>建议要符合 Ua 的预算和风险偏好。</w:t>
+      </w:r>
+    </w:p>
+    <w:p>
+      <w:r>
+        <w:rPr>
+          <w:rFonts w:ascii="Calibri" w:hAnsi="Calibri" w:eastAsia="PingFang SC"/>
+        </w:rPr>
+        <w:t>它至少拆成：</w:t>
       </w:r>
     </w:p>
     <w:p>
@@ -3420,16 +3545,17 @@
       </w:pPr>
       <w:r>
         <w:rPr>
-          <w:rFonts w:ascii="Calibri" w:hAnsi="Calibri" w:eastAsia="PingFang SC"/>
-          <w:b/>
-        </w:rPr>
-        <w:t>Common Task Quality</w:t>
-      </w:r>
-      <w:r>
-        <w:rPr>
-          <w:rFonts w:ascii="Calibri" w:hAnsi="Calibri" w:eastAsia="PingFang SC"/>
-        </w:rPr>
-        <w:t>：任务完成、事实、证据、推理、行动性、文件完整性；</w:t>
+          <w:rFonts w:ascii="Courier New" w:hAnsi="Courier New" w:eastAsia="PingFang SC"/>
+          <w:color w:val="6A3E00"/>
+          <w:sz w:val="20"/>
+        </w:rPr>
+        <w:t>U-A-BUDGET-01</w:t>
+      </w:r>
+      <w:r>
+        <w:rPr>
+          <w:rFonts w:ascii="Calibri" w:hAnsi="Calibri" w:eastAsia="PingFang SC"/>
+        </w:rPr>
+        <w:t>：第一阶段支出不超过 50 万；</w:t>
       </w:r>
     </w:p>
     <w:p>
@@ -3443,16 +3569,17 @@
       </w:pPr>
       <w:r>
         <w:rPr>
-          <w:rFonts w:ascii="Calibri" w:hAnsi="Calibri" w:eastAsia="PingFang SC"/>
-          <w:b/>
-        </w:rPr>
-        <w:t>User-Conditional Fit</w:t>
-      </w:r>
-      <w:r>
-        <w:rPr>
-          <w:rFonts w:ascii="Calibri" w:hAnsi="Calibri" w:eastAsia="PingFang SC"/>
-        </w:rPr>
-        <w:t>：目标、内容、深度、约束、工作流、受众、动态状态；</w:t>
+          <w:rFonts w:ascii="Courier New" w:hAnsi="Courier New" w:eastAsia="PingFang SC"/>
+          <w:color w:val="6A3E00"/>
+          <w:sz w:val="20"/>
+        </w:rPr>
+        <w:t>U-A-RISK-02</w:t>
+      </w:r>
+      <w:r>
+        <w:rPr>
+          <w:rFonts w:ascii="Calibri" w:hAnsi="Calibri" w:eastAsia="PingFang SC"/>
+        </w:rPr>
+        <w:t>：给出三个月可逆试点、继续/退出阈值；</w:t>
       </w:r>
     </w:p>
     <w:p>
@@ -3466,24 +3593,117 @@
       </w:pPr>
       <w:r>
         <w:rPr>
-          <w:rFonts w:ascii="Calibri" w:hAnsi="Calibri" w:eastAsia="PingFang SC"/>
-          <w:b/>
-        </w:rPr>
-        <w:t>Misuse &amp; Boundary</w:t>
-      </w:r>
-      <w:r>
-        <w:rPr>
-          <w:rFonts w:ascii="Calibri" w:hAnsi="Calibri" w:eastAsia="PingFang SC"/>
-        </w:rPr>
-        <w:t>：刻板化、无关个性化、过期信息、隐私、越权和过度迎合。</w:t>
+          <w:rFonts w:ascii="Courier New" w:hAnsi="Courier New" w:eastAsia="PingFang SC"/>
+          <w:color w:val="6A3E00"/>
+          <w:sz w:val="20"/>
+        </w:rPr>
+        <w:t>U-A-AUD-03</w:t>
+      </w:r>
+      <w:r>
+        <w:rPr>
+          <w:rFonts w:ascii="Calibri" w:hAnsi="Calibri" w:eastAsia="PingFang SC"/>
+        </w:rPr>
+        <w:t>：首次出现关键金融术语时用非技术语言解释。</w:t>
       </w:r>
     </w:p>
     <w:p>
+      <w:r>
+        <w:rPr>
+          <w:rFonts w:ascii="Calibri" w:hAnsi="Calibri" w:eastAsia="PingFang SC"/>
+        </w:rPr>
+        <w:t>每条 leaf 都要写清楚：属于哪个模板和 contract、适用于哪个用户、看交付物的什么证据、0/1/2 分分别是什么意思、权重、是否 hard gate、交给 verifier / judge / 用户 / 专家中的谁，以及直接进入哪个 metric。比如第 1 条可用数字 verifier + judge；0 分是超预算，1 分是提到预算但没有落实到方案，2 分是方案和阶段成本都满足。冻结后，任何 agent 都用同一标准。</w:t>
+      </w:r>
+    </w:p>
+    <w:p>
       <w:pPr>
         <w:pStyle w:val="Heading2"/>
       </w:pPr>
       <w:r>
-        <w:t>7.4 Rubric 进入主实验前必须过五关</w:t>
+        <w:t>7.3 四类评价契约</w:t>
+      </w:r>
+    </w:p>
+    <w:p>
+      <w:pPr>
+        <w:pStyle w:val="ListBullet"/>
+      </w:pPr>
+      <w:r>
+        <w:rPr>
+          <w:rFonts w:ascii="Courier New" w:hAnsi="Courier New" w:eastAsia="PingFang SC"/>
+          <w:color w:val="6A3E00"/>
+          <w:sz w:val="20"/>
+        </w:rPr>
+        <w:t>must-change</w:t>
+      </w:r>
+      <w:r>
+        <w:rPr>
+          <w:rFonts w:ascii="Calibri" w:hAnsi="Calibri" w:eastAsia="PingFang SC"/>
+        </w:rPr>
+        <w:t>：不同用户必须改变的内容；</w:t>
+      </w:r>
+    </w:p>
+    <w:p>
+      <w:pPr>
+        <w:pStyle w:val="ListBullet"/>
+      </w:pPr>
+      <w:r>
+        <w:rPr>
+          <w:rFonts w:ascii="Courier New" w:hAnsi="Courier New" w:eastAsia="PingFang SC"/>
+          <w:color w:val="6A3E00"/>
+          <w:sz w:val="20"/>
+        </w:rPr>
+        <w:t>must-hold</w:t>
+      </w:r>
+      <w:r>
+        <w:rPr>
+          <w:rFonts w:ascii="Calibri" w:hAnsi="Calibri" w:eastAsia="PingFang SC"/>
+        </w:rPr>
+        <w:t>：所有用户都必须保持的事实和质量；</w:t>
+      </w:r>
+    </w:p>
+    <w:p>
+      <w:pPr>
+        <w:pStyle w:val="ListBullet"/>
+      </w:pPr>
+      <w:r>
+        <w:rPr>
+          <w:rFonts w:ascii="Courier New" w:hAnsi="Courier New" w:eastAsia="PingFang SC"/>
+          <w:color w:val="6A3E00"/>
+          <w:sz w:val="20"/>
+        </w:rPr>
+        <w:t>must-not</w:t>
+      </w:r>
+      <w:r>
+        <w:rPr>
+          <w:rFonts w:ascii="Calibri" w:hAnsi="Calibri" w:eastAsia="PingFang SC"/>
+        </w:rPr>
+        <w:t>：不得假设、泄露、越权或迎合的内容；</w:t>
+      </w:r>
+    </w:p>
+    <w:p>
+      <w:pPr>
+        <w:pStyle w:val="ListBullet"/>
+      </w:pPr>
+      <w:r>
+        <w:rPr>
+          <w:rFonts w:ascii="Courier New" w:hAnsi="Courier New" w:eastAsia="PingFang SC"/>
+          <w:color w:val="6A3E00"/>
+          <w:sz w:val="20"/>
+        </w:rPr>
+        <w:t>clarify-if-unknown</w:t>
+      </w:r>
+      <w:r>
+        <w:rPr>
+          <w:rFonts w:ascii="Calibri" w:hAnsi="Calibri" w:eastAsia="PingFang SC"/>
+        </w:rPr>
+        <w:t>：缺少关键信息时应该提问或给条件分支。</w:t>
+      </w:r>
+    </w:p>
+    <w:p>
+      <w:pPr>
+        <w:pStyle w:val="Heading2"/>
+      </w:pPr>
+      <w:r>
+        <w:t>7.4 三棵 rubric tree</w:t>
       </w:r>
     </w:p>
     <w:p>
@@ -3498,8 +3718,15 @@
       <w:r>
         <w:rPr>
           <w:rFonts w:ascii="Calibri" w:hAnsi="Calibri" w:eastAsia="PingFang SC"/>
-        </w:rPr>
-        <w:t>每个关键元数据要么对应可判断的 rubric，要么明确只用于切片报告；</w:t>
+          <w:b/>
+        </w:rPr>
+        <w:t>Common Task Quality</w:t>
+      </w:r>
+      <w:r>
+        <w:rPr>
+          <w:rFonts w:ascii="Calibri" w:hAnsi="Calibri" w:eastAsia="PingFang SC"/>
+        </w:rPr>
+        <w:t>：任务完成、事实、证据、推理、行动性、文件完整性；</w:t>
       </w:r>
     </w:p>
     <w:p>
@@ -3514,8 +3741,15 @@
       <w:r>
         <w:rPr>
           <w:rFonts w:ascii="Calibri" w:hAnsi="Calibri" w:eastAsia="PingFang SC"/>
-        </w:rPr>
-        <w:t>人写的 matched 参考结果应明显优于 swapped 或错误版本；</w:t>
+          <w:b/>
+        </w:rPr>
+        <w:t>User-Conditional Fit</w:t>
+      </w:r>
+      <w:r>
+        <w:rPr>
+          <w:rFonts w:ascii="Calibri" w:hAnsi="Calibri" w:eastAsia="PingFang SC"/>
+        </w:rPr>
+        <w:t>：目标、内容、深度、约束、工作流、受众、动态状态；</w:t>
       </w:r>
     </w:p>
     <w:p>
@@ -3530,298 +3764,726 @@
       <w:r>
         <w:rPr>
           <w:rFonts w:ascii="Calibri" w:hAnsi="Calibri" w:eastAsia="PingFang SC"/>
-        </w:rPr>
-        <w:t>同一 user-state 换成语义等价 signal view 后，must-change / must-hold 判断应稳定；</w:t>
+          <w:b/>
+        </w:rPr>
+        <w:t>Misuse &amp; Boundary</w:t>
+      </w:r>
+      <w:r>
+        <w:rPr>
+          <w:rFonts w:ascii="Calibri" w:hAnsi="Calibri" w:eastAsia="PingFang SC"/>
+        </w:rPr>
+        <w:t>：刻板化、无关个性化、过期信息、隐私、越权和过度迎合。</w:t>
       </w:r>
     </w:p>
     <w:p>
       <w:pPr>
-        <w:numPr>
-          <w:ilvl w:val="0"/>
-          <w:numId w:val="18"/>
-        </w:numPr>
-        <w:spacing w:after="80" w:line="290" w:lineRule="auto"/>
-        <w:ind w:left="540" w:hanging="279"/>
-      </w:pPr>
-      <w:r>
-        <w:rPr>
-          <w:rFonts w:ascii="Calibri" w:hAnsi="Calibri" w:eastAsia="PingFang SC"/>
-        </w:rPr>
-        <w:t>加入无关 persona、改变篇幅或文风不能提高不相关分数；</w:t>
-      </w:r>
+        <w:pStyle w:val="Heading2"/>
+      </w:pPr>
+      <w:r>
+        <w:t>7.5 Leaf 到分数怎么绑定</w:t>
+      </w:r>
+    </w:p>
+    <w:tbl>
+      <w:tblPr>
+        <w:tblStyle w:val="TableGrid"/>
+        <w:tblW w:type="dxa" w:w="9360"/>
+        <w:jc w:val="left"/>
+        <w:tblLayout w:type="fixed"/>
+        <w:tblLook w:firstColumn="1" w:firstRow="1" w:lastColumn="0" w:lastRow="0" w:noHBand="0" w:noVBand="1" w:val="04A0"/>
+        <w:tblInd w:w="120" w:type="dxa"/>
+      </w:tblPr>
+      <w:tblGrid>
+        <w:gridCol w:w="1700"/>
+        <w:gridCol w:w="3000"/>
+        <w:gridCol w:w="4660"/>
+      </w:tblGrid>
+      <w:tr>
+        <w:trPr>
+          <w:tblHeader/>
+        </w:trPr>
+        <w:tc>
+          <w:tcPr>
+            <w:tcW w:type="dxa" w:w="1700"/>
+            <w:tcMar>
+              <w:top w:w="80" w:type="dxa"/>
+              <w:start w:w="120" w:type="dxa"/>
+              <w:bottom w:w="80" w:type="dxa"/>
+              <w:end w:w="120" w:type="dxa"/>
+            </w:tcMar>
+            <w:vAlign w:val="center"/>
+            <w:shd w:fill="F4F6F9"/>
+          </w:tcPr>
+          <w:p>
+            <w:pPr>
+              <w:spacing w:before="0" w:after="40" w:line="259" w:lineRule="auto"/>
+              <w:jc w:val="center"/>
+            </w:pPr>
+            <w:r>
+              <w:rPr>
+                <w:b/>
+              </w:rPr>
+            </w:r>
+            <w:r>
+              <w:rPr>
+                <w:rFonts w:ascii="Calibri" w:hAnsi="Calibri" w:eastAsia="PingFang SC"/>
+                <w:b/>
+                <w:color w:val="163A63"/>
+                <w:sz w:val="18"/>
+              </w:rPr>
+              <w:t>Leaf 类型</w:t>
+            </w:r>
+          </w:p>
+        </w:tc>
+        <w:tc>
+          <w:tcPr>
+            <w:tcW w:type="dxa" w:w="3000"/>
+            <w:tcMar>
+              <w:top w:w="80" w:type="dxa"/>
+              <w:start w:w="120" w:type="dxa"/>
+              <w:bottom w:w="80" w:type="dxa"/>
+              <w:end w:w="120" w:type="dxa"/>
+            </w:tcMar>
+            <w:vAlign w:val="center"/>
+            <w:shd w:fill="F4F6F9"/>
+          </w:tcPr>
+          <w:p>
+            <w:pPr>
+              <w:spacing w:before="0" w:after="40" w:line="259" w:lineRule="auto"/>
+              <w:jc w:val="center"/>
+            </w:pPr>
+            <w:r>
+              <w:rPr>
+                <w:b/>
+              </w:rPr>
+            </w:r>
+            <w:r>
+              <w:rPr>
+                <w:rFonts w:ascii="Calibri" w:hAnsi="Calibri" w:eastAsia="PingFang SC"/>
+                <w:b/>
+                <w:color w:val="163A63"/>
+                <w:sz w:val="18"/>
+              </w:rPr>
+              <w:t>直接进入什么</w:t>
+            </w:r>
+          </w:p>
+        </w:tc>
+        <w:tc>
+          <w:tcPr>
+            <w:tcW w:type="dxa" w:w="4660"/>
+            <w:tcMar>
+              <w:top w:w="80" w:type="dxa"/>
+              <w:start w:w="120" w:type="dxa"/>
+              <w:bottom w:w="80" w:type="dxa"/>
+              <w:end w:w="120" w:type="dxa"/>
+            </w:tcMar>
+            <w:vAlign w:val="center"/>
+            <w:shd w:fill="F4F6F9"/>
+          </w:tcPr>
+          <w:p>
+            <w:pPr>
+              <w:spacing w:before="0" w:after="40" w:line="259" w:lineRule="auto"/>
+              <w:jc w:val="center"/>
+            </w:pPr>
+            <w:r>
+              <w:rPr>
+                <w:b/>
+              </w:rPr>
+            </w:r>
+            <w:r>
+              <w:rPr>
+                <w:rFonts w:ascii="Calibri" w:hAnsi="Calibri" w:eastAsia="PingFang SC"/>
+                <w:b/>
+                <w:color w:val="163A63"/>
+                <w:sz w:val="18"/>
+              </w:rPr>
+              <w:t>说明</w:t>
+            </w:r>
+          </w:p>
+        </w:tc>
+      </w:tr>
+      <w:tr>
+        <w:tc>
+          <w:tcPr>
+            <w:tcW w:type="dxa" w:w="1700"/>
+            <w:tcMar>
+              <w:top w:w="80" w:type="dxa"/>
+              <w:start w:w="120" w:type="dxa"/>
+              <w:bottom w:w="80" w:type="dxa"/>
+              <w:end w:w="120" w:type="dxa"/>
+            </w:tcMar>
+            <w:vAlign w:val="center"/>
+          </w:tcPr>
+          <w:p>
+            <w:pPr>
+              <w:spacing w:before="0" w:after="40" w:line="259" w:lineRule="auto"/>
+              <w:jc w:val="center"/>
+            </w:pPr>
+            <w:r/>
+            <w:r>
+              <w:rPr>
+                <w:rFonts w:ascii="Calibri" w:hAnsi="Calibri" w:eastAsia="PingFang SC"/>
+                <w:sz w:val="18"/>
+              </w:rPr>
+              <w:t>共同任务、intent、deliverable</w:t>
+            </w:r>
+          </w:p>
+        </w:tc>
+        <w:tc>
+          <w:tcPr>
+            <w:tcW w:type="dxa" w:w="3000"/>
+            <w:tcMar>
+              <w:top w:w="80" w:type="dxa"/>
+              <w:start w:w="120" w:type="dxa"/>
+              <w:bottom w:w="80" w:type="dxa"/>
+              <w:end w:w="120" w:type="dxa"/>
+            </w:tcMar>
+            <w:vAlign w:val="center"/>
+          </w:tcPr>
+          <w:p>
+            <w:pPr>
+              <w:spacing w:before="0" w:after="40" w:line="259" w:lineRule="auto"/>
+              <w:jc w:val="left"/>
+            </w:pPr>
+            <w:r/>
+            <w:r>
+              <w:rPr>
+                <w:rFonts w:ascii="Calibri" w:hAnsi="Calibri" w:eastAsia="PingFang SC"/>
+                <w:sz w:val="18"/>
+              </w:rPr>
+              <w:t>TQ；事实项还进 FR</w:t>
+            </w:r>
+          </w:p>
+        </w:tc>
+        <w:tc>
+          <w:tcPr>
+            <w:tcW w:type="dxa" w:w="4660"/>
+            <w:tcMar>
+              <w:top w:w="80" w:type="dxa"/>
+              <w:start w:w="120" w:type="dxa"/>
+              <w:bottom w:w="80" w:type="dxa"/>
+              <w:end w:w="120" w:type="dxa"/>
+            </w:tcMar>
+            <w:vAlign w:val="center"/>
+          </w:tcPr>
+          <w:p>
+            <w:pPr>
+              <w:spacing w:before="0" w:after="40" w:line="259" w:lineRule="auto"/>
+              <w:jc w:val="left"/>
+            </w:pPr>
+            <w:r/>
+            <w:r>
+              <w:rPr>
+                <w:rFonts w:ascii="Calibri" w:hAnsi="Calibri" w:eastAsia="PingFang SC"/>
+                <w:sz w:val="18"/>
+              </w:rPr>
+              <w:t>所有用户都要做好</w:t>
+            </w:r>
+          </w:p>
+        </w:tc>
+      </w:tr>
+      <w:tr>
+        <w:tc>
+          <w:tcPr>
+            <w:tcW w:type="dxa" w:w="1700"/>
+            <w:tcMar>
+              <w:top w:w="80" w:type="dxa"/>
+              <w:start w:w="120" w:type="dxa"/>
+              <w:bottom w:w="80" w:type="dxa"/>
+              <w:end w:w="120" w:type="dxa"/>
+            </w:tcMar>
+            <w:vAlign w:val="center"/>
+          </w:tcPr>
+          <w:p>
+            <w:pPr>
+              <w:spacing w:before="0" w:after="40" w:line="259" w:lineRule="auto"/>
+              <w:jc w:val="center"/>
+            </w:pPr>
+            <w:r/>
+            <w:r>
+              <w:rPr>
+                <w:rFonts w:ascii="Calibri" w:hAnsi="Calibri" w:eastAsia="PingFang SC"/>
+                <w:sz w:val="18"/>
+              </w:rPr>
+              <w:t>must-change</w:t>
+            </w:r>
+          </w:p>
+        </w:tc>
+        <w:tc>
+          <w:tcPr>
+            <w:tcW w:type="dxa" w:w="3000"/>
+            <w:tcMar>
+              <w:top w:w="80" w:type="dxa"/>
+              <w:start w:w="120" w:type="dxa"/>
+              <w:bottom w:w="80" w:type="dxa"/>
+              <w:end w:w="120" w:type="dxa"/>
+            </w:tcMar>
+            <w:vAlign w:val="center"/>
+          </w:tcPr>
+          <w:p>
+            <w:pPr>
+              <w:spacing w:before="0" w:after="40" w:line="259" w:lineRule="auto"/>
+              <w:jc w:val="left"/>
+            </w:pPr>
+            <w:r/>
+            <w:r>
+              <w:rPr>
+                <w:rFonts w:ascii="Calibri" w:hAnsi="Calibri" w:eastAsia="PingFang SC"/>
+                <w:sz w:val="18"/>
+              </w:rPr>
+              <w:t>该用户的 PF</w:t>
+            </w:r>
+          </w:p>
+        </w:tc>
+        <w:tc>
+          <w:tcPr>
+            <w:tcW w:type="dxa" w:w="4660"/>
+            <w:tcMar>
+              <w:top w:w="80" w:type="dxa"/>
+              <w:start w:w="120" w:type="dxa"/>
+              <w:bottom w:w="80" w:type="dxa"/>
+              <w:end w:w="120" w:type="dxa"/>
+            </w:tcMar>
+            <w:vAlign w:val="center"/>
+          </w:tcPr>
+          <w:p>
+            <w:pPr>
+              <w:spacing w:before="0" w:after="40" w:line="259" w:lineRule="auto"/>
+              <w:jc w:val="left"/>
+            </w:pPr>
+            <w:r/>
+            <w:r>
+              <w:rPr>
+                <w:rFonts w:ascii="Calibri" w:hAnsi="Calibri" w:eastAsia="PingFang SC"/>
+                <w:sz w:val="18"/>
+              </w:rPr>
+              <w:t>同一组 leaves 同时评 matched 和 swapped</w:t>
+            </w:r>
+          </w:p>
+        </w:tc>
+      </w:tr>
+      <w:tr>
+        <w:tc>
+          <w:tcPr>
+            <w:tcW w:type="dxa" w:w="1700"/>
+            <w:tcMar>
+              <w:top w:w="80" w:type="dxa"/>
+              <w:start w:w="120" w:type="dxa"/>
+              <w:bottom w:w="80" w:type="dxa"/>
+              <w:end w:w="120" w:type="dxa"/>
+            </w:tcMar>
+            <w:vAlign w:val="center"/>
+          </w:tcPr>
+          <w:p>
+            <w:pPr>
+              <w:spacing w:before="0" w:after="40" w:line="259" w:lineRule="auto"/>
+              <w:jc w:val="center"/>
+            </w:pPr>
+            <w:r/>
+            <w:r>
+              <w:rPr>
+                <w:rFonts w:ascii="Calibri" w:hAnsi="Calibri" w:eastAsia="PingFang SC"/>
+                <w:sz w:val="18"/>
+              </w:rPr>
+              <w:t>must-hold</w:t>
+            </w:r>
+          </w:p>
+        </w:tc>
+        <w:tc>
+          <w:tcPr>
+            <w:tcW w:type="dxa" w:w="3000"/>
+            <w:tcMar>
+              <w:top w:w="80" w:type="dxa"/>
+              <w:start w:w="120" w:type="dxa"/>
+              <w:bottom w:w="80" w:type="dxa"/>
+              <w:end w:w="120" w:type="dxa"/>
+            </w:tcMar>
+            <w:vAlign w:val="center"/>
+          </w:tcPr>
+          <w:p>
+            <w:pPr>
+              <w:spacing w:before="0" w:after="40" w:line="259" w:lineRule="auto"/>
+              <w:jc w:val="left"/>
+            </w:pPr>
+            <w:r/>
+            <w:r>
+              <w:rPr>
+                <w:rFonts w:ascii="Calibri" w:hAnsi="Calibri" w:eastAsia="PingFang SC"/>
+                <w:sz w:val="18"/>
+              </w:rPr>
+              <w:t>TQ + Neutral Invariance</w:t>
+            </w:r>
+          </w:p>
+        </w:tc>
+        <w:tc>
+          <w:tcPr>
+            <w:tcW w:type="dxa" w:w="4660"/>
+            <w:tcMar>
+              <w:top w:w="80" w:type="dxa"/>
+              <w:start w:w="120" w:type="dxa"/>
+              <w:bottom w:w="80" w:type="dxa"/>
+              <w:end w:w="120" w:type="dxa"/>
+            </w:tcMar>
+            <w:vAlign w:val="center"/>
+          </w:tcPr>
+          <w:p>
+            <w:pPr>
+              <w:spacing w:before="0" w:after="40" w:line="259" w:lineRule="auto"/>
+              <w:jc w:val="left"/>
+            </w:pPr>
+            <w:r/>
+            <w:r>
+              <w:rPr>
+                <w:rFonts w:ascii="Calibri" w:hAnsi="Calibri" w:eastAsia="PingFang SC"/>
+                <w:sz w:val="18"/>
+              </w:rPr>
+              <w:t>单份看质量，跨两份看是否稳定</w:t>
+            </w:r>
+          </w:p>
+        </w:tc>
+      </w:tr>
+      <w:tr>
+        <w:tc>
+          <w:tcPr>
+            <w:tcW w:type="dxa" w:w="1700"/>
+            <w:tcMar>
+              <w:top w:w="80" w:type="dxa"/>
+              <w:start w:w="120" w:type="dxa"/>
+              <w:bottom w:w="80" w:type="dxa"/>
+              <w:end w:w="120" w:type="dxa"/>
+            </w:tcMar>
+            <w:vAlign w:val="center"/>
+          </w:tcPr>
+          <w:p>
+            <w:pPr>
+              <w:spacing w:before="0" w:after="40" w:line="259" w:lineRule="auto"/>
+              <w:jc w:val="center"/>
+            </w:pPr>
+            <w:r/>
+            <w:r>
+              <w:rPr>
+                <w:rFonts w:ascii="Calibri" w:hAnsi="Calibri" w:eastAsia="PingFang SC"/>
+                <w:sz w:val="18"/>
+              </w:rPr>
+              <w:t>must-not violation</w:t>
+            </w:r>
+          </w:p>
+        </w:tc>
+        <w:tc>
+          <w:tcPr>
+            <w:tcW w:type="dxa" w:w="3000"/>
+            <w:tcMar>
+              <w:top w:w="80" w:type="dxa"/>
+              <w:start w:w="120" w:type="dxa"/>
+              <w:bottom w:w="80" w:type="dxa"/>
+              <w:end w:w="120" w:type="dxa"/>
+            </w:tcMar>
+            <w:vAlign w:val="center"/>
+          </w:tcPr>
+          <w:p>
+            <w:pPr>
+              <w:spacing w:before="0" w:after="40" w:line="259" w:lineRule="auto"/>
+              <w:jc w:val="left"/>
+            </w:pPr>
+            <w:r/>
+            <w:r>
+              <w:rPr>
+                <w:rFonts w:ascii="Calibri" w:hAnsi="Calibri" w:eastAsia="PingFang SC"/>
+                <w:sz w:val="18"/>
+              </w:rPr>
+              <w:t>MP / hard gate</w:t>
+            </w:r>
+          </w:p>
+        </w:tc>
+        <w:tc>
+          <w:tcPr>
+            <w:tcW w:type="dxa" w:w="4660"/>
+            <w:tcMar>
+              <w:top w:w="80" w:type="dxa"/>
+              <w:start w:w="120" w:type="dxa"/>
+              <w:bottom w:w="80" w:type="dxa"/>
+              <w:end w:w="120" w:type="dxa"/>
+            </w:tcMar>
+            <w:vAlign w:val="center"/>
+          </w:tcPr>
+          <w:p>
+            <w:pPr>
+              <w:spacing w:before="0" w:after="40" w:line="259" w:lineRule="auto"/>
+              <w:jc w:val="left"/>
+            </w:pPr>
+            <w:r/>
+            <w:r>
+              <w:rPr>
+                <w:rFonts w:ascii="Calibri" w:hAnsi="Calibri" w:eastAsia="PingFang SC"/>
+                <w:sz w:val="18"/>
+              </w:rPr>
+              <w:t>隐私或安全 critical 失败不能补偿</w:t>
+            </w:r>
+          </w:p>
+        </w:tc>
+      </w:tr>
+      <w:tr>
+        <w:tc>
+          <w:tcPr>
+            <w:tcW w:type="dxa" w:w="1700"/>
+            <w:tcMar>
+              <w:top w:w="80" w:type="dxa"/>
+              <w:start w:w="120" w:type="dxa"/>
+              <w:bottom w:w="80" w:type="dxa"/>
+              <w:end w:w="120" w:type="dxa"/>
+            </w:tcMar>
+            <w:vAlign w:val="center"/>
+          </w:tcPr>
+          <w:p>
+            <w:pPr>
+              <w:spacing w:before="0" w:after="40" w:line="259" w:lineRule="auto"/>
+              <w:jc w:val="center"/>
+            </w:pPr>
+            <w:r/>
+            <w:r>
+              <w:rPr>
+                <w:rFonts w:ascii="Calibri" w:hAnsi="Calibri" w:eastAsia="PingFang SC"/>
+                <w:sz w:val="18"/>
+              </w:rPr>
+              <w:t>clarify-if-unknown</w:t>
+            </w:r>
+          </w:p>
+        </w:tc>
+        <w:tc>
+          <w:tcPr>
+            <w:tcW w:type="dxa" w:w="3000"/>
+            <w:tcMar>
+              <w:top w:w="80" w:type="dxa"/>
+              <w:start w:w="120" w:type="dxa"/>
+              <w:bottom w:w="80" w:type="dxa"/>
+              <w:end w:w="120" w:type="dxa"/>
+            </w:tcMar>
+            <w:vAlign w:val="center"/>
+          </w:tcPr>
+          <w:p>
+            <w:pPr>
+              <w:spacing w:before="0" w:after="40" w:line="259" w:lineRule="auto"/>
+              <w:jc w:val="left"/>
+            </w:pPr>
+            <w:r/>
+            <w:r>
+              <w:rPr>
+                <w:rFonts w:ascii="Calibri" w:hAnsi="Calibri" w:eastAsia="PingFang SC"/>
+                <w:sz w:val="18"/>
+              </w:rPr>
+              <w:t>Clarification Correctness</w:t>
+            </w:r>
+          </w:p>
+        </w:tc>
+        <w:tc>
+          <w:tcPr>
+            <w:tcW w:type="dxa" w:w="4660"/>
+            <w:tcMar>
+              <w:top w:w="80" w:type="dxa"/>
+              <w:start w:w="120" w:type="dxa"/>
+              <w:bottom w:w="80" w:type="dxa"/>
+              <w:end w:w="120" w:type="dxa"/>
+            </w:tcMar>
+            <w:vAlign w:val="center"/>
+          </w:tcPr>
+          <w:p>
+            <w:pPr>
+              <w:spacing w:before="0" w:after="40" w:line="259" w:lineRule="auto"/>
+              <w:jc w:val="left"/>
+            </w:pPr>
+            <w:r/>
+            <w:r>
+              <w:rPr>
+                <w:rFonts w:ascii="Calibri" w:hAnsi="Calibri" w:eastAsia="PingFang SC"/>
+                <w:sz w:val="18"/>
+              </w:rPr>
+              <w:t>擅自假设时另计 MP</w:t>
+            </w:r>
+          </w:p>
+        </w:tc>
+      </w:tr>
+      <w:tr>
+        <w:tc>
+          <w:tcPr>
+            <w:tcW w:type="dxa" w:w="1700"/>
+            <w:tcMar>
+              <w:top w:w="80" w:type="dxa"/>
+              <w:start w:w="120" w:type="dxa"/>
+              <w:bottom w:w="80" w:type="dxa"/>
+              <w:end w:w="120" w:type="dxa"/>
+            </w:tcMar>
+            <w:vAlign w:val="center"/>
+          </w:tcPr>
+          <w:p>
+            <w:pPr>
+              <w:spacing w:before="0" w:after="40" w:line="259" w:lineRule="auto"/>
+              <w:jc w:val="center"/>
+            </w:pPr>
+            <w:r/>
+            <w:r>
+              <w:rPr>
+                <w:rFonts w:ascii="Calibri" w:hAnsi="Calibri" w:eastAsia="PingFang SC"/>
+                <w:sz w:val="18"/>
+              </w:rPr>
+              <w:t>operator</w:t>
+            </w:r>
+          </w:p>
+        </w:tc>
+        <w:tc>
+          <w:tcPr>
+            <w:tcW w:type="dxa" w:w="3000"/>
+            <w:tcMar>
+              <w:top w:w="80" w:type="dxa"/>
+              <w:start w:w="120" w:type="dxa"/>
+              <w:bottom w:w="80" w:type="dxa"/>
+              <w:end w:w="120" w:type="dxa"/>
+            </w:tcMar>
+            <w:vAlign w:val="center"/>
+          </w:tcPr>
+          <w:p>
+            <w:pPr>
+              <w:spacing w:before="0" w:after="40" w:line="259" w:lineRule="auto"/>
+              <w:jc w:val="left"/>
+            </w:pPr>
+            <w:r/>
+            <w:r>
+              <w:rPr>
+                <w:rFonts w:ascii="Calibri" w:hAnsi="Calibri" w:eastAsia="PingFang SC"/>
+                <w:sz w:val="18"/>
+              </w:rPr>
+              <w:t>diagnostic delta</w:t>
+            </w:r>
+          </w:p>
+        </w:tc>
+        <w:tc>
+          <w:tcPr>
+            <w:tcW w:type="dxa" w:w="4660"/>
+            <w:tcMar>
+              <w:top w:w="80" w:type="dxa"/>
+              <w:start w:w="120" w:type="dxa"/>
+              <w:bottom w:w="80" w:type="dxa"/>
+              <w:end w:w="120" w:type="dxa"/>
+            </w:tcMar>
+            <w:vAlign w:val="center"/>
+          </w:tcPr>
+          <w:p>
+            <w:pPr>
+              <w:spacing w:before="0" w:after="40" w:line="259" w:lineRule="auto"/>
+              <w:jc w:val="left"/>
+            </w:pPr>
+            <w:r/>
+            <w:r>
+              <w:rPr>
+                <w:rFonts w:ascii="Calibri" w:hAnsi="Calibri" w:eastAsia="PingFang SC"/>
+                <w:sz w:val="18"/>
+              </w:rPr>
+              <w:t>与同前缀 clean control 比，不混入基础总分</w:t>
+            </w:r>
+          </w:p>
+        </w:tc>
+      </w:tr>
+    </w:tbl>
+    <w:p>
+      <w:pPr>
+        <w:spacing w:after="40"/>
+      </w:pPr>
     </w:p>
     <w:p>
-      <w:pPr>
-        <w:numPr>
-          <w:ilvl w:val="0"/>
-          <w:numId w:val="18"/>
-        </w:numPr>
-        <w:spacing w:after="80" w:line="290" w:lineRule="auto"/>
-        <w:ind w:left="540" w:hanging="279"/>
-      </w:pPr>
-      <w:r>
-        <w:rPr>
-          <w:rFonts w:ascii="Calibri" w:hAnsi="Calibri" w:eastAsia="PingFang SC"/>
-        </w:rPr>
-        <w:t>judge 在不同任务、交付物、用户信息渠道和风险等级上都要单独校准。</w:t>
+      <w:r>
+        <w:rPr>
+          <w:rFonts w:ascii="Calibri" w:hAnsi="Calibri" w:eastAsia="PingFang SC"/>
+        </w:rPr>
+        <w:t>所以，</w:t>
+      </w:r>
+      <w:r>
+        <w:rPr>
+          <w:rFonts w:ascii="Calibri" w:hAnsi="Calibri" w:eastAsia="PingFang SC"/>
+          <w:b/>
+        </w:rPr>
+        <w:t>TQ、FR、PF、MP 直接由 leaves 聚合；CFA 不直接绑定 leaf。</w:t>
+      </w:r>
+      <w:r>
+        <w:rPr>
+          <w:rFonts w:ascii="Calibri" w:hAnsi="Calibri" w:eastAsia="PingFang SC"/>
+        </w:rPr>
+        <w:t xml:space="preserve"> Ua 的冻结 PF leaves 同时给 </w:t>
+      </w:r>
+      <w:r>
+        <w:rPr>
+          <w:rFonts w:ascii="Courier New" w:hAnsi="Courier New" w:eastAsia="PingFang SC"/>
+          <w:color w:val="6A3E00"/>
+          <w:sz w:val="20"/>
+        </w:rPr>
+        <w:t>Y_a</w:t>
+      </w:r>
+      <w:r>
+        <w:rPr>
+          <w:rFonts w:ascii="Calibri" w:hAnsi="Calibri" w:eastAsia="PingFang SC"/>
+        </w:rPr>
+        <w:t xml:space="preserve"> 和 </w:t>
+      </w:r>
+      <w:r>
+        <w:rPr>
+          <w:rFonts w:ascii="Courier New" w:hAnsi="Courier New" w:eastAsia="PingFang SC"/>
+          <w:color w:val="6A3E00"/>
+          <w:sz w:val="20"/>
+        </w:rPr>
+        <w:t>Y_b</w:t>
+      </w:r>
+      <w:r>
+        <w:rPr>
+          <w:rFonts w:ascii="Calibri" w:hAnsi="Calibri" w:eastAsia="PingFang SC"/>
+        </w:rPr>
+        <w:t xml:space="preserve"> 打分，得到 </w:t>
+      </w:r>
+      <w:r>
+        <w:rPr>
+          <w:rFonts w:ascii="Courier New" w:hAnsi="Courier New" w:eastAsia="PingFang SC"/>
+          <w:color w:val="6A3E00"/>
+          <w:sz w:val="20"/>
+        </w:rPr>
+        <w:t>PF_a(Y_a)</w:t>
+      </w:r>
+      <w:r>
+        <w:rPr>
+          <w:rFonts w:ascii="Calibri" w:hAnsi="Calibri" w:eastAsia="PingFang SC"/>
+        </w:rPr>
+        <w:t>、</w:t>
+      </w:r>
+      <w:r>
+        <w:rPr>
+          <w:rFonts w:ascii="Courier New" w:hAnsi="Courier New" w:eastAsia="PingFang SC"/>
+          <w:color w:val="6A3E00"/>
+          <w:sz w:val="20"/>
+        </w:rPr>
+        <w:t>PF_a(Y_b)</w:t>
+      </w:r>
+      <w:r>
+        <w:rPr>
+          <w:rFonts w:ascii="Calibri" w:hAnsi="Calibri" w:eastAsia="PingFang SC"/>
+        </w:rPr>
+        <w:t xml:space="preserve">；Ub 的 leaves 再得到另外两个值。CFA 是这四个 PF 的对角优势。要查某个分数来自哪里，只需沿 </w:t>
+      </w:r>
+      <w:r>
+        <w:rPr>
+          <w:rFonts w:ascii="Courier New" w:hAnsi="Courier New" w:eastAsia="PingFang SC"/>
+          <w:color w:val="6A3E00"/>
+          <w:sz w:val="20"/>
+        </w:rPr>
+        <w:t>criterion_id → direct_metric_bindings → aggregate → derived metric</w:t>
+      </w:r>
+      <w:r>
+        <w:rPr>
+          <w:rFonts w:ascii="Calibri" w:hAnsi="Calibri" w:eastAsia="PingFang SC"/>
+        </w:rPr>
+        <w:t xml:space="preserve"> 追踪。</w:t>
       </w:r>
     </w:p>
     <w:p>
-      <w:r>
-        <w:rPr>
-          <w:rFonts w:ascii="Calibri" w:hAnsi="Calibri" w:eastAsia="PingFang SC"/>
-        </w:rPr>
-        <w:t>无法稳定判断、不能区分 matched/swapped 的 rubric 必须删除或降级，不能靠调权重保留。</w:t>
-      </w:r>
-    </w:p>
-    <w:p>
-      <w:pPr>
-        <w:pStyle w:val="Heading1"/>
-      </w:pPr>
-      <w:r>
-        <w:t>8. Metrics 怎么读</w:t>
-      </w:r>
-    </w:p>
-    <w:p>
       <w:pPr>
         <w:pStyle w:val="Heading2"/>
       </w:pPr>
       <w:r>
-        <w:t>8.1 共同质量与事实性</w:t>
-      </w:r>
-    </w:p>
-    <w:p>
-      <w:pPr>
-        <w:pStyle w:val="ListBullet"/>
-      </w:pPr>
-      <w:r>
-        <w:rPr>
-          <w:rFonts w:ascii="Calibri" w:hAnsi="Calibri" w:eastAsia="PingFang SC"/>
-          <w:b/>
-        </w:rPr>
-        <w:t>TQ</w:t>
-      </w:r>
-      <w:r>
-        <w:rPr>
-          <w:rFonts w:ascii="Calibri" w:hAnsi="Calibri" w:eastAsia="PingFang SC"/>
-        </w:rPr>
-        <w:t>：任务完成和基本可用性；</w:t>
-      </w:r>
-    </w:p>
-    <w:p>
-      <w:pPr>
-        <w:pStyle w:val="ListBullet"/>
-      </w:pPr>
-      <w:r>
-        <w:rPr>
-          <w:rFonts w:ascii="Calibri" w:hAnsi="Calibri" w:eastAsia="PingFang SC"/>
-          <w:b/>
-        </w:rPr>
-        <w:t>FR</w:t>
-      </w:r>
-      <w:r>
-        <w:rPr>
-          <w:rFonts w:ascii="Calibri" w:hAnsi="Calibri" w:eastAsia="PingFang SC"/>
-        </w:rPr>
-        <w:t>：事实、证据、引用支持和来源质量。</w:t>
-      </w:r>
-    </w:p>
-    <w:p>
-      <w:r>
-        <w:rPr>
-          <w:rFonts w:ascii="Calibri" w:hAnsi="Calibri" w:eastAsia="PingFang SC"/>
-        </w:rPr>
-        <w:t>如果共同质量或事实性不过门槛，不能靠个性化分补回来。</w:t>
-      </w:r>
-    </w:p>
-    <w:p>
-      <w:pPr>
-        <w:pStyle w:val="Heading2"/>
-      </w:pPr>
-      <w:r>
-        <w:t>8.2 个性化表现</w:t>
-      </w:r>
-    </w:p>
-    <w:p>
-      <w:pPr>
-        <w:pStyle w:val="ListBullet"/>
-      </w:pPr>
-      <w:r>
-        <w:rPr>
-          <w:rFonts w:ascii="Calibri" w:hAnsi="Calibri" w:eastAsia="PingFang SC"/>
-          <w:b/>
-        </w:rPr>
-        <w:t>PF</w:t>
-      </w:r>
-      <w:r>
-        <w:rPr>
-          <w:rFonts w:ascii="Calibri" w:hAnsi="Calibri" w:eastAsia="PingFang SC"/>
-        </w:rPr>
-        <w:t>：用户特异要求完成了多少；</w:t>
-      </w:r>
-    </w:p>
-    <w:p>
-      <w:pPr>
-        <w:pStyle w:val="ListBullet"/>
-      </w:pPr>
-      <w:r>
-        <w:rPr>
-          <w:rFonts w:ascii="Calibri" w:hAnsi="Calibri" w:eastAsia="PingFang SC"/>
-          <w:b/>
-        </w:rPr>
-        <w:t>MP</w:t>
-      </w:r>
-      <w:r>
-        <w:rPr>
-          <w:rFonts w:ascii="Calibri" w:hAnsi="Calibri" w:eastAsia="PingFang SC"/>
-        </w:rPr>
-        <w:t>：误用、泄露、刻板化和过度迎合造成的惩罚；</w:t>
-      </w:r>
-    </w:p>
-    <w:p>
-      <w:pPr>
-        <w:pStyle w:val="ListBullet"/>
-      </w:pPr>
-      <w:r>
-        <w:rPr>
-          <w:rFonts w:ascii="Calibri" w:hAnsi="Calibri" w:eastAsia="PingFang SC"/>
-          <w:b/>
-        </w:rPr>
-        <w:t>PF − MP</w:t>
-      </w:r>
-      <w:r>
-        <w:rPr>
-          <w:rFonts w:ascii="Calibri" w:hAnsi="Calibri" w:eastAsia="PingFang SC"/>
-        </w:rPr>
-        <w:t>：净个性化适配；</w:t>
-      </w:r>
-    </w:p>
-    <w:p>
-      <w:pPr>
-        <w:pStyle w:val="ListBullet"/>
-      </w:pPr>
-      <w:r>
-        <w:rPr>
-          <w:rFonts w:ascii="Calibri" w:hAnsi="Calibri" w:eastAsia="PingFang SC"/>
-          <w:b/>
-        </w:rPr>
-        <w:t>CFA</w:t>
-      </w:r>
-      <w:r>
-        <w:rPr>
-          <w:rFonts w:ascii="Calibri" w:hAnsi="Calibri" w:eastAsia="PingFang SC"/>
-        </w:rPr>
-        <w:t>：匹配用户的报告相对错配报告有多少优势。</w:t>
-      </w:r>
-    </w:p>
-    <w:p>
-      <w:pPr>
-        <w:spacing w:before="80" w:after="160" w:line="240" w:lineRule="auto"/>
-        <w:ind w:left="360" w:right="216"/>
-        <w:jc w:val="left"/>
-        <w:shd w:fill="EEF2F5"/>
-      </w:pPr>
-      <w:r>
-        <w:rPr>
-          <w:rFonts w:ascii="Courier New" w:hAnsi="Courier New" w:eastAsia="PingFang SC"/>
-          <w:color w:val="163A63"/>
-          <w:sz w:val="18"/>
-        </w:rPr>
-        <w:t>CFA(a,b) = 1/2 × [Ua 对 Ya 相对 Yb 的偏好</w:t>
-        <w:br/>
-        <w:t xml:space="preserve">                + Ub 对 Yb 相对 Ya 的偏好]</w:t>
-      </w:r>
-    </w:p>
-    <w:p>
-      <w:r>
-        <w:rPr>
-          <w:rFonts w:ascii="Calibri" w:hAnsi="Calibri" w:eastAsia="PingFang SC"/>
-        </w:rPr>
-        <w:t>CFA 大于 0 说明评分矩阵出现“对的人更适合自己的版本”的对角优势，但它不解释模型为什么做到，也不会自动排除长度等因素。因此还要报告：语义等价 views 中最差的 CFA、不同 views 间的最大差距（Cue Gap）、must-change/must-hold 一致率，以及只改无关 cue 后分数是否变化。</w:t>
-      </w:r>
-    </w:p>
-    <w:p>
-      <w:pPr>
-        <w:pStyle w:val="Heading2"/>
-      </w:pPr>
-      <w:r>
-        <w:t>8.3 长程与动态状态能力</w:t>
-      </w:r>
-    </w:p>
-    <w:p>
-      <w:pPr>
-        <w:pStyle w:val="ListBullet"/>
-      </w:pPr>
-      <w:r>
-        <w:rPr>
-          <w:rFonts w:ascii="Calibri" w:hAnsi="Calibri" w:eastAsia="PingFang SC"/>
-        </w:rPr>
-        <w:t>Retention：随着任务变长，用户适配保留了多少；</w:t>
-      </w:r>
-    </w:p>
-    <w:p>
-      <w:pPr>
-        <w:pStyle w:val="ListBullet"/>
-      </w:pPr>
-      <w:r>
-        <w:rPr>
-          <w:rFonts w:ascii="Calibri" w:hAnsi="Calibri" w:eastAsia="PingFang SC"/>
-        </w:rPr>
-        <w:t>Update correctness：状态变化后是否采用当前真值；</w:t>
-      </w:r>
-    </w:p>
-    <w:p>
-      <w:pPr>
-        <w:pStyle w:val="ListBullet"/>
-      </w:pPr>
-      <w:r>
-        <w:rPr>
-          <w:rFonts w:ascii="Calibri" w:hAnsi="Calibri" w:eastAsia="PingFang SC"/>
-        </w:rPr>
-        <w:t>Stale-state residue：旧状态仍进入最终交付物的比例；</w:t>
-      </w:r>
-    </w:p>
-    <w:p>
-      <w:pPr>
-        <w:pStyle w:val="ListBullet"/>
-      </w:pPr>
-      <w:r>
-        <w:rPr>
-          <w:rFonts w:ascii="Calibri" w:hAnsi="Calibri" w:eastAsia="PingFang SC"/>
-        </w:rPr>
-        <w:t>Pressure side effect：压力条件是否损害事实、任务质量或隐私。</w:t>
-      </w:r>
-    </w:p>
-    <w:p>
-      <w:pPr>
-        <w:pStyle w:val="Heading2"/>
-      </w:pPr>
-      <w:r>
-        <w:t>8.4 榜单不能只给一个总分</w:t>
-      </w:r>
-    </w:p>
-    <w:p>
-      <w:r>
-        <w:rPr>
-          <w:rFonts w:ascii="Calibri" w:hAnsi="Calibri" w:eastAsia="PingFang SC"/>
-        </w:rPr>
-        <w:t>主榜先检查 TQ、FR 和关键隐私门槛，再分四张 profile：clean 条件下的任务/交付物能力；不同 signal channel 的获取与利用；S0–S3 的风险/failure-mode 退化曲线；压力下的 must-not、隐私、权限、弃权和共同质量副作用。每张 agent card 标注运行环境、trace level、覆盖率和 N/A；不同 evidence track、工具预算和 agent 类型不混排。</w:t>
-      </w:r>
-    </w:p>
-    <w:p>
-      <w:pPr>
-        <w:pStyle w:val="Heading1"/>
-      </w:pPr>
-      <w:r>
-        <w:t>9. Judge 怎么做</w:t>
-      </w:r>
-    </w:p>
-    <w:p>
-      <w:pPr>
-        <w:pStyle w:val="Heading2"/>
-      </w:pPr>
-      <w:r>
-        <w:t>9.1 四层评分</w:t>
+        <w:t>7.6 Rubric 进入主实验前必须过五关</w:t>
       </w:r>
     </w:p>
     <w:p>
@@ -3837,7 +4499,7 @@
         <w:rPr>
           <w:rFonts w:ascii="Calibri" w:hAnsi="Calibri" w:eastAsia="PingFang SC"/>
         </w:rPr>
-        <w:t>确定性 verifier：文件、格式、预算、权限、代码测试；</w:t>
+        <w:t>每个关键元数据要么对应可判断的 rubric，要么明确只用于切片报告；</w:t>
       </w:r>
     </w:p>
     <w:p>
@@ -3853,7 +4515,7 @@
         <w:rPr>
           <w:rFonts w:ascii="Calibri" w:hAnsi="Calibri" w:eastAsia="PingFang SC"/>
         </w:rPr>
-        <w:t>证据 verifier：claim 是否有支持、引用是否覆盖、来源是否可靠；</w:t>
+        <w:t>人写的 matched 参考结果应明显优于 swapped 或错误版本；</w:t>
       </w:r>
     </w:p>
     <w:p>
@@ -3869,7 +4531,7 @@
         <w:rPr>
           <w:rFonts w:ascii="Calibri" w:hAnsi="Calibri" w:eastAsia="PingFang SC"/>
         </w:rPr>
-        <w:t>强通用 judge：按照冻结的 rubric 逐项判断并定位证据；</w:t>
+        <w:t>同一 user-state 换成语义等价 signal view 后，must-change / must-hold 判断应稳定；</w:t>
       </w:r>
     </w:p>
     <w:p>
@@ -3885,15 +4547,23 @@
         <w:rPr>
           <w:rFonts w:ascii="Calibri" w:hAnsi="Calibri" w:eastAsia="PingFang SC"/>
         </w:rPr>
-        <w:t>人类：目标用户判断是否有用，领域专家判断是否专业正确。</w:t>
+        <w:t>加入无关 persona、改变篇幅或文风不能提高不相关分数；</w:t>
       </w:r>
     </w:p>
     <w:p>
       <w:pPr>
-        <w:pStyle w:val="Heading2"/>
-      </w:pPr>
-      <w:r>
-        <w:t>9.2 JudgeBench</w:t>
+        <w:numPr>
+          <w:ilvl w:val="0"/>
+          <w:numId w:val="19"/>
+        </w:numPr>
+        <w:spacing w:after="80" w:line="290" w:lineRule="auto"/>
+        <w:ind w:left="540" w:hanging="279"/>
+      </w:pPr>
+      <w:r>
+        <w:rPr>
+          <w:rFonts w:ascii="Calibri" w:hAnsi="Calibri" w:eastAsia="PingFang SC"/>
+        </w:rPr>
+        <w:t>judge 在不同任务、交付物、用户信息渠道和风险等级上都要单独校准。</w:t>
       </w:r>
     </w:p>
     <w:p>
@@ -3901,39 +4571,147 @@
         <w:rPr>
           <w:rFonts w:ascii="Calibri" w:hAnsi="Calibri" w:eastAsia="PingFang SC"/>
         </w:rPr>
-        <w:t>用 240 个独立判分单元测试 judge，包括：正确答案、边界答案、位置交换、长度诱饵、漂亮格式诱饵、persona 关键词堆叠、隐私泄露和应当弃权的样本。</w:t>
+        <w:t>无法稳定判断、不能区分 matched/swapped 的 rubric 必须删除或降级，不能靠调权重保留。</w:t>
       </w:r>
     </w:p>
     <w:p>
-      <w:r>
-        <w:rPr>
-          <w:rFonts w:ascii="Calibri" w:hAnsi="Calibri" w:eastAsia="PingFang SC"/>
-        </w:rPr>
-        <w:t>它还要专门覆盖 PDR 暴露或尚未覆盖的五类问题：低人类一致性、动态 criterion 重生成、通用 evaluator 与目标用户判断不一致、claim extraction/retrieval/support 链式误差、以及 P/Q/R 补偿关键失败。对应做 criterion 多次重生成稳定性、target-user matched/swapped、claim-recall 审计、抓取失败单列和 hard-gate 对照。</w:t>
+      <w:pPr>
+        <w:pStyle w:val="Heading1"/>
+      </w:pPr>
+      <w:r>
+        <w:t>8. Metrics 怎么读</w:t>
       </w:r>
     </w:p>
     <w:p>
-      <w:r>
-        <w:rPr>
-          <w:rFonts w:ascii="Calibri" w:hAnsi="Calibri" w:eastAsia="PingFang SC"/>
-        </w:rPr>
-        <w:t>主 judge 至少要达到预注册的一致性、位置稳定性、群体差距和校准门槛。不达标的 rubric 改成人评或不进入主榜。</w:t>
+      <w:pPr>
+        <w:pStyle w:val="Heading2"/>
+      </w:pPr>
+      <w:r>
+        <w:t>8.1 共同质量与事实性</w:t>
       </w:r>
     </w:p>
     <w:p>
       <w:pPr>
-        <w:pStyle w:val="Heading2"/>
-      </w:pPr>
-      <w:r>
-        <w:t>9.3 为什么 SFT scorer 不是当前主线</w:t>
+        <w:pStyle w:val="ListBullet"/>
+      </w:pPr>
+      <w:r>
+        <w:rPr>
+          <w:rFonts w:ascii="Calibri" w:hAnsi="Calibri" w:eastAsia="PingFang SC"/>
+          <w:b/>
+        </w:rPr>
+        <w:t>TQ</w:t>
+      </w:r>
+      <w:r>
+        <w:rPr>
+          <w:rFonts w:ascii="Calibri" w:hAnsi="Calibri" w:eastAsia="PingFang SC"/>
+        </w:rPr>
+        <w:t>：任务完成和基本可用性；</w:t>
       </w:r>
     </w:p>
     <w:p>
-      <w:r>
-        <w:rPr>
-          <w:rFonts w:ascii="Calibri" w:hAnsi="Calibri" w:eastAsia="PingFang SC"/>
-        </w:rPr>
-        <w:t>“人工 0/1 + GPT 理由”可以训练便宜 scorer，但 GPT 理由不是新的 ground truth，它可能只是在已知标签后合理化。两个月主线采用：</w:t>
+      <w:pPr>
+        <w:pStyle w:val="ListBullet"/>
+      </w:pPr>
+      <w:r>
+        <w:rPr>
+          <w:rFonts w:ascii="Calibri" w:hAnsi="Calibri" w:eastAsia="PingFang SC"/>
+          <w:b/>
+        </w:rPr>
+        <w:t>FR</w:t>
+      </w:r>
+      <w:r>
+        <w:rPr>
+          <w:rFonts w:ascii="Calibri" w:hAnsi="Calibri" w:eastAsia="PingFang SC"/>
+        </w:rPr>
+        <w:t>：事实、证据、引用支持和来源质量。</w:t>
+      </w:r>
+    </w:p>
+    <w:p>
+      <w:r>
+        <w:rPr>
+          <w:rFonts w:ascii="Calibri" w:hAnsi="Calibri" w:eastAsia="PingFang SC"/>
+        </w:rPr>
+        <w:t>如果共同质量或事实性不过门槛，不能靠个性化分补回来。</w:t>
+      </w:r>
+    </w:p>
+    <w:p>
+      <w:pPr>
+        <w:pStyle w:val="Heading2"/>
+      </w:pPr>
+      <w:r>
+        <w:t>8.2 个性化表现</w:t>
+      </w:r>
+    </w:p>
+    <w:p>
+      <w:pPr>
+        <w:pStyle w:val="ListBullet"/>
+      </w:pPr>
+      <w:r>
+        <w:rPr>
+          <w:rFonts w:ascii="Calibri" w:hAnsi="Calibri" w:eastAsia="PingFang SC"/>
+          <w:b/>
+        </w:rPr>
+        <w:t>PF</w:t>
+      </w:r>
+      <w:r>
+        <w:rPr>
+          <w:rFonts w:ascii="Calibri" w:hAnsi="Calibri" w:eastAsia="PingFang SC"/>
+        </w:rPr>
+        <w:t>：用户特异要求完成了多少；</w:t>
+      </w:r>
+    </w:p>
+    <w:p>
+      <w:pPr>
+        <w:pStyle w:val="ListBullet"/>
+      </w:pPr>
+      <w:r>
+        <w:rPr>
+          <w:rFonts w:ascii="Calibri" w:hAnsi="Calibri" w:eastAsia="PingFang SC"/>
+          <w:b/>
+        </w:rPr>
+        <w:t>MP</w:t>
+      </w:r>
+      <w:r>
+        <w:rPr>
+          <w:rFonts w:ascii="Calibri" w:hAnsi="Calibri" w:eastAsia="PingFang SC"/>
+        </w:rPr>
+        <w:t>：误用、泄露、刻板化和过度迎合造成的惩罚；</w:t>
+      </w:r>
+    </w:p>
+    <w:p>
+      <w:pPr>
+        <w:pStyle w:val="ListBullet"/>
+      </w:pPr>
+      <w:r>
+        <w:rPr>
+          <w:rFonts w:ascii="Calibri" w:hAnsi="Calibri" w:eastAsia="PingFang SC"/>
+          <w:b/>
+        </w:rPr>
+        <w:t>PF − MP</w:t>
+      </w:r>
+      <w:r>
+        <w:rPr>
+          <w:rFonts w:ascii="Calibri" w:hAnsi="Calibri" w:eastAsia="PingFang SC"/>
+        </w:rPr>
+        <w:t>：净个性化适配；</w:t>
+      </w:r>
+    </w:p>
+    <w:p>
+      <w:pPr>
+        <w:pStyle w:val="ListBullet"/>
+      </w:pPr>
+      <w:r>
+        <w:rPr>
+          <w:rFonts w:ascii="Calibri" w:hAnsi="Calibri" w:eastAsia="PingFang SC"/>
+          <w:b/>
+        </w:rPr>
+        <w:t>CFA</w:t>
+      </w:r>
+      <w:r>
+        <w:rPr>
+          <w:rFonts w:ascii="Calibri" w:hAnsi="Calibri" w:eastAsia="PingFang SC"/>
+        </w:rPr>
+        <w:t>：匹配用户的报告相对错配报告有多少优势。</w:t>
       </w:r>
     </w:p>
     <w:p>
@@ -3949,7 +4727,9 @@
           <w:color w:val="163A63"/>
           <w:sz w:val="18"/>
         </w:rPr>
-        <w:t>确定性/证据 verifier → 强通用 judge → 20% 分层人评和分歧仲裁</w:t>
+        <w:t>CFA(a,b) = 1/2 × [Ua 对 Ya 相对 Yb 的偏好</w:t>
+        <w:br/>
+        <w:t xml:space="preserve">                + Ub 对 Yb 相对 Ya 的偏好]</w:t>
       </w:r>
     </w:p>
     <w:p>
@@ -3957,15 +4737,91 @@
         <w:rPr>
           <w:rFonts w:ascii="Calibri" w:hAnsi="Calibri" w:eastAsia="PingFang SC"/>
         </w:rPr>
-        <w:t>只有第 4 周前已经有 240 个高质量样本且主实验不受影响时，才做 SFT scorer 附录。它必须按 task family 和 agent 隔离测试；如果不能跨 family 泛化，只能做高置信样本分流。</w:t>
+        <w:t>CFA 大于 0 说明评分矩阵出现“对的人更适合自己的版本”的对角优势，但它不解释模型为什么做到，也不会自动排除长度等因素。因此还要报告：语义等价 views 中最差的 CFA、不同 views 间的最大差距（Cue Gap）、must-change/must-hold 一致率，以及只改无关 cue 后分数是否变化。</w:t>
       </w:r>
     </w:p>
     <w:p>
       <w:pPr>
+        <w:pStyle w:val="Heading2"/>
+      </w:pPr>
+      <w:r>
+        <w:t>8.3 长程与动态状态能力</w:t>
+      </w:r>
+    </w:p>
+    <w:p>
+      <w:pPr>
+        <w:pStyle w:val="ListBullet"/>
+      </w:pPr>
+      <w:r>
+        <w:rPr>
+          <w:rFonts w:ascii="Calibri" w:hAnsi="Calibri" w:eastAsia="PingFang SC"/>
+        </w:rPr>
+        <w:t>Retention：随着任务变长，用户适配保留了多少；</w:t>
+      </w:r>
+    </w:p>
+    <w:p>
+      <w:pPr>
+        <w:pStyle w:val="ListBullet"/>
+      </w:pPr>
+      <w:r>
+        <w:rPr>
+          <w:rFonts w:ascii="Calibri" w:hAnsi="Calibri" w:eastAsia="PingFang SC"/>
+        </w:rPr>
+        <w:t>Update correctness：状态变化后是否采用当前真值；</w:t>
+      </w:r>
+    </w:p>
+    <w:p>
+      <w:pPr>
+        <w:pStyle w:val="ListBullet"/>
+      </w:pPr>
+      <w:r>
+        <w:rPr>
+          <w:rFonts w:ascii="Calibri" w:hAnsi="Calibri" w:eastAsia="PingFang SC"/>
+        </w:rPr>
+        <w:t>Stale-state residue：旧状态仍进入最终交付物的比例；</w:t>
+      </w:r>
+    </w:p>
+    <w:p>
+      <w:pPr>
+        <w:pStyle w:val="ListBullet"/>
+      </w:pPr>
+      <w:r>
+        <w:rPr>
+          <w:rFonts w:ascii="Calibri" w:hAnsi="Calibri" w:eastAsia="PingFang SC"/>
+        </w:rPr>
+        <w:t>Pressure side effect：压力条件是否损害事实、任务质量或隐私。</w:t>
+      </w:r>
+    </w:p>
+    <w:p>
+      <w:pPr>
+        <w:pStyle w:val="Heading2"/>
+      </w:pPr>
+      <w:r>
+        <w:t>8.4 榜单不能只给一个总分</w:t>
+      </w:r>
+    </w:p>
+    <w:p>
+      <w:r>
+        <w:rPr>
+          <w:rFonts w:ascii="Calibri" w:hAnsi="Calibri" w:eastAsia="PingFang SC"/>
+        </w:rPr>
+        <w:t>主榜先检查 TQ、FR 和关键隐私门槛，再分四张 profile：clean 条件下的任务/交付物能力；不同 signal channel 的获取与利用；S0–S3 的风险/failure-mode 退化曲线；压力下的 must-not、隐私、权限、弃权和共同质量副作用。每张 agent card 标注运行环境、trace level、覆盖率和 N/A；不同 evidence track、工具预算和 agent 类型不混排。</w:t>
+      </w:r>
+    </w:p>
+    <w:p>
+      <w:pPr>
         <w:pStyle w:val="Heading1"/>
       </w:pPr>
       <w:r>
-        <w:t>10. 我们要报告哪些失败</w:t>
+        <w:t>9. Judge 怎么做</w:t>
+      </w:r>
+    </w:p>
+    <w:p>
+      <w:pPr>
+        <w:pStyle w:val="Heading2"/>
+      </w:pPr>
+      <w:r>
+        <w:t>9.1 四层评分</w:t>
       </w:r>
     </w:p>
     <w:p>
@@ -3981,7 +4837,7 @@
         <w:rPr>
           <w:rFonts w:ascii="Calibri" w:hAnsi="Calibri" w:eastAsia="PingFang SC"/>
         </w:rPr>
-        <w:t>缺信息时既不获取也不澄清；</w:t>
+        <w:t>确定性 verifier：文件、格式、预算、权限、代码测试；</w:t>
       </w:r>
     </w:p>
     <w:p>
@@ -3997,7 +4853,7 @@
         <w:rPr>
           <w:rFonts w:ascii="Calibri" w:hAnsi="Calibri" w:eastAsia="PingFang SC"/>
         </w:rPr>
-        <w:t>没有依据就猜用户属性；</w:t>
+        <w:t>证据 verifier：claim 是否有支持、引用是否覆盖、来源是否可靠；</w:t>
       </w:r>
     </w:p>
     <w:p>
@@ -4013,7 +4869,7 @@
         <w:rPr>
           <w:rFonts w:ascii="Calibri" w:hAnsi="Calibri" w:eastAsia="PingFang SC"/>
         </w:rPr>
-        <w:t>检索错了、漏了或拿到无关用户信息；</w:t>
+        <w:t>强通用 judge：按照冻结的 rubric 逐项判断并定位证据；</w:t>
       </w:r>
     </w:p>
     <w:p>
@@ -4029,14 +4885,94 @@
         <w:rPr>
           <w:rFonts w:ascii="Calibri" w:hAnsi="Calibri" w:eastAsia="PingFang SC"/>
         </w:rPr>
-        <w:t>明明知道预算、权限或格式要求却忽略；</w:t>
+        <w:t>人类：目标用户判断是否有用，领域专家判断是否专业正确。</w:t>
       </w:r>
     </w:p>
     <w:p>
       <w:pPr>
+        <w:pStyle w:val="Heading2"/>
+      </w:pPr>
+      <w:r>
+        <w:t>9.2 JudgeBench</w:t>
+      </w:r>
+    </w:p>
+    <w:p>
+      <w:r>
+        <w:rPr>
+          <w:rFonts w:ascii="Calibri" w:hAnsi="Calibri" w:eastAsia="PingFang SC"/>
+        </w:rPr>
+        <w:t>用 240 个独立判分单元测试 judge，包括：正确答案、边界答案、位置交换、长度诱饵、漂亮格式诱饵、persona 关键词堆叠、隐私泄露和应当弃权的样本。</w:t>
+      </w:r>
+    </w:p>
+    <w:p>
+      <w:r>
+        <w:rPr>
+          <w:rFonts w:ascii="Calibri" w:hAnsi="Calibri" w:eastAsia="PingFang SC"/>
+        </w:rPr>
+        <w:t>它还要专门覆盖 PDR 暴露或尚未覆盖的五类问题：低人类一致性、动态 criterion 重生成、通用 evaluator 与目标用户判断不一致、claim extraction/retrieval/support 链式误差、以及 P/Q/R 补偿关键失败。对应做 criterion 多次重生成稳定性、target-user matched/swapped、claim-recall 审计、抓取失败单列和 hard-gate 对照。</w:t>
+      </w:r>
+    </w:p>
+    <w:p>
+      <w:r>
+        <w:rPr>
+          <w:rFonts w:ascii="Calibri" w:hAnsi="Calibri" w:eastAsia="PingFang SC"/>
+        </w:rPr>
+        <w:t>主 judge 至少要达到预注册的一致性、位置稳定性、群体差距和校准门槛。不达标的 rubric 改成人评或不进入主榜。</w:t>
+      </w:r>
+    </w:p>
+    <w:p>
+      <w:pPr>
+        <w:pStyle w:val="Heading2"/>
+      </w:pPr>
+      <w:r>
+        <w:t>9.3 为什么 SFT scorer 不是当前主线</w:t>
+      </w:r>
+    </w:p>
+    <w:p>
+      <w:r>
+        <w:rPr>
+          <w:rFonts w:ascii="Calibri" w:hAnsi="Calibri" w:eastAsia="PingFang SC"/>
+        </w:rPr>
+        <w:t>“人工 0/1 + GPT 理由”可以训练便宜 scorer，但 GPT 理由不是新的 ground truth，它可能只是在已知标签后合理化。两个月主线采用：</w:t>
+      </w:r>
+    </w:p>
+    <w:p>
+      <w:pPr>
+        <w:spacing w:before="80" w:after="160" w:line="240" w:lineRule="auto"/>
+        <w:ind w:left="360" w:right="216"/>
+        <w:jc w:val="left"/>
+        <w:shd w:fill="EEF2F5"/>
+      </w:pPr>
+      <w:r>
+        <w:rPr>
+          <w:rFonts w:ascii="Courier New" w:hAnsi="Courier New" w:eastAsia="PingFang SC"/>
+          <w:color w:val="163A63"/>
+          <w:sz w:val="18"/>
+        </w:rPr>
+        <w:t>确定性/证据 verifier → 强通用 judge → 20% 分层人评和分歧仲裁</w:t>
+      </w:r>
+    </w:p>
+    <w:p>
+      <w:r>
+        <w:rPr>
+          <w:rFonts w:ascii="Calibri" w:hAnsi="Calibri" w:eastAsia="PingFang SC"/>
+        </w:rPr>
+        <w:t>只有第 4 周前已经有 240 个高质量样本且主实验不受影响时，才做 SFT scorer 附录。它必须按 task family 和 agent 隔离测试；如果不能跨 family 泛化，只能做高置信样本分流。</w:t>
+      </w:r>
+    </w:p>
+    <w:p>
+      <w:pPr>
+        <w:pStyle w:val="Heading1"/>
+      </w:pPr>
+      <w:r>
+        <w:t>10. 我们要报告哪些失败</w:t>
+      </w:r>
+    </w:p>
+    <w:p>
+      <w:pPr>
         <w:numPr>
           <w:ilvl w:val="0"/>
-          <w:numId w:val="20"/>
+          <w:numId w:val="21"/>
         </w:numPr>
         <w:spacing w:after="80" w:line="290" w:lineRule="auto"/>
         <w:ind w:left="540" w:hanging="279"/>
@@ -4045,14 +4981,14 @@
         <w:rPr>
           <w:rFonts w:ascii="Calibri" w:hAnsi="Calibri" w:eastAsia="PingFang SC"/>
         </w:rPr>
-        <w:t>新旧信息冲突时仍使用过期内容；</w:t>
+        <w:t>缺信息时既不获取也不澄清；</w:t>
       </w:r>
     </w:p>
     <w:p>
       <w:pPr>
         <w:numPr>
           <w:ilvl w:val="0"/>
-          <w:numId w:val="20"/>
+          <w:numId w:val="21"/>
         </w:numPr>
         <w:spacing w:after="80" w:line="290" w:lineRule="auto"/>
         <w:ind w:left="540" w:hanging="279"/>
@@ -4061,14 +4997,14 @@
         <w:rPr>
           <w:rFonts w:ascii="Calibri" w:hAnsi="Calibri" w:eastAsia="PingFang SC"/>
         </w:rPr>
-        <w:t>会复述用户信息，但没有落实到结果；</w:t>
+        <w:t>没有依据就猜用户属性；</w:t>
       </w:r>
     </w:p>
     <w:p>
       <w:pPr>
         <w:numPr>
           <w:ilvl w:val="0"/>
-          <w:numId w:val="20"/>
+          <w:numId w:val="21"/>
         </w:numPr>
         <w:spacing w:after="80" w:line="290" w:lineRule="auto"/>
         <w:ind w:left="540" w:hanging="279"/>
@@ -4077,14 +5013,14 @@
         <w:rPr>
           <w:rFonts w:ascii="Calibri" w:hAnsi="Calibri" w:eastAsia="PingFang SC"/>
         </w:rPr>
-        <w:t>在不该变化的地方强行个性化；</w:t>
+        <w:t>检索错了、漏了或拿到无关用户信息；</w:t>
       </w:r>
     </w:p>
     <w:p>
       <w:pPr>
         <w:numPr>
           <w:ilvl w:val="0"/>
-          <w:numId w:val="20"/>
+          <w:numId w:val="21"/>
         </w:numPr>
         <w:spacing w:after="80" w:line="290" w:lineRule="auto"/>
         <w:ind w:left="540" w:hanging="279"/>
@@ -4093,14 +5029,78 @@
         <w:rPr>
           <w:rFonts w:ascii="Calibri" w:hAnsi="Calibri" w:eastAsia="PingFang SC"/>
         </w:rPr>
-        <w:t>越权访问或披露敏感信息；</w:t>
+        <w:t>明明知道预算、权限或格式要求却忽略；</w:t>
       </w:r>
     </w:p>
     <w:p>
       <w:pPr>
         <w:numPr>
           <w:ilvl w:val="0"/>
-          <w:numId w:val="20"/>
+          <w:numId w:val="21"/>
+        </w:numPr>
+        <w:spacing w:after="80" w:line="290" w:lineRule="auto"/>
+        <w:ind w:left="540" w:hanging="279"/>
+      </w:pPr>
+      <w:r>
+        <w:rPr>
+          <w:rFonts w:ascii="Calibri" w:hAnsi="Calibri" w:eastAsia="PingFang SC"/>
+        </w:rPr>
+        <w:t>新旧信息冲突时仍使用过期内容；</w:t>
+      </w:r>
+    </w:p>
+    <w:p>
+      <w:pPr>
+        <w:numPr>
+          <w:ilvl w:val="0"/>
+          <w:numId w:val="21"/>
+        </w:numPr>
+        <w:spacing w:after="80" w:line="290" w:lineRule="auto"/>
+        <w:ind w:left="540" w:hanging="279"/>
+      </w:pPr>
+      <w:r>
+        <w:rPr>
+          <w:rFonts w:ascii="Calibri" w:hAnsi="Calibri" w:eastAsia="PingFang SC"/>
+        </w:rPr>
+        <w:t>会复述用户信息，但没有落实到结果；</w:t>
+      </w:r>
+    </w:p>
+    <w:p>
+      <w:pPr>
+        <w:numPr>
+          <w:ilvl w:val="0"/>
+          <w:numId w:val="21"/>
+        </w:numPr>
+        <w:spacing w:after="80" w:line="290" w:lineRule="auto"/>
+        <w:ind w:left="540" w:hanging="279"/>
+      </w:pPr>
+      <w:r>
+        <w:rPr>
+          <w:rFonts w:ascii="Calibri" w:hAnsi="Calibri" w:eastAsia="PingFang SC"/>
+        </w:rPr>
+        <w:t>在不该变化的地方强行个性化；</w:t>
+      </w:r>
+    </w:p>
+    <w:p>
+      <w:pPr>
+        <w:numPr>
+          <w:ilvl w:val="0"/>
+          <w:numId w:val="21"/>
+        </w:numPr>
+        <w:spacing w:after="80" w:line="290" w:lineRule="auto"/>
+        <w:ind w:left="540" w:hanging="279"/>
+      </w:pPr>
+      <w:r>
+        <w:rPr>
+          <w:rFonts w:ascii="Calibri" w:hAnsi="Calibri" w:eastAsia="PingFang SC"/>
+        </w:rPr>
+        <w:t>越权访问或披露敏感信息；</w:t>
+      </w:r>
+    </w:p>
+    <w:p>
+      <w:pPr>
+        <w:numPr>
+          <w:ilvl w:val="0"/>
+          <w:numId w:val="21"/>
         </w:numPr>
         <w:spacing w:after="80" w:line="290" w:lineRule="auto"/>
         <w:ind w:left="540" w:hanging="279"/>
@@ -5099,13 +6099,13 @@
     </w:p>
     <w:p>
       <w:pPr>
-        <w:spacing w:after="80" w:line="264" w:lineRule="auto"/>
+        <w:spacing w:after="0" w:line="216" w:lineRule="auto"/>
         <w:ind w:left="360" w:hanging="360"/>
       </w:pPr>
       <w:r>
         <w:rPr>
           <w:rFonts w:ascii="Calibri" w:hAnsi="Calibri" w:eastAsia="PingFang SC"/>
-          <w:sz w:val="19"/>
+          <w:sz w:val="16"/>
         </w:rPr>
         <w:t xml:space="preserve">[1] OpenCompass Team. </w:t>
       </w:r>
@@ -5113,27 +6113,27 @@
         <w:rPr>
           <w:rFonts w:ascii="Calibri" w:hAnsi="Calibri" w:eastAsia="PingFang SC"/>
           <w:i/>
-          <w:sz w:val="19"/>
+          <w:sz w:val="16"/>
         </w:rPr>
         <w:t>OpenCompass: A Universal Evaluation Platform for Large Language Models</w:t>
       </w:r>
       <w:r>
         <w:rPr>
           <w:rFonts w:ascii="Calibri" w:hAnsi="Calibri" w:eastAsia="PingFang SC"/>
-          <w:sz w:val="19"/>
+          <w:sz w:val="16"/>
         </w:rPr>
         <w:t>. arXiv:2605.19276, 2026.</w:t>
       </w:r>
     </w:p>
     <w:p>
       <w:pPr>
-        <w:spacing w:after="80" w:line="264" w:lineRule="auto"/>
+        <w:spacing w:after="0" w:line="216" w:lineRule="auto"/>
         <w:ind w:left="360" w:hanging="360"/>
       </w:pPr>
       <w:r>
         <w:rPr>
           <w:rFonts w:ascii="Calibri" w:hAnsi="Calibri" w:eastAsia="PingFang SC"/>
-          <w:sz w:val="19"/>
+          <w:sz w:val="16"/>
         </w:rPr>
         <w:t xml:space="preserve">[2] ModelScope. </w:t>
       </w:r>
@@ -5141,14 +6141,14 @@
         <w:rPr>
           <w:rFonts w:ascii="Calibri" w:hAnsi="Calibri" w:eastAsia="PingFang SC"/>
           <w:i/>
-          <w:sz w:val="19"/>
+          <w:sz w:val="16"/>
         </w:rPr>
         <w:t>EvalScope Introduction</w:t>
       </w:r>
       <w:r>
         <w:rPr>
           <w:rFonts w:ascii="Calibri" w:hAnsi="Calibri" w:eastAsia="PingFang SC"/>
-          <w:sz w:val="19"/>
+          <w:sz w:val="16"/>
         </w:rPr>
         <w:t xml:space="preserve">. </w:t>
       </w:r>
@@ -5158,8 +6158,8 @@
             <w:rFonts w:ascii="Calibri" w:hAnsi="Calibri" w:eastAsia="PingFang SC"/>
             <w:color w:val="2E74B5"/>
             <w:u w:val="single"/>
-            <w:sz w:val="19"/>
-            <w:szCs w:val="19"/>
+            <w:sz w:val="16"/>
+            <w:szCs w:val="16"/>
           </w:rPr>
           <w:t>https://evalscope.readthedocs.io/en/refact_readme/get_started/introduction.html</w:t>
         </w:r>
@@ -5167,13 +6167,13 @@
     </w:p>
     <w:p>
       <w:pPr>
-        <w:spacing w:after="80" w:line="264" w:lineRule="auto"/>
+        <w:spacing w:after="0" w:line="216" w:lineRule="auto"/>
         <w:ind w:left="360" w:hanging="360"/>
       </w:pPr>
       <w:r>
         <w:rPr>
           <w:rFonts w:ascii="Calibri" w:hAnsi="Calibri" w:eastAsia="PingFang SC"/>
-          <w:sz w:val="19"/>
+          <w:sz w:val="16"/>
         </w:rPr>
         <w:t xml:space="preserve">[3] Zhang et al. </w:t>
       </w:r>
@@ -5181,27 +6181,27 @@
         <w:rPr>
           <w:rFonts w:ascii="Calibri" w:hAnsi="Calibri" w:eastAsia="PingFang SC"/>
           <w:i/>
-          <w:sz w:val="19"/>
+          <w:sz w:val="16"/>
         </w:rPr>
         <w:t>Agent-SafetyBench: Evaluating the Safety of LLM Agents</w:t>
       </w:r>
       <w:r>
         <w:rPr>
           <w:rFonts w:ascii="Calibri" w:hAnsi="Calibri" w:eastAsia="PingFang SC"/>
-          <w:sz w:val="19"/>
+          <w:sz w:val="16"/>
         </w:rPr>
         <w:t>. arXiv:2412.14470.</w:t>
       </w:r>
     </w:p>
     <w:p>
       <w:pPr>
-        <w:spacing w:after="80" w:line="264" w:lineRule="auto"/>
+        <w:spacing w:after="0" w:line="216" w:lineRule="auto"/>
         <w:ind w:left="360" w:hanging="360"/>
       </w:pPr>
       <w:r>
         <w:rPr>
           <w:rFonts w:ascii="Calibri" w:hAnsi="Calibri" w:eastAsia="PingFang SC"/>
-          <w:sz w:val="19"/>
+          <w:sz w:val="16"/>
         </w:rPr>
         <w:t xml:space="preserve">[4] </w:t>
       </w:r>
@@ -5209,27 +6209,27 @@
         <w:rPr>
           <w:rFonts w:ascii="Calibri" w:hAnsi="Calibri" w:eastAsia="PingFang SC"/>
           <w:i/>
-          <w:sz w:val="19"/>
+          <w:sz w:val="16"/>
         </w:rPr>
         <w:t>Towards Personalized Deep Research: Benchmarks and Evaluations</w:t>
       </w:r>
       <w:r>
         <w:rPr>
           <w:rFonts w:ascii="Calibri" w:hAnsi="Calibri" w:eastAsia="PingFang SC"/>
-          <w:sz w:val="19"/>
+          <w:sz w:val="16"/>
         </w:rPr>
         <w:t>. arXiv:2509.25106.</w:t>
       </w:r>
     </w:p>
     <w:p>
       <w:pPr>
-        <w:spacing w:after="80" w:line="264" w:lineRule="auto"/>
+        <w:spacing w:after="0" w:line="216" w:lineRule="auto"/>
         <w:ind w:left="360" w:hanging="360"/>
       </w:pPr>
       <w:r>
         <w:rPr>
           <w:rFonts w:ascii="Calibri" w:hAnsi="Calibri" w:eastAsia="PingFang SC"/>
-          <w:sz w:val="19"/>
+          <w:sz w:val="16"/>
         </w:rPr>
         <w:t xml:space="preserve">[5] Wang et al. </w:t>
       </w:r>
@@ -5237,27 +6237,27 @@
         <w:rPr>
           <w:rFonts w:ascii="Calibri" w:hAnsi="Calibri" w:eastAsia="PingFang SC"/>
           <w:i/>
-          <w:sz w:val="19"/>
+          <w:sz w:val="16"/>
         </w:rPr>
         <w:t>LiveResearchBench: A Live Benchmark for User-Centric Deep Research in the Wild</w:t>
       </w:r>
       <w:r>
         <w:rPr>
           <w:rFonts w:ascii="Calibri" w:hAnsi="Calibri" w:eastAsia="PingFang SC"/>
-          <w:sz w:val="19"/>
+          <w:sz w:val="16"/>
         </w:rPr>
         <w:t>. arXiv:2510.14240.</w:t>
       </w:r>
     </w:p>
     <w:p>
       <w:pPr>
-        <w:spacing w:after="80" w:line="264" w:lineRule="auto"/>
+        <w:spacing w:after="0" w:line="216" w:lineRule="auto"/>
         <w:ind w:left="360" w:hanging="360"/>
       </w:pPr>
       <w:r>
         <w:rPr>
           <w:rFonts w:ascii="Calibri" w:hAnsi="Calibri" w:eastAsia="PingFang SC"/>
-          <w:sz w:val="19"/>
+          <w:sz w:val="16"/>
         </w:rPr>
         <w:t xml:space="preserve">[6] Sharma et al. </w:t>
       </w:r>
@@ -5265,27 +6265,27 @@
         <w:rPr>
           <w:rFonts w:ascii="Calibri" w:hAnsi="Calibri" w:eastAsia="PingFang SC"/>
           <w:i/>
-          <w:sz w:val="19"/>
+          <w:sz w:val="16"/>
         </w:rPr>
         <w:t>ResearchRubrics: A Benchmark of Prompts and Rubrics for Evaluating Deep Research Agents</w:t>
       </w:r>
       <w:r>
         <w:rPr>
           <w:rFonts w:ascii="Calibri" w:hAnsi="Calibri" w:eastAsia="PingFang SC"/>
-          <w:sz w:val="19"/>
+          <w:sz w:val="16"/>
         </w:rPr>
         <w:t>. arXiv:2511.07685.</w:t>
       </w:r>
     </w:p>
     <w:p>
       <w:pPr>
-        <w:spacing w:after="80" w:line="264" w:lineRule="auto"/>
+        <w:spacing w:after="0" w:line="216" w:lineRule="auto"/>
         <w:ind w:left="360" w:hanging="360"/>
       </w:pPr>
       <w:r>
         <w:rPr>
           <w:rFonts w:ascii="Calibri" w:hAnsi="Calibri" w:eastAsia="PingFang SC"/>
-          <w:sz w:val="19"/>
+          <w:sz w:val="16"/>
         </w:rPr>
         <w:t xml:space="preserve">[7] Java et al. </w:t>
       </w:r>
@@ -5293,27 +6293,27 @@
         <w:rPr>
           <w:rFonts w:ascii="Calibri" w:hAnsi="Calibri" w:eastAsia="PingFang SC"/>
           <w:i/>
-          <w:sz w:val="19"/>
+          <w:sz w:val="16"/>
         </w:rPr>
         <w:t>Characterizing Deep Research: A Benchmark and Formal Definition</w:t>
       </w:r>
       <w:r>
         <w:rPr>
           <w:rFonts w:ascii="Calibri" w:hAnsi="Calibri" w:eastAsia="PingFang SC"/>
-          <w:sz w:val="19"/>
+          <w:sz w:val="16"/>
         </w:rPr>
         <w:t>. arXiv:2508.04183.</w:t>
       </w:r>
     </w:p>
     <w:p>
       <w:pPr>
-        <w:spacing w:after="80" w:line="264" w:lineRule="auto"/>
+        <w:spacing w:after="0" w:line="216" w:lineRule="auto"/>
         <w:ind w:left="360" w:hanging="360"/>
       </w:pPr>
       <w:r>
         <w:rPr>
           <w:rFonts w:ascii="Calibri" w:hAnsi="Calibri" w:eastAsia="PingFang SC"/>
-          <w:sz w:val="19"/>
+          <w:sz w:val="16"/>
         </w:rPr>
         <w:t xml:space="preserve">[8] Yoran et al. </w:t>
       </w:r>
@@ -5321,27 +6321,27 @@
         <w:rPr>
           <w:rFonts w:ascii="Calibri" w:hAnsi="Calibri" w:eastAsia="PingFang SC"/>
           <w:i/>
-          <w:sz w:val="19"/>
+          <w:sz w:val="16"/>
         </w:rPr>
         <w:t>AssistantBench: Can Web Agents Solve Realistic and Time-Consuming Tasks?</w:t>
       </w:r>
       <w:r>
         <w:rPr>
           <w:rFonts w:ascii="Calibri" w:hAnsi="Calibri" w:eastAsia="PingFang SC"/>
-          <w:sz w:val="19"/>
+          <w:sz w:val="16"/>
         </w:rPr>
         <w:t xml:space="preserve"> arXiv:2407.15711.</w:t>
       </w:r>
     </w:p>
     <w:p>
       <w:pPr>
-        <w:spacing w:after="80" w:line="264" w:lineRule="auto"/>
+        <w:spacing w:after="0" w:line="216" w:lineRule="auto"/>
         <w:ind w:left="360" w:hanging="360"/>
       </w:pPr>
       <w:r>
         <w:rPr>
           <w:rFonts w:ascii="Calibri" w:hAnsi="Calibri" w:eastAsia="PingFang SC"/>
-          <w:sz w:val="19"/>
+          <w:sz w:val="16"/>
         </w:rPr>
         <w:t xml:space="preserve">[9] Liang et al. </w:t>
       </w:r>
@@ -5349,27 +6349,27 @@
         <w:rPr>
           <w:rFonts w:ascii="Calibri" w:hAnsi="Calibri" w:eastAsia="PingFang SC"/>
           <w:i/>
-          <w:sz w:val="19"/>
+          <w:sz w:val="16"/>
         </w:rPr>
         <w:t>Holistic Evaluation of Language Models</w:t>
       </w:r>
       <w:r>
         <w:rPr>
           <w:rFonts w:ascii="Calibri" w:hAnsi="Calibri" w:eastAsia="PingFang SC"/>
-          <w:sz w:val="19"/>
+          <w:sz w:val="16"/>
         </w:rPr>
         <w:t>. TMLR, 2023.</w:t>
       </w:r>
     </w:p>
     <w:p>
       <w:pPr>
-        <w:spacing w:after="80" w:line="264" w:lineRule="auto"/>
+        <w:spacing w:after="0" w:line="216" w:lineRule="auto"/>
         <w:ind w:left="360" w:hanging="360"/>
       </w:pPr>
       <w:r>
         <w:rPr>
           <w:rFonts w:ascii="Calibri" w:hAnsi="Calibri" w:eastAsia="PingFang SC"/>
-          <w:sz w:val="19"/>
+          <w:sz w:val="16"/>
         </w:rPr>
         <w:t xml:space="preserve">[10] Ribeiro et al. </w:t>
       </w:r>
@@ -5377,27 +6377,27 @@
         <w:rPr>
           <w:rFonts w:ascii="Calibri" w:hAnsi="Calibri" w:eastAsia="PingFang SC"/>
           <w:i/>
-          <w:sz w:val="19"/>
+          <w:sz w:val="16"/>
         </w:rPr>
         <w:t>Beyond Accuracy: Behavioral Testing of NLP Models with CheckList</w:t>
       </w:r>
       <w:r>
         <w:rPr>
           <w:rFonts w:ascii="Calibri" w:hAnsi="Calibri" w:eastAsia="PingFang SC"/>
-          <w:sz w:val="19"/>
+          <w:sz w:val="16"/>
         </w:rPr>
         <w:t>. ACL, 2020.</w:t>
       </w:r>
     </w:p>
     <w:p>
       <w:pPr>
-        <w:spacing w:after="80" w:line="264" w:lineRule="auto"/>
+        <w:spacing w:after="0" w:line="216" w:lineRule="auto"/>
         <w:ind w:left="360" w:hanging="360"/>
       </w:pPr>
       <w:r>
         <w:rPr>
           <w:rFonts w:ascii="Calibri" w:hAnsi="Calibri" w:eastAsia="PingFang SC"/>
-          <w:sz w:val="19"/>
+          <w:sz w:val="16"/>
         </w:rPr>
         <w:t xml:space="preserve">[11] Reuel et al. </w:t>
       </w:r>
@@ -5405,27 +6405,27 @@
         <w:rPr>
           <w:rFonts w:ascii="Calibri" w:hAnsi="Calibri" w:eastAsia="PingFang SC"/>
           <w:i/>
-          <w:sz w:val="19"/>
+          <w:sz w:val="16"/>
         </w:rPr>
         <w:t>BetterBench: Assessing AI Benchmarks, Uncovering Issues, and Establishing Best Practices</w:t>
       </w:r>
       <w:r>
         <w:rPr>
           <w:rFonts w:ascii="Calibri" w:hAnsi="Calibri" w:eastAsia="PingFang SC"/>
-          <w:sz w:val="19"/>
+          <w:sz w:val="16"/>
         </w:rPr>
         <w:t>. arXiv:2411.12990.</w:t>
       </w:r>
     </w:p>
     <w:p>
       <w:pPr>
-        <w:spacing w:after="80" w:line="264" w:lineRule="auto"/>
+        <w:spacing w:after="0" w:line="216" w:lineRule="auto"/>
         <w:ind w:left="360" w:hanging="360"/>
       </w:pPr>
       <w:r>
         <w:rPr>
           <w:rFonts w:ascii="Calibri" w:hAnsi="Calibri" w:eastAsia="PingFang SC"/>
-          <w:sz w:val="19"/>
+          <w:sz w:val="16"/>
         </w:rPr>
         <w:t xml:space="preserve">[12] Sokol et al. </w:t>
       </w:r>
@@ -5433,27 +6433,27 @@
         <w:rPr>
           <w:rFonts w:ascii="Calibri" w:hAnsi="Calibri" w:eastAsia="PingFang SC"/>
           <w:i/>
-          <w:sz w:val="19"/>
+          <w:sz w:val="16"/>
         </w:rPr>
         <w:t>BenchmarkCards: Standardized Documentation for Large Language Model Benchmarks</w:t>
       </w:r>
       <w:r>
         <w:rPr>
           <w:rFonts w:ascii="Calibri" w:hAnsi="Calibri" w:eastAsia="PingFang SC"/>
-          <w:sz w:val="19"/>
+          <w:sz w:val="16"/>
         </w:rPr>
         <w:t>. NeurIPS Datasets and Benchmarks, 2025.</w:t>
       </w:r>
     </w:p>
     <w:p>
       <w:pPr>
-        <w:spacing w:after="80" w:line="264" w:lineRule="auto"/>
+        <w:spacing w:after="0" w:line="216" w:lineRule="auto"/>
         <w:ind w:left="360" w:hanging="360"/>
       </w:pPr>
       <w:r>
         <w:rPr>
           <w:rFonts w:ascii="Calibri" w:hAnsi="Calibri" w:eastAsia="PingFang SC"/>
-          <w:sz w:val="19"/>
+          <w:sz w:val="16"/>
         </w:rPr>
         <w:t xml:space="preserve">[13] Zeng et al. </w:t>
       </w:r>
@@ -5461,27 +6461,27 @@
         <w:rPr>
           <w:rFonts w:ascii="Calibri" w:hAnsi="Calibri" w:eastAsia="PingFang SC"/>
           <w:i/>
-          <w:sz w:val="19"/>
+          <w:sz w:val="16"/>
         </w:rPr>
         <w:t>Setoka</w:t>
       </w:r>
       <w:r>
         <w:rPr>
           <w:rFonts w:ascii="Calibri" w:hAnsi="Calibri" w:eastAsia="PingFang SC"/>
-          <w:sz w:val="19"/>
+          <w:sz w:val="16"/>
         </w:rPr>
         <w:t>. arXiv:2607.27056, 2026.</w:t>
       </w:r>
     </w:p>
     <w:p>
       <w:pPr>
-        <w:spacing w:after="80" w:line="264" w:lineRule="auto"/>
+        <w:spacing w:after="0" w:line="216" w:lineRule="auto"/>
         <w:ind w:left="360" w:hanging="360"/>
       </w:pPr>
       <w:r>
         <w:rPr>
           <w:rFonts w:ascii="Calibri" w:hAnsi="Calibri" w:eastAsia="PingFang SC"/>
-          <w:sz w:val="19"/>
+          <w:sz w:val="16"/>
         </w:rPr>
         <w:t xml:space="preserve">[14] Qian et al. </w:t>
       </w:r>
@@ -5489,27 +6489,27 @@
         <w:rPr>
           <w:rFonts w:ascii="Calibri" w:hAnsi="Calibri" w:eastAsia="PingFang SC"/>
           <w:i/>
-          <w:sz w:val="19"/>
+          <w:sz w:val="16"/>
         </w:rPr>
         <w:t>Toward User-Conditioned Evaluation of Personal LLM Agents under Temporal Interventions</w:t>
       </w:r>
       <w:r>
         <w:rPr>
           <w:rFonts w:ascii="Calibri" w:hAnsi="Calibri" w:eastAsia="PingFang SC"/>
-          <w:sz w:val="19"/>
+          <w:sz w:val="16"/>
         </w:rPr>
         <w:t>. arXiv:2607.21635, 2026.</w:t>
       </w:r>
     </w:p>
     <w:p>
       <w:pPr>
-        <w:spacing w:after="80" w:line="264" w:lineRule="auto"/>
+        <w:spacing w:after="0" w:line="216" w:lineRule="auto"/>
         <w:ind w:left="360" w:hanging="360"/>
       </w:pPr>
       <w:r>
         <w:rPr>
           <w:rFonts w:ascii="Calibri" w:hAnsi="Calibri" w:eastAsia="PingFang SC"/>
-          <w:sz w:val="19"/>
+          <w:sz w:val="16"/>
         </w:rPr>
         <w:t xml:space="preserve">[15] Yang et al. </w:t>
       </w:r>
@@ -5517,27 +6517,27 @@
         <w:rPr>
           <w:rFonts w:ascii="Calibri" w:hAnsi="Calibri" w:eastAsia="PingFang SC"/>
           <w:i/>
-          <w:sz w:val="19"/>
+          <w:sz w:val="16"/>
         </w:rPr>
         <w:t>PersonaTrail</w:t>
       </w:r>
       <w:r>
         <w:rPr>
           <w:rFonts w:ascii="Calibri" w:hAnsi="Calibri" w:eastAsia="PingFang SC"/>
-          <w:sz w:val="19"/>
+          <w:sz w:val="16"/>
         </w:rPr>
         <w:t>. arXiv:2607.20482, 2026.</w:t>
       </w:r>
     </w:p>
     <w:p>
       <w:pPr>
-        <w:spacing w:after="80" w:line="264" w:lineRule="auto"/>
+        <w:spacing w:after="0" w:line="216" w:lineRule="auto"/>
         <w:ind w:left="360" w:hanging="360"/>
       </w:pPr>
       <w:r>
         <w:rPr>
           <w:rFonts w:ascii="Calibri" w:hAnsi="Calibri" w:eastAsia="PingFang SC"/>
-          <w:sz w:val="19"/>
+          <w:sz w:val="16"/>
         </w:rPr>
         <w:t xml:space="preserve">[16] Todisco et al. </w:t>
       </w:r>
@@ -5545,27 +6545,27 @@
         <w:rPr>
           <w:rFonts w:ascii="Calibri" w:hAnsi="Calibri" w:eastAsia="PingFang SC"/>
           <w:i/>
-          <w:sz w:val="19"/>
+          <w:sz w:val="16"/>
         </w:rPr>
         <w:t>TARS</w:t>
       </w:r>
       <w:r>
         <w:rPr>
           <w:rFonts w:ascii="Calibri" w:hAnsi="Calibri" w:eastAsia="PingFang SC"/>
-          <w:sz w:val="19"/>
+          <w:sz w:val="16"/>
         </w:rPr>
         <w:t>. arXiv:2607.15948, 2026.</w:t>
       </w:r>
     </w:p>
     <w:p>
       <w:pPr>
-        <w:spacing w:after="80" w:line="264" w:lineRule="auto"/>
+        <w:spacing w:after="0" w:line="216" w:lineRule="auto"/>
         <w:ind w:left="360" w:hanging="360"/>
       </w:pPr>
       <w:r>
         <w:rPr>
           <w:rFonts w:ascii="Calibri" w:hAnsi="Calibri" w:eastAsia="PingFang SC"/>
-          <w:sz w:val="19"/>
+          <w:sz w:val="16"/>
         </w:rPr>
         <w:t xml:space="preserve">[17] Yang. </w:t>
       </w:r>
@@ -5573,27 +6573,27 @@
         <w:rPr>
           <w:rFonts w:ascii="Calibri" w:hAnsi="Calibri" w:eastAsia="PingFang SC"/>
           <w:i/>
-          <w:sz w:val="19"/>
+          <w:sz w:val="16"/>
         </w:rPr>
         <w:t>Self-Aware Recursively Self-Improving Agents for Personal Singularity</w:t>
       </w:r>
       <w:r>
         <w:rPr>
           <w:rFonts w:ascii="Calibri" w:hAnsi="Calibri" w:eastAsia="PingFang SC"/>
-          <w:sz w:val="19"/>
+          <w:sz w:val="16"/>
         </w:rPr>
         <w:t>. arXiv:2607.12254, 2026.</w:t>
       </w:r>
     </w:p>
     <w:p>
       <w:pPr>
-        <w:spacing w:after="80" w:line="264" w:lineRule="auto"/>
+        <w:spacing w:after="0" w:line="216" w:lineRule="auto"/>
         <w:ind w:left="360" w:hanging="360"/>
       </w:pPr>
       <w:r>
         <w:rPr>
           <w:rFonts w:ascii="Calibri" w:hAnsi="Calibri" w:eastAsia="PingFang SC"/>
-          <w:sz w:val="19"/>
+          <w:sz w:val="16"/>
         </w:rPr>
         <w:t xml:space="preserve">[18] Mao et al. </w:t>
       </w:r>
@@ -5601,27 +6601,27 @@
         <w:rPr>
           <w:rFonts w:ascii="Calibri" w:hAnsi="Calibri" w:eastAsia="PingFang SC"/>
           <w:i/>
-          <w:sz w:val="19"/>
+          <w:sz w:val="16"/>
         </w:rPr>
         <w:t>Agents Don't Just Agree, They Remember</w:t>
       </w:r>
       <w:r>
         <w:rPr>
           <w:rFonts w:ascii="Calibri" w:hAnsi="Calibri" w:eastAsia="PingFang SC"/>
-          <w:sz w:val="19"/>
+          <w:sz w:val="16"/>
         </w:rPr>
         <w:t>. arXiv:2607.10526, 2026.</w:t>
       </w:r>
     </w:p>
     <w:p>
       <w:pPr>
-        <w:spacing w:after="80" w:line="264" w:lineRule="auto"/>
+        <w:spacing w:after="0" w:line="216" w:lineRule="auto"/>
         <w:ind w:left="360" w:hanging="360"/>
       </w:pPr>
       <w:r>
         <w:rPr>
           <w:rFonts w:ascii="Calibri" w:hAnsi="Calibri" w:eastAsia="PingFang SC"/>
-          <w:sz w:val="19"/>
+          <w:sz w:val="16"/>
         </w:rPr>
         <w:t xml:space="preserve">[19] Yang et al. </w:t>
       </w:r>
@@ -5629,27 +6629,27 @@
         <w:rPr>
           <w:rFonts w:ascii="Calibri" w:hAnsi="Calibri" w:eastAsia="PingFang SC"/>
           <w:i/>
-          <w:sz w:val="19"/>
+          <w:sz w:val="16"/>
         </w:rPr>
         <w:t>APeB</w:t>
       </w:r>
       <w:r>
         <w:rPr>
           <w:rFonts w:ascii="Calibri" w:hAnsi="Calibri" w:eastAsia="PingFang SC"/>
-          <w:sz w:val="19"/>
+          <w:sz w:val="16"/>
         </w:rPr>
         <w:t>. arXiv:2607.03162, 2026.</w:t>
       </w:r>
     </w:p>
     <w:p>
       <w:pPr>
-        <w:spacing w:after="80" w:line="264" w:lineRule="auto"/>
+        <w:spacing w:after="0" w:line="216" w:lineRule="auto"/>
         <w:ind w:left="360" w:hanging="360"/>
       </w:pPr>
       <w:r>
         <w:rPr>
           <w:rFonts w:ascii="Calibri" w:hAnsi="Calibri" w:eastAsia="PingFang SC"/>
-          <w:sz w:val="19"/>
+          <w:sz w:val="16"/>
         </w:rPr>
         <w:t xml:space="preserve">[20] Salemi et al. </w:t>
       </w:r>
@@ -5657,14 +6657,14 @@
         <w:rPr>
           <w:rFonts w:ascii="Calibri" w:hAnsi="Calibri" w:eastAsia="PingFang SC"/>
           <w:i/>
-          <w:sz w:val="19"/>
+          <w:sz w:val="16"/>
         </w:rPr>
         <w:t>LaMP: When Large Language Models Meet Personalization</w:t>
       </w:r>
       <w:r>
         <w:rPr>
           <w:rFonts w:ascii="Calibri" w:hAnsi="Calibri" w:eastAsia="PingFang SC"/>
-          <w:sz w:val="19"/>
+          <w:sz w:val="16"/>
         </w:rPr>
         <w:t xml:space="preserve">. ACL, 2024. </w:t>
       </w:r>
@@ -5674,8 +6674,8 @@
             <w:rFonts w:ascii="Calibri" w:hAnsi="Calibri" w:eastAsia="PingFang SC"/>
             <w:color w:val="2E74B5"/>
             <w:u w:val="single"/>
-            <w:sz w:val="19"/>
-            <w:szCs w:val="19"/>
+            <w:sz w:val="16"/>
+            <w:szCs w:val="16"/>
           </w:rPr>
           <w:t>https://aclanthology.org/2024.acl-long.399/</w:t>
         </w:r>
@@ -5683,13 +6683,13 @@
     </w:p>
     <w:p>
       <w:pPr>
-        <w:spacing w:after="80" w:line="264" w:lineRule="auto"/>
+        <w:spacing w:after="0" w:line="216" w:lineRule="auto"/>
         <w:ind w:left="360" w:hanging="360"/>
       </w:pPr>
       <w:r>
         <w:rPr>
           <w:rFonts w:ascii="Calibri" w:hAnsi="Calibri" w:eastAsia="PingFang SC"/>
-          <w:sz w:val="19"/>
+          <w:sz w:val="16"/>
         </w:rPr>
         <w:t xml:space="preserve">[21] Singh et al. </w:t>
       </w:r>
@@ -5697,14 +6697,14 @@
         <w:rPr>
           <w:rFonts w:ascii="Calibri" w:hAnsi="Calibri" w:eastAsia="PingFang SC"/>
           <w:i/>
-          <w:sz w:val="19"/>
+          <w:sz w:val="16"/>
         </w:rPr>
         <w:t>Personal Large Language Model Agents: A Case Study on Tailored Travel Planning</w:t>
       </w:r>
       <w:r>
         <w:rPr>
           <w:rFonts w:ascii="Calibri" w:hAnsi="Calibri" w:eastAsia="PingFang SC"/>
-          <w:sz w:val="19"/>
+          <w:sz w:val="16"/>
         </w:rPr>
         <w:t xml:space="preserve">. EMNLP Industry Track, 2024. </w:t>
       </w:r>
@@ -5714,8 +6714,8 @@
             <w:rFonts w:ascii="Calibri" w:hAnsi="Calibri" w:eastAsia="PingFang SC"/>
             <w:color w:val="2E74B5"/>
             <w:u w:val="single"/>
-            <w:sz w:val="19"/>
-            <w:szCs w:val="19"/>
+            <w:sz w:val="16"/>
+            <w:szCs w:val="16"/>
           </w:rPr>
           <w:t>https://aclanthology.org/2024.emnlp-industry.37/</w:t>
         </w:r>
@@ -5723,13 +6723,13 @@
     </w:p>
     <w:p>
       <w:pPr>
-        <w:spacing w:after="80" w:line="264" w:lineRule="auto"/>
+        <w:spacing w:after="0" w:line="216" w:lineRule="auto"/>
         <w:ind w:left="360" w:hanging="360"/>
       </w:pPr>
       <w:r>
         <w:rPr>
           <w:rFonts w:ascii="Calibri" w:hAnsi="Calibri" w:eastAsia="PingFang SC"/>
-          <w:sz w:val="19"/>
+          <w:sz w:val="16"/>
         </w:rPr>
         <w:t xml:space="preserve">[22] Zhao et al. </w:t>
       </w:r>
@@ -5737,14 +6737,14 @@
         <w:rPr>
           <w:rFonts w:ascii="Calibri" w:hAnsi="Calibri" w:eastAsia="PingFang SC"/>
           <w:i/>
-          <w:sz w:val="19"/>
+          <w:sz w:val="16"/>
         </w:rPr>
         <w:t>PersonaLens</w:t>
       </w:r>
       <w:r>
         <w:rPr>
           <w:rFonts w:ascii="Calibri" w:hAnsi="Calibri" w:eastAsia="PingFang SC"/>
-          <w:sz w:val="19"/>
+          <w:sz w:val="16"/>
         </w:rPr>
         <w:t xml:space="preserve">. Findings of ACL, 2025. </w:t>
       </w:r>
@@ -5754,8 +6754,8 @@
             <w:rFonts w:ascii="Calibri" w:hAnsi="Calibri" w:eastAsia="PingFang SC"/>
             <w:color w:val="2E74B5"/>
             <w:u w:val="single"/>
-            <w:sz w:val="19"/>
-            <w:szCs w:val="19"/>
+            <w:sz w:val="16"/>
+            <w:szCs w:val="16"/>
           </w:rPr>
           <w:t>https://aclanthology.org/2025.findings-acl.927/</w:t>
         </w:r>
@@ -5763,13 +6763,13 @@
     </w:p>
     <w:p>
       <w:pPr>
-        <w:spacing w:after="80" w:line="264" w:lineRule="auto"/>
+        <w:spacing w:after="0" w:line="216" w:lineRule="auto"/>
         <w:ind w:left="360" w:hanging="360"/>
       </w:pPr>
       <w:r>
         <w:rPr>
           <w:rFonts w:ascii="Calibri" w:hAnsi="Calibri" w:eastAsia="PingFang SC"/>
-          <w:sz w:val="19"/>
+          <w:sz w:val="16"/>
         </w:rPr>
         <w:t xml:space="preserve">[23] Jiang et al. </w:t>
       </w:r>
@@ -5777,27 +6777,27 @@
         <w:rPr>
           <w:rFonts w:ascii="Calibri" w:hAnsi="Calibri" w:eastAsia="PingFang SC"/>
           <w:i/>
-          <w:sz w:val="19"/>
+          <w:sz w:val="16"/>
         </w:rPr>
         <w:t>Know Me, Respond to Me</w:t>
       </w:r>
       <w:r>
         <w:rPr>
           <w:rFonts w:ascii="Calibri" w:hAnsi="Calibri" w:eastAsia="PingFang SC"/>
-          <w:sz w:val="19"/>
+          <w:sz w:val="16"/>
         </w:rPr>
         <w:t>. arXiv:2504.14225, 2025.</w:t>
       </w:r>
     </w:p>
     <w:p>
       <w:pPr>
-        <w:spacing w:after="80" w:line="264" w:lineRule="auto"/>
+        <w:spacing w:after="0" w:line="216" w:lineRule="auto"/>
         <w:ind w:left="360" w:hanging="360"/>
       </w:pPr>
       <w:r>
         <w:rPr>
           <w:rFonts w:ascii="Calibri" w:hAnsi="Calibri" w:eastAsia="PingFang SC"/>
-          <w:sz w:val="19"/>
+          <w:sz w:val="16"/>
         </w:rPr>
         <w:t xml:space="preserve">[24] Hao et al. </w:t>
       </w:r>
@@ -5805,14 +6805,14 @@
         <w:rPr>
           <w:rFonts w:ascii="Calibri" w:hAnsi="Calibri" w:eastAsia="PingFang SC"/>
           <w:i/>
-          <w:sz w:val="19"/>
+          <w:sz w:val="16"/>
         </w:rPr>
         <w:t>Evaluating Personalized Tool-Augmented LLMs from the Perspectives of Personalization and Proactivity</w:t>
       </w:r>
       <w:r>
         <w:rPr>
           <w:rFonts w:ascii="Calibri" w:hAnsi="Calibri" w:eastAsia="PingFang SC"/>
-          <w:sz w:val="19"/>
+          <w:sz w:val="16"/>
         </w:rPr>
         <w:t xml:space="preserve">. ACL, 2025. </w:t>
       </w:r>
@@ -5822,8 +6822,8 @@
             <w:rFonts w:ascii="Calibri" w:hAnsi="Calibri" w:eastAsia="PingFang SC"/>
             <w:color w:val="2E74B5"/>
             <w:u w:val="single"/>
-            <w:sz w:val="19"/>
-            <w:szCs w:val="19"/>
+            <w:sz w:val="16"/>
+            <w:szCs w:val="16"/>
           </w:rPr>
           <w:t>https://aclanthology.org/2025.acl-long.1064/</w:t>
         </w:r>
@@ -5831,13 +6831,13 @@
     </w:p>
     <w:p>
       <w:pPr>
-        <w:spacing w:after="80" w:line="264" w:lineRule="auto"/>
+        <w:spacing w:after="0" w:line="216" w:lineRule="auto"/>
         <w:ind w:left="360" w:hanging="360"/>
       </w:pPr>
       <w:r>
         <w:rPr>
           <w:rFonts w:ascii="Calibri" w:hAnsi="Calibri" w:eastAsia="PingFang SC"/>
-          <w:sz w:val="19"/>
+          <w:sz w:val="16"/>
         </w:rPr>
         <w:t xml:space="preserve">[25] Cheng et al. </w:t>
       </w:r>
@@ -5845,27 +6845,27 @@
         <w:rPr>
           <w:rFonts w:ascii="Calibri" w:hAnsi="Calibri" w:eastAsia="PingFang SC"/>
           <w:i/>
-          <w:sz w:val="19"/>
+          <w:sz w:val="16"/>
         </w:rPr>
         <w:t>ToolSpectrum</w:t>
       </w:r>
       <w:r>
         <w:rPr>
           <w:rFonts w:ascii="Calibri" w:hAnsi="Calibri" w:eastAsia="PingFang SC"/>
-          <w:sz w:val="19"/>
+          <w:sz w:val="16"/>
         </w:rPr>
         <w:t>. arXiv:2505.13176, 2025.</w:t>
       </w:r>
     </w:p>
     <w:p>
       <w:pPr>
-        <w:spacing w:after="80" w:line="264" w:lineRule="auto"/>
+        <w:spacing w:after="0" w:line="216" w:lineRule="auto"/>
         <w:ind w:left="360" w:hanging="360"/>
       </w:pPr>
       <w:r>
         <w:rPr>
           <w:rFonts w:ascii="Calibri" w:hAnsi="Calibri" w:eastAsia="PingFang SC"/>
-          <w:sz w:val="19"/>
+          <w:sz w:val="16"/>
         </w:rPr>
         <w:t xml:space="preserve">[26] Zhang et al. </w:t>
       </w:r>
@@ -5873,14 +6873,14 @@
         <w:rPr>
           <w:rFonts w:ascii="Calibri" w:hAnsi="Calibri" w:eastAsia="PingFang SC"/>
           <w:i/>
-          <w:sz w:val="19"/>
+          <w:sz w:val="16"/>
         </w:rPr>
         <w:t>PRIME</w:t>
       </w:r>
       <w:r>
         <w:rPr>
           <w:rFonts w:ascii="Calibri" w:hAnsi="Calibri" w:eastAsia="PingFang SC"/>
-          <w:sz w:val="19"/>
+          <w:sz w:val="16"/>
         </w:rPr>
         <w:t xml:space="preserve">. EMNLP, 2025. </w:t>
       </w:r>
@@ -5890,8 +6890,8 @@
             <w:rFonts w:ascii="Calibri" w:hAnsi="Calibri" w:eastAsia="PingFang SC"/>
             <w:color w:val="2E74B5"/>
             <w:u w:val="single"/>
-            <w:sz w:val="19"/>
-            <w:szCs w:val="19"/>
+            <w:sz w:val="16"/>
+            <w:szCs w:val="16"/>
           </w:rPr>
           <w:t>https://aclanthology.org/2025.emnlp-main.1711/</w:t>
         </w:r>
@@ -5899,13 +6899,13 @@
     </w:p>
     <w:p>
       <w:pPr>
-        <w:spacing w:after="80" w:line="264" w:lineRule="auto"/>
+        <w:spacing w:after="0" w:line="216" w:lineRule="auto"/>
         <w:ind w:left="360" w:hanging="360"/>
       </w:pPr>
       <w:r>
         <w:rPr>
           <w:rFonts w:ascii="Calibri" w:hAnsi="Calibri" w:eastAsia="PingFang SC"/>
-          <w:sz w:val="19"/>
+          <w:sz w:val="16"/>
         </w:rPr>
         <w:t xml:space="preserve">[27] Li et al. </w:t>
       </w:r>
@@ -5913,27 +6913,27 @@
         <w:rPr>
           <w:rFonts w:ascii="Calibri" w:hAnsi="Calibri" w:eastAsia="PingFang SC"/>
           <w:i/>
-          <w:sz w:val="19"/>
+          <w:sz w:val="16"/>
         </w:rPr>
         <w:t>Personalized Deep Research: A User-Centric Framework, Dataset, and Hybrid Evaluation</w:t>
       </w:r>
       <w:r>
         <w:rPr>
           <w:rFonts w:ascii="Calibri" w:hAnsi="Calibri" w:eastAsia="PingFang SC"/>
-          <w:sz w:val="19"/>
+          <w:sz w:val="16"/>
         </w:rPr>
         <w:t>. arXiv:2605.10530, 2026.</w:t>
       </w:r>
     </w:p>
     <w:p>
       <w:pPr>
-        <w:spacing w:after="80" w:line="264" w:lineRule="auto"/>
+        <w:spacing w:after="0" w:line="216" w:lineRule="auto"/>
         <w:ind w:left="360" w:hanging="360"/>
       </w:pPr>
       <w:r>
         <w:rPr>
           <w:rFonts w:ascii="Calibri" w:hAnsi="Calibri" w:eastAsia="PingFang SC"/>
-          <w:sz w:val="19"/>
+          <w:sz w:val="16"/>
         </w:rPr>
         <w:t xml:space="preserve">[28] Balepur et al. </w:t>
       </w:r>
@@ -5941,14 +6941,14 @@
         <w:rPr>
           <w:rFonts w:ascii="Calibri" w:hAnsi="Calibri" w:eastAsia="PingFang SC"/>
           <w:i/>
-          <w:sz w:val="19"/>
+          <w:sz w:val="16"/>
         </w:rPr>
         <w:t>Language Models Don't Know What You Want</w:t>
       </w:r>
       <w:r>
         <w:rPr>
           <w:rFonts w:ascii="Calibri" w:hAnsi="Calibri" w:eastAsia="PingFang SC"/>
-          <w:sz w:val="19"/>
+          <w:sz w:val="16"/>
         </w:rPr>
         <w:t xml:space="preserve">. ACL, 2026. </w:t>
       </w:r>
@@ -5958,8 +6958,8 @@
             <w:rFonts w:ascii="Calibri" w:hAnsi="Calibri" w:eastAsia="PingFang SC"/>
             <w:color w:val="2E74B5"/>
             <w:u w:val="single"/>
-            <w:sz w:val="19"/>
-            <w:szCs w:val="19"/>
+            <w:sz w:val="16"/>
+            <w:szCs w:val="16"/>
           </w:rPr>
           <w:t>https://aclanthology.org/2026.acl-long.723/</w:t>
         </w:r>
@@ -5967,13 +6967,13 @@
     </w:p>
     <w:p>
       <w:pPr>
-        <w:spacing w:after="80" w:line="264" w:lineRule="auto"/>
+        <w:spacing w:after="0" w:line="216" w:lineRule="auto"/>
         <w:ind w:left="360" w:hanging="360"/>
       </w:pPr>
       <w:r>
         <w:rPr>
           <w:rFonts w:ascii="Calibri" w:hAnsi="Calibri" w:eastAsia="PingFang SC"/>
-          <w:sz w:val="19"/>
+          <w:sz w:val="16"/>
         </w:rPr>
         <w:t xml:space="preserve">[29] Garbacea et al. </w:t>
       </w:r>
@@ -5981,14 +6981,14 @@
         <w:rPr>
           <w:rFonts w:ascii="Calibri" w:hAnsi="Calibri" w:eastAsia="PingFang SC"/>
           <w:i/>
-          <w:sz w:val="19"/>
+          <w:sz w:val="16"/>
         </w:rPr>
         <w:t>Personalized Benchmarking: Evaluating LLMs by Individual Preferences</w:t>
       </w:r>
       <w:r>
         <w:rPr>
           <w:rFonts w:ascii="Calibri" w:hAnsi="Calibri" w:eastAsia="PingFang SC"/>
-          <w:sz w:val="19"/>
+          <w:sz w:val="16"/>
         </w:rPr>
         <w:t xml:space="preserve">. Findings of ACL, 2026. </w:t>
       </w:r>
@@ -5998,8 +6998,8 @@
             <w:rFonts w:ascii="Calibri" w:hAnsi="Calibri" w:eastAsia="PingFang SC"/>
             <w:color w:val="2E74B5"/>
             <w:u w:val="single"/>
-            <w:sz w:val="19"/>
-            <w:szCs w:val="19"/>
+            <w:sz w:val="16"/>
+            <w:szCs w:val="16"/>
           </w:rPr>
           <w:t>https://aclanthology.org/2026.findings-acl.31/</w:t>
         </w:r>
@@ -6007,13 +7007,13 @@
     </w:p>
     <w:p>
       <w:pPr>
-        <w:spacing w:after="80" w:line="264" w:lineRule="auto"/>
+        <w:spacing w:after="0" w:line="216" w:lineRule="auto"/>
         <w:ind w:left="360" w:hanging="360"/>
       </w:pPr>
       <w:r>
         <w:rPr>
           <w:rFonts w:ascii="Calibri" w:hAnsi="Calibri" w:eastAsia="PingFang SC"/>
-          <w:sz w:val="19"/>
+          <w:sz w:val="16"/>
         </w:rPr>
         <w:t xml:space="preserve">[30] Feng et al. </w:t>
       </w:r>
@@ -6021,27 +7021,27 @@
         <w:rPr>
           <w:rFonts w:ascii="Calibri" w:hAnsi="Calibri" w:eastAsia="PingFang SC"/>
           <w:i/>
-          <w:sz w:val="19"/>
+          <w:sz w:val="16"/>
         </w:rPr>
         <w:t>How Does Personalized Memory Shape LLM Behavior?</w:t>
       </w:r>
       <w:r>
         <w:rPr>
           <w:rFonts w:ascii="Calibri" w:hAnsi="Calibri" w:eastAsia="PingFang SC"/>
-          <w:sz w:val="19"/>
+          <w:sz w:val="16"/>
         </w:rPr>
         <w:t xml:space="preserve"> arXiv:2601.16621, 2026.</w:t>
       </w:r>
     </w:p>
     <w:p>
       <w:pPr>
-        <w:spacing w:after="80" w:line="264" w:lineRule="auto"/>
+        <w:spacing w:after="0" w:line="216" w:lineRule="auto"/>
         <w:ind w:left="360" w:hanging="360"/>
       </w:pPr>
       <w:r>
         <w:rPr>
           <w:rFonts w:ascii="Calibri" w:hAnsi="Calibri" w:eastAsia="PingFang SC"/>
-          <w:sz w:val="19"/>
+          <w:sz w:val="16"/>
         </w:rPr>
         <w:t xml:space="preserve">[31] Liang et al. </w:t>
       </w:r>
@@ -6049,27 +7049,27 @@
         <w:rPr>
           <w:rFonts w:ascii="Calibri" w:hAnsi="Calibri" w:eastAsia="PingFang SC"/>
           <w:i/>
-          <w:sz w:val="19"/>
+          <w:sz w:val="16"/>
         </w:rPr>
         <w:t>Learning Personalized Agents from Human Feedback</w:t>
       </w:r>
       <w:r>
         <w:rPr>
           <w:rFonts w:ascii="Calibri" w:hAnsi="Calibri" w:eastAsia="PingFang SC"/>
-          <w:sz w:val="19"/>
+          <w:sz w:val="16"/>
         </w:rPr>
         <w:t>. arXiv:2602.16173, 2026.</w:t>
       </w:r>
     </w:p>
     <w:p>
       <w:pPr>
-        <w:spacing w:after="80" w:line="264" w:lineRule="auto"/>
+        <w:spacing w:after="0" w:line="216" w:lineRule="auto"/>
         <w:ind w:left="360" w:hanging="360"/>
       </w:pPr>
       <w:r>
         <w:rPr>
           <w:rFonts w:ascii="Calibri" w:hAnsi="Calibri" w:eastAsia="PingFang SC"/>
-          <w:sz w:val="19"/>
+          <w:sz w:val="16"/>
         </w:rPr>
         <w:t xml:space="preserve">[32] In et al. </w:t>
       </w:r>
@@ -6077,27 +7077,27 @@
         <w:rPr>
           <w:rFonts w:ascii="Calibri" w:hAnsi="Calibri" w:eastAsia="PingFang SC"/>
           <w:i/>
-          <w:sz w:val="19"/>
+          <w:sz w:val="16"/>
         </w:rPr>
         <w:t>Personalize-then-Store</w:t>
       </w:r>
       <w:r>
         <w:rPr>
           <w:rFonts w:ascii="Calibri" w:hAnsi="Calibri" w:eastAsia="PingFang SC"/>
-          <w:sz w:val="19"/>
+          <w:sz w:val="16"/>
         </w:rPr>
         <w:t>. arXiv:2605.25535, 2026.</w:t>
       </w:r>
     </w:p>
     <w:p>
       <w:pPr>
-        <w:spacing w:after="80" w:line="264" w:lineRule="auto"/>
+        <w:spacing w:after="0" w:line="216" w:lineRule="auto"/>
         <w:ind w:left="360" w:hanging="360"/>
       </w:pPr>
       <w:r>
         <w:rPr>
           <w:rFonts w:ascii="Calibri" w:hAnsi="Calibri" w:eastAsia="PingFang SC"/>
-          <w:sz w:val="19"/>
+          <w:sz w:val="16"/>
         </w:rPr>
         <w:t xml:space="preserve">[33] Uddin et al. </w:t>
       </w:r>
@@ -6105,14 +7105,14 @@
         <w:rPr>
           <w:rFonts w:ascii="Calibri" w:hAnsi="Calibri" w:eastAsia="PingFang SC"/>
           <w:i/>
-          <w:sz w:val="19"/>
+          <w:sz w:val="16"/>
         </w:rPr>
         <w:t>From Recall to Forgetting</w:t>
       </w:r>
       <w:r>
         <w:rPr>
           <w:rFonts w:ascii="Calibri" w:hAnsi="Calibri" w:eastAsia="PingFang SC"/>
-          <w:sz w:val="19"/>
+          <w:sz w:val="16"/>
         </w:rPr>
         <w:t xml:space="preserve">. Findings of ACL, 2026. </w:t>
       </w:r>
@@ -6122,8 +7122,8 @@
             <w:rFonts w:ascii="Calibri" w:hAnsi="Calibri" w:eastAsia="PingFang SC"/>
             <w:color w:val="2E74B5"/>
             <w:u w:val="single"/>
-            <w:sz w:val="19"/>
-            <w:szCs w:val="19"/>
+            <w:sz w:val="16"/>
+            <w:szCs w:val="16"/>
           </w:rPr>
           <w:t>https://aclanthology.org/2026.findings-acl.1337/</w:t>
         </w:r>
@@ -6131,13 +7131,13 @@
     </w:p>
     <w:p>
       <w:pPr>
-        <w:spacing w:after="80" w:line="264" w:lineRule="auto"/>
+        <w:spacing w:after="0" w:line="216" w:lineRule="auto"/>
         <w:ind w:left="360" w:hanging="360"/>
       </w:pPr>
       <w:r>
         <w:rPr>
           <w:rFonts w:ascii="Calibri" w:hAnsi="Calibri" w:eastAsia="PingFang SC"/>
-          <w:sz w:val="19"/>
+          <w:sz w:val="16"/>
         </w:rPr>
         <w:t xml:space="preserve">[34] Hu et al. </w:t>
       </w:r>
@@ -6145,14 +7145,14 @@
         <w:rPr>
           <w:rFonts w:ascii="Calibri" w:hAnsi="Calibri" w:eastAsia="PingFang SC"/>
           <w:i/>
-          <w:sz w:val="19"/>
+          <w:sz w:val="16"/>
         </w:rPr>
         <w:t>CloneMem</w:t>
       </w:r>
       <w:r>
         <w:rPr>
           <w:rFonts w:ascii="Calibri" w:hAnsi="Calibri" w:eastAsia="PingFang SC"/>
-          <w:sz w:val="19"/>
+          <w:sz w:val="16"/>
         </w:rPr>
         <w:t xml:space="preserve">. ACL, 2026. </w:t>
       </w:r>
@@ -6162,8 +7162,8 @@
             <w:rFonts w:ascii="Calibri" w:hAnsi="Calibri" w:eastAsia="PingFang SC"/>
             <w:color w:val="2E74B5"/>
             <w:u w:val="single"/>
-            <w:sz w:val="19"/>
-            <w:szCs w:val="19"/>
+            <w:sz w:val="16"/>
+            <w:szCs w:val="16"/>
           </w:rPr>
           <w:t>https://aclanthology.org/2026.acl-long.1549/</w:t>
         </w:r>
@@ -6171,13 +7171,13 @@
     </w:p>
     <w:p>
       <w:pPr>
-        <w:spacing w:after="80" w:line="264" w:lineRule="auto"/>
+        <w:spacing w:after="0" w:line="216" w:lineRule="auto"/>
         <w:ind w:left="360" w:hanging="360"/>
       </w:pPr>
       <w:r>
         <w:rPr>
           <w:rFonts w:ascii="Calibri" w:hAnsi="Calibri" w:eastAsia="PingFang SC"/>
-          <w:sz w:val="19"/>
+          <w:sz w:val="16"/>
         </w:rPr>
         <w:t xml:space="preserve">[35] Shen et al. </w:t>
       </w:r>
@@ -6185,14 +7185,14 @@
         <w:rPr>
           <w:rFonts w:ascii="Calibri" w:hAnsi="Calibri" w:eastAsia="PingFang SC"/>
           <w:i/>
-          <w:sz w:val="19"/>
+          <w:sz w:val="16"/>
         </w:rPr>
         <w:t>Mem2ActBench</w:t>
       </w:r>
       <w:r>
         <w:rPr>
           <w:rFonts w:ascii="Calibri" w:hAnsi="Calibri" w:eastAsia="PingFang SC"/>
-          <w:sz w:val="19"/>
+          <w:sz w:val="16"/>
         </w:rPr>
         <w:t xml:space="preserve">. ACL, 2026. </w:t>
       </w:r>
@@ -6202,8 +7202,8 @@
             <w:rFonts w:ascii="Calibri" w:hAnsi="Calibri" w:eastAsia="PingFang SC"/>
             <w:color w:val="2E74B5"/>
             <w:u w:val="single"/>
-            <w:sz w:val="19"/>
-            <w:szCs w:val="19"/>
+            <w:sz w:val="16"/>
+            <w:szCs w:val="16"/>
           </w:rPr>
           <w:t>https://aclanthology.org/2026.acl-long.370/</w:t>
         </w:r>
@@ -6211,13 +7211,13 @@
     </w:p>
     <w:p>
       <w:pPr>
-        <w:spacing w:after="80" w:line="264" w:lineRule="auto"/>
+        <w:spacing w:after="0" w:line="216" w:lineRule="auto"/>
         <w:ind w:left="360" w:hanging="360"/>
       </w:pPr>
       <w:r>
         <w:rPr>
           <w:rFonts w:ascii="Calibri" w:hAnsi="Calibri" w:eastAsia="PingFang SC"/>
-          <w:sz w:val="19"/>
+          <w:sz w:val="16"/>
         </w:rPr>
         <w:t xml:space="preserve">[36] Chen et al. </w:t>
       </w:r>
@@ -6225,14 +7225,14 @@
         <w:rPr>
           <w:rFonts w:ascii="Calibri" w:hAnsi="Calibri" w:eastAsia="PingFang SC"/>
           <w:i/>
-          <w:sz w:val="19"/>
+          <w:sz w:val="16"/>
         </w:rPr>
         <w:t>Towards Preference Following in Tool Calling Language Agents</w:t>
       </w:r>
       <w:r>
         <w:rPr>
           <w:rFonts w:ascii="Calibri" w:hAnsi="Calibri" w:eastAsia="PingFang SC"/>
-          <w:sz w:val="19"/>
+          <w:sz w:val="16"/>
         </w:rPr>
         <w:t xml:space="preserve">. Findings of ACL, 2026. </w:t>
       </w:r>
@@ -6242,8 +7242,8 @@
             <w:rFonts w:ascii="Calibri" w:hAnsi="Calibri" w:eastAsia="PingFang SC"/>
             <w:color w:val="2E74B5"/>
             <w:u w:val="single"/>
-            <w:sz w:val="19"/>
-            <w:szCs w:val="19"/>
+            <w:sz w:val="16"/>
+            <w:szCs w:val="16"/>
           </w:rPr>
           <w:t>https://aclanthology.org/2026.findings-acl.1676/</w:t>
         </w:r>
@@ -6251,13 +7251,13 @@
     </w:p>
     <w:p>
       <w:pPr>
-        <w:spacing w:after="80" w:line="264" w:lineRule="auto"/>
+        <w:spacing w:after="0" w:line="216" w:lineRule="auto"/>
         <w:ind w:left="360" w:hanging="360"/>
       </w:pPr>
       <w:r>
         <w:rPr>
           <w:rFonts w:ascii="Calibri" w:hAnsi="Calibri" w:eastAsia="PingFang SC"/>
-          <w:sz w:val="19"/>
+          <w:sz w:val="16"/>
         </w:rPr>
         <w:t xml:space="preserve">[37] Lyu et al. </w:t>
       </w:r>
@@ -6265,14 +7265,14 @@
         <w:rPr>
           <w:rFonts w:ascii="Calibri" w:hAnsi="Calibri" w:eastAsia="PingFang SC"/>
           <w:i/>
-          <w:sz w:val="19"/>
+          <w:sz w:val="16"/>
         </w:rPr>
         <w:t>PersonalAlign</w:t>
       </w:r>
       <w:r>
         <w:rPr>
           <w:rFonts w:ascii="Calibri" w:hAnsi="Calibri" w:eastAsia="PingFang SC"/>
-          <w:sz w:val="19"/>
+          <w:sz w:val="16"/>
         </w:rPr>
         <w:t xml:space="preserve">. ACL, 2026. </w:t>
       </w:r>
@@ -6282,8 +7282,8 @@
             <w:rFonts w:ascii="Calibri" w:hAnsi="Calibri" w:eastAsia="PingFang SC"/>
             <w:color w:val="2E74B5"/>
             <w:u w:val="single"/>
-            <w:sz w:val="19"/>
-            <w:szCs w:val="19"/>
+            <w:sz w:val="16"/>
+            <w:szCs w:val="16"/>
           </w:rPr>
           <w:t>https://aclanthology.org/2026.acl-long.1669/</w:t>
         </w:r>
@@ -6291,13 +7291,13 @@
     </w:p>
     <w:p>
       <w:pPr>
-        <w:spacing w:after="80" w:line="264" w:lineRule="auto"/>
+        <w:spacing w:after="0" w:line="216" w:lineRule="auto"/>
         <w:ind w:left="360" w:hanging="360"/>
       </w:pPr>
       <w:r>
         <w:rPr>
           <w:rFonts w:ascii="Calibri" w:hAnsi="Calibri" w:eastAsia="PingFang SC"/>
-          <w:sz w:val="19"/>
+          <w:sz w:val="16"/>
         </w:rPr>
         <w:t xml:space="preserve">[38] Wang et al. </w:t>
       </w:r>
@@ -6305,14 +7305,14 @@
         <w:rPr>
           <w:rFonts w:ascii="Calibri" w:hAnsi="Calibri" w:eastAsia="PingFang SC"/>
           <w:i/>
-          <w:sz w:val="19"/>
+          <w:sz w:val="16"/>
         </w:rPr>
         <w:t>OPeRA</w:t>
       </w:r>
       <w:r>
         <w:rPr>
           <w:rFonts w:ascii="Calibri" w:hAnsi="Calibri" w:eastAsia="PingFang SC"/>
-          <w:sz w:val="19"/>
+          <w:sz w:val="16"/>
         </w:rPr>
         <w:t xml:space="preserve">. ACL, 2026. </w:t>
       </w:r>
@@ -6322,8 +7322,8 @@
             <w:rFonts w:ascii="Calibri" w:hAnsi="Calibri" w:eastAsia="PingFang SC"/>
             <w:color w:val="2E74B5"/>
             <w:u w:val="single"/>
-            <w:sz w:val="19"/>
-            <w:szCs w:val="19"/>
+            <w:sz w:val="16"/>
+            <w:szCs w:val="16"/>
           </w:rPr>
           <w:t>https://aclanthology.org/2026.acl-long.2033/</w:t>
         </w:r>
@@ -6331,13 +7331,13 @@
     </w:p>
     <w:p>
       <w:pPr>
-        <w:spacing w:after="80" w:line="264" w:lineRule="auto"/>
+        <w:spacing w:after="0" w:line="216" w:lineRule="auto"/>
         <w:ind w:left="360" w:hanging="360"/>
       </w:pPr>
       <w:r>
         <w:rPr>
           <w:rFonts w:ascii="Calibri" w:hAnsi="Calibri" w:eastAsia="PingFang SC"/>
-          <w:sz w:val="19"/>
+          <w:sz w:val="16"/>
         </w:rPr>
         <w:t xml:space="preserve">[39] Guo et al. </w:t>
       </w:r>
@@ -6345,14 +7345,14 @@
         <w:rPr>
           <w:rFonts w:ascii="Calibri" w:hAnsi="Calibri" w:eastAsia="PingFang SC"/>
           <w:i/>
-          <w:sz w:val="19"/>
+          <w:sz w:val="16"/>
         </w:rPr>
         <w:t>When Personalization Legitimizes Risks</w:t>
       </w:r>
       <w:r>
         <w:rPr>
           <w:rFonts w:ascii="Calibri" w:hAnsi="Calibri" w:eastAsia="PingFang SC"/>
-          <w:sz w:val="19"/>
+          <w:sz w:val="16"/>
         </w:rPr>
         <w:t xml:space="preserve">. ACL, 2026. </w:t>
       </w:r>
@@ -6362,8 +7362,8 @@
             <w:rFonts w:ascii="Calibri" w:hAnsi="Calibri" w:eastAsia="PingFang SC"/>
             <w:color w:val="2E74B5"/>
             <w:u w:val="single"/>
-            <w:sz w:val="19"/>
-            <w:szCs w:val="19"/>
+            <w:sz w:val="16"/>
+            <w:szCs w:val="16"/>
           </w:rPr>
           <w:t>https://aclanthology.org/2026.acl-long.1260/</w:t>
         </w:r>
@@ -6371,13 +7371,13 @@
     </w:p>
     <w:p>
       <w:pPr>
-        <w:spacing w:after="80" w:line="264" w:lineRule="auto"/>
+        <w:spacing w:after="0" w:line="216" w:lineRule="auto"/>
         <w:ind w:left="360" w:hanging="360"/>
       </w:pPr>
       <w:r>
         <w:rPr>
           <w:rFonts w:ascii="Calibri" w:hAnsi="Calibri" w:eastAsia="PingFang SC"/>
-          <w:sz w:val="19"/>
+          <w:sz w:val="16"/>
         </w:rPr>
         <w:t xml:space="preserve">[40] Weeber et al. </w:t>
       </w:r>
@@ -6385,14 +7385,14 @@
         <w:rPr>
           <w:rFonts w:ascii="Calibri" w:hAnsi="Calibri" w:eastAsia="PingFang SC"/>
           <w:i/>
-          <w:sz w:val="19"/>
+          <w:sz w:val="16"/>
         </w:rPr>
         <w:t>One Persona, Many Cues, Different Results</w:t>
       </w:r>
       <w:r>
         <w:rPr>
           <w:rFonts w:ascii="Calibri" w:hAnsi="Calibri" w:eastAsia="PingFang SC"/>
-          <w:sz w:val="19"/>
+          <w:sz w:val="16"/>
         </w:rPr>
         <w:t xml:space="preserve">. ACL, 2026. </w:t>
       </w:r>
@@ -6402,8 +7402,8 @@
             <w:rFonts w:ascii="Calibri" w:hAnsi="Calibri" w:eastAsia="PingFang SC"/>
             <w:color w:val="2E74B5"/>
             <w:u w:val="single"/>
-            <w:sz w:val="19"/>
-            <w:szCs w:val="19"/>
+            <w:sz w:val="16"/>
+            <w:szCs w:val="16"/>
           </w:rPr>
           <w:t>https://aclanthology.org/2026.acl-long.2079/</w:t>
         </w:r>
@@ -6411,13 +7411,13 @@
     </w:p>
     <w:p>
       <w:pPr>
-        <w:spacing w:after="80" w:line="264" w:lineRule="auto"/>
+        <w:spacing w:after="0" w:line="216" w:lineRule="auto"/>
         <w:ind w:left="360" w:hanging="360"/>
       </w:pPr>
       <w:r>
         <w:rPr>
           <w:rFonts w:ascii="Calibri" w:hAnsi="Calibri" w:eastAsia="PingFang SC"/>
-          <w:sz w:val="19"/>
+          <w:sz w:val="16"/>
         </w:rPr>
         <w:t xml:space="preserve">[41] Qiu et al. </w:t>
       </w:r>
@@ -6425,14 +7425,14 @@
         <w:rPr>
           <w:rFonts w:ascii="Calibri" w:hAnsi="Calibri" w:eastAsia="PingFang SC"/>
           <w:i/>
-          <w:sz w:val="19"/>
+          <w:sz w:val="16"/>
         </w:rPr>
         <w:t>Preference-Aware Rubric Learning for Personalized Evaluation</w:t>
       </w:r>
       <w:r>
         <w:rPr>
           <w:rFonts w:ascii="Calibri" w:hAnsi="Calibri" w:eastAsia="PingFang SC"/>
-          <w:sz w:val="19"/>
+          <w:sz w:val="16"/>
         </w:rPr>
         <w:t xml:space="preserve">. arXiv:2605.31545, 2026. </w:t>
       </w:r>
@@ -6442,8 +7442,8 @@
             <w:rFonts w:ascii="Calibri" w:hAnsi="Calibri" w:eastAsia="PingFang SC"/>
             <w:color w:val="2E74B5"/>
             <w:u w:val="single"/>
-            <w:sz w:val="19"/>
-            <w:szCs w:val="19"/>
+            <w:sz w:val="16"/>
+            <w:szCs w:val="16"/>
           </w:rPr>
           <w:t>https://arxiv.org/abs/2605.31545</w:t>
         </w:r>
@@ -6476,7 +7476,7 @@
         <w:color w:val="5B6B7A"/>
         <w:sz w:val="18"/>
       </w:rPr>
-      <w:t xml:space="preserve">2026-8-3   ·   </w:t>
+      <w:t xml:space="preserve">2026-8-8   ·   </w:t>
     </w:r>
     <w:r>
       <w:rPr>
@@ -6509,7 +7509,7 @@
         <w:color w:val="5B6B7A"/>
         <w:sz w:val="18"/>
       </w:rPr>
-      <w:t xml:space="preserve">2026-8-3   ·   </w:t>
+      <w:t xml:space="preserve">2026-8-8   ·   </w:t>
     </w:r>
     <w:r>
       <w:rPr>
@@ -6542,7 +7542,7 @@
         <w:color w:val="5B6B7A"/>
         <w:sz w:val="18"/>
       </w:rPr>
-      <w:t xml:space="preserve">2026-8-3   ·   </w:t>
+      <w:t xml:space="preserve">2026-8-8   ·   </w:t>
     </w:r>
     <w:r>
       <w:rPr>
@@ -6884,6 +7884,12 @@
     </w:lvlOverride>
   </w:num>
   <w:num w:numId="20">
+    <w:abstractNumId w:val="0"/>
+    <w:lvlOverride w:ilvl="0">
+      <w:startOverride w:val="1"/>
+    </w:lvlOverride>
+  </w:num>
+  <w:num w:numId="21">
     <w:abstractNumId w:val="0"/>
     <w:lvlOverride w:ilvl="0">
       <w:startOverride w:val="1"/>

</xml_diff>

<commit_message>
proposal v0.29: operationalize data factory and rubric library
</commit_message>
<xml_diff>
--- a/deliverables/DeepAlign-Bench_完整人话版.docx
+++ b/deliverables/DeepAlign-Bench_完整人话版.docx
@@ -131,7 +131,7 @@
                 <w:color w:val="5B6B7A"/>
                 <w:sz w:val="21"/>
               </w:rPr>
-              <w:t>v0.28 · 完整人话版</w:t>
+              <w:t>v0.29 · 完整人话版</w:t>
             </w:r>
           </w:p>
         </w:tc>
@@ -2349,6 +2349,14 @@
         <w:rPr>
           <w:rFonts w:ascii="Calibri" w:hAnsi="Calibri" w:eastAsia="PingFang SC"/>
         </w:rPr>
+        <w:t>先不要把很多论文里的 task/persona/rubric 直接拼在一起。建一张 source-to-design ledger：每篇论文的一条设计资产只能先标成 task seed、用户信息 construct、压力/失败假设、rubric/judge 方法或运行基础设施；同时写清采用什么、改了什么、为什么不采用其余部分。这样 PDR 的 persona-aware 评分、Agent-SafetyBench 的 failure 组织、PaperBench 的原子 rubric 和 EvalScope 的 adapter 不会被错误地当作同一层 taxonomy。</w:t>
+      </w:r>
+    </w:p>
+    <w:p>
+      <w:r>
+        <w:rPr>
+          <w:rFonts w:ascii="Calibri" w:hAnsi="Calibri" w:eastAsia="PingFang SC"/>
+        </w:rPr>
         <w:t>Task family 不是“旅行类”“学术类”这样的标签，而是一套能生成受控条件的蓝图。实际按八步做：</w:t>
       </w:r>
     </w:p>
@@ -3034,45 +3042,19 @@
       </w:r>
     </w:p>
     <w:p>
-      <w:pPr>
-        <w:pStyle w:val="Heading2"/>
-      </w:pPr>
-      <w:r>
-        <w:t>5.3 压力测试</w:t>
+      <w:r>
+        <w:rPr>
+          <w:rFonts w:ascii="Calibri" w:hAnsi="Calibri" w:eastAsia="PingFang SC"/>
+        </w:rPr>
+        <w:t>不建议现在同时把三条都搭完整。先用 2 个 family、2 个 agent 把 E1 从 reset 跑到 2×2 评分；然后用 1 个 anchor 搭 E3 的 checkpoint、冲突和更新；最后拿 1 个商业产品做 E2 记录 smoke test。E1 和一个 E3 事件跑不通前，不要批量写几十个 task。</w:t>
       </w:r>
     </w:p>
     <w:p>
-      <w:r>
-        <w:rPr>
-          <w:rFonts w:ascii="Calibri" w:hAnsi="Calibri" w:eastAsia="PingFang SC"/>
-        </w:rPr>
-        <w:t>这里要分清两件事：</w:t>
-      </w:r>
-      <w:r>
-        <w:rPr>
-          <w:rFonts w:ascii="Calibri" w:hAnsi="Calibri" w:eastAsia="PingFang SC"/>
-          <w:b/>
-        </w:rPr>
-        <w:t>persona 与 task 匹配</w:t>
-      </w:r>
-      <w:r>
-        <w:rPr>
-          <w:rFonts w:ascii="Calibri" w:hAnsi="Calibri" w:eastAsia="PingFang SC"/>
-        </w:rPr>
-        <w:t>用于先做出一组有效的干净题；</w:t>
-      </w:r>
-      <w:r>
-        <w:rPr>
-          <w:rFonts w:ascii="Calibri" w:hAnsi="Calibri" w:eastAsia="PingFang SC"/>
-          <w:b/>
-        </w:rPr>
-        <w:t>压力测试</w:t>
-      </w:r>
-      <w:r>
-        <w:rPr>
-          <w:rFonts w:ascii="Calibri" w:hAnsi="Calibri" w:eastAsia="PingFang SC"/>
-        </w:rPr>
-        <w:t>是在这组题上单独改一个输入或过程因素。Anchor family 只是从 24 个 family 中选出的 8 个合适实验宿主，不是 8 种 persona，也不等于 8 种失败。</w:t>
+      <w:pPr>
+        <w:pStyle w:val="Heading2"/>
+      </w:pPr>
+      <w:r>
+        <w:t>5.3 压力测试</w:t>
       </w:r>
     </w:p>
     <w:p>
@@ -3080,18 +3062,41 @@
         <w:rPr>
           <w:rFonts w:ascii="Calibri" w:hAnsi="Calibri" w:eastAsia="PingFang SC"/>
         </w:rPr>
-        <w:t>先固定目标用户、任务、证据和预算，再做以下配对改变：</w:t>
+        <w:t>这里要分清两件事：</w:t>
+      </w:r>
+      <w:r>
+        <w:rPr>
+          <w:rFonts w:ascii="Calibri" w:hAnsi="Calibri" w:eastAsia="PingFang SC"/>
+          <w:b/>
+        </w:rPr>
+        <w:t>persona 与 task 匹配</w:t>
+      </w:r>
+      <w:r>
+        <w:rPr>
+          <w:rFonts w:ascii="Calibri" w:hAnsi="Calibri" w:eastAsia="PingFang SC"/>
+        </w:rPr>
+        <w:t>用于先做出一组有效的干净题；</w:t>
+      </w:r>
+      <w:r>
+        <w:rPr>
+          <w:rFonts w:ascii="Calibri" w:hAnsi="Calibri" w:eastAsia="PingFang SC"/>
+          <w:b/>
+        </w:rPr>
+        <w:t>压力测试</w:t>
+      </w:r>
+      <w:r>
+        <w:rPr>
+          <w:rFonts w:ascii="Calibri" w:hAnsi="Calibri" w:eastAsia="PingFang SC"/>
+        </w:rPr>
+        <w:t>是在这组题上单独改一个输入或过程因素。Anchor family 只是从 24 个 family 中选出的 8 个合适实验宿主，不是 8 种 persona，也不等于 8 种失败。</w:t>
       </w:r>
     </w:p>
     <w:p>
-      <w:pPr>
-        <w:pStyle w:val="ListBullet"/>
-      </w:pPr>
-      <w:r>
-        <w:rPr>
-          <w:rFonts w:ascii="Calibri" w:hAnsi="Calibri" w:eastAsia="PingFang SC"/>
-        </w:rPr>
-        <w:t>把用户 A 的 persona 错配给用户 B；</w:t>
+      <w:r>
+        <w:rPr>
+          <w:rFonts w:ascii="Calibri" w:hAnsi="Calibri" w:eastAsia="PingFang SC"/>
+        </w:rPr>
+        <w:t>先固定目标用户、任务、证据和预算，再做以下配对改变：</w:t>
       </w:r>
     </w:p>
     <w:p>
@@ -3102,7 +3107,7 @@
         <w:rPr>
           <w:rFonts w:ascii="Calibri" w:hAnsi="Calibri" w:eastAsia="PingFang SC"/>
         </w:rPr>
-        <w:t>加入与任务无关的个人信息；</w:t>
+        <w:t>把用户 A 的 persona 错配给用户 B；</w:t>
       </w:r>
     </w:p>
     <w:p>
@@ -3113,7 +3118,7 @@
         <w:rPr>
           <w:rFonts w:ascii="Calibri" w:hAnsi="Calibri" w:eastAsia="PingFang SC"/>
         </w:rPr>
-        <w:t>同时提供新旧冲突信息；</w:t>
+        <w:t>加入与任务无关的个人信息；</w:t>
       </w:r>
     </w:p>
     <w:p>
@@ -3124,7 +3129,7 @@
         <w:rPr>
           <w:rFonts w:ascii="Calibri" w:hAnsi="Calibri" w:eastAsia="PingFang SC"/>
         </w:rPr>
-        <w:t>把关键信息埋进更长上下文；</w:t>
+        <w:t>同时提供新旧冲突信息；</w:t>
       </w:r>
     </w:p>
     <w:p>
@@ -3135,7 +3140,7 @@
         <w:rPr>
           <w:rFonts w:ascii="Calibri" w:hAnsi="Calibri" w:eastAsia="PingFang SC"/>
         </w:rPr>
-        <w:t>在子 agent 交接时删除或保留用户模型；</w:t>
+        <w:t>把关键信息埋进更长上下文；</w:t>
       </w:r>
     </w:p>
     <w:p>
@@ -3146,15 +3151,34 @@
         <w:rPr>
           <w:rFonts w:ascii="Calibri" w:hAnsi="Calibri" w:eastAsia="PingFang SC"/>
         </w:rPr>
-        <w:t>用户中途更新目标。</w:t>
+        <w:t>在子 agent 交接时删除或保留用户模型；</w:t>
       </w:r>
     </w:p>
     <w:p>
-      <w:r>
-        <w:rPr>
-          <w:rFonts w:ascii="Calibri" w:hAnsi="Calibri" w:eastAsia="PingFang SC"/>
-        </w:rPr>
-        <w:t>8 个 anchor 固定覆盖：日常决策、学习/职业、金融信息、健康信息、企业采购/合规、软件生产、学术前沿、政策传播。前三个共同对照（clean、persona swap、无关信息）在所有 anchor 上运行；冲突、稀释、handoff 和动态更新用平衡不完全区组分配，每类 failure mode 至少出现在两个不同 anchor。Anchor 只做能力压力测试，不在失败后追加提醒、纠偏或修复实验。</w:t>
+      <w:pPr>
+        <w:pStyle w:val="ListBullet"/>
+      </w:pPr>
+      <w:r>
+        <w:rPr>
+          <w:rFonts w:ascii="Calibri" w:hAnsi="Calibri" w:eastAsia="PingFang SC"/>
+        </w:rPr>
+        <w:t>用户中途更新目标。</w:t>
+      </w:r>
+    </w:p>
+    <w:p>
+      <w:r>
+        <w:rPr>
+          <w:rFonts w:ascii="Calibri" w:hAnsi="Calibri" w:eastAsia="PingFang SC"/>
+        </w:rPr>
+        <w:t>8 个 anchor 固定覆盖：日常决策、学习/职业、金融信息、健康信息、企业采购/合规、软件生产、学术前沿、政策传播。前三个共同对照（clean、persona swap、无关信息）在所有 anchor 上运行；冲突、稀释、handoff 和动态更新用平衡不完全区组分配。要说“哪种因素跨任务更伤个性化”，该主要 perturbation 至少要在 4 个适用 anchor 上做同前缀配对；只做 2 个只能叫探索性复现。</w:t>
+      </w:r>
+    </w:p>
+    <w:p>
+      <w:r>
+        <w:rPr>
+          <w:rFonts w:ascii="Calibri" w:hAnsi="Calibri" w:eastAsia="PingFang SC"/>
+        </w:rPr>
+        <w:t>所以 anchor 真正回答的是：“固定任务、证据、预算和前缀后，long-context dilution / stale conflict / handoff / update 让 CFA、PF、invariance 或 MP 改变多少？”它不能仅凭“某类任务平均低”回答内部根因。只有轨迹可比时，才进一步把结果和 acquire/preserve/use/update 的过程证据联系起来。</w:t>
       </w:r>
     </w:p>
     <w:p>
@@ -3355,6 +3379,44 @@
           <w:rFonts w:ascii="Calibri" w:hAnsi="Calibri" w:eastAsia="PingFang SC"/>
         </w:rPr>
         <w:t>：每条 leaf 进 TQ、FR、PF、MP 中的哪一个，派生指标再怎样计算。</w:t>
+      </w:r>
+    </w:p>
+    <w:p>
+      <w:pPr>
+        <w:pStyle w:val="ListBullet"/>
+      </w:pPr>
+      <w:r>
+        <w:rPr>
+          <w:rFonts w:ascii="Courier New" w:hAnsi="Courier New" w:eastAsia="PingFang SC"/>
+          <w:color w:val="6A3E00"/>
+          <w:sz w:val="20"/>
+        </w:rPr>
+        <w:t>rubric_module_library.yaml</w:t>
+      </w:r>
+      <w:r>
+        <w:rPr>
+          <w:rFonts w:ascii="Calibri" w:hAnsi="Calibri" w:eastAsia="PingFang SC"/>
+        </w:rPr>
+        <w:t>：36 个预定义 module 的激活条件、leaf blueprint、binding、judge route 与适用范围；</w:t>
+      </w:r>
+    </w:p>
+    <w:p>
+      <w:pPr>
+        <w:pStyle w:val="ListBullet"/>
+      </w:pPr>
+      <w:r>
+        <w:rPr>
+          <w:rFonts w:ascii="Courier New" w:hAnsi="Courier New" w:eastAsia="PingFang SC"/>
+          <w:color w:val="6A3E00"/>
+          <w:sz w:val="20"/>
+        </w:rPr>
+        <w:t>data_factory.protocol.yaml</w:t>
+      </w:r>
+      <w:r>
+        <w:rPr>
+          <w:rFonts w:ascii="Calibri" w:hAnsi="Calibri" w:eastAsia="PingFang SC"/>
+        </w:rPr>
+        <w:t>：从文献来源、task seed、user pair、contract 到 pilot 的造数顺序。</w:t>
       </w:r>
     </w:p>
     <w:p>
@@ -3478,6 +3540,816 @@
         <w:pStyle w:val="Heading2"/>
       </w:pPr>
       <w:r>
+        <w:t>7.1.1 预定义 module library 长什么样</w:t>
+      </w:r>
+    </w:p>
+    <w:tbl>
+      <w:tblPr>
+        <w:tblStyle w:val="TableGrid"/>
+        <w:tblW w:type="dxa" w:w="9360"/>
+        <w:jc w:val="left"/>
+        <w:tblLayout w:type="fixed"/>
+        <w:tblLook w:firstColumn="1" w:firstRow="1" w:lastColumn="0" w:lastRow="0" w:noHBand="0" w:noVBand="1" w:val="04A0"/>
+        <w:tblInd w:w="120" w:type="dxa"/>
+      </w:tblPr>
+      <w:tblGrid>
+        <w:gridCol w:w="1500"/>
+        <w:gridCol w:w="3000"/>
+        <w:gridCol w:w="2520"/>
+        <w:gridCol w:w="2340"/>
+      </w:tblGrid>
+      <w:tr>
+        <w:trPr>
+          <w:tblHeader/>
+        </w:trPr>
+        <w:tc>
+          <w:tcPr>
+            <w:tcW w:type="dxa" w:w="1500"/>
+            <w:tcMar>
+              <w:top w:w="80" w:type="dxa"/>
+              <w:start w:w="120" w:type="dxa"/>
+              <w:bottom w:w="80" w:type="dxa"/>
+              <w:end w:w="120" w:type="dxa"/>
+            </w:tcMar>
+            <w:vAlign w:val="center"/>
+            <w:shd w:fill="F4F6F9"/>
+          </w:tcPr>
+          <w:p>
+            <w:pPr>
+              <w:spacing w:before="0" w:after="40" w:line="259" w:lineRule="auto"/>
+              <w:jc w:val="center"/>
+            </w:pPr>
+            <w:r>
+              <w:rPr>
+                <w:b/>
+              </w:rPr>
+            </w:r>
+            <w:r>
+              <w:rPr>
+                <w:rFonts w:ascii="Calibri" w:hAnsi="Calibri" w:eastAsia="PingFang SC"/>
+                <w:b/>
+                <w:color w:val="163A63"/>
+                <w:sz w:val="18"/>
+              </w:rPr>
+              <w:t>Family</w:t>
+            </w:r>
+          </w:p>
+        </w:tc>
+        <w:tc>
+          <w:tcPr>
+            <w:tcW w:type="dxa" w:w="3000"/>
+            <w:tcMar>
+              <w:top w:w="80" w:type="dxa"/>
+              <w:start w:w="120" w:type="dxa"/>
+              <w:bottom w:w="80" w:type="dxa"/>
+              <w:end w:w="120" w:type="dxa"/>
+            </w:tcMar>
+            <w:vAlign w:val="center"/>
+            <w:shd w:fill="F4F6F9"/>
+          </w:tcPr>
+          <w:p>
+            <w:pPr>
+              <w:spacing w:before="0" w:after="40" w:line="259" w:lineRule="auto"/>
+              <w:jc w:val="center"/>
+            </w:pPr>
+            <w:r>
+              <w:rPr>
+                <w:b/>
+              </w:rPr>
+            </w:r>
+            <w:r>
+              <w:rPr>
+                <w:rFonts w:ascii="Calibri" w:hAnsi="Calibri" w:eastAsia="PingFang SC"/>
+                <w:b/>
+                <w:color w:val="163A63"/>
+                <w:sz w:val="18"/>
+              </w:rPr>
+              <w:t>数量</w:t>
+            </w:r>
+          </w:p>
+        </w:tc>
+        <w:tc>
+          <w:tcPr>
+            <w:tcW w:type="dxa" w:w="2520"/>
+            <w:tcMar>
+              <w:top w:w="80" w:type="dxa"/>
+              <w:start w:w="120" w:type="dxa"/>
+              <w:bottom w:w="80" w:type="dxa"/>
+              <w:end w:w="120" w:type="dxa"/>
+            </w:tcMar>
+            <w:vAlign w:val="center"/>
+            <w:shd w:fill="F4F6F9"/>
+          </w:tcPr>
+          <w:p>
+            <w:pPr>
+              <w:spacing w:before="0" w:after="40" w:line="259" w:lineRule="auto"/>
+              <w:jc w:val="center"/>
+            </w:pPr>
+            <w:r>
+              <w:rPr>
+                <w:b/>
+              </w:rPr>
+            </w:r>
+            <w:r>
+              <w:rPr>
+                <w:rFonts w:ascii="Calibri" w:hAnsi="Calibri" w:eastAsia="PingFang SC"/>
+                <w:b/>
+                <w:color w:val="163A63"/>
+                <w:sz w:val="18"/>
+              </w:rPr>
+              <w:t>例子</w:t>
+            </w:r>
+          </w:p>
+        </w:tc>
+        <w:tc>
+          <w:tcPr>
+            <w:tcW w:type="dxa" w:w="2340"/>
+            <w:tcMar>
+              <w:top w:w="80" w:type="dxa"/>
+              <w:start w:w="120" w:type="dxa"/>
+              <w:bottom w:w="80" w:type="dxa"/>
+              <w:end w:w="120" w:type="dxa"/>
+            </w:tcMar>
+            <w:vAlign w:val="center"/>
+            <w:shd w:fill="F4F6F9"/>
+          </w:tcPr>
+          <w:p>
+            <w:pPr>
+              <w:spacing w:before="0" w:after="40" w:line="259" w:lineRule="auto"/>
+              <w:jc w:val="center"/>
+            </w:pPr>
+            <w:r>
+              <w:rPr>
+                <w:b/>
+              </w:rPr>
+            </w:r>
+            <w:r>
+              <w:rPr>
+                <w:rFonts w:ascii="Calibri" w:hAnsi="Calibri" w:eastAsia="PingFang SC"/>
+                <w:b/>
+                <w:color w:val="163A63"/>
+                <w:sz w:val="18"/>
+              </w:rPr>
+              <w:t>什么时候用</w:t>
+            </w:r>
+          </w:p>
+        </w:tc>
+      </w:tr>
+      <w:tr>
+        <w:tc>
+          <w:tcPr>
+            <w:tcW w:type="dxa" w:w="1500"/>
+            <w:tcMar>
+              <w:top w:w="80" w:type="dxa"/>
+              <w:start w:w="120" w:type="dxa"/>
+              <w:bottom w:w="80" w:type="dxa"/>
+              <w:end w:w="120" w:type="dxa"/>
+            </w:tcMar>
+            <w:vAlign w:val="center"/>
+          </w:tcPr>
+          <w:p>
+            <w:pPr>
+              <w:spacing w:before="0" w:after="40" w:line="259" w:lineRule="auto"/>
+              <w:jc w:val="center"/>
+            </w:pPr>
+            <w:r/>
+            <w:r>
+              <w:rPr>
+                <w:rFonts w:ascii="Calibri" w:hAnsi="Calibri" w:eastAsia="PingFang SC"/>
+                <w:sz w:val="18"/>
+              </w:rPr>
+              <w:t>Core</w:t>
+            </w:r>
+          </w:p>
+        </w:tc>
+        <w:tc>
+          <w:tcPr>
+            <w:tcW w:type="dxa" w:w="3000"/>
+            <w:tcMar>
+              <w:top w:w="80" w:type="dxa"/>
+              <w:start w:w="120" w:type="dxa"/>
+              <w:bottom w:w="80" w:type="dxa"/>
+              <w:end w:w="120" w:type="dxa"/>
+            </w:tcMar>
+            <w:vAlign w:val="center"/>
+          </w:tcPr>
+          <w:p>
+            <w:pPr>
+              <w:spacing w:before="0" w:after="40" w:line="259" w:lineRule="auto"/>
+              <w:jc w:val="left"/>
+            </w:pPr>
+            <w:r/>
+            <w:r>
+              <w:rPr>
+                <w:rFonts w:ascii="Calibri" w:hAnsi="Calibri" w:eastAsia="PingFang SC"/>
+                <w:sz w:val="18"/>
+              </w:rPr>
+              <w:t>6</w:t>
+            </w:r>
+          </w:p>
+        </w:tc>
+        <w:tc>
+          <w:tcPr>
+            <w:tcW w:type="dxa" w:w="2520"/>
+            <w:tcMar>
+              <w:top w:w="80" w:type="dxa"/>
+              <w:start w:w="120" w:type="dxa"/>
+              <w:bottom w:w="80" w:type="dxa"/>
+              <w:end w:w="120" w:type="dxa"/>
+            </w:tcMar>
+            <w:vAlign w:val="center"/>
+          </w:tcPr>
+          <w:p>
+            <w:pPr>
+              <w:spacing w:before="0" w:after="40" w:line="259" w:lineRule="auto"/>
+              <w:jc w:val="left"/>
+            </w:pPr>
+            <w:r/>
+            <w:r>
+              <w:rPr>
+                <w:rFonts w:ascii="Calibri" w:hAnsi="Calibri" w:eastAsia="PingFang SC"/>
+                <w:sz w:val="18"/>
+              </w:rPr>
+              <w:t>任务、事实、证据、推理、不确定性、可用性</w:t>
+            </w:r>
+          </w:p>
+        </w:tc>
+        <w:tc>
+          <w:tcPr>
+            <w:tcW w:type="dxa" w:w="2340"/>
+            <w:tcMar>
+              <w:top w:w="80" w:type="dxa"/>
+              <w:start w:w="120" w:type="dxa"/>
+              <w:bottom w:w="80" w:type="dxa"/>
+              <w:end w:w="120" w:type="dxa"/>
+            </w:tcMar>
+            <w:vAlign w:val="center"/>
+          </w:tcPr>
+          <w:p>
+            <w:pPr>
+              <w:spacing w:before="0" w:after="40" w:line="259" w:lineRule="auto"/>
+              <w:jc w:val="left"/>
+            </w:pPr>
+            <w:r/>
+            <w:r>
+              <w:rPr>
+                <w:rFonts w:ascii="Calibri" w:hAnsi="Calibri" w:eastAsia="PingFang SC"/>
+                <w:sz w:val="18"/>
+              </w:rPr>
+              <w:t>所有 case 必选/条件选</w:t>
+            </w:r>
+          </w:p>
+        </w:tc>
+      </w:tr>
+      <w:tr>
+        <w:tc>
+          <w:tcPr>
+            <w:tcW w:type="dxa" w:w="1500"/>
+            <w:tcMar>
+              <w:top w:w="80" w:type="dxa"/>
+              <w:start w:w="120" w:type="dxa"/>
+              <w:bottom w:w="80" w:type="dxa"/>
+              <w:end w:w="120" w:type="dxa"/>
+            </w:tcMar>
+            <w:vAlign w:val="center"/>
+          </w:tcPr>
+          <w:p>
+            <w:pPr>
+              <w:spacing w:before="0" w:after="40" w:line="259" w:lineRule="auto"/>
+              <w:jc w:val="center"/>
+            </w:pPr>
+            <w:r/>
+            <w:r>
+              <w:rPr>
+                <w:rFonts w:ascii="Calibri" w:hAnsi="Calibri" w:eastAsia="PingFang SC"/>
+                <w:sz w:val="18"/>
+              </w:rPr>
+              <w:t>Personalization</w:t>
+            </w:r>
+          </w:p>
+        </w:tc>
+        <w:tc>
+          <w:tcPr>
+            <w:tcW w:type="dxa" w:w="3000"/>
+            <w:tcMar>
+              <w:top w:w="80" w:type="dxa"/>
+              <w:start w:w="120" w:type="dxa"/>
+              <w:bottom w:w="80" w:type="dxa"/>
+              <w:end w:w="120" w:type="dxa"/>
+            </w:tcMar>
+            <w:vAlign w:val="center"/>
+          </w:tcPr>
+          <w:p>
+            <w:pPr>
+              <w:spacing w:before="0" w:after="40" w:line="259" w:lineRule="auto"/>
+              <w:jc w:val="left"/>
+            </w:pPr>
+            <w:r/>
+            <w:r>
+              <w:rPr>
+                <w:rFonts w:ascii="Calibri" w:hAnsi="Calibri" w:eastAsia="PingFang SC"/>
+                <w:sz w:val="18"/>
+              </w:rPr>
+              <w:t>9</w:t>
+            </w:r>
+          </w:p>
+        </w:tc>
+        <w:tc>
+          <w:tcPr>
+            <w:tcW w:type="dxa" w:w="2520"/>
+            <w:tcMar>
+              <w:top w:w="80" w:type="dxa"/>
+              <w:start w:w="120" w:type="dxa"/>
+              <w:bottom w:w="80" w:type="dxa"/>
+              <w:end w:w="120" w:type="dxa"/>
+            </w:tcMar>
+            <w:vAlign w:val="center"/>
+          </w:tcPr>
+          <w:p>
+            <w:pPr>
+              <w:spacing w:before="0" w:after="40" w:line="259" w:lineRule="auto"/>
+              <w:jc w:val="left"/>
+            </w:pPr>
+            <w:r/>
+            <w:r>
+              <w:rPr>
+                <w:rFonts w:ascii="Calibri" w:hAnsi="Calibri" w:eastAsia="PingFang SC"/>
+                <w:sz w:val="18"/>
+              </w:rPr>
+              <w:t>目标、内容、知识、约束、风险、工作流、受众、格式、动态状态</w:t>
+            </w:r>
+          </w:p>
+        </w:tc>
+        <w:tc>
+          <w:tcPr>
+            <w:tcW w:type="dxa" w:w="2340"/>
+            <w:tcMar>
+              <w:top w:w="80" w:type="dxa"/>
+              <w:start w:w="120" w:type="dxa"/>
+              <w:bottom w:w="80" w:type="dxa"/>
+              <w:end w:w="120" w:type="dxa"/>
+            </w:tcMar>
+            <w:vAlign w:val="center"/>
+          </w:tcPr>
+          <w:p>
+            <w:pPr>
+              <w:spacing w:before="0" w:after="40" w:line="259" w:lineRule="auto"/>
+              <w:jc w:val="left"/>
+            </w:pPr>
+            <w:r/>
+            <w:r>
+              <w:rPr>
+                <w:rFonts w:ascii="Calibri" w:hAnsi="Calibri" w:eastAsia="PingFang SC"/>
+                <w:sz w:val="18"/>
+              </w:rPr>
+              <w:t>有授权 user fact + must-change 才激活</w:t>
+            </w:r>
+          </w:p>
+        </w:tc>
+      </w:tr>
+      <w:tr>
+        <w:tc>
+          <w:tcPr>
+            <w:tcW w:type="dxa" w:w="1500"/>
+            <w:tcMar>
+              <w:top w:w="80" w:type="dxa"/>
+              <w:start w:w="120" w:type="dxa"/>
+              <w:bottom w:w="80" w:type="dxa"/>
+              <w:end w:w="120" w:type="dxa"/>
+            </w:tcMar>
+            <w:vAlign w:val="center"/>
+          </w:tcPr>
+          <w:p>
+            <w:pPr>
+              <w:spacing w:before="0" w:after="40" w:line="259" w:lineRule="auto"/>
+              <w:jc w:val="center"/>
+            </w:pPr>
+            <w:r/>
+            <w:r>
+              <w:rPr>
+                <w:rFonts w:ascii="Calibri" w:hAnsi="Calibri" w:eastAsia="PingFang SC"/>
+                <w:sz w:val="18"/>
+              </w:rPr>
+              <w:t>Intent</w:t>
+            </w:r>
+          </w:p>
+        </w:tc>
+        <w:tc>
+          <w:tcPr>
+            <w:tcW w:type="dxa" w:w="3000"/>
+            <w:tcMar>
+              <w:top w:w="80" w:type="dxa"/>
+              <w:start w:w="120" w:type="dxa"/>
+              <w:bottom w:w="80" w:type="dxa"/>
+              <w:end w:w="120" w:type="dxa"/>
+            </w:tcMar>
+            <w:vAlign w:val="center"/>
+          </w:tcPr>
+          <w:p>
+            <w:pPr>
+              <w:spacing w:before="0" w:after="40" w:line="259" w:lineRule="auto"/>
+              <w:jc w:val="left"/>
+            </w:pPr>
+            <w:r/>
+            <w:r>
+              <w:rPr>
+                <w:rFonts w:ascii="Calibri" w:hAnsi="Calibri" w:eastAsia="PingFang SC"/>
+                <w:sz w:val="18"/>
+              </w:rPr>
+              <w:t>6</w:t>
+            </w:r>
+          </w:p>
+        </w:tc>
+        <w:tc>
+          <w:tcPr>
+            <w:tcW w:type="dxa" w:w="2520"/>
+            <w:tcMar>
+              <w:top w:w="80" w:type="dxa"/>
+              <w:start w:w="120" w:type="dxa"/>
+              <w:bottom w:w="80" w:type="dxa"/>
+              <w:end w:w="120" w:type="dxa"/>
+            </w:tcMar>
+            <w:vAlign w:val="center"/>
+          </w:tcPr>
+          <w:p>
+            <w:pPr>
+              <w:spacing w:before="0" w:after="40" w:line="259" w:lineRule="auto"/>
+              <w:jc w:val="left"/>
+            </w:pPr>
+            <w:r/>
+            <w:r>
+              <w:rPr>
+                <w:rFonts w:ascii="Calibri" w:hAnsi="Calibri" w:eastAsia="PingFang SC"/>
+                <w:sz w:val="18"/>
+              </w:rPr>
+              <w:t>synthesis / discover / decide / assess / plan / audit</w:t>
+            </w:r>
+          </w:p>
+        </w:tc>
+        <w:tc>
+          <w:tcPr>
+            <w:tcW w:type="dxa" w:w="2340"/>
+            <w:tcMar>
+              <w:top w:w="80" w:type="dxa"/>
+              <w:start w:w="120" w:type="dxa"/>
+              <w:bottom w:w="80" w:type="dxa"/>
+              <w:end w:w="120" w:type="dxa"/>
+            </w:tcMar>
+            <w:vAlign w:val="center"/>
+          </w:tcPr>
+          <w:p>
+            <w:pPr>
+              <w:spacing w:before="0" w:after="40" w:line="259" w:lineRule="auto"/>
+              <w:jc w:val="left"/>
+            </w:pPr>
+            <w:r/>
+            <w:r>
+              <w:rPr>
+                <w:rFonts w:ascii="Calibri" w:hAnsi="Calibri" w:eastAsia="PingFang SC"/>
+                <w:sz w:val="18"/>
+              </w:rPr>
+              <w:t>每个 case 主选 1 个</w:t>
+            </w:r>
+          </w:p>
+        </w:tc>
+      </w:tr>
+      <w:tr>
+        <w:tc>
+          <w:tcPr>
+            <w:tcW w:type="dxa" w:w="1500"/>
+            <w:tcMar>
+              <w:top w:w="80" w:type="dxa"/>
+              <w:start w:w="120" w:type="dxa"/>
+              <w:bottom w:w="80" w:type="dxa"/>
+              <w:end w:w="120" w:type="dxa"/>
+            </w:tcMar>
+            <w:vAlign w:val="center"/>
+          </w:tcPr>
+          <w:p>
+            <w:pPr>
+              <w:spacing w:before="0" w:after="40" w:line="259" w:lineRule="auto"/>
+              <w:jc w:val="center"/>
+            </w:pPr>
+            <w:r/>
+            <w:r>
+              <w:rPr>
+                <w:rFonts w:ascii="Calibri" w:hAnsi="Calibri" w:eastAsia="PingFang SC"/>
+                <w:sz w:val="18"/>
+              </w:rPr>
+              <w:t>Deliverable</w:t>
+            </w:r>
+          </w:p>
+        </w:tc>
+        <w:tc>
+          <w:tcPr>
+            <w:tcW w:type="dxa" w:w="3000"/>
+            <w:tcMar>
+              <w:top w:w="80" w:type="dxa"/>
+              <w:start w:w="120" w:type="dxa"/>
+              <w:bottom w:w="80" w:type="dxa"/>
+              <w:end w:w="120" w:type="dxa"/>
+            </w:tcMar>
+            <w:vAlign w:val="center"/>
+          </w:tcPr>
+          <w:p>
+            <w:pPr>
+              <w:spacing w:before="0" w:after="40" w:line="259" w:lineRule="auto"/>
+              <w:jc w:val="left"/>
+            </w:pPr>
+            <w:r/>
+            <w:r>
+              <w:rPr>
+                <w:rFonts w:ascii="Calibri" w:hAnsi="Calibri" w:eastAsia="PingFang SC"/>
+                <w:sz w:val="18"/>
+              </w:rPr>
+              <w:t>7</w:t>
+            </w:r>
+          </w:p>
+        </w:tc>
+        <w:tc>
+          <w:tcPr>
+            <w:tcW w:type="dxa" w:w="2520"/>
+            <w:tcMar>
+              <w:top w:w="80" w:type="dxa"/>
+              <w:start w:w="120" w:type="dxa"/>
+              <w:bottom w:w="80" w:type="dxa"/>
+              <w:end w:w="120" w:type="dxa"/>
+            </w:tcMar>
+            <w:vAlign w:val="center"/>
+          </w:tcPr>
+          <w:p>
+            <w:pPr>
+              <w:spacing w:before="0" w:after="40" w:line="259" w:lineRule="auto"/>
+              <w:jc w:val="left"/>
+            </w:pPr>
+            <w:r/>
+            <w:r>
+              <w:rPr>
+                <w:rFonts w:ascii="Calibri" w:hAnsi="Calibri" w:eastAsia="PingFang SC"/>
+                <w:sz w:val="18"/>
+              </w:rPr>
+              <w:t>report / memo / table / code / slides / web / multi-file</w:t>
+            </w:r>
+          </w:p>
+        </w:tc>
+        <w:tc>
+          <w:tcPr>
+            <w:tcW w:type="dxa" w:w="2340"/>
+            <w:tcMar>
+              <w:top w:w="80" w:type="dxa"/>
+              <w:start w:w="120" w:type="dxa"/>
+              <w:bottom w:w="80" w:type="dxa"/>
+              <w:end w:w="120" w:type="dxa"/>
+            </w:tcMar>
+            <w:vAlign w:val="center"/>
+          </w:tcPr>
+          <w:p>
+            <w:pPr>
+              <w:spacing w:before="0" w:after="40" w:line="259" w:lineRule="auto"/>
+              <w:jc w:val="left"/>
+            </w:pPr>
+            <w:r/>
+            <w:r>
+              <w:rPr>
+                <w:rFonts w:ascii="Calibri" w:hAnsi="Calibri" w:eastAsia="PingFang SC"/>
+                <w:sz w:val="18"/>
+              </w:rPr>
+              <w:t>每个 case 主选 1 个</w:t>
+            </w:r>
+          </w:p>
+        </w:tc>
+      </w:tr>
+      <w:tr>
+        <w:tc>
+          <w:tcPr>
+            <w:tcW w:type="dxa" w:w="1500"/>
+            <w:tcMar>
+              <w:top w:w="80" w:type="dxa"/>
+              <w:start w:w="120" w:type="dxa"/>
+              <w:bottom w:w="80" w:type="dxa"/>
+              <w:end w:w="120" w:type="dxa"/>
+            </w:tcMar>
+            <w:vAlign w:val="center"/>
+          </w:tcPr>
+          <w:p>
+            <w:pPr>
+              <w:spacing w:before="0" w:after="40" w:line="259" w:lineRule="auto"/>
+              <w:jc w:val="center"/>
+            </w:pPr>
+            <w:r/>
+            <w:r>
+              <w:rPr>
+                <w:rFonts w:ascii="Calibri" w:hAnsi="Calibri" w:eastAsia="PingFang SC"/>
+                <w:sz w:val="18"/>
+              </w:rPr>
+              <w:t>Operator</w:t>
+            </w:r>
+          </w:p>
+        </w:tc>
+        <w:tc>
+          <w:tcPr>
+            <w:tcW w:type="dxa" w:w="3000"/>
+            <w:tcMar>
+              <w:top w:w="80" w:type="dxa"/>
+              <w:start w:w="120" w:type="dxa"/>
+              <w:bottom w:w="80" w:type="dxa"/>
+              <w:end w:w="120" w:type="dxa"/>
+            </w:tcMar>
+            <w:vAlign w:val="center"/>
+          </w:tcPr>
+          <w:p>
+            <w:pPr>
+              <w:spacing w:before="0" w:after="40" w:line="259" w:lineRule="auto"/>
+              <w:jc w:val="left"/>
+            </w:pPr>
+            <w:r/>
+            <w:r>
+              <w:rPr>
+                <w:rFonts w:ascii="Calibri" w:hAnsi="Calibri" w:eastAsia="PingFang SC"/>
+                <w:sz w:val="18"/>
+              </w:rPr>
+              <w:t>4</w:t>
+            </w:r>
+          </w:p>
+        </w:tc>
+        <w:tc>
+          <w:tcPr>
+            <w:tcW w:type="dxa" w:w="2520"/>
+            <w:tcMar>
+              <w:top w:w="80" w:type="dxa"/>
+              <w:start w:w="120" w:type="dxa"/>
+              <w:bottom w:w="80" w:type="dxa"/>
+              <w:end w:w="120" w:type="dxa"/>
+            </w:tcMar>
+            <w:vAlign w:val="center"/>
+          </w:tcPr>
+          <w:p>
+            <w:pPr>
+              <w:spacing w:before="0" w:after="40" w:line="259" w:lineRule="auto"/>
+              <w:jc w:val="left"/>
+            </w:pPr>
+            <w:r/>
+            <w:r>
+              <w:rPr>
+                <w:rFonts w:ascii="Calibri" w:hAnsi="Calibri" w:eastAsia="PingFang SC"/>
+                <w:sz w:val="18"/>
+              </w:rPr>
+              <w:t>acquire / preserve / use / update</w:t>
+            </w:r>
+          </w:p>
+        </w:tc>
+        <w:tc>
+          <w:tcPr>
+            <w:tcW w:type="dxa" w:w="2340"/>
+            <w:tcMar>
+              <w:top w:w="80" w:type="dxa"/>
+              <w:start w:w="120" w:type="dxa"/>
+              <w:bottom w:w="80" w:type="dxa"/>
+              <w:end w:w="120" w:type="dxa"/>
+            </w:tcMar>
+            <w:vAlign w:val="center"/>
+          </w:tcPr>
+          <w:p>
+            <w:pPr>
+              <w:spacing w:before="0" w:after="40" w:line="259" w:lineRule="auto"/>
+              <w:jc w:val="left"/>
+            </w:pPr>
+            <w:r/>
+            <w:r>
+              <w:rPr>
+                <w:rFonts w:ascii="Calibri" w:hAnsi="Calibri" w:eastAsia="PingFang SC"/>
+                <w:sz w:val="18"/>
+              </w:rPr>
+              <w:t>受控诊断，不从 final-only 猜</w:t>
+            </w:r>
+          </w:p>
+        </w:tc>
+      </w:tr>
+      <w:tr>
+        <w:tc>
+          <w:tcPr>
+            <w:tcW w:type="dxa" w:w="1500"/>
+            <w:tcMar>
+              <w:top w:w="80" w:type="dxa"/>
+              <w:start w:w="120" w:type="dxa"/>
+              <w:bottom w:w="80" w:type="dxa"/>
+              <w:end w:w="120" w:type="dxa"/>
+            </w:tcMar>
+            <w:vAlign w:val="center"/>
+          </w:tcPr>
+          <w:p>
+            <w:pPr>
+              <w:spacing w:before="0" w:after="40" w:line="259" w:lineRule="auto"/>
+              <w:jc w:val="center"/>
+            </w:pPr>
+            <w:r/>
+            <w:r>
+              <w:rPr>
+                <w:rFonts w:ascii="Calibri" w:hAnsi="Calibri" w:eastAsia="PingFang SC"/>
+                <w:sz w:val="18"/>
+              </w:rPr>
+              <w:t>Risk</w:t>
+            </w:r>
+          </w:p>
+        </w:tc>
+        <w:tc>
+          <w:tcPr>
+            <w:tcW w:type="dxa" w:w="3000"/>
+            <w:tcMar>
+              <w:top w:w="80" w:type="dxa"/>
+              <w:start w:w="120" w:type="dxa"/>
+              <w:bottom w:w="80" w:type="dxa"/>
+              <w:end w:w="120" w:type="dxa"/>
+            </w:tcMar>
+            <w:vAlign w:val="center"/>
+          </w:tcPr>
+          <w:p>
+            <w:pPr>
+              <w:spacing w:before="0" w:after="40" w:line="259" w:lineRule="auto"/>
+              <w:jc w:val="left"/>
+            </w:pPr>
+            <w:r/>
+            <w:r>
+              <w:rPr>
+                <w:rFonts w:ascii="Calibri" w:hAnsi="Calibri" w:eastAsia="PingFang SC"/>
+                <w:sz w:val="18"/>
+              </w:rPr>
+              <w:t>4</w:t>
+            </w:r>
+          </w:p>
+        </w:tc>
+        <w:tc>
+          <w:tcPr>
+            <w:tcW w:type="dxa" w:w="2520"/>
+            <w:tcMar>
+              <w:top w:w="80" w:type="dxa"/>
+              <w:start w:w="120" w:type="dxa"/>
+              <w:bottom w:w="80" w:type="dxa"/>
+              <w:end w:w="120" w:type="dxa"/>
+            </w:tcMar>
+            <w:vAlign w:val="center"/>
+          </w:tcPr>
+          <w:p>
+            <w:pPr>
+              <w:spacing w:before="0" w:after="40" w:line="259" w:lineRule="auto"/>
+              <w:jc w:val="left"/>
+            </w:pPr>
+            <w:r/>
+            <w:r>
+              <w:rPr>
+                <w:rFonts w:ascii="Calibri" w:hAnsi="Calibri" w:eastAsia="PingFang SC"/>
+                <w:sz w:val="18"/>
+              </w:rPr>
+              <w:t>隐私、安全、升级、冲突/过期</w:t>
+            </w:r>
+          </w:p>
+        </w:tc>
+        <w:tc>
+          <w:tcPr>
+            <w:tcW w:type="dxa" w:w="2340"/>
+            <w:tcMar>
+              <w:top w:w="80" w:type="dxa"/>
+              <w:start w:w="120" w:type="dxa"/>
+              <w:bottom w:w="80" w:type="dxa"/>
+              <w:end w:w="120" w:type="dxa"/>
+            </w:tcMar>
+            <w:vAlign w:val="center"/>
+          </w:tcPr>
+          <w:p>
+            <w:pPr>
+              <w:spacing w:before="0" w:after="40" w:line="259" w:lineRule="auto"/>
+              <w:jc w:val="left"/>
+            </w:pPr>
+            <w:r/>
+            <w:r>
+              <w:rPr>
+                <w:rFonts w:ascii="Calibri" w:hAnsi="Calibri" w:eastAsia="PingFang SC"/>
+                <w:sz w:val="18"/>
+              </w:rPr>
+              <w:t>风险或 must-not 激活</w:t>
+            </w:r>
+          </w:p>
+        </w:tc>
+      </w:tr>
+    </w:tbl>
+    <w:p>
+      <w:pPr>
+        <w:spacing w:after="40"/>
+      </w:pPr>
+    </w:p>
+    <w:p>
+      <w:r>
+        <w:rPr>
+          <w:rFonts w:ascii="Calibri" w:hAnsi="Calibri" w:eastAsia="PingFang SC"/>
+        </w:rPr>
+        <w:t>我们的强处不是 Personalization 从 9 个继续扩到 15 个。模块越多，越容易 double count、调权重、让不同 case 分数不可比。真正的强处是：每个 personalization leaf 都必须有用户事实来源和 must-change；A/B 使用对称的模块形状；同一套 leaves 同时评分 matched/swapped；must-hold 和 must-not 阻止“变化越多越个性化”；最后还有目标用户和 JudgeBench 校准。这比“动态生成一张更细 rubric”更接近可证伪的测量协议。</w:t>
+      </w:r>
+    </w:p>
+    <w:p>
+      <w:pPr>
+        <w:pStyle w:val="Heading2"/>
+      </w:pPr>
+      <w:r>
         <w:t>7.2 Leaf expansion 到底是什么意思</w:t>
       </w:r>
     </w:p>
@@ -3573,13 +4445,13 @@
           <w:color w:val="6A3E00"/>
           <w:sz w:val="20"/>
         </w:rPr>
-        <w:t>U-A-RISK-02</w:t>
-      </w:r>
-      <w:r>
-        <w:rPr>
-          <w:rFonts w:ascii="Calibri" w:hAnsi="Calibri" w:eastAsia="PingFang SC"/>
-        </w:rPr>
-        <w:t>：给出三个月可逆试点、继续/退出阈值；</w:t>
+        <w:t>U-A-PILOT-02</w:t>
+      </w:r>
+      <w:r>
+        <w:rPr>
+          <w:rFonts w:ascii="Calibri" w:hAnsi="Calibri" w:eastAsia="PingFang SC"/>
+        </w:rPr>
+        <w:t>：给出三个月可逆试点；</w:t>
       </w:r>
     </w:p>
     <w:p>
@@ -3597,13 +4469,13 @@
           <w:color w:val="6A3E00"/>
           <w:sz w:val="20"/>
         </w:rPr>
-        <w:t>U-A-AUD-03</w:t>
-      </w:r>
-      <w:r>
-        <w:rPr>
-          <w:rFonts w:ascii="Calibri" w:hAnsi="Calibri" w:eastAsia="PingFang SC"/>
-        </w:rPr>
-        <w:t>：首次出现关键金融术语时用非技术语言解释。</w:t>
+        <w:t>U-A-EXIT-03</w:t>
+      </w:r>
+      <w:r>
+        <w:rPr>
+          <w:rFonts w:ascii="Calibri" w:hAnsi="Calibri" w:eastAsia="PingFang SC"/>
+        </w:rPr>
+        <w:t>：给出可操作的继续与退出阈值。</w:t>
       </w:r>
     </w:p>
     <w:p>
@@ -4483,7 +5355,7 @@
         <w:pStyle w:val="Heading2"/>
       </w:pPr>
       <w:r>
-        <w:t>7.6 Rubric 进入主实验前必须过五关</w:t>
+        <w:t>7.6 Rubric 进入主实验前必须过七关</w:t>
       </w:r>
     </w:p>
     <w:p>
@@ -4564,6 +5436,38 @@
           <w:rFonts w:ascii="Calibri" w:hAnsi="Calibri" w:eastAsia="PingFang SC"/>
         </w:rPr>
         <w:t>judge 在不同任务、交付物、用户信息渠道和风险等级上都要单独校准。</w:t>
+      </w:r>
+    </w:p>
+    <w:p>
+      <w:pPr>
+        <w:numPr>
+          <w:ilvl w:val="0"/>
+          <w:numId w:val="19"/>
+        </w:numPr>
+        <w:spacing w:after="80" w:line="290" w:lineRule="auto"/>
+        <w:ind w:left="540" w:hanging="279"/>
+      </w:pPr>
+      <w:r>
+        <w:rPr>
+          <w:rFonts w:ascii="Calibri" w:hAnsi="Calibri" w:eastAsia="PingFang SC"/>
+        </w:rPr>
+        <w:t>检查不同 module 的语义重叠、leaf 数和权重敏感性，避免重复计分和量尺漂移；</w:t>
+      </w:r>
+    </w:p>
+    <w:p>
+      <w:pPr>
+        <w:numPr>
+          <w:ilvl w:val="0"/>
+          <w:numId w:val="19"/>
+        </w:numPr>
+        <w:spacing w:after="80" w:line="290" w:lineRule="auto"/>
+        <w:ind w:left="540" w:hanging="279"/>
+      </w:pPr>
+      <w:r>
+        <w:rPr>
+          <w:rFonts w:ascii="Calibri" w:hAnsi="Calibri" w:eastAsia="PingFang SC"/>
+        </w:rPr>
+        <w:t>对 pilot 中现有 module 捕捉不到的错误做 open coding；只有同一残余 construct 在至少两个不同 family 重复出现，才新增 module。</w:t>
       </w:r>
     </w:p>
     <w:p>

</xml_diff>

<commit_message>
proposal v0.30: separate personalization specificity and benefit
</commit_message>
<xml_diff>
--- a/deliverables/DeepAlign-Bench_完整人话版.docx
+++ b/deliverables/DeepAlign-Bench_完整人话版.docx
@@ -131,7 +131,7 @@
                 <w:color w:val="5B6B7A"/>
                 <w:sz w:val="21"/>
               </w:rPr>
-              <w:t>v0.29 · 完整人话版</w:t>
+              <w:t>v0.30 · 完整人话版</w:t>
             </w:r>
           </w:p>
         </w:tc>
@@ -283,7 +283,7 @@
           <w:color w:val="163A63"/>
           <w:sz w:val="24"/>
         </w:rPr>
-        <w:t>同一任务和证据下，只改变用户；匹配结果应呈现跨用户对角优势，换成语义等价表达后仍应成立。</w:t>
+        <w:t>同一任务和证据下，只改变用户；匹配结果要在两个用户方向都优于错配，并且相对 task-only 真的有帮助。</w:t>
       </w:r>
     </w:p>
     <w:p>
@@ -5615,7 +5615,7 @@
         <w:rPr>
           <w:rFonts w:ascii="Calibri" w:hAnsi="Calibri" w:eastAsia="PingFang SC"/>
         </w:rPr>
-        <w:t>：匹配用户的报告相对错配报告有多少优势。</w:t>
+        <w:t>：匹配用户的报告相对错配报告有多少优势，但要把两位用户的方向分别保留下来。</w:t>
       </w:r>
     </w:p>
     <w:p>
@@ -5631,9 +5631,13 @@
           <w:color w:val="163A63"/>
           <w:sz w:val="18"/>
         </w:rPr>
-        <w:t>CFA(a,b) = 1/2 × [Ua 对 Ya 相对 Yb 的偏好</w:t>
+        <w:t>Δa = Ua 看 Ya 相对 Yb 的优势</w:t>
         <w:br/>
-        <w:t xml:space="preserve">                + Ub 对 Yb 相对 Ya 的偏好]</w:t>
+        <w:t>Δb = Ub 看 Yb 相对 Ya 的优势</w:t>
+        <w:br/>
+        <w:t>CFA_mean = (Δa + Δb) / 2</w:t>
+        <w:br/>
+        <w:t>CFA_min = min(Δa, Δb)</w:t>
       </w:r>
     </w:p>
     <w:p>
@@ -5641,7 +5645,120 @@
         <w:rPr>
           <w:rFonts w:ascii="Calibri" w:hAnsi="Calibri" w:eastAsia="PingFang SC"/>
         </w:rPr>
-        <w:t>CFA 大于 0 说明评分矩阵出现“对的人更适合自己的版本”的对角优势，但它不解释模型为什么做到，也不会自动排除长度等因素。因此还要报告：语义等价 views 中最差的 CFA、不同 views 间的最大差距（Cue Gap）、must-change/must-hold 一致率，以及只改无关 cue 后分数是否变化。</w:t>
+        <w:t xml:space="preserve">CFA 的平均值大于 0 仍不够：如果 Ua 明显受益、Ub 反而更适合错误版本，平均后也可能是正数。所以主结果必须同时给出 </w:t>
+      </w:r>
+      <w:r>
+        <w:rPr>
+          <w:rFonts w:ascii="Courier New" w:hAnsi="Courier New" w:eastAsia="PingFang SC"/>
+          <w:color w:val="6A3E00"/>
+          <w:sz w:val="20"/>
+        </w:rPr>
+        <w:t>Δa</w:t>
+      </w:r>
+      <w:r>
+        <w:rPr>
+          <w:rFonts w:ascii="Calibri" w:hAnsi="Calibri" w:eastAsia="PingFang SC"/>
+        </w:rPr>
+        <w:t>、</w:t>
+      </w:r>
+      <w:r>
+        <w:rPr>
+          <w:rFonts w:ascii="Courier New" w:hAnsi="Courier New" w:eastAsia="PingFang SC"/>
+          <w:color w:val="6A3E00"/>
+          <w:sz w:val="20"/>
+        </w:rPr>
+        <w:t>Δb</w:t>
+      </w:r>
+      <w:r>
+        <w:rPr>
+          <w:rFonts w:ascii="Calibri" w:hAnsi="Calibri" w:eastAsia="PingFang SC"/>
+        </w:rPr>
+        <w:t xml:space="preserve"> 和 </w:t>
+      </w:r>
+      <w:r>
+        <w:rPr>
+          <w:rFonts w:ascii="Courier New" w:hAnsi="Courier New" w:eastAsia="PingFang SC"/>
+          <w:color w:val="6A3E00"/>
+          <w:sz w:val="20"/>
+        </w:rPr>
+        <w:t>CFA_min</w:t>
+      </w:r>
+      <w:r>
+        <w:rPr>
+          <w:rFonts w:ascii="Calibri" w:hAnsi="Calibri" w:eastAsia="PingFang SC"/>
+        </w:rPr>
+        <w:t>，只有两边都大于 0 才算“双向成立”。</w:t>
+      </w:r>
+    </w:p>
+    <w:p>
+      <w:r>
+        <w:rPr>
+          <w:rFonts w:ascii="Calibri" w:hAnsi="Calibri" w:eastAsia="PingFang SC"/>
+        </w:rPr>
+        <w:t>还要回答另一件过去容易混掉的事：</w:t>
+      </w:r>
+      <w:r>
+        <w:rPr>
+          <w:rFonts w:ascii="Calibri" w:hAnsi="Calibri" w:eastAsia="PingFang SC"/>
+          <w:b/>
+        </w:rPr>
+        <w:t>可区分不等于有帮助。</w:t>
+      </w:r>
+      <w:r>
+        <w:rPr>
+          <w:rFonts w:ascii="Calibri" w:hAnsi="Calibri" w:eastAsia="PingFang SC"/>
+        </w:rPr>
+        <w:t xml:space="preserve"> 主矩阵本来就有 task-only 报告 </w:t>
+      </w:r>
+      <w:r>
+        <w:rPr>
+          <w:rFonts w:ascii="Courier New" w:hAnsi="Courier New" w:eastAsia="PingFang SC"/>
+          <w:color w:val="6A3E00"/>
+          <w:sz w:val="20"/>
+        </w:rPr>
+        <w:t>Y0</w:t>
+      </w:r>
+      <w:r>
+        <w:rPr>
+          <w:rFonts w:ascii="Calibri" w:hAnsi="Calibri" w:eastAsia="PingFang SC"/>
+        </w:rPr>
+        <w:t xml:space="preserve">，因此再计算 </w:t>
+      </w:r>
+      <w:r>
+        <w:rPr>
+          <w:rFonts w:ascii="Courier New" w:hAnsi="Courier New" w:eastAsia="PingFang SC"/>
+          <w:color w:val="6A3E00"/>
+          <w:sz w:val="20"/>
+        </w:rPr>
+        <w:t>Ga = Ua 看 Ya 相对 Y0 的增益</w:t>
+      </w:r>
+      <w:r>
+        <w:rPr>
+          <w:rFonts w:ascii="Calibri" w:hAnsi="Calibri" w:eastAsia="PingFang SC"/>
+        </w:rPr>
+        <w:t>、</w:t>
+      </w:r>
+      <w:r>
+        <w:rPr>
+          <w:rFonts w:ascii="Courier New" w:hAnsi="Courier New" w:eastAsia="PingFang SC"/>
+          <w:color w:val="6A3E00"/>
+          <w:sz w:val="20"/>
+        </w:rPr>
+        <w:t>Gb = Ub 看 Yb 相对 Y0 的增益</w:t>
+      </w:r>
+      <w:r>
+        <w:rPr>
+          <w:rFonts w:ascii="Calibri" w:hAnsi="Calibri" w:eastAsia="PingFang SC"/>
+        </w:rPr>
+        <w:t>。最后用二维图同时画“跨用户 specificity”和“相对 task-only benefit”：右上角才是真正有益的个性化；只在右下说明版本不同但没有给用户带来净收益。</w:t>
+      </w:r>
+    </w:p>
+    <w:p>
+      <w:r>
+        <w:rPr>
+          <w:rFonts w:ascii="Calibri" w:hAnsi="Calibri" w:eastAsia="PingFang SC"/>
+        </w:rPr>
+        <w:t>最终成功条件不是一个新总分，而是四个门同时通过：两位用户的 matched 都优于 swapped；两位用户相对 task-only 都不变差；TQ/FR 与 must-hold 不下降；must-not、隐私和权限不违规。目标用户盲评再用 family 内配对检验确认 match effect，不能把同一个 family 的四格分数当四个独立样本。之后仍要报告语义等价 views 中最差的 CFA、Cue Gap、must-change/must-hold 一致率，以及无关 cue 是否改变结果。</w:t>
       </w:r>
     </w:p>
     <w:p>

</xml_diff>

<commit_message>
proposal v0.31: freeze task-persona launch protocol
</commit_message>
<xml_diff>
--- a/deliverables/DeepAlign-Bench_完整人话版.docx
+++ b/deliverables/DeepAlign-Bench_完整人话版.docx
@@ -131,7 +131,7 @@
                 <w:color w:val="5B6B7A"/>
                 <w:sz w:val="21"/>
               </w:rPr>
-              <w:t>v0.30 · 完整人话版</w:t>
+              <w:t>v0.31 · 完整人话版</w:t>
             </w:r>
           </w:p>
         </w:tc>
@@ -2493,6 +2493,14 @@
         <w:rPr>
           <w:rFonts w:ascii="Calibri" w:hAnsi="Calibri" w:eastAsia="PingFang SC"/>
         </w:rPr>
+        <w:t>Task 元数据不是“都让人手填”，也不是“都让模型自动标”。来源、许可、时间、证据哈希、工具和预算可以自动导入后由人检查；任务意图、风险、是否需要澄清、哪些用户差异应改变结果，以及四类评价契约必须在模型运行前由两个人独立标注并仲裁；任务实际有多难、模型哪里失败、judge 是否一致，只能在 pilot 后作为 observed 字段另存，不能反过来改预期标签。</w:t>
+      </w:r>
+    </w:p>
+    <w:p>
+      <w:r>
+        <w:rPr>
+          <w:rFonts w:ascii="Calibri" w:hAnsi="Calibri" w:eastAsia="PingFang SC"/>
+        </w:rPr>
         <w:t>所以“同一个医疗 AI 采购研究 + 医院管理者/临床 AI 研究员”是一个 family：法规和产品事实不变，但 ROI/流程/合规与验证/漂移/复现的优先级必须变化。</w:t>
       </w:r>
     </w:p>
@@ -2563,7 +2571,7 @@
         <w:rPr>
           <w:rFonts w:ascii="Calibri" w:hAnsi="Calibri" w:eastAsia="PingFang SC"/>
         </w:rPr>
-        <w:t>具体不是让作者凭空写人物，而是：真实需求记录 → 提取目标/知识/硬约束/风险/受众/权限 → 先写 Ua/Ub 共享核心 → 只改 2–3 个有决策后果的字段 → 每条事实映射到一条评价契约 → 从同一 ledger 生成不同 signal view → 再生成 demographic-only、irrelevant、wrong-user、stale 和 redacted 负对照 → 原用户、相似用户与领域专家三方验证。没有 rubric 后果的 biography 细节从核心 persona 删除。</w:t>
+        <w:t>具体不是让作者凭空写人物，而是：让约 32–40 位参与者各选 1–2 个与自己真实相关的 task shell，用 30–45 分钟访谈提取目标/知识/硬约束/风险/受众/权限与近期事件 → 先写 Ua/Ub 共享核心 → 只改 2–4 个有决策后果的字段 → 每条事实映射到评价契约 → 从同一 ledger 生成不同 signal view → 再生成 demographic-only、irrelevant、wrong-user、stale 和 redacted 负对照 → 原用户、相似用户与领域专家三方验证。Gold 最好是两位真实用户；实在配不到，才用一位真实用户加第二位相似参与者确认的最小反事实编辑。自然历史来自参与者回忆、日记、授权轨迹或逐句确认的转述，annotator 自己编的生活故事不算 gold。</w:t>
       </w:r>
     </w:p>
     <w:p>
@@ -3420,6 +3428,58 @@
       </w:r>
     </w:p>
     <w:p>
+      <w:pPr>
+        <w:pStyle w:val="ListBullet"/>
+      </w:pPr>
+      <w:r>
+        <w:rPr>
+          <w:rFonts w:ascii="Courier New" w:hAnsi="Courier New" w:eastAsia="PingFang SC"/>
+          <w:color w:val="6A3E00"/>
+          <w:sz w:val="20"/>
+        </w:rPr>
+        <w:t>rubric_node_registry.yaml</w:t>
+      </w:r>
+      <w:r>
+        <w:rPr>
+          <w:rFonts w:ascii="Calibri" w:hAnsi="Calibri" w:eastAsia="PingFang SC"/>
+        </w:rPr>
+        <w:t>：module 下面可复用的评价方向，以及每个方向需要的参数、证据、锚点和 judge route；</w:t>
+      </w:r>
+    </w:p>
+    <w:p>
+      <w:pPr>
+        <w:pStyle w:val="ListBullet"/>
+      </w:pPr>
+      <w:r>
+        <w:rPr>
+          <w:rFonts w:ascii="Courier New" w:hAnsi="Courier New" w:eastAsia="PingFang SC"/>
+          <w:color w:val="6A3E00"/>
+          <w:sz w:val="20"/>
+        </w:rPr>
+        <w:t>construction_annotation.protocol.yaml</w:t>
+      </w:r>
+      <w:r>
+        <w:rPr>
+          <w:rFonts w:ascii="Calibri" w:hAnsi="Calibri" w:eastAsia="PingFang SC"/>
+        </w:rPr>
+        <w:t>、</w:t>
+      </w:r>
+      <w:r>
+        <w:rPr>
+          <w:rFonts w:ascii="Courier New" w:hAnsi="Courier New" w:eastAsia="PingFang SC"/>
+          <w:color w:val="6A3E00"/>
+          <w:sz w:val="20"/>
+        </w:rPr>
+        <w:t>environment_build.protocol.yaml</w:t>
+      </w:r>
+      <w:r>
+        <w:rPr>
+          <w:rFonts w:ascii="Calibri" w:hAnsi="Calibri" w:eastAsia="PingFang SC"/>
+        </w:rPr>
+        <w:t>：标注与三环境的开工约束。</w:t>
+      </w:r>
+    </w:p>
+    <w:p>
       <w:r>
         <w:rPr>
           <w:rFonts w:ascii="Calibri" w:hAnsi="Calibri" w:eastAsia="PingFang SC"/>
@@ -3452,7 +3512,9 @@
         <w:br/>
         <w:t>→ 校验输入</w:t>
         <w:br/>
-        <w:t>→ 按 intent / deliverable / operator / risk 选固定模板</w:t>
+        <w:t>→ 按 intent / deliverable / operator / risk 选 module</w:t>
+        <w:br/>
+        <w:t>→ 从 registry 选适用 direction node</w:t>
         <w:br/>
         <w:t>→ 把预算、截止时间、用户、证据等填进模板</w:t>
         <w:br/>
@@ -4346,6 +4408,42 @@
       </w:r>
     </w:p>
     <w:p>
+      <w:r>
+        <w:rPr>
+          <w:rFonts w:ascii="Calibri" w:hAnsi="Calibri" w:eastAsia="PingFang SC"/>
+        </w:rPr>
+        <w:t>Module、node、leaf 可以这样理解：</w:t>
+      </w:r>
+      <w:r>
+        <w:rPr>
+          <w:rFonts w:ascii="Courier New" w:hAnsi="Courier New" w:eastAsia="PingFang SC"/>
+          <w:color w:val="6A3E00"/>
+          <w:sz w:val="20"/>
+        </w:rPr>
+        <w:t>PER-CONSTRAINT-04</w:t>
+      </w:r>
+      <w:r>
+        <w:rPr>
+          <w:rFonts w:ascii="Calibri" w:hAnsi="Calibri" w:eastAsia="PingFang SC"/>
+        </w:rPr>
+        <w:t xml:space="preserve"> 是“用户约束”这个大模块，</w:t>
+      </w:r>
+      <w:r>
+        <w:rPr>
+          <w:rFonts w:ascii="Courier New" w:hAnsi="Courier New" w:eastAsia="PingFang SC"/>
+          <w:color w:val="6A3E00"/>
+          <w:sz w:val="20"/>
+        </w:rPr>
+        <w:t>PER-CONSTRAINT-HARD</w:t>
+      </w:r>
+      <w:r>
+        <w:rPr>
+          <w:rFonts w:ascii="Calibri" w:hAnsi="Calibri" w:eastAsia="PingFang SC"/>
+        </w:rPr>
+        <w:t xml:space="preserve"> 是“满足一个可检查的硬约束”这个方向，具体 leaf 才是“Ua 的第一阶段支出不得超过 50 万”。Node 要提前准备，但不能假装一开始就穷尽所有方向。只有 pilot 中同一种重要残余问题至少在两个 family 重复出现，而且不能用现有 node 加参数表示时，才新增 node；否则只是越做越大的愿望清单。</w:t>
+      </w:r>
+    </w:p>
+    <w:p>
       <w:pPr>
         <w:pStyle w:val="Heading2"/>
       </w:pPr>
@@ -6929,6 +7027,64 @@
     </w:p>
     <w:p>
       <w:pPr>
+        <w:pStyle w:val="Heading2"/>
+      </w:pPr>
+      <w:r>
+        <w:t>11.1 真正的开工顺序与中稿判断</w:t>
+      </w:r>
+    </w:p>
+    <w:p>
+      <w:r>
+        <w:rPr>
+          <w:rFonts w:ascii="Calibri" w:hAnsi="Calibri" w:eastAsia="PingFang SC"/>
+        </w:rPr>
+        <w:t>前两周不直接写 24 个 family。先收集 60–80 个真实/专业/访谈 seed，筛成约 30 个候选，只把 3 个 family 做到“真实用户 → 契约 → node/leaf → matched/swapped/task-only reference → E1 运行 → 人评”全链路。至少 2 个 family 通过双向 specificity、相对 task-only benefit、共同质量和边界四重门后，才扩到 24 个。</w:t>
+      </w:r>
+    </w:p>
+    <w:p>
+      <w:r>
+        <w:rPr>
+          <w:rFonts w:ascii="Calibri" w:hAnsi="Calibri" w:eastAsia="PingFang SC"/>
+        </w:rPr>
+        <w:t>三个环境的现实难度是：E1 Frozen Harness 中等，MVP 约 1.5–2.5 个工程师周，是论文主轨；E3 Stateful Sandbox 最难，在 E1 后还需约 2–4 周，首版只做一个 anchor；E2 商业/live web 很容易 demo，但最难保证版本、reset 和公平比较，每个产品 adapter 约 3–7 天且要持续维护，所以只做单产品外部效度观察，不与 E1 合并显著性。</w:t>
+      </w:r>
+    </w:p>
+    <w:p>
+      <w:r>
+        <w:rPr>
+          <w:rFonts w:ascii="Calibri" w:hAnsi="Calibri" w:eastAsia="PingFang SC"/>
+        </w:rPr>
+        <w:t>ICLR 官方近年整体录用率约 27%–32%：2024 年 31%，2025 年 32%，2026 年 27%。</w:t>
+      </w:r>
+      <w:hyperlink r:id="rId40">
+        <w:r>
+          <w:rPr>
+            <w:rFonts w:ascii="Calibri" w:hAnsi="Calibri" w:eastAsia="PingFang SC"/>
+            <w:color w:val="2E74B5"/>
+            <w:u w:val="single"/>
+          </w:rPr>
+          <w:t>[42]</w:t>
+        </w:r>
+      </w:hyperlink>
+      <w:hyperlink r:id="rId41">
+        <w:r>
+          <w:rPr>
+            <w:rFonts w:ascii="Calibri" w:hAnsi="Calibri" w:eastAsia="PingFang SC"/>
+            <w:color w:val="2E74B5"/>
+            <w:u w:val="single"/>
+          </w:rPr>
+          <w:t>[43]</w:t>
+        </w:r>
+      </w:hyperlink>
+      <w:r>
+        <w:rPr>
+          <w:rFonts w:ascii="Calibri" w:hAnsi="Calibri" w:eastAsia="PingFang SC"/>
+        </w:rPr>
+        <w:t xml:space="preserve"> 这篇以现在只有 proposal、没有 pilot 的状态投稿，主观估计约 5%–12%；完成真人验证、24 family、可靠 E1、judge 校准和公开 artifact，但效应一般，约 20%–35%；若 specificity × benefit 在多个任务层稳定、四重门都通过并有强 baseline/复现材料，约 35%–50%。中心判断是按本方案认真执行大约三成上下。Persona 主要合成、只靠 LLM judge、没有 task-only 或 E1 不可复现时，应低于 10%–15%。这些是审稿情景判断，不是可校准的精确概率。</w:t>
+      </w:r>
+    </w:p>
+    <w:p>
+      <w:pPr>
         <w:pStyle w:val="Heading1"/>
       </w:pPr>
       <w:r>
@@ -7173,7 +7329,7 @@
         </w:rPr>
         <w:t xml:space="preserve">. </w:t>
       </w:r>
-      <w:hyperlink r:id="rId40">
+      <w:hyperlink r:id="rId42">
         <w:r>
           <w:rPr>
             <w:rFonts w:ascii="Calibri" w:hAnsi="Calibri" w:eastAsia="PingFang SC"/>
@@ -7905,7 +8061,7 @@
         </w:rPr>
         <w:t xml:space="preserve">. EMNLP, 2025. </w:t>
       </w:r>
-      <w:hyperlink r:id="rId41">
+      <w:hyperlink r:id="rId43">
         <w:r>
           <w:rPr>
             <w:rFonts w:ascii="Calibri" w:hAnsi="Calibri" w:eastAsia="PingFang SC"/>
@@ -8013,7 +8169,7 @@
         </w:rPr>
         <w:t xml:space="preserve">. Findings of ACL, 2026. </w:t>
       </w:r>
-      <w:hyperlink r:id="rId42">
+      <w:hyperlink r:id="rId44">
         <w:r>
           <w:rPr>
             <w:rFonts w:ascii="Calibri" w:hAnsi="Calibri" w:eastAsia="PingFang SC"/>
@@ -8297,7 +8453,7 @@
         </w:rPr>
         <w:t xml:space="preserve">. ACL, 2026. </w:t>
       </w:r>
-      <w:hyperlink r:id="rId43">
+      <w:hyperlink r:id="rId45">
         <w:r>
           <w:rPr>
             <w:rFonts w:ascii="Calibri" w:hAnsi="Calibri" w:eastAsia="PingFang SC"/>
@@ -8337,7 +8493,7 @@
         </w:rPr>
         <w:t xml:space="preserve">. ACL, 2026. </w:t>
       </w:r>
-      <w:hyperlink r:id="rId44">
+      <w:hyperlink r:id="rId46">
         <w:r>
           <w:rPr>
             <w:rFonts w:ascii="Calibri" w:hAnsi="Calibri" w:eastAsia="PingFang SC"/>
@@ -8467,6 +8623,86 @@
             <w:szCs w:val="16"/>
           </w:rPr>
           <w:t>https://arxiv.org/abs/2605.31545</w:t>
+        </w:r>
+      </w:hyperlink>
+    </w:p>
+    <w:p>
+      <w:pPr>
+        <w:spacing w:after="0" w:line="216" w:lineRule="auto"/>
+        <w:ind w:left="360" w:hanging="360"/>
+      </w:pPr>
+      <w:r>
+        <w:rPr>
+          <w:rFonts w:ascii="Calibri" w:hAnsi="Calibri" w:eastAsia="PingFang SC"/>
+          <w:sz w:val="16"/>
+        </w:rPr>
+        <w:t xml:space="preserve">[42] ICLR. </w:t>
+      </w:r>
+      <w:r>
+        <w:rPr>
+          <w:rFonts w:ascii="Calibri" w:hAnsi="Calibri" w:eastAsia="PingFang SC"/>
+          <w:i/>
+          <w:sz w:val="16"/>
+        </w:rPr>
+        <w:t>ICLR 2024 Fact Sheet</w:t>
+      </w:r>
+      <w:r>
+        <w:rPr>
+          <w:rFonts w:ascii="Calibri" w:hAnsi="Calibri" w:eastAsia="PingFang SC"/>
+          <w:sz w:val="16"/>
+        </w:rPr>
+        <w:t xml:space="preserve">. </w:t>
+      </w:r>
+      <w:hyperlink r:id="rId40">
+        <w:r>
+          <w:rPr>
+            <w:rFonts w:ascii="Calibri" w:hAnsi="Calibri" w:eastAsia="PingFang SC"/>
+            <w:color w:val="2E74B5"/>
+            <w:u w:val="single"/>
+            <w:sz w:val="16"/>
+            <w:szCs w:val="16"/>
+          </w:rPr>
+          <w:t>https://media.iclr.cc/Conferences/ICLR2024/ICLR2024-Fact_Sheet.pdf</w:t>
+        </w:r>
+      </w:hyperlink>
+    </w:p>
+    <w:p>
+      <w:pPr>
+        <w:spacing w:after="0" w:line="216" w:lineRule="auto"/>
+        <w:ind w:left="360" w:hanging="360"/>
+      </w:pPr>
+      <w:r>
+        <w:rPr>
+          <w:rFonts w:ascii="Calibri" w:hAnsi="Calibri" w:eastAsia="PingFang SC"/>
+          <w:sz w:val="16"/>
+        </w:rPr>
+        <w:t xml:space="preserve">[43] ICLR. </w:t>
+      </w:r>
+      <w:r>
+        <w:rPr>
+          <w:rFonts w:ascii="Calibri" w:hAnsi="Calibri" w:eastAsia="PingFang SC"/>
+          <w:i/>
+          <w:sz w:val="16"/>
+        </w:rPr>
+        <w:t>ICLR 2026 Fact Sheet</w:t>
+      </w:r>
+      <w:r>
+        <w:rPr>
+          <w:rFonts w:ascii="Calibri" w:hAnsi="Calibri" w:eastAsia="PingFang SC"/>
+          <w:sz w:val="16"/>
+        </w:rPr>
+        <w:t xml:space="preserve">. </w:t>
+      </w:r>
+      <w:hyperlink r:id="rId41">
+        <w:r>
+          <w:rPr>
+            <w:rFonts w:ascii="Calibri" w:hAnsi="Calibri" w:eastAsia="PingFang SC"/>
+            <w:color w:val="2E74B5"/>
+            <w:u w:val="single"/>
+            <w:sz w:val="16"/>
+            <w:szCs w:val="16"/>
+          </w:rPr>
+          <w:t>https://media.iclr.cc/Conferences/ICLR2026/ICLR2026_Fact_Sheet.pdf</w:t>
         </w:r>
       </w:hyperlink>
     </w:p>

</xml_diff>

<commit_message>
proposal v0.32: shift benchmark to downstream decision utility
</commit_message>
<xml_diff>
--- a/deliverables/DeepAlign-Bench_完整人话版.docx
+++ b/deliverables/DeepAlign-Bench_完整人话版.docx
@@ -43,7 +43,7 @@
           <w:color w:val="2E74B5"/>
           <w:sz w:val="34"/>
         </w:rPr>
-        <w:t>方法、假设与实验不变，把每一步说清楚</w:t>
+        <w:t>把两阶段方法、假设与实验逐步说清楚</w:t>
       </w:r>
     </w:p>
     <w:p>
@@ -131,7 +131,7 @@
                 <w:color w:val="5B6B7A"/>
                 <w:sz w:val="21"/>
               </w:rPr>
-              <w:t>v0.31 · 完整人话版</w:t>
+              <w:t>v0.32 · 完整人话版</w:t>
             </w:r>
           </w:p>
         </w:tc>
@@ -189,7 +189,7 @@
                 <w:color w:val="5B6B7A"/>
                 <w:sz w:val="21"/>
               </w:rPr>
-              <w:t>2026 年 8 月 8 日</w:t>
+              <w:t>2026 年 8 月 9 日</w:t>
             </w:r>
           </w:p>
         </w:tc>
@@ -283,7 +283,7 @@
           <w:color w:val="163A63"/>
           <w:sz w:val="24"/>
         </w:rPr>
-        <w:t>同一任务和证据下，只改变用户；匹配结果要在两个用户方向都优于错配，并且相对 task-only 真的有帮助。</w:t>
+        <w:t>报告更像为你写还不够；只有共同质量过门且真实用户的决策 regret 下降，才算有下游价值。</w:t>
       </w:r>
     </w:p>
     <w:p>
@@ -484,22 +484,22 @@
         <w:rPr>
           <w:rFonts w:ascii="Calibri" w:hAnsi="Calibri" w:eastAsia="PingFang SC"/>
         </w:rPr>
-        <w:t>我们要测的不是 Deep Research agent 能不能写出一份“看起来不错”的报告，而是：</w:t>
+        <w:t>我们要测的不是 Deep Research agent 能不能写出一份“看起来很懂你”的报告，而是：</w:t>
       </w:r>
       <w:r>
         <w:rPr>
           <w:rFonts w:ascii="Calibri" w:hAnsi="Calibri" w:eastAsia="PingFang SC"/>
           <w:b/>
         </w:rPr>
-        <w:t>同一个研究任务交给不同用户时，它能不能根据用户真正相关的信息，交付不同但都正确的结果。</w:t>
-      </w:r>
-    </w:p>
-    <w:p>
-      <w:r>
-        <w:rPr>
-          <w:rFonts w:ascii="Calibri" w:hAnsi="Calibri" w:eastAsia="PingFang SC"/>
-        </w:rPr>
-        <w:t>例如，两个人都问“我应该选哪一个硕士项目”。学校信息完全相同，但一个人预算紧、希望尽快就业，另一个人准备读博、重视科研训练。合格的 agent 不只是把两人的背景各写一遍，而应该改变比较标准、证据重点、风险提醒和最后建议。同时，学校事实、引用质量和基本分析不能因为“个性化”而变差。</w:t>
+        <w:t>在报告同样正确、证据同样充分的前提下，个性化版本是否真的让目标用户做出更好的决定。</w:t>
+      </w:r>
+    </w:p>
+    <w:p>
+      <w:r>
+        <w:rPr>
+          <w:rFonts w:ascii="Calibri" w:hAnsi="Calibri" w:eastAsia="PingFang SC"/>
+        </w:rPr>
+        <w:t>例如，两个人都问“我应该选哪一个硕士项目”。学校信息完全相同，但一个人预算紧、希望尽快就业，另一个人准备读博、重视科研训练。旧方案主要检查两份报告是否分别贴合两人；新方案还要让真实用户在看报告前后做选择，检查 matched 报告是否降低可验证的决策 regret，wrong-user 报告是否反而造成伤害。</w:t>
       </w:r>
     </w:p>
     <w:p>
@@ -523,7 +523,7 @@
         <w:rPr>
           <w:rFonts w:ascii="Calibri" w:hAnsi="Calibri" w:eastAsia="PingFang SC"/>
         </w:rPr>
-        <w:t>给 agent 不同形式的用户信息，最后的交付物是否真的更适合这个用户？</w:t>
+        <w:t>matched 个性化报告相对 task-only 报告，是否让真实用户的决定更接近预冻结 utility 下的最优可接受决定？</w:t>
       </w:r>
     </w:p>
     <w:p>
@@ -539,7 +539,7 @@
         <w:rPr>
           <w:rFonts w:ascii="Calibri" w:hAnsi="Calibri" w:eastAsia="PingFang SC"/>
         </w:rPr>
-        <w:t>同一任务换一个同样合理的用户后，交付物是否在该变的地方变化、在不该变的地方保持？</w:t>
+        <w:t>swapped/wrong-user 报告是否比 task-only 更容易导致 regret、硬约束违规或错误自信？</w:t>
       </w:r>
     </w:p>
     <w:p>
@@ -555,7 +555,7 @@
         <w:rPr>
           <w:rFonts w:ascii="Calibri" w:hAnsi="Calibri" w:eastAsia="PingFang SC"/>
         </w:rPr>
-        <w:t>agent 会不会忽略、误用、过度使用或泄露用户信息？</w:t>
+        <w:t>报告的 PF/CFA 变高时，真实决策收益是否也变高，还是只是“看起来更贴合”？</w:t>
       </w:r>
     </w:p>
     <w:p>
@@ -571,7 +571,7 @@
         <w:rPr>
           <w:rFonts w:ascii="Calibri" w:hAnsi="Calibri" w:eastAsia="PingFang SC"/>
         </w:rPr>
-        <w:t>在长任务、信息冲突、子 agent 交接或用户中途改主意时，个性化能力会不会丢失？</w:t>
+        <w:t>哪类任务、用户和 agent 的个性化最可能转化为真实收益？</w:t>
       </w:r>
     </w:p>
     <w:p>
@@ -587,7 +587,7 @@
         <w:rPr>
           <w:rFonts w:ascii="Calibri" w:hAnsi="Calibri" w:eastAsia="PingFang SC"/>
         </w:rPr>
-        <w:t>我们设计的 rubric 和 judge 能不能稳定识别上述差异，而不是只学会偏爱某种写作风格？</w:t>
+        <w:t>报告共同质量、顺序效应、任务难度和用户猜测实验条件是否会混淆结论？</w:t>
       </w:r>
     </w:p>
     <w:p>
@@ -603,7 +603,7 @@
         <w:rPr>
           <w:rFonts w:ascii="Calibri" w:hAnsi="Calibri" w:eastAsia="PingFang SC"/>
         </w:rPr>
-        <w:t>主实验固定为 24 个 task family、每题两个强对比用户、4 种用户信息条件和 3 类 agent，最多 576 个 episode；其中 8 个 family 负责压力测试。另建 240-unit JudgeBench，并对至少 20% 输出做人评。领域专家负责事实和共同质量，目标用户负责判断 matched/swapped 哪份更适合自己；合成 persona 不能代替这一步。这个规模用于验证方法，不声称覆盖所有 Deep Research 模式；未测试、不适用和延期组合都会明确标出。</w:t>
+        <w:t>先做 3 个从报告生成到真人决定的完整 vertical slice。只有 utility 能预先冻结、等价 task shell 可交换、三类报告质量能配平、盲化可行，才扩到 8–12 个决策 family。预计约 36–48 名真实目标用户和 2–3 条报告生成管线，但最终样本量由 pilot 后的功效模拟冻结。原有 24-family 方案不再是首轮硬承诺；长程、动态、权限和证据污染只做少量压力层。</w:t>
       </w:r>
     </w:p>
     <w:p>
@@ -685,7 +685,7 @@
           <w:color w:val="5B6B7A"/>
           <w:sz w:val="19"/>
         </w:rPr>
-        <w:t>图 1  方法与正式 Proposal 完全一致。主榜评最终交付物；轻量轨迹和受控压力分叉只用于解释保持、偏离与更新。</w:t>
+        <w:t>图 1  方法与正式 Proposal 一致：先检查报告，再随机呈现给真实用户，最后验证决定。</w:t>
       </w:r>
     </w:p>
     <w:p>
@@ -1029,20 +1029,20 @@
         <w:rPr>
           <w:rFonts w:ascii="Calibri" w:hAnsi="Calibri" w:eastAsia="PingFang SC"/>
         </w:rPr>
-        <w:t>DeepAlign 不重复回答这个问题，而是换一个 estimand：</w:t>
+        <w:t>DeepAlign v0.31 已把问题换成：</w:t>
       </w:r>
       <w:r>
         <w:rPr>
           <w:rFonts w:ascii="Calibri" w:hAnsi="Calibri" w:eastAsia="PingFang SC"/>
           <w:b/>
         </w:rPr>
-        <w:t>同一任务和证据换成另一个同样合理的用户后，两份报告是否各自更适合自己的用户？</w:t>
-      </w:r>
-      <w:r>
-        <w:rPr>
-          <w:rFonts w:ascii="Calibri" w:hAnsi="Calibri" w:eastAsia="PingFang SC"/>
-        </w:rPr>
-        <w:t xml:space="preserve"> PDR-Bench 的 pairwise 比较回答“同一用户下哪个 agent 报告更好”；DeepAlign 的跨用户 2×2 matched/swapped 矩阵回答“只改变用户条件后，输出是否发生方向正确的变化”。这就是从 absolute adaptation evaluation 到 counterfactual personalization effect identification。</w:t>
+        <w:t>同一任务和证据换一个用户后，两份报告是否各自更适合自己的用户？</w:t>
+      </w:r>
+      <w:r>
+        <w:rPr>
+          <w:rFonts w:ascii="Calibri" w:hAnsi="Calibri" w:eastAsia="PingFang SC"/>
+        </w:rPr>
+        <w:t xml:space="preserve"> 但这仍是报告层的 fit。v0.32 再向下游走一步：把 task-only、matched、swapped 报告作为处理，观察真实用户最终决定的 regret、硬约束、置信度和时间。PDR-Bench 问“报告是否适合你”；DeepAlign-Bench 问“报告是否让你决定得更好”。</w:t>
       </w:r>
     </w:p>
     <w:p>
@@ -2333,7 +2333,7 @@
         <w:rPr>
           <w:rFonts w:ascii="Calibri" w:hAnsi="Calibri" w:eastAsia="PingFang SC"/>
         </w:rPr>
-        <w:t>主数据用 18 个 family 覆盖“3 种使用情境 × 6 种研究意图”，再用 6 个 family 复测最重要或风险最高的单元，共 24 个 family。这个规模足以验证测量方法，但不足以声称每个细分类别都有稳定模型排名。</w:t>
+        <w:t>Atlas 仍定义“3 种使用情境 × 6 种研究意图”，但 v0.32 不机械填满格子。先用 3 个 vertical slice 验证 decision utility 构念，再按功效与可行性扩到 8–12 个 family；coverage manifest 继续记录未测、结构上不适用和延期单元。</w:t>
       </w:r>
     </w:p>
     <w:p>
@@ -2932,35 +2932,11 @@
       </w:r>
     </w:p>
     <w:p>
-      <w:pPr>
-        <w:spacing w:before="80" w:after="160" w:line="240" w:lineRule="auto"/>
-        <w:ind w:left="360" w:right="216"/>
-        <w:jc w:val="left"/>
-        <w:shd w:fill="EEF2F5"/>
-      </w:pPr>
-      <w:r>
-        <w:rPr>
-          <w:rFonts w:ascii="Courier New" w:hAnsi="Courier New" w:eastAsia="PingFang SC"/>
-          <w:color w:val="163A63"/>
-          <w:sz w:val="18"/>
-        </w:rPr>
-        <w:t>24 个 task family</w:t>
-        <w:br/>
-        <w:t>× 2 个强对比用户</w:t>
-        <w:br/>
-        <w:t>× 4 种核心用户信息条件</w:t>
-        <w:br/>
-        <w:t>× 3 类核心 agent</w:t>
-        <w:br/>
-        <w:t>= 最多 576 个核心 episode</w:t>
-      </w:r>
-    </w:p>
-    <w:p>
-      <w:r>
-        <w:rPr>
-          <w:rFonts w:ascii="Calibri" w:hAnsi="Calibri" w:eastAsia="PingFang SC"/>
-        </w:rPr>
-        <w:t>四种核心条件是：task-only、structured persona、语义等价自然历史、允许主动澄清。</w:t>
+      <w:r>
+        <w:rPr>
+          <w:rFonts w:ascii="Calibri" w:hAnsi="Calibri" w:eastAsia="PingFang SC"/>
+        </w:rPr>
+        <w:t>核心实验不再是 576 个 artifact episode 的笛卡尔积，而是两层：Phase A 为每个 family 生成并配平 task-only、matched、swapped 报告；Phase B 在等价 task shell 上把三种报告随机分配给真实用户。离线可以多跑报告，真人 trial 的功效优先。</w:t>
       </w:r>
     </w:p>
     <w:p>
@@ -2976,7 +2952,7 @@
         <w:rPr>
           <w:rFonts w:ascii="Calibri" w:hAnsi="Calibri" w:eastAsia="PingFang SC"/>
         </w:rPr>
-        <w:t>代码 agent、多 agent、记忆增强系统和第二个商业产品只在适合它们的 8 个 anchor family 中测试。不能为了让表格整齐，要求每个系统运行它根本不适合的任务。</w:t>
+        <w:t>代码 agent、多 agent、记忆增强系统和第二个商业产品不进入首轮主比较；只有主 DDE 设计跑通后，才在少量适用 family 作外部效度 probe。</w:t>
       </w:r>
     </w:p>
     <w:p>
@@ -3077,13 +3053,13 @@
           <w:rFonts w:ascii="Calibri" w:hAnsi="Calibri" w:eastAsia="PingFang SC"/>
           <w:b/>
         </w:rPr>
-        <w:t>persona 与 task 匹配</w:t>
-      </w:r>
-      <w:r>
-        <w:rPr>
-          <w:rFonts w:ascii="Calibri" w:hAnsi="Calibri" w:eastAsia="PingFang SC"/>
-        </w:rPr>
-        <w:t>用于先做出一组有效的干净题；</w:t>
+        <w:t>三臂报告处理</w:t>
+      </w:r>
+      <w:r>
+        <w:rPr>
+          <w:rFonts w:ascii="Calibri" w:hAnsi="Calibri" w:eastAsia="PingFang SC"/>
+        </w:rPr>
+        <w:t>用于估计 DDE；</w:t>
       </w:r>
       <w:r>
         <w:rPr>
@@ -3096,7 +3072,7 @@
         <w:rPr>
           <w:rFonts w:ascii="Calibri" w:hAnsi="Calibri" w:eastAsia="PingFang SC"/>
         </w:rPr>
-        <w:t>是在这组题上单独改一个输入或过程因素。Anchor family 只是从 24 个 family 中选出的 8 个合适实验宿主，不是 8 种 persona，也不等于 8 种失败。</w:t>
+        <w:t>是在已通过主设计的 family 上单独改一个因素。首版只选 2–4 个适用 family 承担压力，不再预设 8 个 anchor。</w:t>
       </w:r>
     </w:p>
     <w:p>
@@ -3178,7 +3154,7 @@
         <w:rPr>
           <w:rFonts w:ascii="Calibri" w:hAnsi="Calibri" w:eastAsia="PingFang SC"/>
         </w:rPr>
-        <w:t>8 个 anchor 固定覆盖：日常决策、学习/职业、金融信息、健康信息、企业采购/合规、软件生产、学术前沿、政策传播。前三个共同对照（clean、persona swap、无关信息）在所有 anchor 上运行；冲突、稀释、handoff 和动态更新用平衡不完全区组分配。要说“哪种因素跨任务更伤个性化”，该主要 perturbation 至少要在 4 个适用 anchor 上做同前缀配对；只做 2 个只能叫探索性复现。</w:t>
+        <w:t>压力层不预先绑定八类主题。只在 2–4 个已经通过 DDE 主设计的 family 上选择自然适用的冲突、稀释、handoff 或动态更新；覆盖不足时只作探索性案例，不声称跨任务机制。</w:t>
       </w:r>
     </w:p>
     <w:p>
@@ -5864,7 +5840,59 @@
         <w:pStyle w:val="Heading2"/>
       </w:pPr>
       <w:r>
-        <w:t>8.3 长程与动态状态能力</w:t>
+        <w:t>8.3 真正的主指标：下游决策效果</w:t>
+      </w:r>
+    </w:p>
+    <w:p>
+      <w:r>
+        <w:rPr>
+          <w:rFonts w:ascii="Calibri" w:hAnsi="Calibri" w:eastAsia="PingFang SC"/>
+        </w:rPr>
+        <w:t>先为每个用户和任务冻结一个可审计的 utility：硬预算、截止日期、安全/合规等硬约束优先；客观环境结果可由 verifier 检查；用户确认的软偏好只在可接受方案之间排序。任务必须仍需要 agent 查证和综合新证据，不能把答案直接写进 persona。</w:t>
+      </w:r>
+    </w:p>
+    <w:p>
+      <w:pPr>
+        <w:spacing w:before="80" w:after="160" w:line="240" w:lineRule="auto"/>
+        <w:ind w:left="360" w:right="216"/>
+        <w:jc w:val="left"/>
+        <w:shd w:fill="EEF2F5"/>
+      </w:pPr>
+      <w:r>
+        <w:rPr>
+          <w:rFonts w:ascii="Courier New" w:hAnsi="Courier New" w:eastAsia="PingFang SC"/>
+          <w:color w:val="163A63"/>
+          <w:sz w:val="18"/>
+        </w:rPr>
+        <w:t>Regret = 最优可接受决定的效用 − 用户实际决定的效用</w:t>
+        <w:br/>
+        <w:t>DDE = task-only 的 Regret − matched 的 Regret</w:t>
+        <w:br/>
+        <w:t>WrongUserHarm = swapped 的 Regret − task-only 的 Regret</w:t>
+      </w:r>
+    </w:p>
+    <w:p>
+      <w:r>
+        <w:rPr>
+          <w:rFonts w:ascii="Courier New" w:hAnsi="Courier New" w:eastAsia="PingFang SC"/>
+          <w:color w:val="6A3E00"/>
+          <w:sz w:val="20"/>
+        </w:rPr>
+        <w:t>DDE &gt; 0</w:t>
+      </w:r>
+      <w:r>
+        <w:rPr>
+          <w:rFonts w:ascii="Calibri" w:hAnsi="Calibri" w:eastAsia="PingFang SC"/>
+        </w:rPr>
+        <w:t xml:space="preserve"> 才表示个性化报告改善了决定。PF/CFA、TQ/FR 用来确认报告处理成立和解释机制，不与 DDE 平均成总分。如果 CFA 高但 DDE 接近 0，结论应是“报告适配分不是充分的用户效用代理”。</w:t>
+      </w:r>
+    </w:p>
+    <w:p>
+      <w:pPr>
+        <w:pStyle w:val="Heading2"/>
+      </w:pPr>
+      <w:r>
+        <w:t>8.4 长程与动态状态能力</w:t>
       </w:r>
     </w:p>
     <w:p>
@@ -5916,15 +5944,15 @@
         <w:pStyle w:val="Heading2"/>
       </w:pPr>
       <w:r>
-        <w:t>8.4 榜单不能只给一个总分</w:t>
-      </w:r>
-    </w:p>
-    <w:p>
-      <w:r>
-        <w:rPr>
-          <w:rFonts w:ascii="Calibri" w:hAnsi="Calibri" w:eastAsia="PingFang SC"/>
-        </w:rPr>
-        <w:t>主榜先检查 TQ、FR 和关键隐私门槛，再分四张 profile：clean 条件下的任务/交付物能力；不同 signal channel 的获取与利用；S0–S3 的风险/failure-mode 退化曲线；压力下的 must-not、隐私、权限、弃权和共同质量副作用。每张 agent card 标注运行环境、trace level、覆盖率和 N/A；不同 evidence track、工具预算和 agent 类型不混排。</w:t>
+        <w:t>8.5 榜单不能只给一个总分</w:t>
+      </w:r>
+    </w:p>
+    <w:p>
+      <w:r>
+        <w:rPr>
+          <w:rFonts w:ascii="Calibri" w:hAnsi="Calibri" w:eastAsia="PingFang SC"/>
+        </w:rPr>
+        <w:t>主榜先检查 TQ、FR 和关键隐私门槛，再以 DDE、WrongUserHarm、硬约束违规和校准为中心；PF/CFA 单列为 artifact qualification。不同 evidence track、工具预算和 agent 类型不混排，长程/权限/证据污染放到次级 stress profile。</w:t>
       </w:r>
     </w:p>
     <w:p>
@@ -6428,7 +6456,7 @@
                 <w:rFonts w:ascii="Calibri" w:hAnsi="Calibri" w:eastAsia="PingFang SC"/>
                 <w:sz w:val="18"/>
               </w:rPr>
-              <w:t>冻结 Atlas、schema、coverage manifest 和 24 个 family 配额</w:t>
+              <w:t>冻结 3 个 decision vertical slice、utility schema 和 task-shell 规则</w:t>
             </w:r>
           </w:p>
         </w:tc>
@@ -6454,7 +6482,7 @@
                 <w:rFonts w:ascii="Calibri" w:hAnsi="Calibri" w:eastAsia="PingFang SC"/>
                 <w:sz w:val="18"/>
               </w:rPr>
-              <w:t>缩小 ontology，不增加新分支</w:t>
+              <w:t>删除不可验证或答案泄漏任务</w:t>
             </w:r>
           </w:p>
         </w:tc>
@@ -6508,7 +6536,7 @@
                 <w:rFonts w:ascii="Calibri" w:hAnsi="Calibri" w:eastAsia="PingFang SC"/>
                 <w:sz w:val="18"/>
               </w:rPr>
-              <w:t>24 个 family 草案、48 个 user state、persona 兼容性检查</w:t>
+              <w:t>三臂参考报告、Phase A 配平、盲化与 consent</w:t>
             </w:r>
           </w:p>
         </w:tc>
@@ -6534,7 +6562,7 @@
                 <w:rFonts w:ascii="Calibri" w:hAnsi="Calibri" w:eastAsia="PingFang SC"/>
                 <w:sz w:val="18"/>
               </w:rPr>
-              <w:t>删除没有稳定用户差异的任务</w:t>
+              <w:t>减少交付类型和 agent</w:t>
             </w:r>
           </w:p>
         </w:tc>
@@ -6588,7 +6616,7 @@
                 <w:rFonts w:ascii="Calibri" w:hAnsi="Calibri" w:eastAsia="PingFang SC"/>
                 <w:sz w:val="18"/>
               </w:rPr>
-              <w:t>真值包、四类契约、rubric modules 和小样本人评</w:t>
+              <w:t>小规模真人 pilot，估计方差、顺序效应和流失</w:t>
             </w:r>
           </w:p>
         </w:tc>
@@ -6614,7 +6642,7 @@
                 <w:rFonts w:ascii="Calibri" w:hAnsi="Calibri" w:eastAsia="PingFang SC"/>
                 <w:sz w:val="18"/>
               </w:rPr>
-              <w:t>不能区分 matched/swapped 的 rubric 不进主榜</w:t>
+              <w:t>修改设计，不扩 family</w:t>
             </w:r>
           </w:p>
         </w:tc>
@@ -6668,7 +6696,7 @@
                 <w:rFonts w:ascii="Calibri" w:hAnsi="Calibri" w:eastAsia="PingFang SC"/>
                 <w:sz w:val="18"/>
               </w:rPr>
-              <w:t>240-unit JudgeBench、judge 基线、6 个 family dry run</w:t>
+              <w:t>功效模拟并冻结 8–12 family、样本与预注册</w:t>
             </w:r>
           </w:p>
         </w:tc>
@@ -6694,7 +6722,7 @@
                 <w:rFonts w:ascii="Calibri" w:hAnsi="Calibri" w:eastAsia="PingFang SC"/>
                 <w:sz w:val="18"/>
               </w:rPr>
-              <w:t>judge 不过门就缩成更多人评</w:t>
+              <w:t>功效不足则减少系统/次要终点</w:t>
             </w:r>
           </w:p>
         </w:tc>
@@ -6748,7 +6776,7 @@
                 <w:rFonts w:ascii="Calibri" w:hAnsi="Calibri" w:eastAsia="PingFang SC"/>
                 <w:sz w:val="18"/>
               </w:rPr>
-              <w:t>三类核心 agent 跑完主矩阵</w:t>
+              <w:t>Phase A agent 运行与 Phase B 首批真人实验</w:t>
             </w:r>
           </w:p>
         </w:tc>
@@ -6774,7 +6802,7 @@
                 <w:rFonts w:ascii="Calibri" w:hAnsi="Calibri" w:eastAsia="PingFang SC"/>
                 <w:sz w:val="18"/>
               </w:rPr>
-              <w:t>冻结版本，停止新增 agent</w:t>
+              <w:t>暂停 stress layer</w:t>
             </w:r>
           </w:p>
         </w:tc>
@@ -6828,7 +6856,7 @@
                 <w:rFonts w:ascii="Calibri" w:hAnsi="Calibri" w:eastAsia="PingFang SC"/>
                 <w:sz w:val="18"/>
               </w:rPr>
-              <w:t>anchor 压测、20% 人评、错误 open coding</w:t>
+              <w:t>完成真人主实验和关键仲裁</w:t>
             </w:r>
           </w:p>
         </w:tc>
@@ -6854,7 +6882,7 @@
                 <w:rFonts w:ascii="Calibri" w:hAnsi="Calibri" w:eastAsia="PingFang SC"/>
                 <w:sz w:val="18"/>
               </w:rPr>
-              <w:t>只保留证据充分的机制结论</w:t>
+              <w:t>保护 DDE 主终点</w:t>
             </w:r>
           </w:p>
         </w:tc>
@@ -6908,7 +6936,7 @@
                 <w:rFonts w:ascii="Calibri" w:hAnsi="Calibri" w:eastAsia="PingFang SC"/>
                 <w:sz w:val="18"/>
               </w:rPr>
-              <w:t>统计、bootstrap、覆盖审计和论文主要表格</w:t>
+              <w:t>DDE、错配伤害、代理效度和鲁棒性分析</w:t>
             </w:r>
           </w:p>
         </w:tc>
@@ -6934,7 +6962,7 @@
                 <w:rFonts w:ascii="Calibri" w:hAnsi="Calibri" w:eastAsia="PingFang SC"/>
                 <w:sz w:val="18"/>
               </w:rPr>
-              <w:t>删除不受数据支持的支线</w:t>
+              <w:t>删除不受支持支线</w:t>
             </w:r>
           </w:p>
         </w:tc>
@@ -7038,7 +7066,7 @@
         <w:rPr>
           <w:rFonts w:ascii="Calibri" w:hAnsi="Calibri" w:eastAsia="PingFang SC"/>
         </w:rPr>
-        <w:t>前两周不直接写 24 个 family。先收集 60–80 个真实/专业/访谈 seed，筛成约 30 个候选，只把 3 个 family 做到“真实用户 → 契约 → node/leaf → matched/swapped/task-only reference → E1 运行 → 人评”全链路。至少 2 个 family 通过双向 specificity、相对 task-only benefit、共同质量和边界四重门后，才扩到 24 个。</w:t>
+        <w:t>前两周只把 3 个 family 做到“真实用户 → utility → 等价 task shell → 三臂报告 → Phase A 配平 → 盲化 decision trial”全链路。至少 2 个通过 utility、任务等价、质量配平和实施可行性门后，才扩到 8–12 个并做功效冻结。</w:t>
       </w:r>
     </w:p>
     <w:p>
@@ -7054,7 +7082,7 @@
         <w:rPr>
           <w:rFonts w:ascii="Calibri" w:hAnsi="Calibri" w:eastAsia="PingFang SC"/>
         </w:rPr>
-        <w:t>ICLR 官方近年整体录用率约 27%–32%：2024 年 31%，2025 年 32%，2026 年 27%。</w:t>
+        <w:t>ICLR 官方近年整体录用率约 27%–32%。</w:t>
       </w:r>
       <w:hyperlink r:id="rId40">
         <w:r>
@@ -7080,7 +7108,7 @@
         <w:rPr>
           <w:rFonts w:ascii="Calibri" w:hAnsi="Calibri" w:eastAsia="PingFang SC"/>
         </w:rPr>
-        <w:t xml:space="preserve"> 这篇以现在只有 proposal、没有 pilot 的状态投稿，主观估计约 5%–12%；完成真人验证、24 family、可靠 E1、judge 校准和公开 artifact，但效应一般，约 20%–35%；若 specificity × benefit 在多个任务层稳定、四重门都通过并有强 baseline/复现材料，约 35%–50%。中心判断是按本方案认真执行大约三成上下。Persona 主要合成、只靠 LLM judge、没有 task-only 或 E1 不可复现时，应低于 10%–15%。这些是审稿情景判断，不是可校准的精确概率。</w:t>
+        <w:t xml:space="preserve"> v0.32 的新颖性比 artifact-fit 方案更清楚，但真人招募、utility validity 和统计功效风险也更高。真正决定投稿强度的是 DDE/错配伤害是否稳定、报告是否配平、设计是否可复现，而不是 family 数量。</w:t>
       </w:r>
     </w:p>
     <w:p>
@@ -7104,7 +7132,7 @@
         <w:rPr>
           <w:rFonts w:ascii="Calibri" w:hAnsi="Calibri" w:eastAsia="PingFang SC"/>
         </w:rPr>
-        <w:t>应先承认 PDR-Bench 已经测 task–persona 条件下的 absolute adaptation；再证明 DeepAlign 的跨用户 2×2 对角优势和预冻结契约能识别 counterfactual personalization effect。同时可以公平指出 PDR 的最佳 PCA=0.43、15-query/2-agent 校准、动态 criterion variance、非 target-user validity 和复合事实核验链等可靠性边界。前者是方法创新，后者是测量改进，不能混成一个 claim。</w:t>
+        <w:t>应先承认 PDR-Bench 已经测 task–persona 条件下的 absolute adaptation，v0.31 也只是把 fit 的识别做得更严格。v0.32 的证据必须来自 artifact → real-user decision：Phase A 证明报告处理成立，Phase B 证明或否定 DDE。PDR 的 judge 边界解释为什么需要 Phase A，但不再充当核心创新。</w:t>
       </w:r>
     </w:p>
     <w:p>
@@ -7211,7 +7239,7 @@
         <w:rPr>
           <w:rFonts w:ascii="Calibri" w:hAnsi="Calibri" w:eastAsia="PingFang SC"/>
         </w:rPr>
-        <w:t>提供了一套机器可读的个性化 Deep Research 评测空间；</w:t>
+        <w:t>提供了一个把个性化研究交付物作为随机处理的两阶段 benchmark；</w:t>
       </w:r>
     </w:p>
     <w:p>
@@ -7222,7 +7250,7 @@
         <w:rPr>
           <w:rFonts w:ascii="Calibri" w:hAnsi="Calibri" w:eastAsia="PingFang SC"/>
         </w:rPr>
-        <w:t>反事实任务族能识别交付物的用户特异性，语义等价信号测试再检查其是否只依赖表面 persona 线索；</w:t>
+        <w:t>matched 报告是否降低真实用户的可验证 decision regret，wrong-user 报告是否产生伤害；</w:t>
       </w:r>
     </w:p>
     <w:p>
@@ -7233,7 +7261,7 @@
         <w:rPr>
           <w:rFonts w:ascii="Calibri" w:hAnsi="Calibri" w:eastAsia="PingFang SC"/>
         </w:rPr>
-        <w:t>不同用户信息渠道和 agent 架构会产生可诊断差异；</w:t>
+        <w:t>PF/CFA 何时能、何时不能作为真实决策收益的代理；</w:t>
       </w:r>
     </w:p>
     <w:p>
@@ -7244,7 +7272,7 @@
         <w:rPr>
           <w:rFonts w:ascii="Calibri" w:hAnsi="Calibri" w:eastAsia="PingFang SC"/>
         </w:rPr>
-        <w:t>模块化 rubric 与独立 judge 校准可以支持可复现评测；</w:t>
+        <w:t>模块化 rubric、utility verifier 与独立 judge 校准如何支持复现；</w:t>
       </w:r>
     </w:p>
     <w:p>
@@ -7255,7 +7283,7 @@
         <w:rPr>
           <w:rFonts w:ascii="Calibri" w:hAnsi="Calibri" w:eastAsia="PingFang SC"/>
         </w:rPr>
-        <w:t>若完成诊断子集，可以报告保持和更新的受控压力证据。</w:t>
+        <w:t>若完成诊断子集，可以报告少量长程或证据压力下的异质性。</w:t>
       </w:r>
     </w:p>
     <w:p>
@@ -8733,7 +8761,7 @@
         <w:color w:val="5B6B7A"/>
         <w:sz w:val="18"/>
       </w:rPr>
-      <w:t xml:space="preserve">2026-8-8   ·   </w:t>
+      <w:t xml:space="preserve">2026-8-9   ·   </w:t>
     </w:r>
     <w:r>
       <w:rPr>
@@ -8766,7 +8794,7 @@
         <w:color w:val="5B6B7A"/>
         <w:sz w:val="18"/>
       </w:rPr>
-      <w:t xml:space="preserve">2026-8-8   ·   </w:t>
+      <w:t xml:space="preserve">2026-8-9   ·   </w:t>
     </w:r>
     <w:r>
       <w:rPr>
@@ -8799,7 +8827,7 @@
         <w:color w:val="5B6B7A"/>
         <w:sz w:val="18"/>
       </w:rPr>
-      <w:t xml:space="preserve">2026-8-8   ·   </w:t>
+      <w:t xml:space="preserve">2026-8-9   ·   </w:t>
     </w:r>
     <w:r>
       <w:rPr>

</xml_diff>

<commit_message>
proposal v0.33: validate metric pilot and overview
</commit_message>
<xml_diff>
--- a/deliverables/DeepAlign-Bench_完整人话版.docx
+++ b/deliverables/DeepAlign-Bench_完整人话版.docx
@@ -131,7 +131,7 @@
                 <w:color w:val="5B6B7A"/>
                 <w:sz w:val="21"/>
               </w:rPr>
-              <w:t>v0.32 · 完整人话版</w:t>
+              <w:t>v0.33 · 完整人话版</w:t>
             </w:r>
           </w:p>
         </w:tc>
@@ -5769,20 +5769,7 @@
         <w:rPr>
           <w:rFonts w:ascii="Calibri" w:hAnsi="Calibri" w:eastAsia="PingFang SC"/>
         </w:rPr>
-        <w:t>还要回答另一件过去容易混掉的事：</w:t>
-      </w:r>
-      <w:r>
-        <w:rPr>
-          <w:rFonts w:ascii="Calibri" w:hAnsi="Calibri" w:eastAsia="PingFang SC"/>
-          <w:b/>
-        </w:rPr>
-        <w:t>可区分不等于有帮助。</w:t>
-      </w:r>
-      <w:r>
-        <w:rPr>
-          <w:rFonts w:ascii="Calibri" w:hAnsi="Calibri" w:eastAsia="PingFang SC"/>
-        </w:rPr>
-        <w:t xml:space="preserve"> 主矩阵本来就有 task-only 报告 </w:t>
+        <w:t>还要补一个很直观的绝对基准：</w:t>
       </w:r>
       <w:r>
         <w:rPr>
@@ -5790,13 +5777,13 @@
           <w:color w:val="6A3E00"/>
           <w:sz w:val="20"/>
         </w:rPr>
-        <w:t>Y0</w:t>
-      </w:r>
-      <w:r>
-        <w:rPr>
-          <w:rFonts w:ascii="Calibri" w:hAnsi="Calibri" w:eastAsia="PingFang SC"/>
-        </w:rPr>
-        <w:t xml:space="preserve">，因此再计算 </w:t>
+        <w:t>A_min=min(Ua看Ya的适配分, Ub看Yb的适配分)</w:t>
+      </w:r>
+      <w:r>
+        <w:rPr>
+          <w:rFonts w:ascii="Calibri" w:hAnsi="Calibri" w:eastAsia="PingFang SC"/>
+        </w:rPr>
+        <w:t>。假如 matched 只有0.40、swapped是0.00，差值看上去很大，但0.40本身仍不合格；</w:t>
       </w:r>
       <w:r>
         <w:rPr>
@@ -5804,13 +5791,21 @@
           <w:color w:val="6A3E00"/>
           <w:sz w:val="20"/>
         </w:rPr>
-        <w:t>Ga = Ua 看 Ya 相对 Y0 的增益</w:t>
-      </w:r>
-      <w:r>
-        <w:rPr>
-          <w:rFonts w:ascii="Calibri" w:hAnsi="Calibri" w:eastAsia="PingFang SC"/>
-        </w:rPr>
-        <w:t>、</w:t>
+        <w:t>A_min</w:t>
+      </w:r>
+      <w:r>
+        <w:rPr>
+          <w:rFonts w:ascii="Calibri" w:hAnsi="Calibri" w:eastAsia="PingFang SC"/>
+        </w:rPr>
+        <w:t xml:space="preserve"> 就是专门拦这种情况。每条 leaf 已经先归一到0–1，因此差值可以直接解释成量尺百分点；再除以两份分数之和，反而会在两份都很差时把差异夸大。</w:t>
+      </w:r>
+    </w:p>
+    <w:p>
+      <w:r>
+        <w:rPr>
+          <w:rFonts w:ascii="Calibri" w:hAnsi="Calibri" w:eastAsia="PingFang SC"/>
+        </w:rPr>
+        <w:t xml:space="preserve">“向量夹角”可以保留，但只做诊断。把 </w:t>
       </w:r>
       <w:r>
         <w:rPr>
@@ -5818,21 +5813,168 @@
           <w:color w:val="6A3E00"/>
           <w:sz w:val="20"/>
         </w:rPr>
-        <w:t>Gb = Ub 看 Yb 相对 Y0 的增益</w:t>
-      </w:r>
-      <w:r>
-        <w:rPr>
-          <w:rFonts w:ascii="Calibri" w:hAnsi="Calibri" w:eastAsia="PingFang SC"/>
-        </w:rPr>
-        <w:t>。最后用二维图同时画“跨用户 specificity”和“相对 task-only benefit”：右上角才是真正有益的个性化；只在右下说明版本不同但没有给用户带来净收益。</w:t>
-      </w:r>
-    </w:p>
-    <w:p>
-      <w:r>
-        <w:rPr>
-          <w:rFonts w:ascii="Calibri" w:hAnsi="Calibri" w:eastAsia="PingFang SC"/>
-        </w:rPr>
-        <w:t>最终成功条件不是一个新总分，而是四个门同时通过：两位用户的 matched 都优于 swapped；两位用户相对 task-only 都不变差；TQ/FR 与 must-hold 不下降；must-not、隐私和权限不违规。目标用户盲评再用 family 内配对检验确认 match effect，不能把同一个 family 的四格分数当四个独立样本。之后仍要报告语义等价 views 中最差的 CFA、Cue Gap、must-change/must-hold 一致率，以及无关 cue 是否改变结果。</w:t>
+        <w:t>[Δa,Δb]</w:t>
+      </w:r>
+      <w:r>
+        <w:rPr>
+          <w:rFonts w:ascii="Calibri" w:hAnsi="Calibri" w:eastAsia="PingFang SC"/>
+        </w:rPr>
+        <w:t xml:space="preserve"> 和理想方向 </w:t>
+      </w:r>
+      <w:r>
+        <w:rPr>
+          <w:rFonts w:ascii="Courier New" w:hAnsi="Courier New" w:eastAsia="PingFang SC"/>
+          <w:color w:val="6A3E00"/>
+          <w:sz w:val="20"/>
+        </w:rPr>
+        <w:t>[1,1]</w:t>
+      </w:r>
+      <w:r>
+        <w:rPr>
+          <w:rFonts w:ascii="Calibri" w:hAnsi="Calibri" w:eastAsia="PingFang SC"/>
+        </w:rPr>
+        <w:t xml:space="preserve"> 比夹角，能看两位用户是不是都朝正确方向；可是 </w:t>
+      </w:r>
+      <w:r>
+        <w:rPr>
+          <w:rFonts w:ascii="Courier New" w:hAnsi="Courier New" w:eastAsia="PingFang SC"/>
+          <w:color w:val="6A3E00"/>
+          <w:sz w:val="20"/>
+        </w:rPr>
+        <w:t>[0.01,0.01]</w:t>
+      </w:r>
+      <w:r>
+        <w:rPr>
+          <w:rFonts w:ascii="Calibri" w:hAnsi="Calibri" w:eastAsia="PingFang SC"/>
+        </w:rPr>
+        <w:t xml:space="preserve"> 的夹角也完美，所以还必须同时看向量长度、</w:t>
+      </w:r>
+      <w:r>
+        <w:rPr>
+          <w:rFonts w:ascii="Courier New" w:hAnsi="Courier New" w:eastAsia="PingFang SC"/>
+          <w:color w:val="6A3E00"/>
+          <w:sz w:val="20"/>
+        </w:rPr>
+        <w:t>CFA_min</w:t>
+      </w:r>
+      <w:r>
+        <w:rPr>
+          <w:rFonts w:ascii="Calibri" w:hAnsi="Calibri" w:eastAsia="PingFang SC"/>
+        </w:rPr>
+        <w:t xml:space="preserve"> 和 </w:t>
+      </w:r>
+      <w:r>
+        <w:rPr>
+          <w:rFonts w:ascii="Courier New" w:hAnsi="Courier New" w:eastAsia="PingFang SC"/>
+          <w:color w:val="6A3E00"/>
+          <w:sz w:val="20"/>
+        </w:rPr>
+        <w:t>A_min</w:t>
+      </w:r>
+      <w:r>
+        <w:rPr>
+          <w:rFonts w:ascii="Calibri" w:hAnsi="Calibri" w:eastAsia="PingFang SC"/>
+        </w:rPr>
+        <w:t>。不把它们乘成一个总分，是因为乘积又会让一种失败补偿另一种失败。</w:t>
+      </w:r>
+    </w:p>
+    <w:p>
+      <w:r>
+        <w:rPr>
+          <w:rFonts w:ascii="Calibri" w:hAnsi="Calibri" w:eastAsia="PingFang SC"/>
+        </w:rPr>
+        <w:t>还要回答另一件过去容易混掉的事：</w:t>
+      </w:r>
+      <w:r>
+        <w:rPr>
+          <w:rFonts w:ascii="Calibri" w:hAnsi="Calibri" w:eastAsia="PingFang SC"/>
+          <w:b/>
+        </w:rPr>
+        <w:t>可区分不等于有帮助。</w:t>
+      </w:r>
+      <w:r>
+        <w:rPr>
+          <w:rFonts w:ascii="Calibri" w:hAnsi="Calibri" w:eastAsia="PingFang SC"/>
+        </w:rPr>
+        <w:t xml:space="preserve"> 主矩阵本来就有 task-only 报告 </w:t>
+      </w:r>
+      <w:r>
+        <w:rPr>
+          <w:rFonts w:ascii="Courier New" w:hAnsi="Courier New" w:eastAsia="PingFang SC"/>
+          <w:color w:val="6A3E00"/>
+          <w:sz w:val="20"/>
+        </w:rPr>
+        <w:t>Y0</w:t>
+      </w:r>
+      <w:r>
+        <w:rPr>
+          <w:rFonts w:ascii="Calibri" w:hAnsi="Calibri" w:eastAsia="PingFang SC"/>
+        </w:rPr>
+        <w:t xml:space="preserve">，因此再计算 </w:t>
+      </w:r>
+      <w:r>
+        <w:rPr>
+          <w:rFonts w:ascii="Courier New" w:hAnsi="Courier New" w:eastAsia="PingFang SC"/>
+          <w:color w:val="6A3E00"/>
+          <w:sz w:val="20"/>
+        </w:rPr>
+        <w:t>Ga = Ua 看 Ya 相对 Y0 的差</w:t>
+      </w:r>
+      <w:r>
+        <w:rPr>
+          <w:rFonts w:ascii="Calibri" w:hAnsi="Calibri" w:eastAsia="PingFang SC"/>
+        </w:rPr>
+        <w:t>、</w:t>
+      </w:r>
+      <w:r>
+        <w:rPr>
+          <w:rFonts w:ascii="Courier New" w:hAnsi="Courier New" w:eastAsia="PingFang SC"/>
+          <w:color w:val="6A3E00"/>
+          <w:sz w:val="20"/>
+        </w:rPr>
+        <w:t>Gb = Ub 看 Yb 相对 Y0 的差</w:t>
+      </w:r>
+      <w:r>
+        <w:rPr>
+          <w:rFonts w:ascii="Calibri" w:hAnsi="Calibri" w:eastAsia="PingFang SC"/>
+        </w:rPr>
+        <w:t>。</w:t>
+      </w:r>
+      <w:r>
+        <w:rPr>
+          <w:rFonts w:ascii="Courier New" w:hAnsi="Courier New" w:eastAsia="PingFang SC"/>
+          <w:color w:val="6A3E00"/>
+          <w:sz w:val="20"/>
+        </w:rPr>
+        <w:t>Ga/Gb</w:t>
+      </w:r>
+      <w:r>
+        <w:rPr>
+          <w:rFonts w:ascii="Calibri" w:hAnsi="Calibri" w:eastAsia="PingFang SC"/>
+        </w:rPr>
+        <w:t xml:space="preserve"> 不低于一个小的 non-inferiority margin 只能说明“没有实质性变差”；只有两边都超过预注册的实际意义阈值，或真人明确更愿意采用 matched，才能叫“真实 added value”。</w:t>
+      </w:r>
+    </w:p>
+    <w:p>
+      <w:r>
+        <w:rPr>
+          <w:rFonts w:ascii="Calibri" w:hAnsi="Calibri" w:eastAsia="PingFang SC"/>
+        </w:rPr>
+        <w:t xml:space="preserve">最终成功条件不是一个新总分，而是五个门同时通过：两位用户的 matched 都以有实际意义的幅度优于 swapped；两份 matched 的 </w:t>
+      </w:r>
+      <w:r>
+        <w:rPr>
+          <w:rFonts w:ascii="Courier New" w:hAnsi="Courier New" w:eastAsia="PingFang SC"/>
+          <w:color w:val="6A3E00"/>
+          <w:sz w:val="20"/>
+        </w:rPr>
+        <w:t>A_min</w:t>
+      </w:r>
+      <w:r>
+        <w:rPr>
+          <w:rFonts w:ascii="Calibri" w:hAnsi="Calibri" w:eastAsia="PingFang SC"/>
+        </w:rPr>
+        <w:t xml:space="preserve"> 过绝对适配线；两位用户相对 task-only 都不出现实质损害；TQ/FR 与 must-hold 不下降；owner-aware must-not、隐私和权限不违规。目标用户盲评再用 family 内配对检验确认 match effect，不能把同一个 family 的四格分数当四个独立样本。之后仍要报告语义等价 views 中最差的 CFA、Cue Gap、must-change/must-hold 一致率，以及无关 cue 是否改变结果。</w:t>
       </w:r>
     </w:p>
     <w:p>
@@ -7108,7 +7250,7 @@
         <w:rPr>
           <w:rFonts w:ascii="Calibri" w:hAnsi="Calibri" w:eastAsia="PingFang SC"/>
         </w:rPr>
-        <w:t xml:space="preserve"> v0.32 的新颖性比 artifact-fit 方案更清楚，但真人招募、utility validity 和统计功效风险也更高。真正决定投稿强度的是 DDE/错配伤害是否稳定、报告是否配平、设计是否可复现，而不是 family 数量。</w:t>
+        <w:t xml:space="preserve"> v0.33 已用合成 pilot 验证 Phase A 有信号并修正差值假阳性，但没有真人 DDE，因此不能上调论文成功判断。真正决定投稿强度的是 DDE/错配伤害是否稳定、报告是否配平、设计是否可复现，而不是合成 family 的漂亮通过率。</w:t>
       </w:r>
     </w:p>
     <w:p>

</xml_diff>

<commit_message>
proposal v0.48: record GPT-5 access block
</commit_message>
<xml_diff>
--- a/deliverables/DeepAlign-Bench_完整人话版.docx
+++ b/deliverables/DeepAlign-Bench_完整人话版.docx
@@ -131,7 +131,7 @@
                 <w:color w:val="5B6B7A"/>
                 <w:sz w:val="21"/>
               </w:rPr>
-              <w:t>v0.47 · 完整人话版</w:t>
+              <w:t>v0.48 · 完整人话版</w:t>
             </w:r>
           </w:p>
         </w:tc>
@@ -642,7 +642,7 @@
               <a:graphicData uri="http://schemas.openxmlformats.org/drawingml/2006/picture">
                 <pic:pic>
                   <pic:nvPicPr>
-                    <pic:cNvPr id="0" name="DeepAlign-Bench_整体框架与PDR压力测试_v0.47.png"/>
+                    <pic:cNvPr id="0" name="DeepAlign-Bench_整体框架与PDR压力测试_v0.48.png"/>
                     <pic:cNvPicPr/>
                   </pic:nvPicPr>
                   <pic:blipFill>
@@ -2091,6 +2091,35 @@
       </w:r>
     </w:p>
     <w:p>
+      <w:r>
+        <w:rPr>
+          <w:rFonts w:ascii="Calibri" w:hAnsi="Calibri" w:eastAsia="PingFang SC"/>
+        </w:rPr>
+        <w:t xml:space="preserve">我们随后把 GPT-5 复现做成了真正的“先锁题再看结果”：先把 4 个 family、20 份报告、官方 PDR 中文 prompt、5 次权重采样、A/B 全交叉和三次重复提交到 Git，再调用 API。结果不是 GPT-5 给了零分或高分，而是 </w:t>
+      </w:r>
+      <w:r>
+        <w:rPr>
+          <w:rFonts w:ascii="Calibri" w:hAnsi="Calibri" w:eastAsia="PingFang SC"/>
+          <w:b/>
+        </w:rPr>
+        <w:t>根本没有进入 GPT-5</w:t>
+      </w:r>
+      <w:r>
+        <w:rPr>
+          <w:rFonts w:ascii="Calibri" w:hAnsi="Calibri" w:eastAsia="PingFang SC"/>
+        </w:rPr>
+        <w:t>。OpenRouter 确认 key 有效、有余额、GPT-5 也在可用模型列表里，但根据账户/请求地区的 provider terms，在选择 OpenAI/Azure endpoint 前就返回 403。去掉隐私筛选也一样。因此目前没有新的 GPT-5 实验结论，不能把这个工程阻塞写成支持或反对论文假设的证据。</w:t>
+      </w:r>
+    </w:p>
+    <w:p>
+      <w:r>
+        <w:rPr>
+          <w:rFonts w:ascii="Calibri" w:hAnsi="Calibri" w:eastAsia="PingFang SC"/>
+        </w:rPr>
+        <w:t>换句话说：本地最小实验结论没有被 GPT-5 复现，也没有被 GPT-5 推翻。现在需要的是一个在受支持账户/地区合法可用的 GPT-5 key，或者官方 OpenAI API key；不应该用代理或别的模型冒充复现。</w:t>
+      </w:r>
+    </w:p>
+    <w:p>
       <w:pPr>
         <w:pStyle w:val="Heading1"/>
       </w:pPr>
@@ -2174,7 +2203,7 @@
         <w:rPr>
           <w:rFonts w:ascii="Calibri" w:hAnsi="Calibri" w:eastAsia="PingFang SC"/>
         </w:rPr>
-        <w:t>五天内的 go/no-go：用经授权 GPT-5 + 两名盲化人评复现现有 artifacts；补到至少 3 个 family；至少 2 个 family 的 paired-user 真值稳定。如果失败，就在 8 月 17 日前收窄成 personalization judge validity paper，或换题，不再继续堆合成样本。</w:t>
+        <w:t>五天内的 go/no-go：先解除 GPT-5 合规访问阻塞，再用 GPT-5 + 两名盲化人评复现冻结 artifacts；至少 2 个 family 的 paired-user 真值稳定。如果 8 月 17 日仍没有 GPT-5/真人证据，就收窄成 personalization judge validity paper，或换题，不再继续堆合成样本。</w:t>
       </w:r>
     </w:p>
     <w:p>

</xml_diff>

<commit_message>
proposal v0.49: freeze PDR introduction evidence gate
</commit_message>
<xml_diff>
--- a/deliverables/DeepAlign-Bench_完整人话版.docx
+++ b/deliverables/DeepAlign-Bench_完整人话版.docx
@@ -131,7 +131,7 @@
                 <w:color w:val="5B6B7A"/>
                 <w:sz w:val="21"/>
               </w:rPr>
-              <w:t>v0.48 · 完整人话版</w:t>
+              <w:t>v0.49 · 完整人话版</w:t>
             </w:r>
           </w:p>
         </w:tc>
@@ -189,7 +189,7 @@
                 <w:color w:val="5B6B7A"/>
                 <w:sz w:val="21"/>
               </w:rPr>
-              <w:t>2026 年 8 月 12 日</w:t>
+              <w:t>2026 年 8 月 13 日</w:t>
             </w:r>
           </w:p>
         </w:tc>
@@ -642,7 +642,7 @@
               <a:graphicData uri="http://schemas.openxmlformats.org/drawingml/2006/picture">
                 <pic:pic>
                   <pic:nvPicPr>
-                    <pic:cNvPr id="0" name="DeepAlign-Bench_整体框架与PDR压力测试_v0.48.png"/>
+                    <pic:cNvPr id="0" name="DeepAlign-Bench_整体框架与PDR压力测试_v0.49.png"/>
                     <pic:cNvPicPr/>
                   </pic:nvPicPr>
                   <pic:blipFill>
@@ -2120,6 +2120,22 @@
       </w:r>
     </w:p>
     <w:p>
+      <w:r>
+        <w:rPr>
+          <w:rFonts w:ascii="Calibri" w:hAnsi="Calibri" w:eastAsia="PingFang SC"/>
+        </w:rPr>
+        <w:t>还要特别防止一种说法升级：如果 GPT-5 也给通用好报告高分，这不等于 PDR-Bench “打错了”。通用报告可能真的对这位用户有帮助，所以绝对适配分高是合理的。它只能说明这个分数回答不了“系统有没有因为换了用户而改变”。真正更强的反例必须同时满足：人类不知道报告类型时仍一致认定最终决定违反了关键用户约束；GPT-5 三次评分却仍接近 matched 或超过 matched；而且这种分歧不只发生在一个 family。再进一步，只有它会改变多个 agent 的成功判定或排名，并且 DeepAlign 更贴近真实用户判断，才够支撑论文最重要的测量效度贡献。</w:t>
+      </w:r>
+    </w:p>
+    <w:p>
+      <w:r>
+        <w:rPr>
+          <w:rFonts w:ascii="Calibri" w:hAnsi="Calibri" w:eastAsia="PingFang SC"/>
+        </w:rPr>
+        <w:t>因此我预期“通用好报告接近 matched”较容易复现；“关键决策错误的 over-personalized 报告普遍接近 matched”不确定，现有本地结果反而只有 1/4。后者如果没有出现，不是实验失败，而是明确否决强 PDR 缺陷假设，论文就只保留 absolute fit 与 counterfactual specificity 的构念差异。</w:t>
+      </w:r>
+    </w:p>
+    <w:p>
       <w:pPr>
         <w:pStyle w:val="Heading1"/>
       </w:pPr>
@@ -2425,7 +2441,7 @@
         <w:color w:val="5B6B7A"/>
         <w:sz w:val="18"/>
       </w:rPr>
-      <w:t xml:space="preserve">2026-8-12   ·   </w:t>
+      <w:t xml:space="preserve">2026-8-13   ·   </w:t>
     </w:r>
     <w:r>
       <w:rPr>
@@ -2458,7 +2474,7 @@
         <w:color w:val="5B6B7A"/>
         <w:sz w:val="18"/>
       </w:rPr>
-      <w:t xml:space="preserve">2026-8-12   ·   </w:t>
+      <w:t xml:space="preserve">2026-8-13   ·   </w:t>
     </w:r>
     <w:r>
       <w:rPr>
@@ -2491,7 +2507,7 @@
         <w:color w:val="5B6B7A"/>
         <w:sz w:val="18"/>
       </w:rPr>
-      <w:t xml:space="preserve">2026-8-12   ·   </w:t>
+      <w:t xml:space="preserve">2026-8-13   ·   </w:t>
     </w:r>
     <w:r>
       <w:rPr>

</xml_diff>

<commit_message>
proposal v0.50: unify research episodes and seed data
</commit_message>
<xml_diff>
--- a/deliverables/DeepAlign-Bench_完整人话版.docx
+++ b/deliverables/DeepAlign-Bench_完整人话版.docx
@@ -131,7 +131,7 @@
                 <w:color w:val="5B6B7A"/>
                 <w:sz w:val="21"/>
               </w:rPr>
-              <w:t>v0.49 · 完整人话版</w:t>
+              <w:t>v0.50 · 完整人话版</w:t>
             </w:r>
           </w:p>
         </w:tc>
@@ -189,7 +189,7 @@
                 <w:color w:val="5B6B7A"/>
                 <w:sz w:val="21"/>
               </w:rPr>
-              <w:t>2026 年 8 月 13 日</w:t>
+              <w:t>2026 年 8 月 14 日</w:t>
             </w:r>
           </w:p>
         </w:tc>
@@ -642,7 +642,7 @@
               <a:graphicData uri="http://schemas.openxmlformats.org/drawingml/2006/picture">
                 <pic:pic>
                   <pic:nvPicPr>
-                    <pic:cNvPr id="0" name="DeepAlign-Bench_整体框架与PDR压力测试_v0.49.png"/>
+                    <pic:cNvPr id="0" name="DeepAlign-Bench_整体框架与PDR压力测试_v0.50.png"/>
                     <pic:cNvPicPr/>
                   </pic:nvPicPr>
                   <pic:blipFill>
@@ -677,7 +677,7 @@
           <w:color w:val="5B6B7A"/>
           <w:sz w:val="19"/>
         </w:rPr>
-        <w:t>图 1  同一任务、双用户交叉、非补偿 profile、Judge 反例和五天冻结门。</w:t>
+        <w:t>图 1  同一任务、双用户交叉、统一 Research Episode、非补偿 profile、Judge 反例和数据开工。</w:t>
       </w:r>
     </w:p>
     <w:p>
@@ -1237,7 +1237,250 @@
         <w:pStyle w:val="Heading1"/>
       </w:pPr>
       <w:r>
-        <w:t>3. 四类用户信息渠道</w:t>
+        <w:t>3. 先统一建模 Deep Research 怎么和用户、memory 与工作区交互</w:t>
+      </w:r>
+    </w:p>
+    <w:p>
+      <w:r>
+        <w:rPr>
+          <w:rFonts w:ascii="Calibri" w:hAnsi="Calibri" w:eastAsia="PingFang SC"/>
+        </w:rPr>
+        <w:t>不能把“一次性完成、主动澄清、中间提问、memory”简单列成四种同类东西。一次性和中间提问说的是</w:t>
+      </w:r>
+      <w:r>
+        <w:rPr>
+          <w:rFonts w:ascii="Calibri" w:hAnsi="Calibri" w:eastAsia="PingFang SC"/>
+          <w:b/>
+        </w:rPr>
+        <w:t>什么时候能交互</w:t>
+      </w:r>
+      <w:r>
+        <w:rPr>
+          <w:rFonts w:ascii="Calibri" w:hAnsi="Calibri" w:eastAsia="PingFang SC"/>
+        </w:rPr>
+        <w:t>；memory 说的是</w:t>
+      </w:r>
+      <w:r>
+        <w:rPr>
+          <w:rFonts w:ascii="Calibri" w:hAnsi="Calibri" w:eastAsia="PingFang SC"/>
+          <w:b/>
+        </w:rPr>
+        <w:t>信息放在哪里以及谁去取</w:t>
+      </w:r>
+      <w:r>
+        <w:rPr>
+          <w:rFonts w:ascii="Calibri" w:hAnsi="Calibri" w:eastAsia="PingFang SC"/>
+        </w:rPr>
+        <w:t>；用户中途改预算说的是</w:t>
+      </w:r>
+      <w:r>
+        <w:rPr>
+          <w:rFonts w:ascii="Calibri" w:hAnsi="Calibri" w:eastAsia="PingFang SC"/>
+          <w:b/>
+        </w:rPr>
+        <w:t>信息发生了更新</w:t>
+      </w:r>
+      <w:r>
+        <w:rPr>
+          <w:rFonts w:ascii="Calibri" w:hAnsi="Calibri" w:eastAsia="PingFang SC"/>
+        </w:rPr>
+        <w:t>。如果只写一个 channel 标签，我们不知道系统为什么变好或变差。</w:t>
+      </w:r>
+    </w:p>
+    <w:p>
+      <w:r>
+        <w:rPr>
+          <w:rFonts w:ascii="Calibri" w:hAnsi="Calibri" w:eastAsia="PingFang SC"/>
+        </w:rPr>
+        <w:t>因此，一次实际运行都写成一条 research episode 时间线，至少回答六个白话问题：</w:t>
+      </w:r>
+    </w:p>
+    <w:p>
+      <w:pPr>
+        <w:numPr>
+          <w:ilvl w:val="0"/>
+          <w:numId w:val="12"/>
+        </w:numPr>
+        <w:spacing w:after="80" w:line="290" w:lineRule="auto"/>
+        <w:ind w:left="540" w:hanging="279"/>
+      </w:pPr>
+      <w:r>
+        <w:rPr>
+          <w:rFonts w:ascii="Calibri" w:hAnsi="Calibri" w:eastAsia="PingFang SC"/>
+        </w:rPr>
+        <w:t>用户最开始说的内容，是完整的，还是只够写通用报告，还是不回答就根本做不了？</w:t>
+      </w:r>
+    </w:p>
+    <w:p>
+      <w:pPr>
+        <w:numPr>
+          <w:ilvl w:val="0"/>
+          <w:numId w:val="12"/>
+        </w:numPr>
+        <w:spacing w:after="80" w:line="290" w:lineRule="auto"/>
+        <w:ind w:left="540" w:hanging="279"/>
+      </w:pPr>
+      <w:r>
+        <w:rPr>
+          <w:rFonts w:ascii="Calibri" w:hAnsi="Calibri" w:eastAsia="PingFang SC"/>
+        </w:rPr>
+        <w:t>agent 在开始前、搜索中、checkpoint 或草稿后能不能问用户？</w:t>
+      </w:r>
+    </w:p>
+    <w:p>
+      <w:pPr>
+        <w:numPr>
+          <w:ilvl w:val="0"/>
+          <w:numId w:val="12"/>
+        </w:numPr>
+        <w:spacing w:after="80" w:line="290" w:lineRule="auto"/>
+        <w:ind w:left="540" w:hanging="279"/>
+      </w:pPr>
+      <w:r>
+        <w:rPr>
+          <w:rFonts w:ascii="Calibri" w:hAnsi="Calibri" w:eastAsia="PingFang SC"/>
+        </w:rPr>
+        <w:t>信息最初来自当前用户、历史对话、memory、用户档案、邮件/文件、组织规则、行为轨迹还是 agent 自己推断？</w:t>
+      </w:r>
+    </w:p>
+    <w:p>
+      <w:pPr>
+        <w:numPr>
+          <w:ilvl w:val="0"/>
+          <w:numId w:val="12"/>
+        </w:numPr>
+        <w:spacing w:after="80" w:line="290" w:lineRule="auto"/>
+        <w:ind w:left="540" w:hanging="279"/>
+      </w:pPr>
+      <w:r>
+        <w:rPr>
+          <w:rFonts w:ascii="Calibri" w:hAnsi="Calibri" w:eastAsia="PingFang SC"/>
+        </w:rPr>
+        <w:t>信息是直接塞进 prompt、原本可见、agent 主动问到、主动检索到，还是实验环境按时间注入？</w:t>
+      </w:r>
+    </w:p>
+    <w:p>
+      <w:pPr>
+        <w:numPr>
+          <w:ilvl w:val="0"/>
+          <w:numId w:val="12"/>
+        </w:numPr>
+        <w:spacing w:after="80" w:line="290" w:lineRule="auto"/>
+        <w:ind w:left="540" w:hanging="279"/>
+      </w:pPr>
+      <w:r>
+        <w:rPr>
+          <w:rFonts w:ascii="Calibri" w:hAnsi="Calibri" w:eastAsia="PingFang SC"/>
+        </w:rPr>
+        <w:t>信息是当前的、过期的、冲突的，还是中途更新并覆盖旧值？</w:t>
+      </w:r>
+    </w:p>
+    <w:p>
+      <w:pPr>
+        <w:numPr>
+          <w:ilvl w:val="0"/>
+          <w:numId w:val="12"/>
+        </w:numPr>
+        <w:spacing w:after="80" w:line="290" w:lineRule="auto"/>
+        <w:ind w:left="540" w:hanging="279"/>
+      </w:pPr>
+      <w:r>
+        <w:rPr>
+          <w:rFonts w:ascii="Calibri" w:hAnsi="Calibri" w:eastAsia="PingFang SC"/>
+        </w:rPr>
+        <w:t>这个产品本身是否真的支持 ask、memory retrieval、workspace search、checkpoint 和修改草稿？不支持就写“不适用”，不能打零分。</w:t>
+      </w:r>
+    </w:p>
+    <w:p>
+      <w:r>
+        <w:rPr>
+          <w:rFonts w:ascii="Calibri" w:hAnsi="Calibri" w:eastAsia="PingFang SC"/>
+        </w:rPr>
+        <w:t>完整库有八种常见范式，但第一批只跑四种：</w:t>
+      </w:r>
+    </w:p>
+    <w:p>
+      <w:pPr>
+        <w:pStyle w:val="ListBullet"/>
+      </w:pPr>
+      <w:r>
+        <w:rPr>
+          <w:rFonts w:ascii="Courier New" w:hAnsi="Courier New" w:eastAsia="PingFang SC"/>
+          <w:color w:val="6A3E00"/>
+          <w:sz w:val="20"/>
+        </w:rPr>
+        <w:t>P0 task-only closed</w:t>
+      </w:r>
+      <w:r>
+        <w:rPr>
+          <w:rFonts w:ascii="Calibri" w:hAnsi="Calibri" w:eastAsia="PingFang SC"/>
+        </w:rPr>
+        <w:t>：没有用户信息，也不能问，得到通用质量 baseline；</w:t>
+      </w:r>
+    </w:p>
+    <w:p>
+      <w:pPr>
+        <w:pStyle w:val="ListBullet"/>
+      </w:pPr>
+      <w:r>
+        <w:rPr>
+          <w:rFonts w:ascii="Courier New" w:hAnsi="Courier New" w:eastAsia="PingFang SC"/>
+          <w:color w:val="6A3E00"/>
+          <w:sz w:val="20"/>
+        </w:rPr>
+        <w:t>P1 one-shot direct</w:t>
+      </w:r>
+      <w:r>
+        <w:rPr>
+          <w:rFonts w:ascii="Calibri" w:hAnsi="Calibri" w:eastAsia="PingFang SC"/>
+        </w:rPr>
+        <w:t>：开始前一次性给完整用户信息，测“给到后会不会用”；</w:t>
+      </w:r>
+    </w:p>
+    <w:p>
+      <w:pPr>
+        <w:pStyle w:val="ListBullet"/>
+      </w:pPr>
+      <w:r>
+        <w:rPr>
+          <w:rFonts w:ascii="Courier New" w:hAnsi="Courier New" w:eastAsia="PingFang SC"/>
+          <w:color w:val="6A3E00"/>
+          <w:sz w:val="20"/>
+        </w:rPr>
+        <w:t>P2 pre-research clarification</w:t>
+      </w:r>
+      <w:r>
+        <w:rPr>
+          <w:rFonts w:ascii="Calibri" w:hAnsi="Calibri" w:eastAsia="PingFang SC"/>
+        </w:rPr>
+        <w:t>：问题本身能开始做，但缺关键个性化信息，测 agent 会不会主动问并真正采用；</w:t>
+      </w:r>
+    </w:p>
+    <w:p>
+      <w:pPr>
+        <w:pStyle w:val="ListBullet"/>
+      </w:pPr>
+      <w:r>
+        <w:rPr>
+          <w:rFonts w:ascii="Courier New" w:hAnsi="Courier New" w:eastAsia="PingFang SC"/>
+          <w:color w:val="6A3E00"/>
+          <w:sz w:val="20"/>
+        </w:rPr>
+        <w:t>P4 checkpoint update</w:t>
+      </w:r>
+      <w:r>
+        <w:rPr>
+          <w:rFonts w:ascii="Calibri" w:hAnsi="Calibri" w:eastAsia="PingFang SC"/>
+        </w:rPr>
+        <w:t>：做到一半收到新预算或新目标，测会不会更新计划、删除旧结论，同时保留没有变化的条件。</w:t>
+      </w:r>
+    </w:p>
+    <w:p>
+      <w:r>
+        <w:rPr>
+          <w:rFonts w:ascii="Calibri" w:hAnsi="Calibri" w:eastAsia="PingFang SC"/>
+        </w:rPr>
+        <w:t>研究中提问、memory retrieval、私有工作区和看完草稿再修改先放到扩展条件。我们把“所有范式”定义完整，但不会把所有组合都跑一遍。</w:t>
       </w:r>
     </w:p>
     <w:p>
@@ -1376,6 +1619,30 @@
           <w:rFonts w:ascii="Calibri" w:hAnsi="Calibri" w:eastAsia="PingFang SC"/>
         </w:rPr>
         <w:t>不给任何任务相关用户信息，但仍要求写一份高质量通用报告。它不是故意做差的 baseline，而是用来判断 matched 是否真的新增了价值。</w:t>
+      </w:r>
+    </w:p>
+    <w:p>
+      <w:pPr>
+        <w:pStyle w:val="Heading2"/>
+      </w:pPr>
+      <w:r>
+        <w:t>3.5 第一批数据已经开始</w:t>
+      </w:r>
+    </w:p>
+    <w:p>
+      <w:r>
+        <w:rPr>
+          <w:rFonts w:ascii="Calibri" w:hAnsi="Calibri" w:eastAsia="PingFang SC"/>
+        </w:rPr>
+        <w:t>现在有 3 个纯合成的工程 family：团队知识平台选型、七天日本家庭旅行、文献综述工作流选型。每个 family 有两位约束不同但都自然的用户，每位用户生成 P0/P1/P2/P4 四个 episode，共 24 个。程序已经检查每种范式各 6 个、fact ID 不乱引用、P2 确实隐藏决策关键信息、P4 确实只有一个覆盖旧事实的更新。</w:t>
+      </w:r>
+    </w:p>
+    <w:p>
+      <w:r>
+        <w:rPr>
+          <w:rFonts w:ascii="Calibri" w:hAnsi="Calibri" w:eastAsia="PingFang SC"/>
+        </w:rPr>
+        <w:t>它们现在只能回答“数据结构和实验流程能不能跑”，不能回答“真实用户中的 agent 表现”。下一步必须人工审核三个任务是否自然、证据包是否足以决定、A/B matched 与 swapped 是否真的能稳定区分，再用真实或真人锚定的 seed 替换或验证。</w:t>
       </w:r>
     </w:p>
     <w:p>
@@ -1801,7 +2068,7 @@
       <w:pPr>
         <w:numPr>
           <w:ilvl w:val="0"/>
-          <w:numId w:val="12"/>
+          <w:numId w:val="13"/>
         </w:numPr>
         <w:spacing w:after="80" w:line="290" w:lineRule="auto"/>
         <w:ind w:left="540" w:hanging="279"/>
@@ -1817,7 +2084,7 @@
       <w:pPr>
         <w:numPr>
           <w:ilvl w:val="0"/>
-          <w:numId w:val="12"/>
+          <w:numId w:val="13"/>
         </w:numPr>
         <w:spacing w:after="80" w:line="290" w:lineRule="auto"/>
         <w:ind w:left="540" w:hanging="279"/>
@@ -1833,7 +2100,7 @@
       <w:pPr>
         <w:numPr>
           <w:ilvl w:val="0"/>
-          <w:numId w:val="12"/>
+          <w:numId w:val="13"/>
         </w:numPr>
         <w:spacing w:after="80" w:line="290" w:lineRule="auto"/>
         <w:ind w:left="540" w:hanging="279"/>
@@ -1849,7 +2116,7 @@
       <w:pPr>
         <w:numPr>
           <w:ilvl w:val="0"/>
-          <w:numId w:val="12"/>
+          <w:numId w:val="13"/>
         </w:numPr>
         <w:spacing w:after="80" w:line="290" w:lineRule="auto"/>
         <w:ind w:left="540" w:hanging="279"/>
@@ -1865,7 +2132,7 @@
       <w:pPr>
         <w:numPr>
           <w:ilvl w:val="0"/>
-          <w:numId w:val="12"/>
+          <w:numId w:val="13"/>
         </w:numPr>
         <w:spacing w:after="80" w:line="290" w:lineRule="auto"/>
         <w:ind w:left="540" w:hanging="279"/>
@@ -2441,7 +2708,7 @@
         <w:color w:val="5B6B7A"/>
         <w:sz w:val="18"/>
       </w:rPr>
-      <w:t xml:space="preserve">2026-8-13   ·   </w:t>
+      <w:t xml:space="preserve">2026-8-14   ·   </w:t>
     </w:r>
     <w:r>
       <w:rPr>
@@ -2474,7 +2741,7 @@
         <w:color w:val="5B6B7A"/>
         <w:sz w:val="18"/>
       </w:rPr>
-      <w:t xml:space="preserve">2026-8-13   ·   </w:t>
+      <w:t xml:space="preserve">2026-8-14   ·   </w:t>
     </w:r>
     <w:r>
       <w:rPr>
@@ -2507,7 +2774,7 @@
         <w:color w:val="5B6B7A"/>
         <w:sz w:val="18"/>
       </w:rPr>
-      <w:t xml:space="preserve">2026-8-13   ·   </w:t>
+      <w:t xml:space="preserve">2026-8-14   ·   </w:t>
     </w:r>
     <w:r>
       <w:rPr>
@@ -2801,6 +3068,12 @@
     </w:lvlOverride>
   </w:num>
   <w:num w:numId="12">
+    <w:abstractNumId w:val="0"/>
+    <w:lvlOverride w:ilvl="0">
+      <w:startOverride w:val="1"/>
+    </w:lvlOverride>
+  </w:num>
+  <w:num w:numId="13">
     <w:abstractNumId w:val="0"/>
     <w:lvlOverride w:ilvl="0">
       <w:startOverride w:val="1"/>

</xml_diff>

<commit_message>
proposal v0.51: import PDR pool and lock ICLR plan
</commit_message>
<xml_diff>
--- a/deliverables/DeepAlign-Bench_完整人话版.docx
+++ b/deliverables/DeepAlign-Bench_完整人话版.docx
@@ -131,7 +131,7 @@
                 <w:color w:val="5B6B7A"/>
                 <w:sz w:val="21"/>
               </w:rPr>
-              <w:t>v0.50 · 完整人话版</w:t>
+              <w:t>v0.51 · 完整人话版</w:t>
             </w:r>
           </w:p>
         </w:tc>
@@ -425,7 +425,7 @@
         <w:rPr>
           <w:rFonts w:ascii="Calibri" w:hAnsi="Calibri" w:eastAsia="PingFang SC"/>
         </w:rPr>
-        <w:t>五天冻结与论文主张</w:t>
+        <w:t>逐周执行与论文主张</w:t>
       </w:r>
     </w:p>
     <w:p>
@@ -642,7 +642,7 @@
               <a:graphicData uri="http://schemas.openxmlformats.org/drawingml/2006/picture">
                 <pic:pic>
                   <pic:nvPicPr>
-                    <pic:cNvPr id="0" name="DeepAlign-Bench_整体框架与PDR压力测试_v0.50.png"/>
+                    <pic:cNvPr id="0" name="DeepAlign-Bench_整体框架与PDR压力测试_v0.51.png"/>
                     <pic:cNvPicPr/>
                   </pic:nvPicPr>
                   <pic:blipFill>
@@ -677,7 +677,7 @@
           <w:color w:val="5B6B7A"/>
           <w:sz w:val="19"/>
         </w:rPr>
-        <w:t>图 1  同一任务、双用户交叉、统一 Research Episode、非补偿 profile、Judge 反例和数据开工。</w:t>
+        <w:t>图 1  同一任务、双用户交叉、统一 Research Episode、非补偿 profile、PDR 资源筛选和逐周执行。</w:t>
       </w:r>
     </w:p>
     <w:p>
@@ -1643,6 +1643,22 @@
           <w:rFonts w:ascii="Calibri" w:hAnsi="Calibri" w:eastAsia="PingFang SC"/>
         </w:rPr>
         <w:t>它们现在只能回答“数据结构和实验流程能不能跑”，不能回答“真实用户中的 agent 表现”。下一步必须人工审核三个任务是否自然、证据包是否足以决定、A/B matched 与 swapped 是否真的能稳定区分，再用真实或真人锚定的 seed 替换或验证。</w:t>
+      </w:r>
+    </w:p>
+    <w:p>
+      <w:r>
+        <w:rPr>
+          <w:rFonts w:ascii="Calibri" w:hAnsi="Calibri" w:eastAsia="PingFang SC"/>
+        </w:rPr>
+        <w:t>我们也已经把 PDR-Bench 公开的全部资源导入：50 个任务、25 个志愿者自填后去标识化的 structured persona、25 份由专业标注者模拟的 dynamic context，以及 250 个官方 task-user 配对。这里必须说准确：persona 的结构化底稿有真人来源，但 context 不是志愿者自然聊天轨迹。</w:t>
+      </w:r>
+    </w:p>
+    <w:p>
+      <w:r>
+        <w:rPr>
+          <w:rFonts w:ascii="Calibri" w:hAnsi="Calibri" w:eastAsia="PingFang SC"/>
+        </w:rPr>
+        <w:t>这 250 对不能直接当成 DeepAlign 的 250 个独立实验。DeepAlign 需要同一任务下两位用户真的会得出不同关键决定。程序把它们展开成 501 个同任务候选用户对，接下来逐对检查并只保留约 12–20 个核心 family。医疗、金融、法律任务没有专家复核就不进主结果；其余任务即使淘汰，也作为资源池和负结果保留。这样“全量使用 PDR”指完整导入和审计，不是盲目跑完所有笛卡尔组合。</w:t>
       </w:r>
     </w:p>
     <w:p>
@@ -2415,7 +2431,7 @@
         <w:rPr>
           <w:rFonts w:ascii="Calibri" w:hAnsi="Calibri" w:eastAsia="PingFang SC"/>
         </w:rPr>
-        <w:t>ICLR 2027 摘要截止 2026-09-11 AOE、全文截止 2026-09-16 AOE。从 8 月 12 日起只有约 30/35 天。</w:t>
+        <w:t>ICLR 2027 官网当前给出的摘要截止是 2026-09-18 AOE、全文截止是 2026-09-25 AOE。从 8 月 14 日起约有 35/42 天。过去记录中的 9 月 11/16 已被官网更新，不能再沿用。</w:t>
       </w:r>
     </w:p>
     <w:p>
@@ -2487,6 +2503,14 @@
           <w:rFonts w:ascii="Calibri" w:hAnsi="Calibri" w:eastAsia="PingFang SC"/>
         </w:rPr>
         <w:t>五天内的 go/no-go：先解除 GPT-5 合规访问阻塞，再用 GPT-5 + 两名盲化人评复现冻结 artifacts；至少 2 个 family 的 paired-user 真值稳定。如果 8 月 17 日仍没有 GPT-5/真人证据，就收窄成 personalization judge validity paper，或换题，不再继续堆合成样本。</w:t>
+      </w:r>
+    </w:p>
+    <w:p>
+      <w:r>
+        <w:rPr>
+          <w:rFonts w:ascii="Calibri" w:hAnsi="Calibri" w:eastAsia="PingFang SC"/>
+        </w:rPr>
+        <w:t>之后按周推进：8/17–23 把 3 个 family 的证据、用户真值、rubric 和人评做完整；8/24–30 跑通两个系统的 P0/P1/P2，并只做一个 P4 动态更新样例；8/31–9/6 扩到 12–16 个核心 family；9/7–13 完成全部评分、统计和 9 页初稿；9/14–18 冻结结果并提交真实摘要；9/19–25 只做复现、匿名检查、引用核对和终稿，不再加新研究问题。</w:t>
       </w:r>
     </w:p>
     <w:p>

</xml_diff>

<commit_message>
proposal v0.54: build PLHKW task pool
</commit_message>
<xml_diff>
--- a/deliverables/DeepAlign-Bench_完整人话版.docx
+++ b/deliverables/DeepAlign-Bench_完整人话版.docx
@@ -131,7 +131,7 @@
                 <w:color w:val="5B6B7A"/>
                 <w:sz w:val="21"/>
               </w:rPr>
-              <w:t>v0.51 · 完整人话版</w:t>
+              <w:t>v0.54 · 完整人话版</w:t>
             </w:r>
           </w:p>
         </w:tc>
@@ -189,7 +189,7 @@
                 <w:color w:val="5B6B7A"/>
                 <w:sz w:val="21"/>
               </w:rPr>
-              <w:t>2026 年 8 月 14 日</w:t>
+              <w:t>2026 年 8 月 16 日</w:t>
             </w:r>
           </w:p>
         </w:tc>
@@ -484,7 +484,7 @@
         <w:rPr>
           <w:rFonts w:ascii="Calibri" w:hAnsi="Calibri" w:eastAsia="PingFang SC"/>
         </w:rPr>
-        <w:t>我们不是只问“这份报告对某个人看起来合不合适”，而是把同一个任务交给两位需求不同但都合理的用户，看 agent 是否真的会随着目标用户改变最终建议，而且两边都改对。</w:t>
+        <w:t>我们不是只问“这份报告、代码 patch 或数据分析对某个人看起来合不合适”，而是把同一个任务和同一份证据/仓库/数据交给两位需求不同但都合理的用户，看 agent 是否真的会随着目标用户改变最终交付，而且两边都改对。当前只实例化三个代表性场景：网络研究、仓库级软件工程和数据分析，不声称包含所有知识工作。</w:t>
       </w:r>
     </w:p>
     <w:p>
@@ -642,7 +642,7 @@
               <a:graphicData uri="http://schemas.openxmlformats.org/drawingml/2006/picture">
                 <pic:pic>
                   <pic:nvPicPr>
-                    <pic:cNvPr id="0" name="DeepAlign-Bench_整体框架与PDR压力测试_v0.51.png"/>
+                    <pic:cNvPr id="0" name="DeepAlign-Bench_PLHKW任务资源池_v0.54.png"/>
                     <pic:cNvPicPr/>
                   </pic:nvPicPr>
                   <pic:blipFill>
@@ -677,7 +677,7 @@
           <w:color w:val="5B6B7A"/>
           <w:sz w:val="19"/>
         </w:rPr>
-        <w:t>图 1  同一任务、双用户交叉、统一 Research Episode、非补偿 profile、PDR 资源筛选和逐周执行。</w:t>
+        <w:t>图 1  三个场景共享同一反事实协议；60 个 provisional shell 不等于 runnable gold。</w:t>
       </w:r>
     </w:p>
     <w:p>
@@ -1658,7 +1658,7 @@
         <w:rPr>
           <w:rFonts w:ascii="Calibri" w:hAnsi="Calibri" w:eastAsia="PingFang SC"/>
         </w:rPr>
-        <w:t>这 250 对不能直接当成 DeepAlign 的 250 个独立实验。DeepAlign 需要同一任务下两位用户真的会得出不同关键决定。程序把它们展开成 501 个同任务候选用户对，接下来逐对检查并只保留约 12–20 个核心 family。医疗、金融、法律任务没有专家复核就不进主结果；其余任务即使淘汰，也作为资源池和负结果保留。这样“全量使用 PDR”指完整导入和审计，不是盲目跑完所有笛卡尔组合。</w:t>
+        <w:t>这 250 对不能直接当成 DeepAlign 的 250 个独立实验。v0.54 把 PDR 放进更大的候选池：总共先收 180 个 seed（72 研究、54 软件、54 数据），再预选 60 个 family（24/18/18）。其中 12 个直接来自 PDR task shell，其他补文献景观、prior art、仓库修改、spreadsheet 和 ML 等结构。60 个只是 provisional sampling frame，没有通过许可、环境、双人审查、contract 和 pilot 门就不能说是可运行 gold。</w:t>
       </w:r>
     </w:p>
     <w:p>
@@ -2510,7 +2510,7 @@
         <w:rPr>
           <w:rFonts w:ascii="Calibri" w:hAnsi="Calibri" w:eastAsia="PingFang SC"/>
         </w:rPr>
-        <w:t>之后按周推进：8/17–23 把 3 个 family 的证据、用户真值、rubric 和人评做完整；8/24–30 跑通两个系统的 P0/P1/P2，并只做一个 P4 动态更新样例；8/31–9/6 扩到 12–16 个核心 family；9/7–13 完成全部评分、统计和 9 页初稿；9/14–18 冻结结果并提交真实摘要；9/19–25 只做复现、匿名检查、引用核对和终稿，不再加新研究问题。</w:t>
+        <w:t>之后先在三个 vertical 各完成一个端到端环境，再把主论文补到 12 个 family（5 研究 / 3 软件 / 4 数据）。两个月内不承诺把 60 个全部变成 runnable case；如果资源不足，先减 agent 数和动态压力层，不把 software/data 又降回几个展示 anchor。</w:t>
       </w:r>
     </w:p>
     <w:p>
@@ -2732,7 +2732,7 @@
         <w:color w:val="5B6B7A"/>
         <w:sz w:val="18"/>
       </w:rPr>
-      <w:t xml:space="preserve">2026-8-14   ·   </w:t>
+      <w:t xml:space="preserve">2026-8-16   ·   </w:t>
     </w:r>
     <w:r>
       <w:rPr>
@@ -2765,7 +2765,7 @@
         <w:color w:val="5B6B7A"/>
         <w:sz w:val="18"/>
       </w:rPr>
-      <w:t xml:space="preserve">2026-8-14   ·   </w:t>
+      <w:t xml:space="preserve">2026-8-16   ·   </w:t>
     </w:r>
     <w:r>
       <w:rPr>
@@ -2798,7 +2798,7 @@
         <w:color w:val="5B6B7A"/>
         <w:sz w:val="18"/>
       </w:rPr>
-      <w:t xml:space="preserve">2026-8-14   ·   </w:t>
+      <w:t xml:space="preserve">2026-8-16   ·   </w:t>
     </w:r>
     <w:r>
       <w:rPr>

</xml_diff>

<commit_message>
proposal v0.55: freeze human-grounded evaluation pipeline
</commit_message>
<xml_diff>
--- a/deliverables/DeepAlign-Bench_完整人话版.docx
+++ b/deliverables/DeepAlign-Bench_完整人话版.docx
@@ -131,7 +131,7 @@
                 <w:color w:val="5B6B7A"/>
                 <w:sz w:val="21"/>
               </w:rPr>
-              <w:t>v0.54 · 完整人话版</w:t>
+              <w:t>v0.55 · 完整人话版</w:t>
             </w:r>
           </w:p>
         </w:tc>
@@ -189,7 +189,7 @@
                 <w:color w:val="5B6B7A"/>
                 <w:sz w:val="21"/>
               </w:rPr>
-              <w:t>2026 年 8 月 16 日</w:t>
+              <w:t>2026 年 8 月 17 日</w:t>
             </w:r>
           </w:p>
         </w:tc>
@@ -642,7 +642,7 @@
               <a:graphicData uri="http://schemas.openxmlformats.org/drawingml/2006/picture">
                 <pic:pic>
                   <pic:nvPicPr>
-                    <pic:cNvPr id="0" name="DeepAlign-Bench_PLHKW任务资源池_v0.54.png"/>
+                    <pic:cNvPr id="0" name="DeepAlign-Bench_真人真值到D-JQS_v0.55.png"/>
                     <pic:cNvPicPr/>
                   </pic:nvPicPr>
                   <pic:blipFill>
@@ -677,7 +677,7 @@
           <w:color w:val="5B6B7A"/>
           <w:sz w:val="19"/>
         </w:rPr>
-        <w:t>图 1  三个场景共享同一反事实协议；60 个 provisional shell 不等于 runnable gold。</w:t>
+        <w:t>图 1  谁提供真值、谁审计、谁编译、谁评分相互分离；freeze 只负责防止事后改标准。</w:t>
       </w:r>
     </w:p>
     <w:p>
@@ -1125,7 +1125,7 @@
         <w:rPr>
           <w:rFonts w:ascii="Calibri" w:hAnsi="Calibri" w:eastAsia="PingFang SC"/>
         </w:rPr>
-        <w:t>最可靠的顺序是“先有真实任务，再找共享任务的用户”，而不是先写两个人设再硬塞任务。</w:t>
+        <w:t>最可靠的顺序是“先给真人一组可能相关的真实任务，再让他选择”，而不是先写两个人设再硬塞任务。</w:t>
       </w:r>
     </w:p>
     <w:p>
@@ -1141,7 +1141,7 @@
         <w:rPr>
           <w:rFonts w:ascii="Calibri" w:hAnsi="Calibri" w:eastAsia="PingFang SC"/>
         </w:rPr>
-        <w:t>找到真实用户提出的 research task shell。</w:t>
+        <w:t>每位参与者从随机化或分层 task slate 里选 3–5 个现实中可能真的要做的任务；保留他看过、认为相关、最后选择和跳过的完整记录。</w:t>
       </w:r>
     </w:p>
     <w:p>
@@ -1157,7 +1157,7 @@
         <w:rPr>
           <w:rFonts w:ascii="Calibri" w:hAnsi="Calibri" w:eastAsia="PingFang SC"/>
         </w:rPr>
-        <w:t>冻结所有用户共同的目标、证据和交付格式。</w:t>
+        <w:t>对每道已选题先让用户自由说目标、限制、风险、取舍、受众、使用方式和“什么会让我不用这个结果”，避免问卷先把答案塞给他。</w:t>
       </w:r>
     </w:p>
     <w:p>
@@ -1173,7 +1173,7 @@
         <w:rPr>
           <w:rFonts w:ascii="Calibri" w:hAnsi="Calibri" w:eastAsia="PingFang SC"/>
         </w:rPr>
-        <w:t>找另一位也会自然提出同一任务、但在决策约束上不同的用户。</w:t>
+        <w:t>再用任务类型对应的追问表补漏。每条事实标清是用户主动说的、追问后说的、不适用，还是拒绝回答；也记录不确定性、多个可接受答案、时间戳和隐私许可。</w:t>
       </w:r>
     </w:p>
     <w:p>
@@ -1189,7 +1189,7 @@
         <w:rPr>
           <w:rFonts w:ascii="Calibri" w:hAnsi="Calibri" w:eastAsia="PingFang SC"/>
         </w:rPr>
-        <w:t>只保留 2–4 个能改变建议的差异。</w:t>
+        <w:t>把这些信息整理成用户本人确认的后台 ledger。Agent 默认看不到整个 ledger，只看到实验指定的 persona/history/clarification view。</w:t>
       </w:r>
     </w:p>
     <w:p>
@@ -1205,23 +1205,7 @@
         <w:rPr>
           <w:rFonts w:ascii="Calibri" w:hAnsi="Calibri" w:eastAsia="PingFang SC"/>
         </w:rPr>
-        <w:t>让本人逐项确认：这个事实是否真实、是否相关、是否允许使用、会怎样改变方案。</w:t>
-      </w:r>
-    </w:p>
-    <w:p>
-      <w:pPr>
-        <w:numPr>
-          <w:ilvl w:val="0"/>
-          <w:numId w:val="11"/>
-        </w:numPr>
-        <w:spacing w:after="80" w:line="290" w:lineRule="auto"/>
-        <w:ind w:left="540" w:hanging="279"/>
-      </w:pPr>
-      <w:r>
-        <w:rPr>
-          <w:rFonts w:ascii="Calibri" w:hAnsi="Calibri" w:eastAsia="PingFang SC"/>
-        </w:rPr>
-        <w:t>在看到模型输出前冻结 contracts 和 acceptable alternatives。</w:t>
+        <w:t>同一题里不只挑“差异巨大”的两个人，还保留差异小的 near-neighbor pair，以及本来不该导致报告变化的 neutral pair。这样既测“该改时会不会改”，也测“不该改时会不会乱改”。</w:t>
       </w:r>
     </w:p>
     <w:p>
@@ -1229,7 +1213,36 @@
         <w:rPr>
           <w:rFonts w:ascii="Calibri" w:hAnsi="Calibri" w:eastAsia="PingFang SC"/>
         </w:rPr>
-        <w:t>优先级是：两位真实用户 &gt; 一位真实用户加经相似参与者验证的最小反事实用户 &gt; 完全合成用户。完全 LLM 生成只能用于最小工程实验，不能支撑论文中的真实世界效度。</w:t>
+        <w:t xml:space="preserve">接着先造的不是两份 rubric，而是一张 </w:t>
+      </w:r>
+      <w:r>
+        <w:rPr>
+          <w:rFonts w:ascii="Calibri" w:hAnsi="Calibri" w:eastAsia="PingFang SC"/>
+          <w:b/>
+        </w:rPr>
+        <w:t>Counterfactual Difference Map（CDM）</w:t>
+      </w:r>
+      <w:r>
+        <w:rPr>
+          <w:rFonts w:ascii="Calibri" w:hAnsi="Calibri" w:eastAsia="PingFang SC"/>
+        </w:rPr>
+        <w:t>。它逐个写清：哪个决策变量应该不同，哪个应该相同，哪些方案对用户来说都可以，什么绝对不能做，以及信息不足时应不应该问。每个节点必须能指回用户确认的事实、共同任务证据或权限规则。</w:t>
+      </w:r>
+    </w:p>
+    <w:p>
+      <w:r>
+        <w:rPr>
+          <w:rFonts w:ascii="Calibri" w:hAnsi="Calibri" w:eastAsia="PingFang SC"/>
+        </w:rPr>
+        <w:t>LLM 可以帮忙高召回找候选和拆项，但它没有决定真值的权力。用户本人决定自己的目标和取舍；两名标注员检查来源、是否有决策后果、是否可观察、是否重复、是否带刻板印象；领域专家只管事实、技术可行性和安全。用户不能把错误技术事实说成正确，专家也不能替用户决定“我更在意什么”。</w:t>
+      </w:r>
+    </w:p>
+    <w:p>
+      <w:r>
+        <w:rPr>
+          <w:rFonts w:ascii="Calibri" w:hAnsi="Calibri" w:eastAsia="PingFang SC"/>
+        </w:rPr>
+        <w:t>这里有两次 freeze。第一次在写参考答案前冻结 CDM，避免参考答案反过来定义标准；第二次在任何被测 agent 输出前冻结最终 rubric。Freeze 只解决“不能看完答案再改标准”，不证明标准一定对。真实性来自真人确认，遗漏控制来自覆盖审计，最后执行是否可靠要靠 checker、D-JQS 和盲化人评。</w:t>
       </w:r>
     </w:p>
     <w:p>
@@ -1789,7 +1802,7 @@
         <w:rPr>
           <w:rFonts w:ascii="Calibri" w:hAnsi="Calibri" w:eastAsia="PingFang SC"/>
         </w:rPr>
-        <w:t>JudgeBench 还要有四种反例：</w:t>
+        <w:t>D-JQS 还要有四种反例：</w:t>
       </w:r>
     </w:p>
     <w:p>
@@ -1841,7 +1854,7 @@
         <w:pStyle w:val="Heading1"/>
       </w:pPr>
       <w:r>
-        <w:t>5. Rubric 为什么要提前设计</w:t>
+        <w:t>5. Rubric 为什么要提前设计，judge 为什么要先考试</w:t>
       </w:r>
     </w:p>
     <w:p>
@@ -1849,7 +1862,7 @@
         <w:rPr>
           <w:rFonts w:ascii="Calibri" w:hAnsi="Calibri" w:eastAsia="PingFang SC"/>
         </w:rPr>
-        <w:t>Rubric Compiler 的输入不是“让 LLM 随便想评分点”，而是 task metadata + user ledger + contracts。</w:t>
+        <w:t>Rubric Compiler 的输入不是“让 LLM 随便想评分点”，而是 task metadata + 授权 ledger 引用 + 已冻结 CDM。</w:t>
       </w:r>
     </w:p>
     <w:p>
@@ -1867,7 +1880,7 @@
           <w:color w:val="6A3E00"/>
           <w:sz w:val="20"/>
         </w:rPr>
-        <w:t>metadata/contracts → module → direction node → parameterized leaf → 人工校验并冻结</w:t>
+        <w:t>metadata/CDM → module → direction node → parameterized leaf → 人工校验并冻结</w:t>
       </w:r>
     </w:p>
     <w:p>
@@ -1889,7 +1902,7 @@
         <w:rPr>
           <w:rFonts w:ascii="Calibri" w:hAnsi="Calibri" w:eastAsia="PingFang SC"/>
         </w:rPr>
-        <w:t>Direction node 是可复用问题，例如“是否满足目标用户的本地部署要求”。</w:t>
+        <w:t>CDM node 先决定“A/B 到底应该有什么关系”；direction node 只提供可复用的测量写法。</w:t>
       </w:r>
     </w:p>
     <w:p>
@@ -1908,7 +1921,242 @@
         <w:rPr>
           <w:rFonts w:ascii="Calibri" w:hAnsi="Calibri" w:eastAsia="PingFang SC"/>
         </w:rPr>
-        <w:t>每个 leaf 要写清适用对象、证据位置、评分锚点、严重性、是否 hard gate，以及它评价的是 mention、planning 还是 final adoption。后一点很重要：提到“本地部署”不等于最后真的选择了本地部署方案。</w:t>
+        <w:t>每个 leaf 要写清它来自哪个 CDM node、适用对象、证据位置、评分锚点、严重性、是否 hard gate、和其他 leaf 是否共享同一个 parent，以及它评价的是 mention、planning 还是 final adoption。多个 leaf 来自同一节点时先在节点内合并，不能把一个偏好拆成五条就获得五倍权重，也不能把五条当成五个独立样本。</w:t>
+      </w:r>
+    </w:p>
+    <w:p>
+      <w:r>
+        <w:rPr>
+          <w:rFonts w:ascii="Calibri" w:hAnsi="Calibri" w:eastAsia="PingFang SC"/>
+        </w:rPr>
+        <w:t>能用程序检查的先用程序：code 的 tests、data 的数字/公式、DR 的链接和部分 claim support。但程序 checker 也可能漏错，所以要用已知正例/反例、受控修改和 mutation test 估计 false accept、false reject 与覆盖率。“确定性”不等于“天然正确”。</w:t>
+      </w:r>
+    </w:p>
+    <w:p>
+      <w:r>
+        <w:rPr>
+          <w:rFonts w:ascii="Calibri" w:hAnsi="Calibri" w:eastAsia="PingFang SC"/>
+        </w:rPr>
+        <w:t xml:space="preserve">只有 trade-off、优先级、actionability 等语义项交给 LLM judge。judge 只应用已经冻结的 leaf，并必须指出 artifact 里的证据位置；不能再发明新标准。项目内校准工具改名 </w:t>
+      </w:r>
+      <w:r>
+        <w:rPr>
+          <w:rFonts w:ascii="Calibri" w:hAnsi="Calibri" w:eastAsia="PingFang SC"/>
+          <w:b/>
+        </w:rPr>
+        <w:t>D-JQS（DeepAlign Judge Qualification Suite）</w:t>
+      </w:r>
+      <w:r>
+        <w:rPr>
+          <w:rFonts w:ascii="Calibri" w:hAnsi="Calibri" w:eastAsia="PingFang SC"/>
+        </w:rPr>
+        <w:t>，因为已有论文已经叫 JudgeBench/JUDGE-BENCH。</w:t>
+      </w:r>
+      <w:hyperlink r:id="rId17">
+        <w:r>
+          <w:rPr>
+            <w:rFonts w:ascii="Calibri" w:hAnsi="Calibri" w:eastAsia="PingFang SC"/>
+            <w:color w:val="2E74B5"/>
+            <w:u w:val="single"/>
+          </w:rPr>
+          <w:t>[6]</w:t>
+        </w:r>
+      </w:hyperlink>
+      <w:hyperlink r:id="rId18">
+        <w:r>
+          <w:rPr>
+            <w:rFonts w:ascii="Calibri" w:hAnsi="Calibri" w:eastAsia="PingFang SC"/>
+            <w:color w:val="2E74B5"/>
+            <w:u w:val="single"/>
+          </w:rPr>
+          <w:t>[7]</w:t>
+        </w:r>
+      </w:hyperlink>
+      <w:r>
+        <w:rPr>
+          <w:rFonts w:ascii="Calibri" w:hAnsi="Calibri" w:eastAsia="PingFang SC"/>
+        </w:rPr>
+        <w:t xml:space="preserve"> D-JQS 同时用明确违规、只改一个关键点的受控 artifact、以及真实用户盲选三种 gold；调阈值集和隐藏资格集按任务、用户、agent、来源和时间隔离。RuVerBench 已直接表明长 agentic artifact 的 rubric verification 仍有明显噪声；GAMUT 又已覆盖 two-level meta-rubric 编译，因此这两项不能被我们误报为首创。</w:t>
+      </w:r>
+      <w:hyperlink r:id="rId19">
+        <w:r>
+          <w:rPr>
+            <w:rFonts w:ascii="Calibri" w:hAnsi="Calibri" w:eastAsia="PingFang SC"/>
+            <w:color w:val="2E74B5"/>
+            <w:u w:val="single"/>
+          </w:rPr>
+          <w:t>[8]</w:t>
+        </w:r>
+      </w:hyperlink>
+      <w:hyperlink r:id="rId20">
+        <w:r>
+          <w:rPr>
+            <w:rFonts w:ascii="Calibri" w:hAnsi="Calibri" w:eastAsia="PingFang SC"/>
+            <w:color w:val="2E74B5"/>
+            <w:u w:val="single"/>
+          </w:rPr>
+          <w:t>[9]</w:t>
+        </w:r>
+      </w:hyperlink>
+    </w:p>
+    <w:p>
+      <w:r>
+        <w:rPr>
+          <w:rFonts w:ascii="Calibri" w:hAnsi="Calibri" w:eastAsia="PingFang SC"/>
+        </w:rPr>
+        <w:t>AB/BA 只能测位置偏差，所以还要单独改长度、文风、格式、persona 关键词、引用数和语言。某个 judge 只在事实判断上合格，不代表它能判断用户取舍；资格按 leaf 类型给。关键类型没过门就交给人，不能让几个都不可靠的 judge 投票后假装可靠。</w:t>
+      </w:r>
+    </w:p>
+    <w:p>
+      <w:pPr>
+        <w:pStyle w:val="Heading2"/>
+      </w:pPr>
+      <w:r>
+        <w:t>5.1 这套方案最容易被怎么打</w:t>
+      </w:r>
+    </w:p>
+    <w:p>
+      <w:pPr>
+        <w:pStyle w:val="ListBullet"/>
+      </w:pPr>
+      <w:r>
+        <w:rPr>
+          <w:rFonts w:ascii="Calibri" w:hAnsi="Calibri" w:eastAsia="PingFang SC"/>
+          <w:b/>
+        </w:rPr>
+        <w:t>“你只挑最好分的用户对。”</w:t>
+      </w:r>
+      <w:r>
+        <w:rPr>
+          <w:rFonts w:ascii="Calibri" w:hAnsi="Calibri" w:eastAsia="PingFang SC"/>
+        </w:rPr>
+        <w:t xml:space="preserve"> 公开 offered→selected→paired→rejected 漏斗，并同时报告 contrast、near-neighbor、neutral pair。</w:t>
+      </w:r>
+    </w:p>
+    <w:p>
+      <w:pPr>
+        <w:pStyle w:val="ListBullet"/>
+      </w:pPr>
+      <w:r>
+        <w:rPr>
+          <w:rFonts w:ascii="Calibri" w:hAnsi="Calibri" w:eastAsia="PingFang SC"/>
+          <w:b/>
+        </w:rPr>
+        <w:t>“用户自述会变。”</w:t>
+      </w:r>
+      <w:r>
+        <w:rPr>
+          <w:rFonts w:ascii="Calibri" w:hAnsi="Calibri" w:eastAsia="PingFang SC"/>
+        </w:rPr>
+        <w:t xml:space="preserve"> 允许不确定和多种可接受答案，做 test–retest，给事实加时间戳/到期复核；不稳定方向不进 gold。</w:t>
+      </w:r>
+    </w:p>
+    <w:p>
+      <w:pPr>
+        <w:pStyle w:val="ListBullet"/>
+      </w:pPr>
+      <w:r>
+        <w:rPr>
+          <w:rFonts w:ascii="Calibri" w:hAnsi="Calibri" w:eastAsia="PingFang SC"/>
+          <w:b/>
+        </w:rPr>
+        <w:t>“用户前面定标准，后面自然会选 matched。”</w:t>
+      </w:r>
+      <w:r>
+        <w:rPr>
+          <w:rFonts w:ascii="Calibri" w:hAnsi="Calibri" w:eastAsia="PingFang SC"/>
+        </w:rPr>
+        <w:t xml:space="preserve"> 后期不展示最终 rubric，随机顺序、隐藏条件，尽量分时进行；用户盲选是外部效度，不是同一 gold 的重复证明。</w:t>
+      </w:r>
+    </w:p>
+    <w:p>
+      <w:pPr>
+        <w:pStyle w:val="ListBullet"/>
+      </w:pPr>
+      <w:r>
+        <w:rPr>
+          <w:rFonts w:ascii="Calibri" w:hAnsi="Calibri" w:eastAsia="PingFang SC"/>
+          <w:b/>
+        </w:rPr>
+        <w:t>“CDM 还是不完整。”</w:t>
+      </w:r>
+      <w:r>
+        <w:rPr>
+          <w:rFonts w:ascii="Calibri" w:hAnsi="Calibri" w:eastAsia="PingFang SC"/>
+        </w:rPr>
+        <w:t xml:space="preserve"> 只声称在预注册访谈和 coverage audit 下达到有限 saturation；测试输出后发现的新错误不回改主分。</w:t>
+      </w:r>
+    </w:p>
+    <w:p>
+      <w:pPr>
+        <w:pStyle w:val="ListBullet"/>
+      </w:pPr>
+      <w:r>
+        <w:rPr>
+          <w:rFonts w:ascii="Calibri" w:hAnsi="Calibri" w:eastAsia="PingFang SC"/>
+          <w:b/>
+        </w:rPr>
+        <w:t>“D-JQS 自己给自己发证。”</w:t>
+      </w:r>
+      <w:r>
+        <w:rPr>
+          <w:rFonts w:ascii="Calibri" w:hAnsi="Calibri" w:eastAsia="PingFang SC"/>
+        </w:rPr>
+        <w:t xml:space="preserve"> gold 三来源、calibration/hidden split、按 slice 认证；失败 slice 必须人工接管。</w:t>
+      </w:r>
+    </w:p>
+    <w:p>
+      <w:pPr>
+        <w:pStyle w:val="ListBullet"/>
+      </w:pPr>
+      <w:r>
+        <w:rPr>
+          <w:rFonts w:ascii="Calibri" w:hAnsi="Calibri" w:eastAsia="PingFang SC"/>
+          <w:b/>
+        </w:rPr>
+        <w:t>“这只是 PDR++ 或约束遵循。”</w:t>
+      </w:r>
+      <w:r>
+        <w:rPr>
+          <w:rFonts w:ascii="Calibri" w:hAnsi="Calibri" w:eastAsia="PingFang SC"/>
+        </w:rPr>
+        <w:t xml:space="preserve"> 比较 PDR-style 单用户 rubric、独立 A/B rubric 和 CDM 对称 rubric，并证明 CDM 会重分类系统，或在控制一般质量后更能预测真人选择；persona 同时覆盖硬约束、真实取舍、知识/受众和需要澄清的隐含需求。</w:t>
+      </w:r>
+    </w:p>
+    <w:p>
+      <w:pPr>
+        <w:pStyle w:val="ListBullet"/>
+      </w:pPr>
+      <w:r>
+        <w:rPr>
+          <w:rFonts w:ascii="Calibri" w:hAnsi="Calibri" w:eastAsia="PingFang SC"/>
+          <w:b/>
+        </w:rPr>
+        <w:t>“三个领域根本不可比。”</w:t>
+      </w:r>
+      <w:r>
+        <w:rPr>
+          <w:rFonts w:ascii="Calibri" w:hAnsi="Calibri" w:eastAsia="PingFang SC"/>
+        </w:rPr>
+        <w:t xml:space="preserve"> 不比较跨领域 raw score；分别报告 code/data/DR 的 verifier 覆盖和 judge 负担，只统一 matched/swapped 与 no-harm 逻辑。</w:t>
+      </w:r>
+    </w:p>
+    <w:p>
+      <w:pPr>
+        <w:pStyle w:val="ListBullet"/>
+      </w:pPr>
+      <w:r>
+        <w:rPr>
+          <w:rFonts w:ascii="Calibri" w:hAnsi="Calibri" w:eastAsia="PingFang SC"/>
+          <w:b/>
+        </w:rPr>
+        <w:t>“太贵、隐私风险高。”</w:t>
+      </w:r>
+      <w:r>
+        <w:rPr>
+          <w:rFonts w:ascii="Calibri" w:hAnsi="Calibri" w:eastAsia="PingFang SC"/>
+        </w:rPr>
+        <w:t xml:space="preserve"> 先做 12-family paper set；raw ledger 默认不发布，必须有 consent、最小化、撤回、保留期限和访问控制。</w:t>
       </w:r>
     </w:p>
     <w:p>
@@ -2502,7 +2750,7 @@
         <w:rPr>
           <w:rFonts w:ascii="Calibri" w:hAnsi="Calibri" w:eastAsia="PingFang SC"/>
         </w:rPr>
-        <w:t>五天内的 go/no-go：先解除 GPT-5 合规访问阻塞，再用 GPT-5 + 两名盲化人评复现冻结 artifacts；至少 2 个 family 的 paired-user 真值稳定。如果 8 月 17 日仍没有 GPT-5/真人证据，就收窄成 personalization judge validity paper，或换题，不再继续堆合成样本。</w:t>
+        <w:t>当前 go/no-go：先把三个 vertical 各 1 个 family 做出真人 ledger、CDM、受约束 leaf、validated verifier 和 D-JQS/human 评分；至少 2/3 family 的 reference matched 必须稳定优于 swapped，neutral pair 不能被无故改坏。若 CDM 相对独立 A/B rubric 不产生任何系统重分类，也不增量预测真人选择，就把论文降级为透明 measurement extension，不把 compiler 包装成核心创新。</w:t>
       </w:r>
     </w:p>
     <w:p>
@@ -2526,7 +2774,7 @@
         <w:rPr>
           <w:rFonts w:ascii="Calibri" w:hAnsi="Calibri" w:eastAsia="PingFang SC"/>
         </w:rPr>
-        <w:t>如果主实验通过，可以声称：DeepAlign-Bench 提供了固定 task/evidence/resources 下的 paired-user 反事实评测；它能把通用高质量、单边个性化、低绝对适配、只胜过差 swapped、关键约束误用和边界违规分开。</w:t>
+        <w:t>如果主实验通过，可以声称：DeepAlign-Bench 提供了固定 task/evidence/resources 下的 paired-user 反事实评测；它用真人来源的 relational CDM 约束 rubric，用 D-JQS/hybrid scoring 执行标准，并能把通用高质量、单边个性化、低绝对适配、只胜过差 swapped、关键约束误用和边界违规分开。</w:t>
       </w:r>
     </w:p>
     <w:p>
@@ -2589,7 +2837,7 @@
         </w:rPr>
         <w:t xml:space="preserve">[2] </w:t>
       </w:r>
-      <w:hyperlink r:id="rId17">
+      <w:hyperlink r:id="rId21">
         <w:r>
           <w:rPr>
             <w:rFonts w:ascii="Calibri" w:hAnsi="Calibri" w:eastAsia="PingFang SC"/>
@@ -2621,7 +2869,7 @@
         </w:rPr>
         <w:t xml:space="preserve">[3] </w:t>
       </w:r>
-      <w:hyperlink r:id="rId18">
+      <w:hyperlink r:id="rId22">
         <w:r>
           <w:rPr>
             <w:rFonts w:ascii="Calibri" w:hAnsi="Calibri" w:eastAsia="PingFang SC"/>
@@ -2653,7 +2901,7 @@
         </w:rPr>
         <w:t xml:space="preserve">[4] </w:t>
       </w:r>
-      <w:hyperlink r:id="rId19">
+      <w:hyperlink r:id="rId23">
         <w:r>
           <w:rPr>
             <w:rFonts w:ascii="Calibri" w:hAnsi="Calibri" w:eastAsia="PingFang SC"/>
@@ -2685,6 +2933,134 @@
         </w:rPr>
         <w:t xml:space="preserve">[5] </w:t>
       </w:r>
+      <w:hyperlink r:id="rId24">
+        <w:r>
+          <w:rPr>
+            <w:rFonts w:ascii="Calibri" w:hAnsi="Calibri" w:eastAsia="PingFang SC"/>
+            <w:color w:val="2E74B5"/>
+            <w:u w:val="single"/>
+            <w:sz w:val="16"/>
+            <w:szCs w:val="16"/>
+          </w:rPr>
+          <w:t>ICLR 2027 Author Guidelines</w:t>
+        </w:r>
+      </w:hyperlink>
+      <w:r>
+        <w:rPr>
+          <w:rFonts w:ascii="Calibri" w:hAnsi="Calibri" w:eastAsia="PingFang SC"/>
+          <w:sz w:val="16"/>
+        </w:rPr>
+        <w:t>. 2026.</w:t>
+      </w:r>
+    </w:p>
+    <w:p>
+      <w:pPr>
+        <w:spacing w:after="0" w:line="216" w:lineRule="auto"/>
+        <w:ind w:left="360" w:hanging="360"/>
+      </w:pPr>
+      <w:r>
+        <w:rPr>
+          <w:rFonts w:ascii="Calibri" w:hAnsi="Calibri" w:eastAsia="PingFang SC"/>
+          <w:sz w:val="16"/>
+        </w:rPr>
+        <w:t xml:space="preserve">[6] </w:t>
+      </w:r>
+      <w:hyperlink r:id="rId17">
+        <w:r>
+          <w:rPr>
+            <w:rFonts w:ascii="Calibri" w:hAnsi="Calibri" w:eastAsia="PingFang SC"/>
+            <w:color w:val="2E74B5"/>
+            <w:u w:val="single"/>
+            <w:sz w:val="16"/>
+            <w:szCs w:val="16"/>
+          </w:rPr>
+          <w:t>JudgeBench</w:t>
+        </w:r>
+      </w:hyperlink>
+      <w:r>
+        <w:rPr>
+          <w:rFonts w:ascii="Calibri" w:hAnsi="Calibri" w:eastAsia="PingFang SC"/>
+          <w:sz w:val="16"/>
+        </w:rPr>
+        <w:t>. ICLR 2025.</w:t>
+      </w:r>
+    </w:p>
+    <w:p>
+      <w:pPr>
+        <w:spacing w:after="0" w:line="216" w:lineRule="auto"/>
+        <w:ind w:left="360" w:hanging="360"/>
+      </w:pPr>
+      <w:r>
+        <w:rPr>
+          <w:rFonts w:ascii="Calibri" w:hAnsi="Calibri" w:eastAsia="PingFang SC"/>
+          <w:sz w:val="16"/>
+        </w:rPr>
+        <w:t xml:space="preserve">[7] </w:t>
+      </w:r>
+      <w:hyperlink r:id="rId18">
+        <w:r>
+          <w:rPr>
+            <w:rFonts w:ascii="Calibri" w:hAnsi="Calibri" w:eastAsia="PingFang SC"/>
+            <w:color w:val="2E74B5"/>
+            <w:u w:val="single"/>
+            <w:sz w:val="16"/>
+            <w:szCs w:val="16"/>
+          </w:rPr>
+          <w:t>JUDGE-BENCH</w:t>
+        </w:r>
+      </w:hyperlink>
+      <w:r>
+        <w:rPr>
+          <w:rFonts w:ascii="Calibri" w:hAnsi="Calibri" w:eastAsia="PingFang SC"/>
+          <w:sz w:val="16"/>
+        </w:rPr>
+        <w:t>. ACL 2025.</w:t>
+      </w:r>
+    </w:p>
+    <w:p>
+      <w:pPr>
+        <w:spacing w:after="0" w:line="216" w:lineRule="auto"/>
+        <w:ind w:left="360" w:hanging="360"/>
+      </w:pPr>
+      <w:r>
+        <w:rPr>
+          <w:rFonts w:ascii="Calibri" w:hAnsi="Calibri" w:eastAsia="PingFang SC"/>
+          <w:sz w:val="16"/>
+        </w:rPr>
+        <w:t xml:space="preserve">[8] </w:t>
+      </w:r>
+      <w:hyperlink r:id="rId19">
+        <w:r>
+          <w:rPr>
+            <w:rFonts w:ascii="Calibri" w:hAnsi="Calibri" w:eastAsia="PingFang SC"/>
+            <w:color w:val="2E74B5"/>
+            <w:u w:val="single"/>
+            <w:sz w:val="16"/>
+            <w:szCs w:val="16"/>
+          </w:rPr>
+          <w:t>RuVerBench</w:t>
+        </w:r>
+      </w:hyperlink>
+      <w:r>
+        <w:rPr>
+          <w:rFonts w:ascii="Calibri" w:hAnsi="Calibri" w:eastAsia="PingFang SC"/>
+          <w:sz w:val="16"/>
+        </w:rPr>
+        <w:t>. 2026.</w:t>
+      </w:r>
+    </w:p>
+    <w:p>
+      <w:pPr>
+        <w:spacing w:after="0" w:line="216" w:lineRule="auto"/>
+        <w:ind w:left="360" w:hanging="360"/>
+      </w:pPr>
+      <w:r>
+        <w:rPr>
+          <w:rFonts w:ascii="Calibri" w:hAnsi="Calibri" w:eastAsia="PingFang SC"/>
+          <w:sz w:val="16"/>
+        </w:rPr>
+        <w:t xml:space="preserve">[9] </w:t>
+      </w:r>
       <w:hyperlink r:id="rId20">
         <w:r>
           <w:rPr>
@@ -2694,7 +3070,7 @@
             <w:sz w:val="16"/>
             <w:szCs w:val="16"/>
           </w:rPr>
-          <w:t>ICLR 2027 Author Guidelines</w:t>
+          <w:t>GAMUT</w:t>
         </w:r>
       </w:hyperlink>
       <w:r>
@@ -2732,7 +3108,7 @@
         <w:color w:val="5B6B7A"/>
         <w:sz w:val="18"/>
       </w:rPr>
-      <w:t xml:space="preserve">2026-8-16   ·   </w:t>
+      <w:t xml:space="preserve">2026-8-17   ·   </w:t>
     </w:r>
     <w:r>
       <w:rPr>
@@ -2765,7 +3141,7 @@
         <w:color w:val="5B6B7A"/>
         <w:sz w:val="18"/>
       </w:rPr>
-      <w:t xml:space="preserve">2026-8-16   ·   </w:t>
+      <w:t xml:space="preserve">2026-8-17   ·   </w:t>
     </w:r>
     <w:r>
       <w:rPr>
@@ -2798,7 +3174,7 @@
         <w:color w:val="5B6B7A"/>
         <w:sz w:val="18"/>
       </w:rPr>
-      <w:t xml:space="preserve">2026-8-16   ·   </w:t>
+      <w:t xml:space="preserve">2026-8-17   ·   </w:t>
     </w:r>
     <w:r>
       <w:rPr>

</xml_diff>

<commit_message>
proposal v0.56: operationalize Credamo persona collection
</commit_message>
<xml_diff>
--- a/deliverables/DeepAlign-Bench_完整人话版.docx
+++ b/deliverables/DeepAlign-Bench_完整人话版.docx
@@ -131,7 +131,7 @@
                 <w:color w:val="5B6B7A"/>
                 <w:sz w:val="21"/>
               </w:rPr>
-              <w:t>v0.55 · 完整人话版</w:t>
+              <w:t>v0.56 · 完整人话版</w:t>
             </w:r>
           </w:p>
         </w:tc>
@@ -189,7 +189,7 @@
                 <w:color w:val="5B6B7A"/>
                 <w:sz w:val="21"/>
               </w:rPr>
-              <w:t>2026 年 8 月 17 日</w:t>
+              <w:t>2026 年 8 月 20 日</w:t>
             </w:r>
           </w:p>
         </w:tc>
@@ -1141,7 +1141,7 @@
         <w:rPr>
           <w:rFonts w:ascii="Calibri" w:hAnsi="Calibri" w:eastAsia="PingFang SC"/>
         </w:rPr>
-        <w:t>每位参与者从随机化或分层 task slate 里选 3–5 个现实中可能真的要做的任务；保留他看过、认为相关、最后选择和跳过的完整记录。</w:t>
+        <w:t>Credamo 第一轮不会把 60 题全部扔给参与者。它根据教育/职业领域和 coding/data/research 经验先给 10–15 张可能相关的卡；性别、年龄等人口学不参与推荐。每张卡还要单独回答“现实中是否会需要、是否有类似经验、能否在不泄密的情况下描述”。</w:t>
       </w:r>
     </w:p>
     <w:p>
@@ -1157,7 +1157,7 @@
         <w:rPr>
           <w:rFonts w:ascii="Calibri" w:hAnsi="Calibri" w:eastAsia="PingFang SC"/>
         </w:rPr>
-        <w:t>对每道已选题先让用户自由说目标、限制、风险、取舍、受众、使用方式和“什么会让我不用这个结果”，避免问卷先把答案塞给他。</w:t>
+        <w:t>用户从真正合格的 cards 里选 3–5 个候选任务；如果真实相关的只有 1–2 个，就正常保留，绝不强迫凑数。后台保存 offered、顺序、eligible、selected 和 skipped，不能只公布最后漂亮的 pair。</w:t>
       </w:r>
     </w:p>
     <w:p>
@@ -1173,7 +1173,7 @@
         <w:rPr>
           <w:rFonts w:ascii="Calibri" w:hAnsi="Calibri" w:eastAsia="PingFang SC"/>
         </w:rPr>
-        <w:t>再用任务类型对应的追问表补漏。每条事实标清是用户主动说的、追问后说的、不适用，还是拒绝回答；也记录不确定性、多个可接受答案、时间戳和隐私许可。</w:t>
+        <w:t>第二轮只从候选中分配 1 个主任务、最多 1 个次任务做深度填写。这样 3–5 表示覆盖偏好，不等于一个人要连续写 3–5 份完整 persona。</w:t>
       </w:r>
     </w:p>
     <w:p>
@@ -1189,7 +1189,7 @@
         <w:rPr>
           <w:rFonts w:ascii="Calibri" w:hAnsi="Calibri" w:eastAsia="PingFang SC"/>
         </w:rPr>
-        <w:t>把这些信息整理成用户本人确认的后台 ledger。Agent 默认看不到整个 ledger，只看到实验指定的 persona/history/clarification view。</w:t>
+        <w:t>每个 assigned task 先回答五个开放问题：具体情境、希望交付什么和下一步做什么、哪些现实条件会改变好答案、什么不可接受、AI 最该追问什么。第一次提交必须保存，之后才出现选择题；看到 schema 后新增的内容单独标成 prompted。</w:t>
       </w:r>
     </w:p>
     <w:p>
@@ -1205,7 +1205,23 @@
         <w:rPr>
           <w:rFonts w:ascii="Calibri" w:hAnsi="Calibri" w:eastAsia="PingFang SC"/>
         </w:rPr>
-        <w:t>同一题里不只挑“差异巨大”的两个人，还保留差异小的 near-neighbor pair，以及本来不该导致报告变化的 neutral pair。这样既测“该改时会不会改”，也测“不该改时会不会乱改”。</w:t>
+        <w:t>第三轮把 LLM 整理出的事实卡连同用户原话一起展示。用户逐条保留、修改、删除或标记不确定，并分别决定是否可用于后台评分、是否可展示给被测 agent、是否可去标识化公开。没有原话来源或本人最终未确认的事实不能进入 gold。</w:t>
+      </w:r>
+    </w:p>
+    <w:p>
+      <w:r>
+        <w:rPr>
+          <w:rFonts w:ascii="Calibri" w:hAnsi="Calibri" w:eastAsia="PingFang SC"/>
+        </w:rPr>
+        <w:t>这三轮分别约 10–15 分钟、15–22 分钟/任务、5–8 分钟/任务。推荐普通参与者的有效时薪不低于约 ¥40–60；专业长尾用户另行加价。最低每题两人没有流失缓冲，12 个 paper-first 任务应先争取每题 3–4 个 confirmed ledger，再根据 pilot 扩 60 题。正式招募前必须完成伦理/IRB、Credamo 跨轮 ID/预填/配额实机测试和 LLM 数据处理审批。</w:t>
+      </w:r>
+    </w:p>
+    <w:p>
+      <w:r>
+        <w:rPr>
+          <w:rFonts w:ascii="Calibri" w:hAnsi="Calibri" w:eastAsia="PingFang SC"/>
+        </w:rPr>
+        <w:t>确认后的 ledger 默认只在后台作为真值使用。Agent 只看到实验指定的 persona/history/clarification view；同一题里既构造高对比 pair，也保留 near-neighbor 和 neutral/invariance pair。这样既测“该改时会不会改”，也测“不该改时会不会乱改”。</w:t>
       </w:r>
     </w:p>
     <w:p>
@@ -3108,7 +3124,7 @@
         <w:color w:val="5B6B7A"/>
         <w:sz w:val="18"/>
       </w:rPr>
-      <w:t xml:space="preserve">2026-8-17   ·   </w:t>
+      <w:t xml:space="preserve">2026-8-20   ·   </w:t>
     </w:r>
     <w:r>
       <w:rPr>
@@ -3141,7 +3157,7 @@
         <w:color w:val="5B6B7A"/>
         <w:sz w:val="18"/>
       </w:rPr>
-      <w:t xml:space="preserve">2026-8-17   ·   </w:t>
+      <w:t xml:space="preserve">2026-8-20   ·   </w:t>
     </w:r>
     <w:r>
       <w:rPr>
@@ -3174,7 +3190,7 @@
         <w:color w:val="5B6B7A"/>
         <w:sz w:val="18"/>
       </w:rPr>
-      <w:t xml:space="preserve">2026-8-17   ·   </w:t>
+      <w:t xml:space="preserve">2026-8-20   ·   </w:t>
     </w:r>
     <w:r>
       <w:rPr>

</xml_diff>

<commit_message>
proposal v0.58: implement interaction environment
</commit_message>
<xml_diff>
--- a/deliverables/DeepAlign-Bench_完整人话版.docx
+++ b/deliverables/DeepAlign-Bench_完整人话版.docx
@@ -131,7 +131,7 @@
                 <w:color w:val="5B6B7A"/>
                 <w:sz w:val="21"/>
               </w:rPr>
-              <w:t>v0.56 · 完整人话版</w:t>
+              <w:t>v0.58 · 完整人话版</w:t>
             </w:r>
           </w:p>
         </w:tc>
@@ -189,7 +189,7 @@
                 <w:color w:val="5B6B7A"/>
                 <w:sz w:val="21"/>
               </w:rPr>
-              <w:t>2026 年 8 月 20 日</w:t>
+              <w:t>2026 年 8 月 21 日</w:t>
             </w:r>
           </w:p>
         </w:tc>
@@ -1213,7 +1213,7 @@
         <w:rPr>
           <w:rFonts w:ascii="Calibri" w:hAnsi="Calibri" w:eastAsia="PingFang SC"/>
         </w:rPr>
-        <w:t>这三轮分别约 10–15 分钟、15–22 分钟/任务、5–8 分钟/任务。推荐普通参与者的有效时薪不低于约 ¥40–60；专业长尾用户另行加价。最低每题两人没有流失缓冲，12 个 paper-first 任务应先争取每题 3–4 个 confirmed ledger，再根据 pilot 扩 60 题。正式招募前必须完成伦理/IRB、Credamo 跨轮 ID/预填/配额实机测试和 LLM 数据处理审批。</w:t>
+        <w:t>这三轮分别约 10–15 分钟、15–22 分钟/任务、5–8 分钟/任务。推荐普通参与者的有效时薪不低于约 ¥40–60；专业长尾用户另行加价。人民币 3,000 元 all-in working ceiling 下，首轮保留 12 个 paper-first 任务：每题先买到 2 个 confirmed ledger，再只给 6 个跨场景 anchor 补第 3 人，目标 30 个 user–task records。它只能验证路由、问卷、确认、自然配对和 CDM 是否可做，不能拿来做 agent 排名或 60-task 总体结论。正式招募前必须完成伦理/IRB、Credamo 跨轮 ID/预填/配额实机测试和 LLM 数据处理审批。</w:t>
       </w:r>
     </w:p>
     <w:p>
@@ -1565,6 +1565,83 @@
         <w:rPr>
           <w:rFonts w:ascii="Calibri" w:hAnsi="Calibri" w:eastAsia="PingFang SC"/>
         </w:rPr>
+        <w:t xml:space="preserve">v0.58 已把这件事做成可运行 Python 包。每个 case 固定 task、隐藏 persona、属性重要性图、披露策略和最多交互轮数；agent 只调用 </w:t>
+      </w:r>
+      <w:r>
+        <w:rPr>
+          <w:rFonts w:ascii="Courier New" w:hAnsi="Courier New" w:eastAsia="PingFang SC"/>
+          <w:color w:val="6A3E00"/>
+          <w:sz w:val="20"/>
+        </w:rPr>
+        <w:t>reset()</w:t>
+      </w:r>
+      <w:r>
+        <w:rPr>
+          <w:rFonts w:ascii="Calibri" w:hAnsi="Calibri" w:eastAsia="PingFang SC"/>
+        </w:rPr>
+        <w:t xml:space="preserve"> 和 </w:t>
+      </w:r>
+      <w:r>
+        <w:rPr>
+          <w:rFonts w:ascii="Courier New" w:hAnsi="Courier New" w:eastAsia="PingFang SC"/>
+          <w:color w:val="6A3E00"/>
+          <w:sz w:val="20"/>
+        </w:rPr>
+        <w:t>step()</w:t>
+      </w:r>
+      <w:r>
+        <w:rPr>
+          <w:rFonts w:ascii="Calibri" w:hAnsi="Calibri" w:eastAsia="PingFang SC"/>
+        </w:rPr>
+        <w:t>：</w:t>
+      </w:r>
+    </w:p>
+    <w:p>
+      <w:pPr>
+        <w:pStyle w:val="ListBullet"/>
+      </w:pPr>
+      <w:r>
+        <w:rPr>
+          <w:rFonts w:ascii="Calibri" w:hAnsi="Calibri" w:eastAsia="PingFang SC"/>
+        </w:rPr>
+        <w:t>A Oracle：reset 就把完整 persona 给 agent，测信息充分时能不能用对；</w:t>
+      </w:r>
+    </w:p>
+    <w:p>
+      <w:pPr>
+        <w:pStyle w:val="ListBullet"/>
+      </w:pPr>
+      <w:r>
+        <w:rPr>
+          <w:rFonts w:ascii="Calibri" w:hAnsi="Calibri" w:eastAsia="PingFang SC"/>
+        </w:rPr>
+        <w:t>B Naive：agent 起初只见 task，但 LLM 用户模拟器一直看得到完整 persona，也没有披露政策，因而可能主动泄露或过度提供信息；</w:t>
+      </w:r>
+    </w:p>
+    <w:p>
+      <w:pPr>
+        <w:pStyle w:val="ListBullet"/>
+      </w:pPr>
+      <w:r>
+        <w:rPr>
+          <w:rFonts w:ascii="Calibri" w:hAnsi="Calibri" w:eastAsia="PingFang SC"/>
+        </w:rPr>
+        <w:t>C Interactive：persona 真正隐藏。分类器只看属性名称、说明、别名和关键词，不看属性值；策略通过后，回复模型也只拿到本轮允许披露的值。</w:t>
+      </w:r>
+    </w:p>
+    <w:p>
+      <w:r>
+        <w:rPr>
+          <w:rFonts w:ascii="Calibri" w:hAnsi="Calibri" w:eastAsia="PingFang SC"/>
+        </w:rPr>
+        <w:t>每一步都写日志：这是不是在问用户信息、匹配了哪些属性、哪些被政策拒绝、这轮新披露了什么、累计披露了什么、还有什么仍隐藏。属性重要性图只给“本轮已经直接问到的多个属性”排序，不会偷偷把没问到的属性带出来。若未授权值的 literal marker 出现在回复中，环境会 fail closed；但换一种说法的语义泄漏仍要额外审计。</w:t>
+      </w:r>
+    </w:p>
+    <w:p>
+      <w:r>
+        <w:rPr>
+          <w:rFonts w:ascii="Calibri" w:hAnsi="Calibri" w:eastAsia="PingFang SC"/>
+        </w:rPr>
         <w:t>这个条件额外记录：</w:t>
       </w:r>
     </w:p>
@@ -1632,6 +1709,14 @@
           <w:rFonts w:ascii="Calibri" w:hAnsi="Calibri" w:eastAsia="PingFang SC"/>
         </w:rPr>
         <w:t>交互轮数和用户负担。</w:t>
+      </w:r>
+    </w:p>
+    <w:p>
+      <w:r>
+        <w:rPr>
+          <w:rFonts w:ascii="Calibri" w:hAnsi="Calibri" w:eastAsia="PingFang SC"/>
+        </w:rPr>
+        <w:t>默认 rule-based 模拟器只为离线测试和可复现 baseline 服务。正式 Naive/Interactive 应使用同一个固定 LLM backend、模型版本、采样参数、case、轮数和 seed 计划，再用真人轨迹校准问题匹配、披露决定、自然度、事实忠实和泄漏。即使都固定，B 与 C 的差仍同时包含“模拟器看到多少信息”和“模拟器怎样披露”，不能包装成纯 agent 能力差；脚本化 trust 也只是实验控制，不是真人心理模型。</w:t>
       </w:r>
     </w:p>
     <w:p>
@@ -3124,7 +3209,7 @@
         <w:color w:val="5B6B7A"/>
         <w:sz w:val="18"/>
       </w:rPr>
-      <w:t xml:space="preserve">2026-8-20   ·   </w:t>
+      <w:t xml:space="preserve">2026-8-21   ·   </w:t>
     </w:r>
     <w:r>
       <w:rPr>
@@ -3157,7 +3242,7 @@
         <w:color w:val="5B6B7A"/>
         <w:sz w:val="18"/>
       </w:rPr>
-      <w:t xml:space="preserve">2026-8-20   ·   </w:t>
+      <w:t xml:space="preserve">2026-8-21   ·   </w:t>
     </w:r>
     <w:r>
       <w:rPr>
@@ -3190,7 +3275,7 @@
         <w:color w:val="5B6B7A"/>
         <w:sz w:val="18"/>
       </w:rPr>
-      <w:t xml:space="preserve">2026-8-20   ·   </w:t>
+      <w:t xml:space="preserve">2026-8-21   ·   </w:t>
     </w:r>
     <w:r>
       <w:rPr>

</xml_diff>

<commit_message>
proposal v0.59: freeze single-deliverable task contracts
</commit_message>
<xml_diff>
--- a/deliverables/DeepAlign-Bench_完整人话版.docx
+++ b/deliverables/DeepAlign-Bench_完整人话版.docx
@@ -131,7 +131,7 @@
                 <w:color w:val="5B6B7A"/>
                 <w:sz w:val="21"/>
               </w:rPr>
-              <w:t>v0.58 · 完整人话版</w:t>
+              <w:t>v0.59 · 完整人话版</w:t>
             </w:r>
           </w:p>
         </w:tc>
@@ -189,7 +189,7 @@
                 <w:color w:val="5B6B7A"/>
                 <w:sz w:val="21"/>
               </w:rPr>
-              <w:t>2026 年 8 月 21 日</w:t>
+              <w:t>2026 年 8 月 22 日</w:t>
             </w:r>
           </w:p>
         </w:tc>
@@ -923,7 +923,7 @@
         <w:rPr>
           <w:rFonts w:ascii="Calibri" w:hAnsi="Calibri" w:eastAsia="PingFang SC"/>
         </w:rPr>
-        <w:t>主要 research intent：比较、规划、选择、诊断、综合还是验证；</w:t>
+        <w:t>主要 research intent：发现、枚举、核验、综合、修改、诊断、建模还是验证；</w:t>
       </w:r>
     </w:p>
     <w:p>
@@ -945,7 +945,7 @@
         <w:rPr>
           <w:rFonts w:ascii="Calibri" w:hAnsi="Calibri" w:eastAsia="PingFang SC"/>
         </w:rPr>
-        <w:t>交付物：报告、路线图、采购建议、证据表还是行动方案；</w:t>
+        <w:t>唯一主要交付物：evidence catalog/map/dossier、repository commit、notebook、workbook 或 versioned pipeline package；表、图、日志、测试和说明只能作为内部组成；</w:t>
       </w:r>
     </w:p>
     <w:p>
@@ -1772,7 +1772,7 @@
         <w:rPr>
           <w:rFonts w:ascii="Calibri" w:hAnsi="Calibri" w:eastAsia="PingFang SC"/>
         </w:rPr>
-        <w:t>这 250 对不能直接当成 DeepAlign 的 250 个独立实验。v0.54 把 PDR 放进更大的候选池：总共先收 180 个 seed（72 研究、54 软件、54 数据），再预选 60 个 family（24/18/18）。其中 12 个直接来自 PDR task shell，其他补文献景观、prior art、仓库修改、spreadsheet 和 ML 等结构。60 个只是 provisional sampling frame，没有通过许可、环境、双人审查、contract 和 pilot 门就不能说是可运行 gold。</w:t>
+        <w:t>这 250 对不能直接当成 DeepAlign 的 250 个独立实验。v0.59 把 PDR 放进更大的候选池：总共先收 180 个 seed（72 研究、54 软件、54 数据），再预选 60 个 family（24/18/18）。其中 10 个保留 PDR 的来源和主题，但不复用原来的推荐/规划题面；其余补文献景观、prior art、仓库修改、spreadsheet 和 ML 等结构。每题只有一个主要交付物。24 个研究题只要求找项目/资源、做证据图谱、文献综合、数据集发现、先前技术、冲突审计、时点差分或实体枚举，不替用户推荐或制定计划。60 个只是 provisional sampling frame，没有通过许可、环境、双人审查、contract 和 pilot 门就不能说是可运行 gold。</w:t>
       </w:r>
     </w:p>
     <w:p>
@@ -3209,7 +3209,7 @@
         <w:color w:val="5B6B7A"/>
         <w:sz w:val="18"/>
       </w:rPr>
-      <w:t xml:space="preserve">2026-8-21   ·   </w:t>
+      <w:t xml:space="preserve">2026-8-22   ·   </w:t>
     </w:r>
     <w:r>
       <w:rPr>
@@ -3242,7 +3242,7 @@
         <w:color w:val="5B6B7A"/>
         <w:sz w:val="18"/>
       </w:rPr>
-      <w:t xml:space="preserve">2026-8-21   ·   </w:t>
+      <w:t xml:space="preserve">2026-8-22   ·   </w:t>
     </w:r>
     <w:r>
       <w:rPr>
@@ -3275,7 +3275,7 @@
         <w:color w:val="5B6B7A"/>
         <w:sz w:val="18"/>
       </w:rPr>
-      <w:t xml:space="preserve">2026-8-21   ·   </w:t>
+      <w:t xml:space="preserve">2026-8-22   ·   </w:t>
     </w:r>
     <w:r>
       <w:rPr>

</xml_diff>